<commit_message>
Paper v2: add 512-px seg results (tuned 0.733 vs 0.76), below SOTA; pdfinfo 8 pages
</commit_message>
<xml_diff>
--- a/paper/mega27-03-virtual-organoid-paper.docx
+++ b/paper/mega27-03-virtual-organoid-paper.docx
@@ -51,7 +51,7 @@
         <w:jc w:val="both"/>
       </w:pPr>
       <w:r>
-        <w:t>Negatives. Size-adjusted and size-filtered readouts do not improve per-donor Trikafta-vs-DMSO separation, so the finding does not change theratyping calls at this assay's well counts. Replication on the public FIS time series is impossible because it is well-level. Our U-Net segmentation reaches mAP@0.5 = 0.710 +/- 0.127 on the OrgaSegment eval split (published 0.76 +/- 0.12): below the state of the art.</w:t>
+        <w:t>Negatives. Size-adjusted and size-filtered readouts do not improve per-donor Trikafta-vs-DMSO separation, so the finding does not change theratyping calls at this assay's well counts. Replication on the public FIS time series is impossible because it is well-level. Our best U-Net segmentation (512 px, tuned) reaches mAP@0.5 = 0.733 +/- 0.129 on the OrgaSegment eval split (published 0.76 +/- 0.12): below the state of the art, although the gap is within one standard deviation on 12 images.</w:t>
       </w:r>
     </w:p>
     <w:p>
@@ -2553,6 +2553,90 @@
           </w:tcPr>
           <w:p>
             <w:r>
+              <w:t>U-Net v2, 512 px, 60 epochs, default post-processing</w:t>
+            </w:r>
+          </w:p>
+        </w:tc>
+        <w:tc>
+          <w:tcPr>
+            <w:tcW w:type="dxa" w:w="2160"/>
+          </w:tcPr>
+          <w:p>
+            <w:r>
+              <w:t>0.691</w:t>
+            </w:r>
+          </w:p>
+        </w:tc>
+        <w:tc>
+          <w:tcPr>
+            <w:tcW w:type="dxa" w:w="2160"/>
+          </w:tcPr>
+          <w:p>
+            <w:r>
+              <w:t>0.135</w:t>
+            </w:r>
+          </w:p>
+        </w:tc>
+        <w:tc>
+          <w:tcPr>
+            <w:tcW w:type="dxa" w:w="2160"/>
+          </w:tcPr>
+          <w:p>
+            <w:r>
+              <w:t>results/seg_eval_512.json</w:t>
+            </w:r>
+          </w:p>
+        </w:tc>
+      </w:tr>
+      <w:tr>
+        <w:tc>
+          <w:tcPr>
+            <w:tcW w:type="dxa" w:w="2160"/>
+          </w:tcPr>
+          <w:p>
+            <w:r>
+              <w:t>U-Net v2 + val-tuned post-processing + flip TTA</w:t>
+            </w:r>
+          </w:p>
+        </w:tc>
+        <w:tc>
+          <w:tcPr>
+            <w:tcW w:type="dxa" w:w="2160"/>
+          </w:tcPr>
+          <w:p>
+            <w:r>
+              <w:t>0.733</w:t>
+            </w:r>
+          </w:p>
+        </w:tc>
+        <w:tc>
+          <w:tcPr>
+            <w:tcW w:type="dxa" w:w="2160"/>
+          </w:tcPr>
+          <w:p>
+            <w:r>
+              <w:t>0.129</w:t>
+            </w:r>
+          </w:p>
+        </w:tc>
+        <w:tc>
+          <w:tcPr>
+            <w:tcW w:type="dxa" w:w="2160"/>
+          </w:tcPr>
+          <w:p>
+            <w:r>
+              <w:t>results/seg_eval_tuned_512.json</w:t>
+            </w:r>
+          </w:p>
+        </w:tc>
+      </w:tr>
+      <w:tr>
+        <w:tc>
+          <w:tcPr>
+            <w:tcW w:type="dxa" w:w="2160"/>
+          </w:tcPr>
+          <w:p>
+            <w:r>
               <w:t>OrgaSegment (published, Mask R-CNN)</w:t>
             </w:r>
           </w:p>
@@ -2595,7 +2679,7 @@
         <w:jc w:val="both"/>
       </w:pPr>
       <w:r>
-        <w:t>Caveat: the validation images used for tuning were also in the training set, so the tuning signal is optimistic; the eval split was scored once. A 512-px model was killed by an out-of-memory error at epoch 18 and has been restarted; it is not reported.</w:t>
+        <w:t>Caveat: the validation images used for tuning were also in the training set, so the tuning signal is optimistic; the eval split was scored once. The 512-px model (resumed from checkpoint after an out-of-memory kill at epoch 18) raises the tuned score from 0.710 to 0.733, still below the published mean. With 12 eval images and sd near 0.13, neither a win nor a loss against OrgaSegment is statistically resolved; we report it as below state of the art.</w:t>
       </w:r>
     </w:p>
     <w:p>

</xml_diff>

<commit_message>
Paper v3: GEO fidelity section (4 new equations, table, figure, negatives), tools table from ledger (16); pdfinfo 10 pages
</commit_message>
<xml_diff>
--- a/paper/mega27-03-virtual-organoid-paper.docx
+++ b/paper/mega27-03-virtual-organoid-paper.docx
@@ -2684,6 +2684,617 @@
     </w:p>
     <w:p>
       <w:pPr>
+        <w:pStyle w:val="Heading2"/>
+      </w:pPr>
+      <w:r>
+        <w:t>4.6 Organoid-to-tissue fidelity across 151 GEO series</w:t>
+      </w:r>
+    </w:p>
+    <w:p>
+      <w:pPr>
+        <w:spacing w:after="120"/>
+        <w:jc w:val="both"/>
+      </w:pPr>
+      <w:r>
+        <w:t>To test organoid fidelity at scale, we searched GEO through NCBI E-utilities for human organoid bulk RNA-seq series (2,838 hits; 1,545 with text count matrices). For 151 series with a usable gene-level matrix and a title naming a single organ, each sample was converted to log counts per million and averaged. The series profile was then correlated with every GTEx v8 tissue median profile (54 tissues).</w:t>
+      </w:r>
+    </w:p>
+    <w:p>
+      <w:pPr>
+        <w:jc w:val="center"/>
+      </w:pPr>
+      <w:r>
+        <w:rPr>
+          <w:i/>
+        </w:rPr>
+        <w:t>CPM_gs = 10^6 x_gs / sum_g x_gs,   p_g = (1/S) sum_s log(1 + CPM_gs)</w:t>
+      </w:r>
+      <w:r>
+        <w:tab/>
+        <w:tab/>
+        <w:t>(11)</w:t>
+      </w:r>
+    </w:p>
+    <w:p>
+      <w:pPr>
+        <w:jc w:val="center"/>
+      </w:pPr>
+      <w:r>
+        <w:rPr>
+          <w:i/>
+        </w:rPr>
+        <w:t>r_t^cent = &lt;p - mu_p - (m - mu_m), G_t - m - mean(G_t - m)&gt; / (||.|| ||.||),   m_g = mean_t G_gt</w:t>
+      </w:r>
+      <w:r>
+        <w:tab/>
+        <w:tab/>
+        <w:t>(12)</w:t>
+      </w:r>
+    </w:p>
+    <w:p>
+      <w:pPr>
+        <w:spacing w:after="120"/>
+        <w:jc w:val="both"/>
+      </w:pPr>
+      <w:r>
+        <w:t>The permutation p-value for the top-1 recovery rate reshuffles organ labels across series, B = 10,000 times:</w:t>
+      </w:r>
+    </w:p>
+    <w:p>
+      <w:pPr>
+        <w:jc w:val="center"/>
+      </w:pPr>
+      <w:r>
+        <w:rPr>
+          <w:i/>
+        </w:rPr>
+        <w:t>p_perm = (1 + #{b : top1_b &gt;= top1_obs}) / (1 + B)</w:t>
+      </w:r>
+      <w:r>
+        <w:tab/>
+        <w:tab/>
+        <w:t>(13)</w:t>
+      </w:r>
+    </w:p>
+    <w:p>
+      <w:pPr>
+        <w:spacing w:after="120"/>
+        <w:jc w:val="both"/>
+      </w:pPr>
+      <w:r>
+        <w:t>Uncertainty on shares uses a series-level percentile bootstrap:</w:t>
+      </w:r>
+    </w:p>
+    <w:p>
+      <w:pPr>
+        <w:jc w:val="center"/>
+      </w:pPr>
+      <w:r>
+        <w:rPr>
+          <w:i/>
+        </w:rPr>
+        <w:t>CI_95 = [q_0.025, q_0.975] of { f(D*_b) },  D*_b drawn with replacement from the series set, b = 1..2000</w:t>
+      </w:r>
+      <w:r>
+        <w:tab/>
+        <w:tab/>
+        <w:t>(14)</w:t>
+      </w:r>
+    </w:p>
+    <w:p>
+      <w:r>
+        <w:rPr>
+          <w:b/>
+        </w:rPr>
+        <w:t>Table 6. Tissue recovery and fibroblast best-match share. S3000: Spearman on the 3,000 most tissue-variable genes; SALL: all genes; CENT: GTEx-centred Pearson; _NOCULT: 853 MSigDB Hallmark proliferation/MYC/EMT genes removed. Clean subset: 114 series whose summary confirms a single organ and mentions organoids (113 with profiles). Files: results/geo_fidelity_methods.json, results/geo_fidelity_clean.json.</w:t>
+      </w:r>
+    </w:p>
+    <w:tbl>
+      <w:tblPr>
+        <w:tblStyle w:val="LightGrid-Accent1"/>
+        <w:tblW w:type="auto" w:w="0"/>
+        <w:tblLook w:firstColumn="1" w:firstRow="1" w:lastColumn="0" w:lastRow="0" w:noHBand="0" w:noVBand="1" w:val="04A0"/>
+      </w:tblPr>
+      <w:tblGrid>
+        <w:gridCol w:w="1234"/>
+        <w:gridCol w:w="1234"/>
+        <w:gridCol w:w="1234"/>
+        <w:gridCol w:w="1234"/>
+        <w:gridCol w:w="1234"/>
+        <w:gridCol w:w="1234"/>
+        <w:gridCol w:w="1234"/>
+      </w:tblGrid>
+      <w:tr>
+        <w:tc>
+          <w:tcPr>
+            <w:tcW w:type="dxa" w:w="1234"/>
+          </w:tcPr>
+          <w:p>
+            <w:r>
+              <w:t>method</w:t>
+            </w:r>
+          </w:p>
+        </w:tc>
+        <w:tc>
+          <w:tcPr>
+            <w:tcW w:type="dxa" w:w="1234"/>
+          </w:tcPr>
+          <w:p>
+            <w:r>
+              <w:t>top-1 (all)</w:t>
+            </w:r>
+          </w:p>
+        </w:tc>
+        <w:tc>
+          <w:tcPr>
+            <w:tcW w:type="dxa" w:w="1234"/>
+          </w:tcPr>
+          <w:p>
+            <w:r>
+              <w:t>null top-1</w:t>
+            </w:r>
+          </w:p>
+        </w:tc>
+        <w:tc>
+          <w:tcPr>
+            <w:tcW w:type="dxa" w:w="1234"/>
+          </w:tcPr>
+          <w:p>
+            <w:r>
+              <w:t>p_perm</w:t>
+            </w:r>
+          </w:p>
+        </w:tc>
+        <w:tc>
+          <w:tcPr>
+            <w:tcW w:type="dxa" w:w="1234"/>
+          </w:tcPr>
+          <w:p>
+            <w:r>
+              <w:t>top-1 (clean)</w:t>
+            </w:r>
+          </w:p>
+        </w:tc>
+        <w:tc>
+          <w:tcPr>
+            <w:tcW w:type="dxa" w:w="1234"/>
+          </w:tcPr>
+          <w:p>
+            <w:r>
+              <w:t>fibroblast best (clean)</w:t>
+            </w:r>
+          </w:p>
+        </w:tc>
+        <w:tc>
+          <w:tcPr>
+            <w:tcW w:type="dxa" w:w="1234"/>
+          </w:tcPr>
+          <w:p>
+            <w:r>
+              <w:t>95% CI</w:t>
+            </w:r>
+          </w:p>
+        </w:tc>
+      </w:tr>
+      <w:tr>
+        <w:tc>
+          <w:tcPr>
+            <w:tcW w:type="dxa" w:w="1234"/>
+          </w:tcPr>
+          <w:p>
+            <w:r>
+              <w:t>S3000</w:t>
+            </w:r>
+          </w:p>
+        </w:tc>
+        <w:tc>
+          <w:tcPr>
+            <w:tcW w:type="dxa" w:w="1234"/>
+          </w:tcPr>
+          <w:p>
+            <w:r>
+              <w:t>0.272</w:t>
+            </w:r>
+          </w:p>
+        </w:tc>
+        <w:tc>
+          <w:tcPr>
+            <w:tcW w:type="dxa" w:w="1234"/>
+          </w:tcPr>
+          <w:p>
+            <w:r>
+              <w:t>0.060</w:t>
+            </w:r>
+          </w:p>
+        </w:tc>
+        <w:tc>
+          <w:tcPr>
+            <w:tcW w:type="dxa" w:w="1234"/>
+          </w:tcPr>
+          <w:p>
+            <w:r>
+              <w:t>1e-04</w:t>
+            </w:r>
+          </w:p>
+        </w:tc>
+        <w:tc>
+          <w:tcPr>
+            <w:tcW w:type="dxa" w:w="1234"/>
+          </w:tcPr>
+          <w:p>
+            <w:r>
+              <w:t>0.301</w:t>
+            </w:r>
+          </w:p>
+        </w:tc>
+        <w:tc>
+          <w:tcPr>
+            <w:tcW w:type="dxa" w:w="1234"/>
+          </w:tcPr>
+          <w:p>
+            <w:r>
+              <w:t>0.230</w:t>
+            </w:r>
+          </w:p>
+        </w:tc>
+        <w:tc>
+          <w:tcPr>
+            <w:tcW w:type="dxa" w:w="1234"/>
+          </w:tcPr>
+          <w:p>
+            <w:r>
+              <w:t>[0.15, 0.31]</w:t>
+            </w:r>
+          </w:p>
+        </w:tc>
+      </w:tr>
+      <w:tr>
+        <w:tc>
+          <w:tcPr>
+            <w:tcW w:type="dxa" w:w="1234"/>
+          </w:tcPr>
+          <w:p>
+            <w:r>
+              <w:t>SALL</w:t>
+            </w:r>
+          </w:p>
+        </w:tc>
+        <w:tc>
+          <w:tcPr>
+            <w:tcW w:type="dxa" w:w="1234"/>
+          </w:tcPr>
+          <w:p>
+            <w:r>
+              <w:t>0.331</w:t>
+            </w:r>
+          </w:p>
+        </w:tc>
+        <w:tc>
+          <w:tcPr>
+            <w:tcW w:type="dxa" w:w="1234"/>
+          </w:tcPr>
+          <w:p>
+            <w:r>
+              <w:t>0.080</w:t>
+            </w:r>
+          </w:p>
+        </w:tc>
+        <w:tc>
+          <w:tcPr>
+            <w:tcW w:type="dxa" w:w="1234"/>
+          </w:tcPr>
+          <w:p>
+            <w:r>
+              <w:t>1e-04</w:t>
+            </w:r>
+          </w:p>
+        </w:tc>
+        <w:tc>
+          <w:tcPr>
+            <w:tcW w:type="dxa" w:w="1234"/>
+          </w:tcPr>
+          <w:p>
+            <w:r>
+              <w:t>0.327</w:t>
+            </w:r>
+          </w:p>
+        </w:tc>
+        <w:tc>
+          <w:tcPr>
+            <w:tcW w:type="dxa" w:w="1234"/>
+          </w:tcPr>
+          <w:p>
+            <w:r>
+              <w:t>0.257</w:t>
+            </w:r>
+          </w:p>
+        </w:tc>
+        <w:tc>
+          <w:tcPr>
+            <w:tcW w:type="dxa" w:w="1234"/>
+          </w:tcPr>
+          <w:p>
+            <w:r>
+              <w:t>[0.18, 0.34]</w:t>
+            </w:r>
+          </w:p>
+        </w:tc>
+      </w:tr>
+      <w:tr>
+        <w:tc>
+          <w:tcPr>
+            <w:tcW w:type="dxa" w:w="1234"/>
+          </w:tcPr>
+          <w:p>
+            <w:r>
+              <w:t>CENT</w:t>
+            </w:r>
+          </w:p>
+        </w:tc>
+        <w:tc>
+          <w:tcPr>
+            <w:tcW w:type="dxa" w:w="1234"/>
+          </w:tcPr>
+          <w:p>
+            <w:r>
+              <w:t>0.252</w:t>
+            </w:r>
+          </w:p>
+        </w:tc>
+        <w:tc>
+          <w:tcPr>
+            <w:tcW w:type="dxa" w:w="1234"/>
+          </w:tcPr>
+          <w:p>
+            <w:r>
+              <w:t>0.056</w:t>
+            </w:r>
+          </w:p>
+        </w:tc>
+        <w:tc>
+          <w:tcPr>
+            <w:tcW w:type="dxa" w:w="1234"/>
+          </w:tcPr>
+          <w:p>
+            <w:r>
+              <w:t>1e-04</w:t>
+            </w:r>
+          </w:p>
+        </w:tc>
+        <w:tc>
+          <w:tcPr>
+            <w:tcW w:type="dxa" w:w="1234"/>
+          </w:tcPr>
+          <w:p>
+            <w:r>
+              <w:t>0.274</w:t>
+            </w:r>
+          </w:p>
+        </w:tc>
+        <w:tc>
+          <w:tcPr>
+            <w:tcW w:type="dxa" w:w="1234"/>
+          </w:tcPr>
+          <w:p>
+            <w:r>
+              <w:t>0.363</w:t>
+            </w:r>
+          </w:p>
+        </w:tc>
+        <w:tc>
+          <w:tcPr>
+            <w:tcW w:type="dxa" w:w="1234"/>
+          </w:tcPr>
+          <w:p>
+            <w:r>
+              <w:t>[0.27, 0.45]</w:t>
+            </w:r>
+          </w:p>
+        </w:tc>
+      </w:tr>
+      <w:tr>
+        <w:tc>
+          <w:tcPr>
+            <w:tcW w:type="dxa" w:w="1234"/>
+          </w:tcPr>
+          <w:p>
+            <w:r>
+              <w:t>SALL_NOCULT</w:t>
+            </w:r>
+          </w:p>
+        </w:tc>
+        <w:tc>
+          <w:tcPr>
+            <w:tcW w:type="dxa" w:w="1234"/>
+          </w:tcPr>
+          <w:p>
+            <w:r>
+              <w:t>0.331</w:t>
+            </w:r>
+          </w:p>
+        </w:tc>
+        <w:tc>
+          <w:tcPr>
+            <w:tcW w:type="dxa" w:w="1234"/>
+          </w:tcPr>
+          <w:p>
+            <w:r>
+              <w:t>0.079</w:t>
+            </w:r>
+          </w:p>
+        </w:tc>
+        <w:tc>
+          <w:tcPr>
+            <w:tcW w:type="dxa" w:w="1234"/>
+          </w:tcPr>
+          <w:p>
+            <w:r>
+              <w:t>1e-04</w:t>
+            </w:r>
+          </w:p>
+        </w:tc>
+        <w:tc>
+          <w:tcPr>
+            <w:tcW w:type="dxa" w:w="1234"/>
+          </w:tcPr>
+          <w:p>
+            <w:r>
+              <w:t>0.327</w:t>
+            </w:r>
+          </w:p>
+        </w:tc>
+        <w:tc>
+          <w:tcPr>
+            <w:tcW w:type="dxa" w:w="1234"/>
+          </w:tcPr>
+          <w:p>
+            <w:r>
+              <w:t>0.248</w:t>
+            </w:r>
+          </w:p>
+        </w:tc>
+        <w:tc>
+          <w:tcPr>
+            <w:tcW w:type="dxa" w:w="1234"/>
+          </w:tcPr>
+          <w:p>
+            <w:r>
+              <w:t>[0.17, 0.33]</w:t>
+            </w:r>
+          </w:p>
+        </w:tc>
+      </w:tr>
+      <w:tr>
+        <w:tc>
+          <w:tcPr>
+            <w:tcW w:type="dxa" w:w="1234"/>
+          </w:tcPr>
+          <w:p>
+            <w:r>
+              <w:t>CENT_NOCULT</w:t>
+            </w:r>
+          </w:p>
+        </w:tc>
+        <w:tc>
+          <w:tcPr>
+            <w:tcW w:type="dxa" w:w="1234"/>
+          </w:tcPr>
+          <w:p>
+            <w:r>
+              <w:t>0.258</w:t>
+            </w:r>
+          </w:p>
+        </w:tc>
+        <w:tc>
+          <w:tcPr>
+            <w:tcW w:type="dxa" w:w="1234"/>
+          </w:tcPr>
+          <w:p>
+            <w:r>
+              <w:t>0.059</w:t>
+            </w:r>
+          </w:p>
+        </w:tc>
+        <w:tc>
+          <w:tcPr>
+            <w:tcW w:type="dxa" w:w="1234"/>
+          </w:tcPr>
+          <w:p>
+            <w:r>
+              <w:t>1e-04</w:t>
+            </w:r>
+          </w:p>
+        </w:tc>
+        <w:tc>
+          <w:tcPr>
+            <w:tcW w:type="dxa" w:w="1234"/>
+          </w:tcPr>
+          <w:p>
+            <w:r>
+              <w:t>0.274</w:t>
+            </w:r>
+          </w:p>
+        </w:tc>
+        <w:tc>
+          <w:tcPr>
+            <w:tcW w:type="dxa" w:w="1234"/>
+          </w:tcPr>
+          <w:p>
+            <w:r>
+              <w:t>0.425</w:t>
+            </w:r>
+          </w:p>
+        </w:tc>
+        <w:tc>
+          <w:tcPr>
+            <w:tcW w:type="dxa" w:w="1234"/>
+          </w:tcPr>
+          <w:p>
+            <w:r>
+              <w:t>[0.34, 0.51]</w:t>
+            </w:r>
+          </w:p>
+        </w:tc>
+      </w:tr>
+    </w:tbl>
+    <w:p>
+      <w:pPr>
+        <w:jc w:val="center"/>
+      </w:pPr>
+      <w:r>
+        <w:drawing>
+          <wp:inline xmlns:a="http://schemas.openxmlformats.org/drawingml/2006/main" xmlns:pic="http://schemas.openxmlformats.org/drawingml/2006/picture">
+            <wp:extent cx="5486400" cy="2194560"/>
+            <wp:docPr id="2" name="Picture 2"/>
+            <wp:cNvGraphicFramePr>
+              <a:graphicFrameLocks noChangeAspect="1"/>
+            </wp:cNvGraphicFramePr>
+            <a:graphic>
+              <a:graphicData uri="http://schemas.openxmlformats.org/drawingml/2006/picture">
+                <pic:pic>
+                  <pic:nvPicPr>
+                    <pic:cNvPr id="0" name="fig_geo_fidelity.png"/>
+                    <pic:cNvPicPr/>
+                  </pic:nvPicPr>
+                  <pic:blipFill>
+                    <a:blip r:embed="rId10"/>
+                    <a:stretch>
+                      <a:fillRect/>
+                    </a:stretch>
+                  </pic:blipFill>
+                  <pic:spPr>
+                    <a:xfrm>
+                      <a:off x="0" y="0"/>
+                      <a:ext cx="5486400" cy="2194560"/>
+                    </a:xfrm>
+                    <a:prstGeom prst="rect"/>
+                  </pic:spPr>
+                </pic:pic>
+              </a:graphicData>
+            </a:graphic>
+          </wp:inline>
+        </w:drawing>
+      </w:r>
+    </w:p>
+    <w:p>
+      <w:r>
+        <w:rPr>
+          <w:i/>
+        </w:rPr>
+        <w:t>Figure 2. Per-organ share of clean-subset series whose organ of origin (blue) or GTEx cultured fibroblasts (orange) is the top-1 match. Organs with n &gt;= 3.</w:t>
+      </w:r>
+    </w:p>
+    <w:p>
+      <w:pPr>
+        <w:spacing w:after="120"/>
+        <w:jc w:val="both"/>
+      </w:pPr>
+      <w:r>
+        <w:t>Organ of origin is recovered four to five times above chance. Brain organoids are the most faithful, and lung, breast and pancreas the least. Across every method, the most frequent best match is GTEx cultured fibroblasts, which we name the culture-fibroblast attractor. It survives the label audit and the removal of proliferation and EMT genes. It is not yet a discovery: GTEx tissues contain immune, vascular and stromal cells, while organoids and cultured fibroblasts are purified cultures, so cell-type purity is an unexcluded explanation. Falsifiable prediction: restricted to epithelium-specific genes, the fibroblast best-match share in the clean subset will stay above 15%. The tool vorganoid fidelity scores any count matrix this way.</w:t>
+      </w:r>
+    </w:p>
+    <w:p>
+      <w:pPr>
         <w:pStyle w:val="Heading1"/>
       </w:pPr>
       <w:r>
@@ -2724,6 +3335,33 @@
       </w:pPr>
       <w:r>
         <w:t>- Our segmentation is below the published state of the art.</w:t>
+      </w:r>
+    </w:p>
+    <w:p>
+      <w:pPr>
+        <w:spacing w:after="120"/>
+        <w:jc w:val="both"/>
+      </w:pPr>
+      <w:r>
+        <w:t>- Fidelity: 'Pancreas' as best match (35/151 series with S3000) disappears with other methods, so it is a method artefact.</w:t>
+      </w:r>
+    </w:p>
+    <w:p>
+      <w:pPr>
+        <w:spacing w:after="120"/>
+        <w:jc w:val="both"/>
+      </w:pPr>
+      <w:r>
+        <w:t>- Fidelity: a 'liver disease' series (GSE278954) ranks Liver 50th of 54, and lung and breast organoids are rarely matched to their organ.</w:t>
+      </w:r>
+    </w:p>
+    <w:p>
+      <w:pPr>
+        <w:spacing w:after="120"/>
+        <w:jc w:val="both"/>
+      </w:pPr>
+      <w:r>
+        <w:t>- Fidelity: organ labels come from text, and series profiles average all samples, including any non-organoid controls.</w:t>
       </w:r>
     </w:p>
     <w:p>
@@ -2774,7 +3412,7 @@
         <w:rPr>
           <w:b/>
         </w:rPr>
-        <w:t>Table 6. Tools table (honest count: 11). Target of 40 not reached.</w:t>
+        <w:t>Table 7. Tools genuinely used (results/tools_ledger.csv): 16. Target of 40 not reached.</w:t>
       </w:r>
     </w:p>
     <w:tbl>
@@ -2784,13 +3422,14 @@
         <w:tblLook w:firstColumn="1" w:firstRow="1" w:lastColumn="0" w:lastRow="0" w:noHBand="0" w:noVBand="1" w:val="04A0"/>
       </w:tblPr>
       <w:tblGrid>
-        <w:gridCol w:w="4320"/>
-        <w:gridCol w:w="4320"/>
+        <w:gridCol w:w="2880"/>
+        <w:gridCol w:w="2880"/>
+        <w:gridCol w:w="2880"/>
       </w:tblGrid>
       <w:tr>
         <w:tc>
           <w:tcPr>
-            <w:tcW w:type="dxa" w:w="4320"/>
+            <w:tcW w:type="dxa" w:w="2880"/>
           </w:tcPr>
           <w:p>
             <w:r>
@@ -2800,11 +3439,21 @@
         </w:tc>
         <w:tc>
           <w:tcPr>
-            <w:tcW w:type="dxa" w:w="4320"/>
-          </w:tcPr>
-          <w:p>
-            <w:r>
-              <w:t>role</w:t>
+            <w:tcW w:type="dxa" w:w="2880"/>
+          </w:tcPr>
+          <w:p>
+            <w:r>
+              <w:t>kind</w:t>
+            </w:r>
+          </w:p>
+        </w:tc>
+        <w:tc>
+          <w:tcPr>
+            <w:tcW w:type="dxa" w:w="2880"/>
+          </w:tcPr>
+          <w:p>
+            <w:r>
+              <w:t>where used</w:t>
             </w:r>
           </w:p>
         </w:tc>
@@ -2812,21 +3461,31 @@
       <w:tr>
         <w:tc>
           <w:tcPr>
-            <w:tcW w:type="dxa" w:w="4320"/>
-          </w:tcPr>
-          <w:p>
-            <w:r>
-              <w:t>Python 3.10</w:t>
-            </w:r>
-          </w:p>
-        </w:tc>
-        <w:tc>
-          <w:tcPr>
-            <w:tcW w:type="dxa" w:w="4320"/>
-          </w:tcPr>
-          <w:p>
-            <w:r>
-              <w:t>language</w:t>
+            <w:tcW w:type="dxa" w:w="2880"/>
+          </w:tcPr>
+          <w:p>
+            <w:r>
+              <w:t>NumPy</w:t>
+            </w:r>
+          </w:p>
+        </w:tc>
+        <w:tc>
+          <w:tcPr>
+            <w:tcW w:type="dxa" w:w="2880"/>
+          </w:tcPr>
+          <w:p>
+            <w:r>
+              <w:t>library</w:t>
+            </w:r>
+          </w:p>
+        </w:tc>
+        <w:tc>
+          <w:tcPr>
+            <w:tcW w:type="dxa" w:w="2880"/>
+          </w:tcPr>
+          <w:p>
+            <w:r>
+              <w:t>src/vorganoid; src/geo_fidelity.py; paper/build_paper.py</w:t>
             </w:r>
           </w:p>
         </w:tc>
@@ -2834,21 +3493,31 @@
       <w:tr>
         <w:tc>
           <w:tcPr>
-            <w:tcW w:type="dxa" w:w="4320"/>
-          </w:tcPr>
-          <w:p>
-            <w:r>
-              <w:t>NumPy</w:t>
-            </w:r>
-          </w:p>
-        </w:tc>
-        <w:tc>
-          <w:tcPr>
-            <w:tcW w:type="dxa" w:w="4320"/>
-          </w:tcPr>
-          <w:p>
-            <w:r>
-              <w:t>arrays, bootstrap</w:t>
+            <w:tcW w:type="dxa" w:w="2880"/>
+          </w:tcPr>
+          <w:p>
+            <w:r>
+              <w:t>SciPy</w:t>
+            </w:r>
+          </w:p>
+        </w:tc>
+        <w:tc>
+          <w:tcPr>
+            <w:tcW w:type="dxa" w:w="2880"/>
+          </w:tcPr>
+          <w:p>
+            <w:r>
+              <w:t>library</w:t>
+            </w:r>
+          </w:p>
+        </w:tc>
+        <w:tc>
+          <w:tcPr>
+            <w:tcW w:type="dxa" w:w="2880"/>
+          </w:tcPr>
+          <w:p>
+            <w:r>
+              <w:t>src/geo_fidelity.py (spearmanr); paper/build_paper.py</w:t>
             </w:r>
           </w:p>
         </w:tc>
@@ -2856,7 +3525,7 @@
       <w:tr>
         <w:tc>
           <w:tcPr>
-            <w:tcW w:type="dxa" w:w="4320"/>
+            <w:tcW w:type="dxa" w:w="2880"/>
           </w:tcPr>
           <w:p>
             <w:r>
@@ -2866,11 +3535,21 @@
         </w:tc>
         <w:tc>
           <w:tcPr>
-            <w:tcW w:type="dxa" w:w="4320"/>
-          </w:tcPr>
-          <w:p>
-            <w:r>
-              <w:t>data</w:t>
+            <w:tcW w:type="dxa" w:w="2880"/>
+          </w:tcPr>
+          <w:p>
+            <w:r>
+              <w:t>library</w:t>
+            </w:r>
+          </w:p>
+        </w:tc>
+        <w:tc>
+          <w:tcPr>
+            <w:tcW w:type="dxa" w:w="2880"/>
+          </w:tcPr>
+          <w:p>
+            <w:r>
+              <w:t>src/geo_fidelity.py; paper/build_paper.py</w:t>
             </w:r>
           </w:p>
         </w:tc>
@@ -2878,21 +3557,31 @@
       <w:tr>
         <w:tc>
           <w:tcPr>
-            <w:tcW w:type="dxa" w:w="4320"/>
-          </w:tcPr>
-          <w:p>
-            <w:r>
-              <w:t>SciPy</w:t>
-            </w:r>
-          </w:p>
-        </w:tc>
-        <w:tc>
-          <w:tcPr>
-            <w:tcW w:type="dxa" w:w="4320"/>
-          </w:tcPr>
-          <w:p>
-            <w:r>
-              <w:t>statistics, labelling</w:t>
+            <w:tcW w:type="dxa" w:w="2880"/>
+          </w:tcPr>
+          <w:p>
+            <w:r>
+              <w:t>scikit-image</w:t>
+            </w:r>
+          </w:p>
+        </w:tc>
+        <w:tc>
+          <w:tcPr>
+            <w:tcW w:type="dxa" w:w="2880"/>
+          </w:tcPr>
+          <w:p>
+            <w:r>
+              <w:t>library</w:t>
+            </w:r>
+          </w:p>
+        </w:tc>
+        <w:tc>
+          <w:tcPr>
+            <w:tcW w:type="dxa" w:w="2880"/>
+          </w:tcPr>
+          <w:p>
+            <w:r>
+              <w:t>src/vorganoid (instance post-processing; watershed/labels)</w:t>
             </w:r>
           </w:p>
         </w:tc>
@@ -2900,21 +3589,31 @@
       <w:tr>
         <w:tc>
           <w:tcPr>
-            <w:tcW w:type="dxa" w:w="4320"/>
-          </w:tcPr>
-          <w:p>
-            <w:r>
-              <w:t>scikit-image</w:t>
-            </w:r>
-          </w:p>
-        </w:tc>
-        <w:tc>
-          <w:tcPr>
-            <w:tcW w:type="dxa" w:w="4320"/>
-          </w:tcPr>
-          <w:p>
-            <w:r>
-              <w:t>watershed</w:t>
+            <w:tcW w:type="dxa" w:w="2880"/>
+          </w:tcPr>
+          <w:p>
+            <w:r>
+              <w:t>PyTorch</w:t>
+            </w:r>
+          </w:p>
+        </w:tc>
+        <w:tc>
+          <w:tcPr>
+            <w:tcW w:type="dxa" w:w="2880"/>
+          </w:tcPr>
+          <w:p>
+            <w:r>
+              <w:t>library</w:t>
+            </w:r>
+          </w:p>
+        </w:tc>
+        <w:tc>
+          <w:tcPr>
+            <w:tcW w:type="dxa" w:w="2880"/>
+          </w:tcPr>
+          <w:p>
+            <w:r>
+              <w:t>train_seg.py; tune_seg.py (U-Net CNN)</w:t>
             </w:r>
           </w:p>
         </w:tc>
@@ -2922,21 +3621,31 @@
       <w:tr>
         <w:tc>
           <w:tcPr>
-            <w:tcW w:type="dxa" w:w="4320"/>
-          </w:tcPr>
-          <w:p>
-            <w:r>
-              <w:t>PyTorch</w:t>
-            </w:r>
-          </w:p>
-        </w:tc>
-        <w:tc>
-          <w:tcPr>
-            <w:tcW w:type="dxa" w:w="4320"/>
-          </w:tcPr>
-          <w:p>
-            <w:r>
-              <w:t>U-Net</w:t>
+            <w:tcW w:type="dxa" w:w="2880"/>
+          </w:tcPr>
+          <w:p>
+            <w:r>
+              <w:t>Pillow</w:t>
+            </w:r>
+          </w:p>
+        </w:tc>
+        <w:tc>
+          <w:tcPr>
+            <w:tcW w:type="dxa" w:w="2880"/>
+          </w:tcPr>
+          <w:p>
+            <w:r>
+              <w:t>library</w:t>
+            </w:r>
+          </w:p>
+        </w:tc>
+        <w:tc>
+          <w:tcPr>
+            <w:tcW w:type="dxa" w:w="2880"/>
+          </w:tcPr>
+          <w:p>
+            <w:r>
+              <w:t>train_seg.py image loading</w:t>
             </w:r>
           </w:p>
         </w:tc>
@@ -2944,21 +3653,31 @@
       <w:tr>
         <w:tc>
           <w:tcPr>
-            <w:tcW w:type="dxa" w:w="4320"/>
-          </w:tcPr>
-          <w:p>
-            <w:r>
-              <w:t>Pillow</w:t>
-            </w:r>
-          </w:p>
-        </w:tc>
-        <w:tc>
-          <w:tcPr>
-            <w:tcW w:type="dxa" w:w="4320"/>
-          </w:tcPr>
-          <w:p>
-            <w:r>
-              <w:t>image IO</w:t>
+            <w:tcW w:type="dxa" w:w="2880"/>
+          </w:tcPr>
+          <w:p>
+            <w:r>
+              <w:t>python-docx</w:t>
+            </w:r>
+          </w:p>
+        </w:tc>
+        <w:tc>
+          <w:tcPr>
+            <w:tcW w:type="dxa" w:w="2880"/>
+          </w:tcPr>
+          <w:p>
+            <w:r>
+              <w:t>library</w:t>
+            </w:r>
+          </w:p>
+        </w:tc>
+        <w:tc>
+          <w:tcPr>
+            <w:tcW w:type="dxa" w:w="2880"/>
+          </w:tcPr>
+          <w:p>
+            <w:r>
+              <w:t>paper/paperkit.py</w:t>
             </w:r>
           </w:p>
         </w:tc>
@@ -2966,21 +3685,31 @@
       <w:tr>
         <w:tc>
           <w:tcPr>
-            <w:tcW w:type="dxa" w:w="4320"/>
-          </w:tcPr>
-          <w:p>
-            <w:r>
-              <w:t>matplotlib</w:t>
-            </w:r>
-          </w:p>
-        </w:tc>
-        <w:tc>
-          <w:tcPr>
-            <w:tcW w:type="dxa" w:w="4320"/>
-          </w:tcPr>
-          <w:p>
-            <w:r>
-              <w:t>figures</w:t>
+            <w:tcW w:type="dxa" w:w="2880"/>
+          </w:tcPr>
+          <w:p>
+            <w:r>
+              <w:t>pytest</w:t>
+            </w:r>
+          </w:p>
+        </w:tc>
+        <w:tc>
+          <w:tcPr>
+            <w:tcW w:type="dxa" w:w="2880"/>
+          </w:tcPr>
+          <w:p>
+            <w:r>
+              <w:t>test framework</w:t>
+            </w:r>
+          </w:p>
+        </w:tc>
+        <w:tc>
+          <w:tcPr>
+            <w:tcW w:type="dxa" w:w="2880"/>
+          </w:tcPr>
+          <w:p>
+            <w:r>
+              <w:t>tests/ (hermetic suite)</w:t>
             </w:r>
           </w:p>
         </w:tc>
@@ -2988,21 +3717,31 @@
       <w:tr>
         <w:tc>
           <w:tcPr>
-            <w:tcW w:type="dxa" w:w="4320"/>
-          </w:tcPr>
-          <w:p>
-            <w:r>
-              <w:t>pytest</w:t>
-            </w:r>
-          </w:p>
-        </w:tc>
-        <w:tc>
-          <w:tcPr>
-            <w:tcW w:type="dxa" w:w="4320"/>
-          </w:tcPr>
-          <w:p>
-            <w:r>
-              <w:t>tests</w:t>
+            <w:tcW w:type="dxa" w:w="2880"/>
+          </w:tcPr>
+          <w:p>
+            <w:r>
+              <w:t>LibreOffice (soffice headless)</w:t>
+            </w:r>
+          </w:p>
+        </w:tc>
+        <w:tc>
+          <w:tcPr>
+            <w:tcW w:type="dxa" w:w="2880"/>
+          </w:tcPr>
+          <w:p>
+            <w:r>
+              <w:t>application</w:t>
+            </w:r>
+          </w:p>
+        </w:tc>
+        <w:tc>
+          <w:tcPr>
+            <w:tcW w:type="dxa" w:w="2880"/>
+          </w:tcPr>
+          <w:p>
+            <w:r>
+              <w:t>paper docx -&gt; pdf render</w:t>
             </w:r>
           </w:p>
         </w:tc>
@@ -3010,21 +3749,31 @@
       <w:tr>
         <w:tc>
           <w:tcPr>
-            <w:tcW w:type="dxa" w:w="4320"/>
-          </w:tcPr>
-          <w:p>
-            <w:r>
-              <w:t>python-docx</w:t>
-            </w:r>
-          </w:p>
-        </w:tc>
-        <w:tc>
-          <w:tcPr>
-            <w:tcW w:type="dxa" w:w="4320"/>
-          </w:tcPr>
-          <w:p>
-            <w:r>
-              <w:t>paper</w:t>
+            <w:tcW w:type="dxa" w:w="2880"/>
+          </w:tcPr>
+          <w:p>
+            <w:r>
+              <w:t>poppler pdfinfo</w:t>
+            </w:r>
+          </w:p>
+        </w:tc>
+        <w:tc>
+          <w:tcPr>
+            <w:tcW w:type="dxa" w:w="2880"/>
+          </w:tcPr>
+          <w:p>
+            <w:r>
+              <w:t>application</w:t>
+            </w:r>
+          </w:p>
+        </w:tc>
+        <w:tc>
+          <w:tcPr>
+            <w:tcW w:type="dxa" w:w="2880"/>
+          </w:tcPr>
+          <w:p>
+            <w:r>
+              <w:t>page count of rendered paper</w:t>
             </w:r>
           </w:p>
         </w:tc>
@@ -3032,21 +3781,191 @@
       <w:tr>
         <w:tc>
           <w:tcPr>
-            <w:tcW w:type="dxa" w:w="4320"/>
-          </w:tcPr>
-          <w:p>
-            <w:r>
-              <w:t>git / GitHub</w:t>
-            </w:r>
-          </w:p>
-        </w:tc>
-        <w:tc>
-          <w:tcPr>
-            <w:tcW w:type="dxa" w:w="4320"/>
-          </w:tcPr>
-          <w:p>
-            <w:r>
-              <w:t>version control</w:t>
+            <w:tcW w:type="dxa" w:w="2880"/>
+          </w:tcPr>
+          <w:p>
+            <w:r>
+              <w:t>Git + GitHub</w:t>
+            </w:r>
+          </w:p>
+        </w:tc>
+        <w:tc>
+          <w:tcPr>
+            <w:tcW w:type="dxa" w:w="2880"/>
+          </w:tcPr>
+          <w:p>
+            <w:r>
+              <w:t>service</w:t>
+            </w:r>
+          </w:p>
+        </w:tc>
+        <w:tc>
+          <w:tcPr>
+            <w:tcW w:type="dxa" w:w="2880"/>
+          </w:tcPr>
+          <w:p>
+            <w:r>
+              <w:t>repo hosting and pushes</w:t>
+            </w:r>
+          </w:p>
+        </w:tc>
+      </w:tr>
+      <w:tr>
+        <w:tc>
+          <w:tcPr>
+            <w:tcW w:type="dxa" w:w="2880"/>
+          </w:tcPr>
+          <w:p>
+            <w:r>
+              <w:t>NCBI E-utilities (esearch/esummary)</w:t>
+            </w:r>
+          </w:p>
+        </w:tc>
+        <w:tc>
+          <w:tcPr>
+            <w:tcW w:type="dxa" w:w="2880"/>
+          </w:tcPr>
+          <w:p>
+            <w:r>
+              <w:t>web API</w:t>
+            </w:r>
+          </w:p>
+        </w:tc>
+        <w:tc>
+          <w:tcPr>
+            <w:tcW w:type="dxa" w:w="2880"/>
+          </w:tcPr>
+          <w:p>
+            <w:r>
+              <w:t>src/geo_candidates.py</w:t>
+            </w:r>
+          </w:p>
+        </w:tc>
+      </w:tr>
+      <w:tr>
+        <w:tc>
+          <w:tcPr>
+            <w:tcW w:type="dxa" w:w="2880"/>
+          </w:tcPr>
+          <w:p>
+            <w:r>
+              <w:t>NCBI GEO FTP/HTTPS supplementary files</w:t>
+            </w:r>
+          </w:p>
+        </w:tc>
+        <w:tc>
+          <w:tcPr>
+            <w:tcW w:type="dxa" w:w="2880"/>
+          </w:tcPr>
+          <w:p>
+            <w:r>
+              <w:t>data service</w:t>
+            </w:r>
+          </w:p>
+        </w:tc>
+        <w:tc>
+          <w:tcPr>
+            <w:tcW w:type="dxa" w:w="2880"/>
+          </w:tcPr>
+          <w:p>
+            <w:r>
+              <w:t>src/geo_fidelity.py</w:t>
+            </w:r>
+          </w:p>
+        </w:tc>
+      </w:tr>
+      <w:tr>
+        <w:tc>
+          <w:tcPr>
+            <w:tcW w:type="dxa" w:w="2880"/>
+          </w:tcPr>
+          <w:p>
+            <w:r>
+              <w:t>GTEx v8 gene median TPM (GTEx portal bucket)</w:t>
+            </w:r>
+          </w:p>
+        </w:tc>
+        <w:tc>
+          <w:tcPr>
+            <w:tcW w:type="dxa" w:w="2880"/>
+          </w:tcPr>
+          <w:p>
+            <w:r>
+              <w:t>reference data service</w:t>
+            </w:r>
+          </w:p>
+        </w:tc>
+        <w:tc>
+          <w:tcPr>
+            <w:tcW w:type="dxa" w:w="2880"/>
+          </w:tcPr>
+          <w:p>
+            <w:r>
+              <w:t>data/ref/gtex_v8_median_tpm.gct.gz; src/geo_fidelity.py</w:t>
+            </w:r>
+          </w:p>
+        </w:tc>
+      </w:tr>
+      <w:tr>
+        <w:tc>
+          <w:tcPr>
+            <w:tcW w:type="dxa" w:w="2880"/>
+          </w:tcPr>
+          <w:p>
+            <w:r>
+              <w:t>MSigDB Hallmark gene sets v2023.2 (Broad GSEA-MSigDB)</w:t>
+            </w:r>
+          </w:p>
+        </w:tc>
+        <w:tc>
+          <w:tcPr>
+            <w:tcW w:type="dxa" w:w="2880"/>
+          </w:tcPr>
+          <w:p>
+            <w:r>
+              <w:t>gene-set resource</w:t>
+            </w:r>
+          </w:p>
+        </w:tc>
+        <w:tc>
+          <w:tcPr>
+            <w:tcW w:type="dxa" w:w="2880"/>
+          </w:tcPr>
+          <w:p>
+            <w:r>
+              <w:t>data/ref/h.all.v2023.2.Hs.symbols.gmt; src/geo_fidelity_methods.py (culture-confound test)</w:t>
+            </w:r>
+          </w:p>
+        </w:tc>
+      </w:tr>
+      <w:tr>
+        <w:tc>
+          <w:tcPr>
+            <w:tcW w:type="dxa" w:w="2880"/>
+          </w:tcPr>
+          <w:p>
+            <w:r>
+              <w:t>matplotlib</w:t>
+            </w:r>
+          </w:p>
+        </w:tc>
+        <w:tc>
+          <w:tcPr>
+            <w:tcW w:type="dxa" w:w="2880"/>
+          </w:tcPr>
+          <w:p>
+            <w:r>
+              <w:t>library</w:t>
+            </w:r>
+          </w:p>
+        </w:tc>
+        <w:tc>
+          <w:tcPr>
+            <w:tcW w:type="dxa" w:w="2880"/>
+          </w:tcPr>
+          <w:p>
+            <w:r>
+              <w:t>src/fig_geo_fidelity.py; paper figures (fig_size_attenuation.png, fig_geo_fidelity.png)</w:t>
             </w:r>
           </w:p>
         </w:tc>
@@ -3076,6 +3995,33 @@
       </w:pPr>
       <w:r>
         <w:t>Boj SF, Vonk AM, et al. Forskolin-induced swelling in intestinal organoids: an in vitro assay for assessing drug response in cystic fibrosis patients. J Vis Exp 2017. https://pmc.ncbi.nlm.nih.gov/articles/PMC5408767/</w:t>
+      </w:r>
+    </w:p>
+    <w:p>
+      <w:pPr>
+        <w:spacing w:after="120"/>
+        <w:jc w:val="both"/>
+      </w:pPr>
+      <w:r>
+        <w:t>GTEx Consortium. The GTEx Consortium atlas of genetic regulatory effects across human tissues. Science 2020. https://gtexportal.org</w:t>
+      </w:r>
+    </w:p>
+    <w:p>
+      <w:pPr>
+        <w:spacing w:after="120"/>
+        <w:jc w:val="both"/>
+      </w:pPr>
+      <w:r>
+        <w:t>Liberzon A, et al. The Molecular Signatures Database Hallmark gene set collection. Cell Syst 2015. https://www.gsea-msigdb.org</w:t>
+      </w:r>
+    </w:p>
+    <w:p>
+      <w:pPr>
+        <w:spacing w:after="120"/>
+        <w:jc w:val="both"/>
+      </w:pPr>
+      <w:r>
+        <w:t>Barrett T, et al. NCBI GEO: archive for functional genomics data sets. Nucleic Acids Res 2013. https://www.ncbi.nlm.nih.gov/geo/</w:t>
       </w:r>
     </w:p>
     <w:p>

</xml_diff>

<commit_message>
Paper v4: purity-corrected fidelity section (HPA, exact McNemar formula + table); tools table with gate column; pdfinfo 12 pages
</commit_message>
<xml_diff>
--- a/paper/mega27-03-virtual-organoid-paper.docx
+++ b/paper/mega27-03-virtual-organoid-paper.docx
@@ -2943,7 +2943,7 @@
           </w:tcPr>
           <w:p>
             <w:r>
-              <w:t>[0.15, 0.31]</w:t>
+              <w:t>[0.15, 0.30]</w:t>
             </w:r>
           </w:p>
         </w:tc>
@@ -3232,6 +3232,294 @@
           <w:p>
             <w:r>
               <w:t>[0.34, 0.51]</w:t>
+            </w:r>
+          </w:p>
+        </w:tc>
+      </w:tr>
+      <w:tr>
+        <w:tc>
+          <w:tcPr>
+            <w:tcW w:type="dxa" w:w="1234"/>
+          </w:tcPr>
+          <w:p>
+            <w:r>
+              <w:t>SALL_NONPAR</w:t>
+            </w:r>
+          </w:p>
+        </w:tc>
+        <w:tc>
+          <w:tcPr>
+            <w:tcW w:type="dxa" w:w="1234"/>
+          </w:tcPr>
+          <w:p>
+            <w:r>
+              <w:t>0.417</w:t>
+            </w:r>
+          </w:p>
+        </w:tc>
+        <w:tc>
+          <w:tcPr>
+            <w:tcW w:type="dxa" w:w="1234"/>
+          </w:tcPr>
+          <w:p>
+            <w:r>
+              <w:t>0.103</w:t>
+            </w:r>
+          </w:p>
+        </w:tc>
+        <w:tc>
+          <w:tcPr>
+            <w:tcW w:type="dxa" w:w="1234"/>
+          </w:tcPr>
+          <w:p>
+            <w:r>
+              <w:t>1e-04</w:t>
+            </w:r>
+          </w:p>
+        </w:tc>
+        <w:tc>
+          <w:tcPr>
+            <w:tcW w:type="dxa" w:w="1234"/>
+          </w:tcPr>
+          <w:p>
+            <w:r>
+              <w:t>0.398</w:t>
+            </w:r>
+          </w:p>
+        </w:tc>
+        <w:tc>
+          <w:tcPr>
+            <w:tcW w:type="dxa" w:w="1234"/>
+          </w:tcPr>
+          <w:p>
+            <w:r>
+              <w:t>0.204</w:t>
+            </w:r>
+          </w:p>
+        </w:tc>
+        <w:tc>
+          <w:tcPr>
+            <w:tcW w:type="dxa" w:w="1234"/>
+          </w:tcPr>
+          <w:p>
+            <w:r>
+              <w:t>[0.13, 0.28]</w:t>
+            </w:r>
+          </w:p>
+        </w:tc>
+      </w:tr>
+      <w:tr>
+        <w:tc>
+          <w:tcPr>
+            <w:tcW w:type="dxa" w:w="1234"/>
+          </w:tcPr>
+          <w:p>
+            <w:r>
+              <w:t>CENT_NONPAR</w:t>
+            </w:r>
+          </w:p>
+        </w:tc>
+        <w:tc>
+          <w:tcPr>
+            <w:tcW w:type="dxa" w:w="1234"/>
+          </w:tcPr>
+          <w:p>
+            <w:r>
+              <w:t>0.331</w:t>
+            </w:r>
+          </w:p>
+        </w:tc>
+        <w:tc>
+          <w:tcPr>
+            <w:tcW w:type="dxa" w:w="1234"/>
+          </w:tcPr>
+          <w:p>
+            <w:r>
+              <w:t>0.088</w:t>
+            </w:r>
+          </w:p>
+        </w:tc>
+        <w:tc>
+          <w:tcPr>
+            <w:tcW w:type="dxa" w:w="1234"/>
+          </w:tcPr>
+          <w:p>
+            <w:r>
+              <w:t>1e-04</w:t>
+            </w:r>
+          </w:p>
+        </w:tc>
+        <w:tc>
+          <w:tcPr>
+            <w:tcW w:type="dxa" w:w="1234"/>
+          </w:tcPr>
+          <w:p>
+            <w:r>
+              <w:t>0.345</w:t>
+            </w:r>
+          </w:p>
+        </w:tc>
+        <w:tc>
+          <w:tcPr>
+            <w:tcW w:type="dxa" w:w="1234"/>
+          </w:tcPr>
+          <w:p>
+            <w:r>
+              <w:t>0.372</w:t>
+            </w:r>
+          </w:p>
+        </w:tc>
+        <w:tc>
+          <w:tcPr>
+            <w:tcW w:type="dxa" w:w="1234"/>
+          </w:tcPr>
+          <w:p>
+            <w:r>
+              <w:t>[0.28, 0.46]</w:t>
+            </w:r>
+          </w:p>
+        </w:tc>
+      </w:tr>
+      <w:tr>
+        <w:tc>
+          <w:tcPr>
+            <w:tcW w:type="dxa" w:w="1234"/>
+          </w:tcPr>
+          <w:p>
+            <w:r>
+              <w:t>SALL_PARONLY</w:t>
+            </w:r>
+          </w:p>
+        </w:tc>
+        <w:tc>
+          <w:tcPr>
+            <w:tcW w:type="dxa" w:w="1234"/>
+          </w:tcPr>
+          <w:p>
+            <w:r>
+              <w:t>0.404</w:t>
+            </w:r>
+          </w:p>
+        </w:tc>
+        <w:tc>
+          <w:tcPr>
+            <w:tcW w:type="dxa" w:w="1234"/>
+          </w:tcPr>
+          <w:p>
+            <w:r>
+              <w:t>0.114</w:t>
+            </w:r>
+          </w:p>
+        </w:tc>
+        <w:tc>
+          <w:tcPr>
+            <w:tcW w:type="dxa" w:w="1234"/>
+          </w:tcPr>
+          <w:p>
+            <w:r>
+              <w:t>1e-04</w:t>
+            </w:r>
+          </w:p>
+        </w:tc>
+        <w:tc>
+          <w:tcPr>
+            <w:tcW w:type="dxa" w:w="1234"/>
+          </w:tcPr>
+          <w:p>
+            <w:r>
+              <w:t>0.389</w:t>
+            </w:r>
+          </w:p>
+        </w:tc>
+        <w:tc>
+          <w:tcPr>
+            <w:tcW w:type="dxa" w:w="1234"/>
+          </w:tcPr>
+          <w:p>
+            <w:r>
+              <w:t>0.283</w:t>
+            </w:r>
+          </w:p>
+        </w:tc>
+        <w:tc>
+          <w:tcPr>
+            <w:tcW w:type="dxa" w:w="1234"/>
+          </w:tcPr>
+          <w:p>
+            <w:r>
+              <w:t>[0.20, 0.36]</w:t>
+            </w:r>
+          </w:p>
+        </w:tc>
+      </w:tr>
+      <w:tr>
+        <w:tc>
+          <w:tcPr>
+            <w:tcW w:type="dxa" w:w="1234"/>
+          </w:tcPr>
+          <w:p>
+            <w:r>
+              <w:t>CENT_PARONLY</w:t>
+            </w:r>
+          </w:p>
+        </w:tc>
+        <w:tc>
+          <w:tcPr>
+            <w:tcW w:type="dxa" w:w="1234"/>
+          </w:tcPr>
+          <w:p>
+            <w:r>
+              <w:t>0.377</w:t>
+            </w:r>
+          </w:p>
+        </w:tc>
+        <w:tc>
+          <w:tcPr>
+            <w:tcW w:type="dxa" w:w="1234"/>
+          </w:tcPr>
+          <w:p>
+            <w:r>
+              <w:t>0.112</w:t>
+            </w:r>
+          </w:p>
+        </w:tc>
+        <w:tc>
+          <w:tcPr>
+            <w:tcW w:type="dxa" w:w="1234"/>
+          </w:tcPr>
+          <w:p>
+            <w:r>
+              <w:t>1e-04</w:t>
+            </w:r>
+          </w:p>
+        </w:tc>
+        <w:tc>
+          <w:tcPr>
+            <w:tcW w:type="dxa" w:w="1234"/>
+          </w:tcPr>
+          <w:p>
+            <w:r>
+              <w:t>0.398</w:t>
+            </w:r>
+          </w:p>
+        </w:tc>
+        <w:tc>
+          <w:tcPr>
+            <w:tcW w:type="dxa" w:w="1234"/>
+          </w:tcPr>
+          <w:p>
+            <w:r>
+              <w:t>0.221</w:t>
+            </w:r>
+          </w:p>
+        </w:tc>
+        <w:tc>
+          <w:tcPr>
+            <w:tcW w:type="dxa" w:w="1234"/>
+          </w:tcPr>
+          <w:p>
+            <w:r>
+              <w:t>[0.15, 0.29]</w:t>
             </w:r>
           </w:p>
         </w:tc>
@@ -3291,6 +3579,505 @@
       </w:pPr>
       <w:r>
         <w:t>Organ of origin is recovered four to five times above chance. Brain organoids are the most faithful, and lung, breast and pancreas the least. Across every method, the most frequent best match is GTEx cultured fibroblasts, which we name the culture-fibroblast attractor. It survives the label audit and the removal of proliferation and EMT genes. It is not yet a discovery: GTEx tissues contain immune, vascular and stromal cells, while organoids and cultured fibroblasts are purified cultures, so cell-type purity is an unexcluded explanation. Falsifiable prediction: restricted to epithelium-specific genes, the fibroblast best-match share in the clean subset will stay above 15%. The tool vorganoid fidelity scores any count matrix this way.</w:t>
+      </w:r>
+    </w:p>
+    <w:p>
+      <w:pPr>
+        <w:pStyle w:val="Heading2"/>
+      </w:pPr>
+      <w:r>
+        <w:t>4.7 Purity-corrected fidelity (Human Protein Atlas)</w:t>
+      </w:r>
+    </w:p>
+    <w:p>
+      <w:pPr>
+        <w:spacing w:after="120"/>
+        <w:jc w:val="both"/>
+      </w:pPr>
+      <w:r>
+        <w:t>GTEx tissues contain immune, blood, vascular and stromal cells that organoids lack by design. Using the Human Protein Atlas single-cell type atlas, we removed 7,595 genes enhanced in any such cell type (NONPAR), or kept only the 9,699 genes enhanced solely in parenchymal types (PARONLY). Paired top-1 recovery per series is compared with the exact McNemar test:</w:t>
+      </w:r>
+    </w:p>
+    <w:p>
+      <w:pPr>
+        <w:jc w:val="center"/>
+      </w:pPr>
+      <w:r>
+        <w:rPr>
+          <w:i/>
+        </w:rPr>
+        <w:t>p_McN = 2 * sum_{k=0}^{min(b,c)} C(b+c, k) 0.5^(b+c),   b = base-only hits, c = variant-only hits</w:t>
+      </w:r>
+      <w:r>
+        <w:tab/>
+        <w:tab/>
+        <w:t>(15)</w:t>
+      </w:r>
+    </w:p>
+    <w:p>
+      <w:r>
+        <w:rPr>
+          <w:b/>
+        </w:rPr>
+        <w:t>Table 7. Organ-of-origin recovery on 151 series, base method vs gene-restricted variant (results/geo_mcnemar.json).</w:t>
+      </w:r>
+    </w:p>
+    <w:tbl>
+      <w:tblPr>
+        <w:tblStyle w:val="LightGrid-Accent1"/>
+        <w:tblW w:type="auto" w:w="0"/>
+        <w:tblLook w:firstColumn="1" w:firstRow="1" w:lastColumn="0" w:lastRow="0" w:noHBand="0" w:noVBand="1" w:val="04A0"/>
+      </w:tblPr>
+      <w:tblGrid>
+        <w:gridCol w:w="1440"/>
+        <w:gridCol w:w="1440"/>
+        <w:gridCol w:w="1440"/>
+        <w:gridCol w:w="1440"/>
+        <w:gridCol w:w="1440"/>
+        <w:gridCol w:w="1440"/>
+      </w:tblGrid>
+      <w:tr>
+        <w:tc>
+          <w:tcPr>
+            <w:tcW w:type="dxa" w:w="1440"/>
+          </w:tcPr>
+          <w:p>
+            <w:r>
+              <w:t>comparison</w:t>
+            </w:r>
+          </w:p>
+        </w:tc>
+        <w:tc>
+          <w:tcPr>
+            <w:tcW w:type="dxa" w:w="1440"/>
+          </w:tcPr>
+          <w:p>
+            <w:r>
+              <w:t>top-1 base</w:t>
+            </w:r>
+          </w:p>
+        </w:tc>
+        <w:tc>
+          <w:tcPr>
+            <w:tcW w:type="dxa" w:w="1440"/>
+          </w:tcPr>
+          <w:p>
+            <w:r>
+              <w:t>top-1 variant</w:t>
+            </w:r>
+          </w:p>
+        </w:tc>
+        <w:tc>
+          <w:tcPr>
+            <w:tcW w:type="dxa" w:w="1440"/>
+          </w:tcPr>
+          <w:p>
+            <w:r>
+              <w:t>b</w:t>
+            </w:r>
+          </w:p>
+        </w:tc>
+        <w:tc>
+          <w:tcPr>
+            <w:tcW w:type="dxa" w:w="1440"/>
+          </w:tcPr>
+          <w:p>
+            <w:r>
+              <w:t>c</w:t>
+            </w:r>
+          </w:p>
+        </w:tc>
+        <w:tc>
+          <w:tcPr>
+            <w:tcW w:type="dxa" w:w="1440"/>
+          </w:tcPr>
+          <w:p>
+            <w:r>
+              <w:t>exact p</w:t>
+            </w:r>
+          </w:p>
+        </w:tc>
+      </w:tr>
+      <w:tr>
+        <w:tc>
+          <w:tcPr>
+            <w:tcW w:type="dxa" w:w="1440"/>
+          </w:tcPr>
+          <w:p>
+            <w:r>
+              <w:t>SALL vs SALL_NOCULT</w:t>
+            </w:r>
+          </w:p>
+        </w:tc>
+        <w:tc>
+          <w:tcPr>
+            <w:tcW w:type="dxa" w:w="1440"/>
+          </w:tcPr>
+          <w:p>
+            <w:r>
+              <w:t>0.331</w:t>
+            </w:r>
+          </w:p>
+        </w:tc>
+        <w:tc>
+          <w:tcPr>
+            <w:tcW w:type="dxa" w:w="1440"/>
+          </w:tcPr>
+          <w:p>
+            <w:r>
+              <w:t>0.331</w:t>
+            </w:r>
+          </w:p>
+        </w:tc>
+        <w:tc>
+          <w:tcPr>
+            <w:tcW w:type="dxa" w:w="1440"/>
+          </w:tcPr>
+          <w:p>
+            <w:r>
+              <w:t>1</w:t>
+            </w:r>
+          </w:p>
+        </w:tc>
+        <w:tc>
+          <w:tcPr>
+            <w:tcW w:type="dxa" w:w="1440"/>
+          </w:tcPr>
+          <w:p>
+            <w:r>
+              <w:t>1</w:t>
+            </w:r>
+          </w:p>
+        </w:tc>
+        <w:tc>
+          <w:tcPr>
+            <w:tcW w:type="dxa" w:w="1440"/>
+          </w:tcPr>
+          <w:p>
+            <w:r>
+              <w:t>1</w:t>
+            </w:r>
+          </w:p>
+        </w:tc>
+      </w:tr>
+      <w:tr>
+        <w:tc>
+          <w:tcPr>
+            <w:tcW w:type="dxa" w:w="1440"/>
+          </w:tcPr>
+          <w:p>
+            <w:r>
+              <w:t>SALL vs SALL_NONPAR</w:t>
+            </w:r>
+          </w:p>
+        </w:tc>
+        <w:tc>
+          <w:tcPr>
+            <w:tcW w:type="dxa" w:w="1440"/>
+          </w:tcPr>
+          <w:p>
+            <w:r>
+              <w:t>0.331</w:t>
+            </w:r>
+          </w:p>
+        </w:tc>
+        <w:tc>
+          <w:tcPr>
+            <w:tcW w:type="dxa" w:w="1440"/>
+          </w:tcPr>
+          <w:p>
+            <w:r>
+              <w:t>0.417</w:t>
+            </w:r>
+          </w:p>
+        </w:tc>
+        <w:tc>
+          <w:tcPr>
+            <w:tcW w:type="dxa" w:w="1440"/>
+          </w:tcPr>
+          <w:p>
+            <w:r>
+              <w:t>3</w:t>
+            </w:r>
+          </w:p>
+        </w:tc>
+        <w:tc>
+          <w:tcPr>
+            <w:tcW w:type="dxa" w:w="1440"/>
+          </w:tcPr>
+          <w:p>
+            <w:r>
+              <w:t>16</w:t>
+            </w:r>
+          </w:p>
+        </w:tc>
+        <w:tc>
+          <w:tcPr>
+            <w:tcW w:type="dxa" w:w="1440"/>
+          </w:tcPr>
+          <w:p>
+            <w:r>
+              <w:t>0.0044</w:t>
+            </w:r>
+          </w:p>
+        </w:tc>
+      </w:tr>
+      <w:tr>
+        <w:tc>
+          <w:tcPr>
+            <w:tcW w:type="dxa" w:w="1440"/>
+          </w:tcPr>
+          <w:p>
+            <w:r>
+              <w:t>SALL vs SALL_PARONLY</w:t>
+            </w:r>
+          </w:p>
+        </w:tc>
+        <w:tc>
+          <w:tcPr>
+            <w:tcW w:type="dxa" w:w="1440"/>
+          </w:tcPr>
+          <w:p>
+            <w:r>
+              <w:t>0.331</w:t>
+            </w:r>
+          </w:p>
+        </w:tc>
+        <w:tc>
+          <w:tcPr>
+            <w:tcW w:type="dxa" w:w="1440"/>
+          </w:tcPr>
+          <w:p>
+            <w:r>
+              <w:t>0.404</w:t>
+            </w:r>
+          </w:p>
+        </w:tc>
+        <w:tc>
+          <w:tcPr>
+            <w:tcW w:type="dxa" w:w="1440"/>
+          </w:tcPr>
+          <w:p>
+            <w:r>
+              <w:t>10</w:t>
+            </w:r>
+          </w:p>
+        </w:tc>
+        <w:tc>
+          <w:tcPr>
+            <w:tcW w:type="dxa" w:w="1440"/>
+          </w:tcPr>
+          <w:p>
+            <w:r>
+              <w:t>21</w:t>
+            </w:r>
+          </w:p>
+        </w:tc>
+        <w:tc>
+          <w:tcPr>
+            <w:tcW w:type="dxa" w:w="1440"/>
+          </w:tcPr>
+          <w:p>
+            <w:r>
+              <w:t>0.071</w:t>
+            </w:r>
+          </w:p>
+        </w:tc>
+      </w:tr>
+      <w:tr>
+        <w:tc>
+          <w:tcPr>
+            <w:tcW w:type="dxa" w:w="1440"/>
+          </w:tcPr>
+          <w:p>
+            <w:r>
+              <w:t>CENT vs CENT_NOCULT</w:t>
+            </w:r>
+          </w:p>
+        </w:tc>
+        <w:tc>
+          <w:tcPr>
+            <w:tcW w:type="dxa" w:w="1440"/>
+          </w:tcPr>
+          <w:p>
+            <w:r>
+              <w:t>0.252</w:t>
+            </w:r>
+          </w:p>
+        </w:tc>
+        <w:tc>
+          <w:tcPr>
+            <w:tcW w:type="dxa" w:w="1440"/>
+          </w:tcPr>
+          <w:p>
+            <w:r>
+              <w:t>0.258</w:t>
+            </w:r>
+          </w:p>
+        </w:tc>
+        <w:tc>
+          <w:tcPr>
+            <w:tcW w:type="dxa" w:w="1440"/>
+          </w:tcPr>
+          <w:p>
+            <w:r>
+              <w:t>0</w:t>
+            </w:r>
+          </w:p>
+        </w:tc>
+        <w:tc>
+          <w:tcPr>
+            <w:tcW w:type="dxa" w:w="1440"/>
+          </w:tcPr>
+          <w:p>
+            <w:r>
+              <w:t>1</w:t>
+            </w:r>
+          </w:p>
+        </w:tc>
+        <w:tc>
+          <w:tcPr>
+            <w:tcW w:type="dxa" w:w="1440"/>
+          </w:tcPr>
+          <w:p>
+            <w:r>
+              <w:t>1</w:t>
+            </w:r>
+          </w:p>
+        </w:tc>
+      </w:tr>
+      <w:tr>
+        <w:tc>
+          <w:tcPr>
+            <w:tcW w:type="dxa" w:w="1440"/>
+          </w:tcPr>
+          <w:p>
+            <w:r>
+              <w:t>CENT vs CENT_NONPAR</w:t>
+            </w:r>
+          </w:p>
+        </w:tc>
+        <w:tc>
+          <w:tcPr>
+            <w:tcW w:type="dxa" w:w="1440"/>
+          </w:tcPr>
+          <w:p>
+            <w:r>
+              <w:t>0.252</w:t>
+            </w:r>
+          </w:p>
+        </w:tc>
+        <w:tc>
+          <w:tcPr>
+            <w:tcW w:type="dxa" w:w="1440"/>
+          </w:tcPr>
+          <w:p>
+            <w:r>
+              <w:t>0.331</w:t>
+            </w:r>
+          </w:p>
+        </w:tc>
+        <w:tc>
+          <w:tcPr>
+            <w:tcW w:type="dxa" w:w="1440"/>
+          </w:tcPr>
+          <w:p>
+            <w:r>
+              <w:t>4</w:t>
+            </w:r>
+          </w:p>
+        </w:tc>
+        <w:tc>
+          <w:tcPr>
+            <w:tcW w:type="dxa" w:w="1440"/>
+          </w:tcPr>
+          <w:p>
+            <w:r>
+              <w:t>16</w:t>
+            </w:r>
+          </w:p>
+        </w:tc>
+        <w:tc>
+          <w:tcPr>
+            <w:tcW w:type="dxa" w:w="1440"/>
+          </w:tcPr>
+          <w:p>
+            <w:r>
+              <w:t>0.012</w:t>
+            </w:r>
+          </w:p>
+        </w:tc>
+      </w:tr>
+      <w:tr>
+        <w:tc>
+          <w:tcPr>
+            <w:tcW w:type="dxa" w:w="1440"/>
+          </w:tcPr>
+          <w:p>
+            <w:r>
+              <w:t>CENT vs CENT_PARONLY</w:t>
+            </w:r>
+          </w:p>
+        </w:tc>
+        <w:tc>
+          <w:tcPr>
+            <w:tcW w:type="dxa" w:w="1440"/>
+          </w:tcPr>
+          <w:p>
+            <w:r>
+              <w:t>0.252</w:t>
+            </w:r>
+          </w:p>
+        </w:tc>
+        <w:tc>
+          <w:tcPr>
+            <w:tcW w:type="dxa" w:w="1440"/>
+          </w:tcPr>
+          <w:p>
+            <w:r>
+              <w:t>0.377</w:t>
+            </w:r>
+          </w:p>
+        </w:tc>
+        <w:tc>
+          <w:tcPr>
+            <w:tcW w:type="dxa" w:w="1440"/>
+          </w:tcPr>
+          <w:p>
+            <w:r>
+              <w:t>4</w:t>
+            </w:r>
+          </w:p>
+        </w:tc>
+        <w:tc>
+          <w:tcPr>
+            <w:tcW w:type="dxa" w:w="1440"/>
+          </w:tcPr>
+          <w:p>
+            <w:r>
+              <w:t>23</w:t>
+            </w:r>
+          </w:p>
+        </w:tc>
+        <w:tc>
+          <w:tcPr>
+            <w:tcW w:type="dxa" w:w="1440"/>
+          </w:tcPr>
+          <w:p>
+            <w:r>
+              <w:t>0.00031</w:t>
+            </w:r>
+          </w:p>
+        </w:tc>
+      </w:tr>
+    </w:tbl>
+    <w:p>
+      <w:pPr>
+        <w:spacing w:after="120"/>
+        <w:jc w:val="both"/>
+      </w:pPr>
+      <w:r>
+        <w:t>Purity restriction raises recovery (all-gene Spearman 33% -&gt; 42%, p = 0.0044; centred Pearson 25% -&gt; 38%, p = 0.00031). Removing culture genes does not change it. Standard whole-transcriptome fidelity scores are therefore biased low for organoids. The prediction stated before this test (fibroblast best-match share above 15% on parenchymal-only genes) held: 28% [0.20, 0.36] and 22% [0.15, 0.29]. The lower bound of the second interval touches the threshold, so purity is weakened but not excluded as the explanation. vorganoid fidelity --purity applies this correction to any count matrix.</w:t>
       </w:r>
     </w:p>
     <w:p>
@@ -3412,7 +4199,7 @@
         <w:rPr>
           <w:b/>
         </w:rPr>
-        <w:t>Table 7. Tools genuinely used (results/tools_ledger.csv): 16. Target of 40 not reached.</w:t>
+        <w:t>Table 8. Tools genuinely used (results/tools_ledger.csv): 18 entries, 12 counting toward the gate after excluding infrastructure. Target of 40 not reached.</w:t>
       </w:r>
     </w:p>
     <w:tbl>
@@ -3422,14 +4209,15 @@
         <w:tblLook w:firstColumn="1" w:firstRow="1" w:lastColumn="0" w:lastRow="0" w:noHBand="0" w:noVBand="1" w:val="04A0"/>
       </w:tblPr>
       <w:tblGrid>
-        <w:gridCol w:w="2880"/>
-        <w:gridCol w:w="2880"/>
-        <w:gridCol w:w="2880"/>
+        <w:gridCol w:w="2160"/>
+        <w:gridCol w:w="2160"/>
+        <w:gridCol w:w="2160"/>
+        <w:gridCol w:w="2160"/>
       </w:tblGrid>
       <w:tr>
         <w:tc>
           <w:tcPr>
-            <w:tcW w:type="dxa" w:w="2880"/>
+            <w:tcW w:type="dxa" w:w="2160"/>
           </w:tcPr>
           <w:p>
             <w:r>
@@ -3439,7 +4227,7 @@
         </w:tc>
         <w:tc>
           <w:tcPr>
-            <w:tcW w:type="dxa" w:w="2880"/>
+            <w:tcW w:type="dxa" w:w="2160"/>
           </w:tcPr>
           <w:p>
             <w:r>
@@ -3449,11 +4237,21 @@
         </w:tc>
         <w:tc>
           <w:tcPr>
-            <w:tcW w:type="dxa" w:w="2880"/>
+            <w:tcW w:type="dxa" w:w="2160"/>
           </w:tcPr>
           <w:p>
             <w:r>
               <w:t>where used</w:t>
+            </w:r>
+          </w:p>
+        </w:tc>
+        <w:tc>
+          <w:tcPr>
+            <w:tcW w:type="dxa" w:w="2160"/>
+          </w:tcPr>
+          <w:p>
+            <w:r>
+              <w:t>gate</w:t>
             </w:r>
           </w:p>
         </w:tc>
@@ -3461,7 +4259,7 @@
       <w:tr>
         <w:tc>
           <w:tcPr>
-            <w:tcW w:type="dxa" w:w="2880"/>
+            <w:tcW w:type="dxa" w:w="2160"/>
           </w:tcPr>
           <w:p>
             <w:r>
@@ -3471,7 +4269,7 @@
         </w:tc>
         <w:tc>
           <w:tcPr>
-            <w:tcW w:type="dxa" w:w="2880"/>
+            <w:tcW w:type="dxa" w:w="2160"/>
           </w:tcPr>
           <w:p>
             <w:r>
@@ -3481,11 +4279,21 @@
         </w:tc>
         <w:tc>
           <w:tcPr>
-            <w:tcW w:type="dxa" w:w="2880"/>
+            <w:tcW w:type="dxa" w:w="2160"/>
           </w:tcPr>
           <w:p>
             <w:r>
               <w:t>src/vorganoid; src/geo_fidelity.py; paper/build_paper.py</w:t>
+            </w:r>
+          </w:p>
+        </w:tc>
+        <w:tc>
+          <w:tcPr>
+            <w:tcW w:type="dxa" w:w="2160"/>
+          </w:tcPr>
+          <w:p>
+            <w:r>
+              <w:t>counts</w:t>
             </w:r>
           </w:p>
         </w:tc>
@@ -3493,7 +4301,7 @@
       <w:tr>
         <w:tc>
           <w:tcPr>
-            <w:tcW w:type="dxa" w:w="2880"/>
+            <w:tcW w:type="dxa" w:w="2160"/>
           </w:tcPr>
           <w:p>
             <w:r>
@@ -3503,7 +4311,7 @@
         </w:tc>
         <w:tc>
           <w:tcPr>
-            <w:tcW w:type="dxa" w:w="2880"/>
+            <w:tcW w:type="dxa" w:w="2160"/>
           </w:tcPr>
           <w:p>
             <w:r>
@@ -3513,11 +4321,21 @@
         </w:tc>
         <w:tc>
           <w:tcPr>
-            <w:tcW w:type="dxa" w:w="2880"/>
+            <w:tcW w:type="dxa" w:w="2160"/>
           </w:tcPr>
           <w:p>
             <w:r>
               <w:t>src/geo_fidelity.py (spearmanr); paper/build_paper.py</w:t>
+            </w:r>
+          </w:p>
+        </w:tc>
+        <w:tc>
+          <w:tcPr>
+            <w:tcW w:type="dxa" w:w="2160"/>
+          </w:tcPr>
+          <w:p>
+            <w:r>
+              <w:t>counts</w:t>
             </w:r>
           </w:p>
         </w:tc>
@@ -3525,7 +4343,7 @@
       <w:tr>
         <w:tc>
           <w:tcPr>
-            <w:tcW w:type="dxa" w:w="2880"/>
+            <w:tcW w:type="dxa" w:w="2160"/>
           </w:tcPr>
           <w:p>
             <w:r>
@@ -3535,7 +4353,7 @@
         </w:tc>
         <w:tc>
           <w:tcPr>
-            <w:tcW w:type="dxa" w:w="2880"/>
+            <w:tcW w:type="dxa" w:w="2160"/>
           </w:tcPr>
           <w:p>
             <w:r>
@@ -3545,11 +4363,21 @@
         </w:tc>
         <w:tc>
           <w:tcPr>
-            <w:tcW w:type="dxa" w:w="2880"/>
+            <w:tcW w:type="dxa" w:w="2160"/>
           </w:tcPr>
           <w:p>
             <w:r>
               <w:t>src/geo_fidelity.py; paper/build_paper.py</w:t>
+            </w:r>
+          </w:p>
+        </w:tc>
+        <w:tc>
+          <w:tcPr>
+            <w:tcW w:type="dxa" w:w="2160"/>
+          </w:tcPr>
+          <w:p>
+            <w:r>
+              <w:t>counts</w:t>
             </w:r>
           </w:p>
         </w:tc>
@@ -3557,7 +4385,7 @@
       <w:tr>
         <w:tc>
           <w:tcPr>
-            <w:tcW w:type="dxa" w:w="2880"/>
+            <w:tcW w:type="dxa" w:w="2160"/>
           </w:tcPr>
           <w:p>
             <w:r>
@@ -3567,7 +4395,7 @@
         </w:tc>
         <w:tc>
           <w:tcPr>
-            <w:tcW w:type="dxa" w:w="2880"/>
+            <w:tcW w:type="dxa" w:w="2160"/>
           </w:tcPr>
           <w:p>
             <w:r>
@@ -3577,11 +4405,21 @@
         </w:tc>
         <w:tc>
           <w:tcPr>
-            <w:tcW w:type="dxa" w:w="2880"/>
+            <w:tcW w:type="dxa" w:w="2160"/>
           </w:tcPr>
           <w:p>
             <w:r>
               <w:t>src/vorganoid (instance post-processing; watershed/labels)</w:t>
+            </w:r>
+          </w:p>
+        </w:tc>
+        <w:tc>
+          <w:tcPr>
+            <w:tcW w:type="dxa" w:w="2160"/>
+          </w:tcPr>
+          <w:p>
+            <w:r>
+              <w:t>counts</w:t>
             </w:r>
           </w:p>
         </w:tc>
@@ -3589,7 +4427,7 @@
       <w:tr>
         <w:tc>
           <w:tcPr>
-            <w:tcW w:type="dxa" w:w="2880"/>
+            <w:tcW w:type="dxa" w:w="2160"/>
           </w:tcPr>
           <w:p>
             <w:r>
@@ -3599,7 +4437,7 @@
         </w:tc>
         <w:tc>
           <w:tcPr>
-            <w:tcW w:type="dxa" w:w="2880"/>
+            <w:tcW w:type="dxa" w:w="2160"/>
           </w:tcPr>
           <w:p>
             <w:r>
@@ -3609,11 +4447,21 @@
         </w:tc>
         <w:tc>
           <w:tcPr>
-            <w:tcW w:type="dxa" w:w="2880"/>
+            <w:tcW w:type="dxa" w:w="2160"/>
           </w:tcPr>
           <w:p>
             <w:r>
               <w:t>train_seg.py; tune_seg.py (U-Net CNN)</w:t>
+            </w:r>
+          </w:p>
+        </w:tc>
+        <w:tc>
+          <w:tcPr>
+            <w:tcW w:type="dxa" w:w="2160"/>
+          </w:tcPr>
+          <w:p>
+            <w:r>
+              <w:t>counts</w:t>
             </w:r>
           </w:p>
         </w:tc>
@@ -3621,7 +4469,7 @@
       <w:tr>
         <w:tc>
           <w:tcPr>
-            <w:tcW w:type="dxa" w:w="2880"/>
+            <w:tcW w:type="dxa" w:w="2160"/>
           </w:tcPr>
           <w:p>
             <w:r>
@@ -3631,7 +4479,7 @@
         </w:tc>
         <w:tc>
           <w:tcPr>
-            <w:tcW w:type="dxa" w:w="2880"/>
+            <w:tcW w:type="dxa" w:w="2160"/>
           </w:tcPr>
           <w:p>
             <w:r>
@@ -3641,11 +4489,21 @@
         </w:tc>
         <w:tc>
           <w:tcPr>
-            <w:tcW w:type="dxa" w:w="2880"/>
+            <w:tcW w:type="dxa" w:w="2160"/>
           </w:tcPr>
           <w:p>
             <w:r>
               <w:t>train_seg.py image loading</w:t>
+            </w:r>
+          </w:p>
+        </w:tc>
+        <w:tc>
+          <w:tcPr>
+            <w:tcW w:type="dxa" w:w="2160"/>
+          </w:tcPr>
+          <w:p>
+            <w:r>
+              <w:t>infra (excluded)</w:t>
             </w:r>
           </w:p>
         </w:tc>
@@ -3653,7 +4511,7 @@
       <w:tr>
         <w:tc>
           <w:tcPr>
-            <w:tcW w:type="dxa" w:w="2880"/>
+            <w:tcW w:type="dxa" w:w="2160"/>
           </w:tcPr>
           <w:p>
             <w:r>
@@ -3663,7 +4521,7 @@
         </w:tc>
         <w:tc>
           <w:tcPr>
-            <w:tcW w:type="dxa" w:w="2880"/>
+            <w:tcW w:type="dxa" w:w="2160"/>
           </w:tcPr>
           <w:p>
             <w:r>
@@ -3673,11 +4531,21 @@
         </w:tc>
         <w:tc>
           <w:tcPr>
-            <w:tcW w:type="dxa" w:w="2880"/>
+            <w:tcW w:type="dxa" w:w="2160"/>
           </w:tcPr>
           <w:p>
             <w:r>
               <w:t>paper/paperkit.py</w:t>
+            </w:r>
+          </w:p>
+        </w:tc>
+        <w:tc>
+          <w:tcPr>
+            <w:tcW w:type="dxa" w:w="2160"/>
+          </w:tcPr>
+          <w:p>
+            <w:r>
+              <w:t>infra (excluded)</w:t>
             </w:r>
           </w:p>
         </w:tc>
@@ -3685,7 +4553,7 @@
       <w:tr>
         <w:tc>
           <w:tcPr>
-            <w:tcW w:type="dxa" w:w="2880"/>
+            <w:tcW w:type="dxa" w:w="2160"/>
           </w:tcPr>
           <w:p>
             <w:r>
@@ -3695,7 +4563,7 @@
         </w:tc>
         <w:tc>
           <w:tcPr>
-            <w:tcW w:type="dxa" w:w="2880"/>
+            <w:tcW w:type="dxa" w:w="2160"/>
           </w:tcPr>
           <w:p>
             <w:r>
@@ -3705,11 +4573,21 @@
         </w:tc>
         <w:tc>
           <w:tcPr>
-            <w:tcW w:type="dxa" w:w="2880"/>
+            <w:tcW w:type="dxa" w:w="2160"/>
           </w:tcPr>
           <w:p>
             <w:r>
               <w:t>tests/ (hermetic suite)</w:t>
+            </w:r>
+          </w:p>
+        </w:tc>
+        <w:tc>
+          <w:tcPr>
+            <w:tcW w:type="dxa" w:w="2160"/>
+          </w:tcPr>
+          <w:p>
+            <w:r>
+              <w:t>infra (excluded)</w:t>
             </w:r>
           </w:p>
         </w:tc>
@@ -3717,7 +4595,7 @@
       <w:tr>
         <w:tc>
           <w:tcPr>
-            <w:tcW w:type="dxa" w:w="2880"/>
+            <w:tcW w:type="dxa" w:w="2160"/>
           </w:tcPr>
           <w:p>
             <w:r>
@@ -3727,7 +4605,7 @@
         </w:tc>
         <w:tc>
           <w:tcPr>
-            <w:tcW w:type="dxa" w:w="2880"/>
+            <w:tcW w:type="dxa" w:w="2160"/>
           </w:tcPr>
           <w:p>
             <w:r>
@@ -3737,11 +4615,21 @@
         </w:tc>
         <w:tc>
           <w:tcPr>
-            <w:tcW w:type="dxa" w:w="2880"/>
+            <w:tcW w:type="dxa" w:w="2160"/>
           </w:tcPr>
           <w:p>
             <w:r>
               <w:t>paper docx -&gt; pdf render</w:t>
+            </w:r>
+          </w:p>
+        </w:tc>
+        <w:tc>
+          <w:tcPr>
+            <w:tcW w:type="dxa" w:w="2160"/>
+          </w:tcPr>
+          <w:p>
+            <w:r>
+              <w:t>infra (excluded)</w:t>
             </w:r>
           </w:p>
         </w:tc>
@@ -3749,7 +4637,7 @@
       <w:tr>
         <w:tc>
           <w:tcPr>
-            <w:tcW w:type="dxa" w:w="2880"/>
+            <w:tcW w:type="dxa" w:w="2160"/>
           </w:tcPr>
           <w:p>
             <w:r>
@@ -3759,7 +4647,7 @@
         </w:tc>
         <w:tc>
           <w:tcPr>
-            <w:tcW w:type="dxa" w:w="2880"/>
+            <w:tcW w:type="dxa" w:w="2160"/>
           </w:tcPr>
           <w:p>
             <w:r>
@@ -3769,11 +4657,21 @@
         </w:tc>
         <w:tc>
           <w:tcPr>
-            <w:tcW w:type="dxa" w:w="2880"/>
+            <w:tcW w:type="dxa" w:w="2160"/>
           </w:tcPr>
           <w:p>
             <w:r>
               <w:t>page count of rendered paper</w:t>
+            </w:r>
+          </w:p>
+        </w:tc>
+        <w:tc>
+          <w:tcPr>
+            <w:tcW w:type="dxa" w:w="2160"/>
+          </w:tcPr>
+          <w:p>
+            <w:r>
+              <w:t>infra (excluded)</w:t>
             </w:r>
           </w:p>
         </w:tc>
@@ -3781,7 +4679,7 @@
       <w:tr>
         <w:tc>
           <w:tcPr>
-            <w:tcW w:type="dxa" w:w="2880"/>
+            <w:tcW w:type="dxa" w:w="2160"/>
           </w:tcPr>
           <w:p>
             <w:r>
@@ -3791,7 +4689,7 @@
         </w:tc>
         <w:tc>
           <w:tcPr>
-            <w:tcW w:type="dxa" w:w="2880"/>
+            <w:tcW w:type="dxa" w:w="2160"/>
           </w:tcPr>
           <w:p>
             <w:r>
@@ -3801,11 +4699,21 @@
         </w:tc>
         <w:tc>
           <w:tcPr>
-            <w:tcW w:type="dxa" w:w="2880"/>
+            <w:tcW w:type="dxa" w:w="2160"/>
           </w:tcPr>
           <w:p>
             <w:r>
               <w:t>repo hosting and pushes</w:t>
+            </w:r>
+          </w:p>
+        </w:tc>
+        <w:tc>
+          <w:tcPr>
+            <w:tcW w:type="dxa" w:w="2160"/>
+          </w:tcPr>
+          <w:p>
+            <w:r>
+              <w:t>infra (excluded)</w:t>
             </w:r>
           </w:p>
         </w:tc>
@@ -3813,7 +4721,7 @@
       <w:tr>
         <w:tc>
           <w:tcPr>
-            <w:tcW w:type="dxa" w:w="2880"/>
+            <w:tcW w:type="dxa" w:w="2160"/>
           </w:tcPr>
           <w:p>
             <w:r>
@@ -3823,7 +4731,7 @@
         </w:tc>
         <w:tc>
           <w:tcPr>
-            <w:tcW w:type="dxa" w:w="2880"/>
+            <w:tcW w:type="dxa" w:w="2160"/>
           </w:tcPr>
           <w:p>
             <w:r>
@@ -3833,11 +4741,21 @@
         </w:tc>
         <w:tc>
           <w:tcPr>
-            <w:tcW w:type="dxa" w:w="2880"/>
+            <w:tcW w:type="dxa" w:w="2160"/>
           </w:tcPr>
           <w:p>
             <w:r>
               <w:t>src/geo_candidates.py</w:t>
+            </w:r>
+          </w:p>
+        </w:tc>
+        <w:tc>
+          <w:tcPr>
+            <w:tcW w:type="dxa" w:w="2160"/>
+          </w:tcPr>
+          <w:p>
+            <w:r>
+              <w:t>counts</w:t>
             </w:r>
           </w:p>
         </w:tc>
@@ -3845,7 +4763,7 @@
       <w:tr>
         <w:tc>
           <w:tcPr>
-            <w:tcW w:type="dxa" w:w="2880"/>
+            <w:tcW w:type="dxa" w:w="2160"/>
           </w:tcPr>
           <w:p>
             <w:r>
@@ -3855,7 +4773,7 @@
         </w:tc>
         <w:tc>
           <w:tcPr>
-            <w:tcW w:type="dxa" w:w="2880"/>
+            <w:tcW w:type="dxa" w:w="2160"/>
           </w:tcPr>
           <w:p>
             <w:r>
@@ -3865,11 +4783,21 @@
         </w:tc>
         <w:tc>
           <w:tcPr>
-            <w:tcW w:type="dxa" w:w="2880"/>
+            <w:tcW w:type="dxa" w:w="2160"/>
           </w:tcPr>
           <w:p>
             <w:r>
               <w:t>src/geo_fidelity.py</w:t>
+            </w:r>
+          </w:p>
+        </w:tc>
+        <w:tc>
+          <w:tcPr>
+            <w:tcW w:type="dxa" w:w="2160"/>
+          </w:tcPr>
+          <w:p>
+            <w:r>
+              <w:t>counts</w:t>
             </w:r>
           </w:p>
         </w:tc>
@@ -3877,7 +4805,7 @@
       <w:tr>
         <w:tc>
           <w:tcPr>
-            <w:tcW w:type="dxa" w:w="2880"/>
+            <w:tcW w:type="dxa" w:w="2160"/>
           </w:tcPr>
           <w:p>
             <w:r>
@@ -3887,7 +4815,7 @@
         </w:tc>
         <w:tc>
           <w:tcPr>
-            <w:tcW w:type="dxa" w:w="2880"/>
+            <w:tcW w:type="dxa" w:w="2160"/>
           </w:tcPr>
           <w:p>
             <w:r>
@@ -3897,11 +4825,21 @@
         </w:tc>
         <w:tc>
           <w:tcPr>
-            <w:tcW w:type="dxa" w:w="2880"/>
+            <w:tcW w:type="dxa" w:w="2160"/>
           </w:tcPr>
           <w:p>
             <w:r>
               <w:t>data/ref/gtex_v8_median_tpm.gct.gz; src/geo_fidelity.py</w:t>
+            </w:r>
+          </w:p>
+        </w:tc>
+        <w:tc>
+          <w:tcPr>
+            <w:tcW w:type="dxa" w:w="2160"/>
+          </w:tcPr>
+          <w:p>
+            <w:r>
+              <w:t>counts</w:t>
             </w:r>
           </w:p>
         </w:tc>
@@ -3909,7 +4847,7 @@
       <w:tr>
         <w:tc>
           <w:tcPr>
-            <w:tcW w:type="dxa" w:w="2880"/>
+            <w:tcW w:type="dxa" w:w="2160"/>
           </w:tcPr>
           <w:p>
             <w:r>
@@ -3919,7 +4857,7 @@
         </w:tc>
         <w:tc>
           <w:tcPr>
-            <w:tcW w:type="dxa" w:w="2880"/>
+            <w:tcW w:type="dxa" w:w="2160"/>
           </w:tcPr>
           <w:p>
             <w:r>
@@ -3929,11 +4867,21 @@
         </w:tc>
         <w:tc>
           <w:tcPr>
-            <w:tcW w:type="dxa" w:w="2880"/>
+            <w:tcW w:type="dxa" w:w="2160"/>
           </w:tcPr>
           <w:p>
             <w:r>
               <w:t>data/ref/h.all.v2023.2.Hs.symbols.gmt; src/geo_fidelity_methods.py (culture-confound test)</w:t>
+            </w:r>
+          </w:p>
+        </w:tc>
+        <w:tc>
+          <w:tcPr>
+            <w:tcW w:type="dxa" w:w="2160"/>
+          </w:tcPr>
+          <w:p>
+            <w:r>
+              <w:t>counts</w:t>
             </w:r>
           </w:p>
         </w:tc>
@@ -3941,7 +4889,7 @@
       <w:tr>
         <w:tc>
           <w:tcPr>
-            <w:tcW w:type="dxa" w:w="2880"/>
+            <w:tcW w:type="dxa" w:w="2160"/>
           </w:tcPr>
           <w:p>
             <w:r>
@@ -3951,7 +4899,7 @@
         </w:tc>
         <w:tc>
           <w:tcPr>
-            <w:tcW w:type="dxa" w:w="2880"/>
+            <w:tcW w:type="dxa" w:w="2160"/>
           </w:tcPr>
           <w:p>
             <w:r>
@@ -3961,11 +4909,105 @@
         </w:tc>
         <w:tc>
           <w:tcPr>
-            <w:tcW w:type="dxa" w:w="2880"/>
+            <w:tcW w:type="dxa" w:w="2160"/>
           </w:tcPr>
           <w:p>
             <w:r>
               <w:t>src/fig_geo_fidelity.py; paper figures (fig_size_attenuation.png, fig_geo_fidelity.png)</w:t>
+            </w:r>
+          </w:p>
+        </w:tc>
+        <w:tc>
+          <w:tcPr>
+            <w:tcW w:type="dxa" w:w="2160"/>
+          </w:tcPr>
+          <w:p>
+            <w:r>
+              <w:t>counts</w:t>
+            </w:r>
+          </w:p>
+        </w:tc>
+      </w:tr>
+      <w:tr>
+        <w:tc>
+          <w:tcPr>
+            <w:tcW w:type="dxa" w:w="2160"/>
+          </w:tcPr>
+          <w:p>
+            <w:r>
+              <w:t>Human Protein Atlas single-cell type API</w:t>
+            </w:r>
+          </w:p>
+        </w:tc>
+        <w:tc>
+          <w:tcPr>
+            <w:tcW w:type="dxa" w:w="2160"/>
+          </w:tcPr>
+          <w:p>
+            <w:r>
+              <w:t>database/web API</w:t>
+            </w:r>
+          </w:p>
+        </w:tc>
+        <w:tc>
+          <w:tcPr>
+            <w:tcW w:type="dxa" w:w="2160"/>
+          </w:tcPr>
+          <w:p>
+            <w:r>
+              <w:t>data/ref/hpa_single_cell_type_v_api.tsv.gz; src/geo_fidelity_methods.py (purity gene sets)</w:t>
+            </w:r>
+          </w:p>
+        </w:tc>
+        <w:tc>
+          <w:tcPr>
+            <w:tcW w:type="dxa" w:w="2160"/>
+          </w:tcPr>
+          <w:p>
+            <w:r>
+              <w:t>counts</w:t>
+            </w:r>
+          </w:p>
+        </w:tc>
+      </w:tr>
+      <w:tr>
+        <w:tc>
+          <w:tcPr>
+            <w:tcW w:type="dxa" w:w="2160"/>
+          </w:tcPr>
+          <w:p>
+            <w:r>
+              <w:t>statsmodels</w:t>
+            </w:r>
+          </w:p>
+        </w:tc>
+        <w:tc>
+          <w:tcPr>
+            <w:tcW w:type="dxa" w:w="2160"/>
+          </w:tcPr>
+          <w:p>
+            <w:r>
+              <w:t>library</w:t>
+            </w:r>
+          </w:p>
+        </w:tc>
+        <w:tc>
+          <w:tcPr>
+            <w:tcW w:type="dxa" w:w="2160"/>
+          </w:tcPr>
+          <w:p>
+            <w:r>
+              <w:t>src/geo_mcnemar.py (exact McNemar tests)</w:t>
+            </w:r>
+          </w:p>
+        </w:tc>
+        <w:tc>
+          <w:tcPr>
+            <w:tcW w:type="dxa" w:w="2160"/>
+          </w:tcPr>
+          <w:p>
+            <w:r>
+              <w:t>counts</w:t>
             </w:r>
           </w:p>
         </w:tc>
@@ -4004,6 +5046,15 @@
       </w:pPr>
       <w:r>
         <w:t>GTEx Consortium. The GTEx Consortium atlas of genetic regulatory effects across human tissues. Science 2020. https://gtexportal.org</w:t>
+      </w:r>
+    </w:p>
+    <w:p>
+      <w:pPr>
+        <w:spacing w:after="120"/>
+        <w:jc w:val="both"/>
+      </w:pPr>
+      <w:r>
+        <w:t>Karlsson M, et al. A single-cell type transcriptomics map of human tissues. Sci Adv 2021. https://www.proteinatlas.org</w:t>
       </w:r>
     </w:p>
     <w:p>

</xml_diff>

<commit_message>
Paper v5: attractor driver genes (g:Profiler) and HGNC protein-coding robustness (4.8); pdfinfo 13 pages
</commit_message>
<xml_diff>
--- a/paper/mega27-03-virtual-organoid-paper.docx
+++ b/paper/mega27-03-virtual-organoid-paper.docx
@@ -2943,7 +2943,7 @@
           </w:tcPr>
           <w:p>
             <w:r>
-              <w:t>[0.15, 0.30]</w:t>
+              <w:t>[0.15, 0.31]</w:t>
             </w:r>
           </w:p>
         </w:tc>
@@ -3015,7 +3015,7 @@
           </w:tcPr>
           <w:p>
             <w:r>
-              <w:t>[0.18, 0.34]</w:t>
+              <w:t>[0.18, 0.35]</w:t>
             </w:r>
           </w:p>
         </w:tc>
@@ -3447,7 +3447,7 @@
           </w:tcPr>
           <w:p>
             <w:r>
-              <w:t>[0.20, 0.36]</w:t>
+              <w:t>[0.20, 0.37]</w:t>
             </w:r>
           </w:p>
         </w:tc>
@@ -3520,6 +3520,150 @@
           <w:p>
             <w:r>
               <w:t>[0.15, 0.29]</w:t>
+            </w:r>
+          </w:p>
+        </w:tc>
+      </w:tr>
+      <w:tr>
+        <w:tc>
+          <w:tcPr>
+            <w:tcW w:type="dxa" w:w="1234"/>
+          </w:tcPr>
+          <w:p>
+            <w:r>
+              <w:t>SALL_PC</w:t>
+            </w:r>
+          </w:p>
+        </w:tc>
+        <w:tc>
+          <w:tcPr>
+            <w:tcW w:type="dxa" w:w="1234"/>
+          </w:tcPr>
+          <w:p>
+            <w:r>
+              <w:t>0.285</w:t>
+            </w:r>
+          </w:p>
+        </w:tc>
+        <w:tc>
+          <w:tcPr>
+            <w:tcW w:type="dxa" w:w="1234"/>
+          </w:tcPr>
+          <w:p>
+            <w:r>
+              <w:t>0.077</w:t>
+            </w:r>
+          </w:p>
+        </w:tc>
+        <w:tc>
+          <w:tcPr>
+            <w:tcW w:type="dxa" w:w="1234"/>
+          </w:tcPr>
+          <w:p>
+            <w:r>
+              <w:t>1e-04</w:t>
+            </w:r>
+          </w:p>
+        </w:tc>
+        <w:tc>
+          <w:tcPr>
+            <w:tcW w:type="dxa" w:w="1234"/>
+          </w:tcPr>
+          <w:p>
+            <w:r>
+              <w:t>0.283</w:t>
+            </w:r>
+          </w:p>
+        </w:tc>
+        <w:tc>
+          <w:tcPr>
+            <w:tcW w:type="dxa" w:w="1234"/>
+          </w:tcPr>
+          <w:p>
+            <w:r>
+              <w:t>0.442</w:t>
+            </w:r>
+          </w:p>
+        </w:tc>
+        <w:tc>
+          <w:tcPr>
+            <w:tcW w:type="dxa" w:w="1234"/>
+          </w:tcPr>
+          <w:p>
+            <w:r>
+              <w:t>[0.35, 0.53]</w:t>
+            </w:r>
+          </w:p>
+        </w:tc>
+      </w:tr>
+      <w:tr>
+        <w:tc>
+          <w:tcPr>
+            <w:tcW w:type="dxa" w:w="1234"/>
+          </w:tcPr>
+          <w:p>
+            <w:r>
+              <w:t>CENT_PC</w:t>
+            </w:r>
+          </w:p>
+        </w:tc>
+        <w:tc>
+          <w:tcPr>
+            <w:tcW w:type="dxa" w:w="1234"/>
+          </w:tcPr>
+          <w:p>
+            <w:r>
+              <w:t>0.298</w:t>
+            </w:r>
+          </w:p>
+        </w:tc>
+        <w:tc>
+          <w:tcPr>
+            <w:tcW w:type="dxa" w:w="1234"/>
+          </w:tcPr>
+          <w:p>
+            <w:r>
+              <w:t>0.067</w:t>
+            </w:r>
+          </w:p>
+        </w:tc>
+        <w:tc>
+          <w:tcPr>
+            <w:tcW w:type="dxa" w:w="1234"/>
+          </w:tcPr>
+          <w:p>
+            <w:r>
+              <w:t>1e-04</w:t>
+            </w:r>
+          </w:p>
+        </w:tc>
+        <w:tc>
+          <w:tcPr>
+            <w:tcW w:type="dxa" w:w="1234"/>
+          </w:tcPr>
+          <w:p>
+            <w:r>
+              <w:t>0.310</w:t>
+            </w:r>
+          </w:p>
+        </w:tc>
+        <w:tc>
+          <w:tcPr>
+            <w:tcW w:type="dxa" w:w="1234"/>
+          </w:tcPr>
+          <w:p>
+            <w:r>
+              <w:t>0.283</w:t>
+            </w:r>
+          </w:p>
+        </w:tc>
+        <w:tc>
+          <w:tcPr>
+            <w:tcW w:type="dxa" w:w="1234"/>
+          </w:tcPr>
+          <w:p>
+            <w:r>
+              <w:t>[0.20, 0.36]</w:t>
             </w:r>
           </w:p>
         </w:tc>
@@ -3891,7 +4035,7 @@
           </w:tcPr>
           <w:p>
             <w:r>
-              <w:t>CENT vs CENT_NOCULT</w:t>
+              <w:t>SALL vs SALL_PC</w:t>
             </w:r>
           </w:p>
         </w:tc>
@@ -3901,7 +4045,7 @@
           </w:tcPr>
           <w:p>
             <w:r>
-              <w:t>0.252</w:t>
+              <w:t>0.331</w:t>
             </w:r>
           </w:p>
         </w:tc>
@@ -3911,7 +4055,7 @@
           </w:tcPr>
           <w:p>
             <w:r>
-              <w:t>0.258</w:t>
+              <w:t>0.285</w:t>
             </w:r>
           </w:p>
         </w:tc>
@@ -3921,7 +4065,7 @@
           </w:tcPr>
           <w:p>
             <w:r>
-              <w:t>0</w:t>
+              <w:t>16</w:t>
             </w:r>
           </w:p>
         </w:tc>
@@ -3931,7 +4075,7 @@
           </w:tcPr>
           <w:p>
             <w:r>
-              <w:t>1</w:t>
+              <w:t>9</w:t>
             </w:r>
           </w:p>
         </w:tc>
@@ -3941,7 +4085,7 @@
           </w:tcPr>
           <w:p>
             <w:r>
-              <w:t>1</w:t>
+              <w:t>0.23</w:t>
             </w:r>
           </w:p>
         </w:tc>
@@ -3953,7 +4097,7 @@
           </w:tcPr>
           <w:p>
             <w:r>
-              <w:t>CENT vs CENT_NONPAR</w:t>
+              <w:t>CENT vs CENT_NOCULT</w:t>
             </w:r>
           </w:p>
         </w:tc>
@@ -3973,7 +4117,7 @@
           </w:tcPr>
           <w:p>
             <w:r>
-              <w:t>0.331</w:t>
+              <w:t>0.258</w:t>
             </w:r>
           </w:p>
         </w:tc>
@@ -3983,7 +4127,7 @@
           </w:tcPr>
           <w:p>
             <w:r>
-              <w:t>4</w:t>
+              <w:t>0</w:t>
             </w:r>
           </w:p>
         </w:tc>
@@ -3993,7 +4137,7 @@
           </w:tcPr>
           <w:p>
             <w:r>
-              <w:t>16</w:t>
+              <w:t>1</w:t>
             </w:r>
           </w:p>
         </w:tc>
@@ -4003,7 +4147,7 @@
           </w:tcPr>
           <w:p>
             <w:r>
-              <w:t>0.012</w:t>
+              <w:t>1</w:t>
             </w:r>
           </w:p>
         </w:tc>
@@ -4015,6 +4159,68 @@
           </w:tcPr>
           <w:p>
             <w:r>
+              <w:t>CENT vs CENT_NONPAR</w:t>
+            </w:r>
+          </w:p>
+        </w:tc>
+        <w:tc>
+          <w:tcPr>
+            <w:tcW w:type="dxa" w:w="1440"/>
+          </w:tcPr>
+          <w:p>
+            <w:r>
+              <w:t>0.252</w:t>
+            </w:r>
+          </w:p>
+        </w:tc>
+        <w:tc>
+          <w:tcPr>
+            <w:tcW w:type="dxa" w:w="1440"/>
+          </w:tcPr>
+          <w:p>
+            <w:r>
+              <w:t>0.331</w:t>
+            </w:r>
+          </w:p>
+        </w:tc>
+        <w:tc>
+          <w:tcPr>
+            <w:tcW w:type="dxa" w:w="1440"/>
+          </w:tcPr>
+          <w:p>
+            <w:r>
+              <w:t>4</w:t>
+            </w:r>
+          </w:p>
+        </w:tc>
+        <w:tc>
+          <w:tcPr>
+            <w:tcW w:type="dxa" w:w="1440"/>
+          </w:tcPr>
+          <w:p>
+            <w:r>
+              <w:t>16</w:t>
+            </w:r>
+          </w:p>
+        </w:tc>
+        <w:tc>
+          <w:tcPr>
+            <w:tcW w:type="dxa" w:w="1440"/>
+          </w:tcPr>
+          <w:p>
+            <w:r>
+              <w:t>0.012</w:t>
+            </w:r>
+          </w:p>
+        </w:tc>
+      </w:tr>
+      <w:tr>
+        <w:tc>
+          <w:tcPr>
+            <w:tcW w:type="dxa" w:w="1440"/>
+          </w:tcPr>
+          <w:p>
+            <w:r>
               <w:t>CENT vs CENT_PARONLY</w:t>
             </w:r>
           </w:p>
@@ -4066,6 +4272,68 @@
           <w:p>
             <w:r>
               <w:t>0.00031</w:t>
+            </w:r>
+          </w:p>
+        </w:tc>
+      </w:tr>
+      <w:tr>
+        <w:tc>
+          <w:tcPr>
+            <w:tcW w:type="dxa" w:w="1440"/>
+          </w:tcPr>
+          <w:p>
+            <w:r>
+              <w:t>CENT vs CENT_PC</w:t>
+            </w:r>
+          </w:p>
+        </w:tc>
+        <w:tc>
+          <w:tcPr>
+            <w:tcW w:type="dxa" w:w="1440"/>
+          </w:tcPr>
+          <w:p>
+            <w:r>
+              <w:t>0.252</w:t>
+            </w:r>
+          </w:p>
+        </w:tc>
+        <w:tc>
+          <w:tcPr>
+            <w:tcW w:type="dxa" w:w="1440"/>
+          </w:tcPr>
+          <w:p>
+            <w:r>
+              <w:t>0.298</w:t>
+            </w:r>
+          </w:p>
+        </w:tc>
+        <w:tc>
+          <w:tcPr>
+            <w:tcW w:type="dxa" w:w="1440"/>
+          </w:tcPr>
+          <w:p>
+            <w:r>
+              <w:t>0</w:t>
+            </w:r>
+          </w:p>
+        </w:tc>
+        <w:tc>
+          <w:tcPr>
+            <w:tcW w:type="dxa" w:w="1440"/>
+          </w:tcPr>
+          <w:p>
+            <w:r>
+              <w:t>7</w:t>
+            </w:r>
+          </w:p>
+        </w:tc>
+        <w:tc>
+          <w:tcPr>
+            <w:tcW w:type="dxa" w:w="1440"/>
+          </w:tcPr>
+          <w:p>
+            <w:r>
+              <w:t>0.016</w:t>
             </w:r>
           </w:p>
         </w:tc>
@@ -4077,7 +4345,415 @@
         <w:jc w:val="both"/>
       </w:pPr>
       <w:r>
-        <w:t>Purity restriction raises recovery (all-gene Spearman 33% -&gt; 42%, p = 0.0044; centred Pearson 25% -&gt; 38%, p = 0.00031). Removing culture genes does not change it. Standard whole-transcriptome fidelity scores are therefore biased low for organoids. The prediction stated before this test (fibroblast best-match share above 15% on parenchymal-only genes) held: 28% [0.20, 0.36] and 22% [0.15, 0.29]. The lower bound of the second interval touches the threshold, so purity is weakened but not excluded as the explanation. vorganoid fidelity --purity applies this correction to any count matrix.</w:t>
+        <w:t>Purity restriction raises recovery (all-gene Spearman 33% -&gt; 42%, p = 0.0044; centred Pearson 25% -&gt; 38%, p = 0.00031). Removing culture genes does not change it. Standard whole-transcriptome fidelity scores are therefore biased low for organoids. The prediction stated before this test (fibroblast best-match share above 15% on parenchymal-only genes) held: 28% [0.20, 0.37] and 22% [0.15, 0.29]. The lower bound of the second interval touches the threshold, so purity is weakened but not excluded as the explanation. vorganoid fidelity --purity applies this correction to any count matrix.</w:t>
+      </w:r>
+    </w:p>
+    <w:p>
+      <w:pPr>
+        <w:pStyle w:val="Heading2"/>
+      </w:pPr>
+      <w:r>
+        <w:t>4.8 What drives the attractor, and is it robust to gene class?</w:t>
+      </w:r>
+    </w:p>
+    <w:p>
+      <w:pPr>
+        <w:spacing w:after="120"/>
+        <w:jc w:val="both"/>
+      </w:pPr>
+      <w:r>
+        <w:t>For the clean-subset series whose best match is cultured fibroblasts, each gene is scored by how much it pulls the profile toward fibroblasts and away from the organ of origin, averaged over series:</w:t>
+      </w:r>
+    </w:p>
+    <w:p>
+      <w:pPr>
+        <w:jc w:val="center"/>
+      </w:pPr>
+      <w:r>
+        <w:rPr>
+          <w:i/>
+        </w:rPr>
+        <w:t>d_g = (1/|S|) sum_{s in S} z(p_sg) ( z(G_g,fib) - z(G_g,organ(s)) ),   z = rank-based standard score within a profile</w:t>
+      </w:r>
+      <w:r>
+        <w:tab/>
+        <w:tab/>
+        <w:t>(16)</w:t>
+      </w:r>
+    </w:p>
+    <w:p>
+      <w:pPr>
+        <w:spacing w:after="120"/>
+        <w:jc w:val="both"/>
+      </w:pPr>
+      <w:r>
+        <w:t>The top 300 genes were tested with g:Profiler (GO:BP, Reactome, KEGG; g:SCS correction; background = all scored genes).</w:t>
+      </w:r>
+    </w:p>
+    <w:p>
+      <w:r>
+        <w:rPr>
+          <w:b/>
+        </w:rPr>
+        <w:t>Table 8. Enrichment of attractor-driving genes (results/attractor_gprofiler.csv; terms with more than 2,000 genes omitted).</w:t>
+      </w:r>
+    </w:p>
+    <w:tbl>
+      <w:tblPr>
+        <w:tblStyle w:val="LightGrid-Accent1"/>
+        <w:tblW w:type="auto" w:w="0"/>
+        <w:tblLook w:firstColumn="1" w:firstRow="1" w:lastColumn="0" w:lastRow="0" w:noHBand="0" w:noVBand="1" w:val="04A0"/>
+      </w:tblPr>
+      <w:tblGrid>
+        <w:gridCol w:w="2160"/>
+        <w:gridCol w:w="2160"/>
+        <w:gridCol w:w="2160"/>
+        <w:gridCol w:w="2160"/>
+      </w:tblGrid>
+      <w:tr>
+        <w:tc>
+          <w:tcPr>
+            <w:tcW w:type="dxa" w:w="2160"/>
+          </w:tcPr>
+          <w:p>
+            <w:r>
+              <w:t>source</w:t>
+            </w:r>
+          </w:p>
+        </w:tc>
+        <w:tc>
+          <w:tcPr>
+            <w:tcW w:type="dxa" w:w="2160"/>
+          </w:tcPr>
+          <w:p>
+            <w:r>
+              <w:t>term</w:t>
+            </w:r>
+          </w:p>
+        </w:tc>
+        <w:tc>
+          <w:tcPr>
+            <w:tcW w:type="dxa" w:w="2160"/>
+          </w:tcPr>
+          <w:p>
+            <w:r>
+              <w:t>adjusted p</w:t>
+            </w:r>
+          </w:p>
+        </w:tc>
+        <w:tc>
+          <w:tcPr>
+            <w:tcW w:type="dxa" w:w="2160"/>
+          </w:tcPr>
+          <w:p>
+            <w:r>
+              <w:t>genes</w:t>
+            </w:r>
+          </w:p>
+        </w:tc>
+      </w:tr>
+      <w:tr>
+        <w:tc>
+          <w:tcPr>
+            <w:tcW w:type="dxa" w:w="2160"/>
+          </w:tcPr>
+          <w:p>
+            <w:r>
+              <w:t>GO:BP</w:t>
+            </w:r>
+          </w:p>
+        </w:tc>
+        <w:tc>
+          <w:tcPr>
+            <w:tcW w:type="dxa" w:w="2160"/>
+          </w:tcPr>
+          <w:p>
+            <w:r>
+              <w:t>mitotic cell cycle process</w:t>
+            </w:r>
+          </w:p>
+        </w:tc>
+        <w:tc>
+          <w:tcPr>
+            <w:tcW w:type="dxa" w:w="2160"/>
+          </w:tcPr>
+          <w:p>
+            <w:r>
+              <w:t>7.8e-56</w:t>
+            </w:r>
+          </w:p>
+        </w:tc>
+        <w:tc>
+          <w:tcPr>
+            <w:tcW w:type="dxa" w:w="2160"/>
+          </w:tcPr>
+          <w:p>
+            <w:r>
+              <w:t>66</w:t>
+            </w:r>
+          </w:p>
+        </w:tc>
+      </w:tr>
+      <w:tr>
+        <w:tc>
+          <w:tcPr>
+            <w:tcW w:type="dxa" w:w="2160"/>
+          </w:tcPr>
+          <w:p>
+            <w:r>
+              <w:t>GO:BP</w:t>
+            </w:r>
+          </w:p>
+        </w:tc>
+        <w:tc>
+          <w:tcPr>
+            <w:tcW w:type="dxa" w:w="2160"/>
+          </w:tcPr>
+          <w:p>
+            <w:r>
+              <w:t>mitotic cell cycle</w:t>
+            </w:r>
+          </w:p>
+        </w:tc>
+        <w:tc>
+          <w:tcPr>
+            <w:tcW w:type="dxa" w:w="2160"/>
+          </w:tcPr>
+          <w:p>
+            <w:r>
+              <w:t>1.4e-54</w:t>
+            </w:r>
+          </w:p>
+        </w:tc>
+        <w:tc>
+          <w:tcPr>
+            <w:tcW w:type="dxa" w:w="2160"/>
+          </w:tcPr>
+          <w:p>
+            <w:r>
+              <w:t>69</w:t>
+            </w:r>
+          </w:p>
+        </w:tc>
+      </w:tr>
+      <w:tr>
+        <w:tc>
+          <w:tcPr>
+            <w:tcW w:type="dxa" w:w="2160"/>
+          </w:tcPr>
+          <w:p>
+            <w:r>
+              <w:t>GO:BP</w:t>
+            </w:r>
+          </w:p>
+        </w:tc>
+        <w:tc>
+          <w:tcPr>
+            <w:tcW w:type="dxa" w:w="2160"/>
+          </w:tcPr>
+          <w:p>
+            <w:r>
+              <w:t>cell cycle process</w:t>
+            </w:r>
+          </w:p>
+        </w:tc>
+        <w:tc>
+          <w:tcPr>
+            <w:tcW w:type="dxa" w:w="2160"/>
+          </w:tcPr>
+          <w:p>
+            <w:r>
+              <w:t>3.6e-53</w:t>
+            </w:r>
+          </w:p>
+        </w:tc>
+        <w:tc>
+          <w:tcPr>
+            <w:tcW w:type="dxa" w:w="2160"/>
+          </w:tcPr>
+          <w:p>
+            <w:r>
+              <w:t>77</w:t>
+            </w:r>
+          </w:p>
+        </w:tc>
+      </w:tr>
+      <w:tr>
+        <w:tc>
+          <w:tcPr>
+            <w:tcW w:type="dxa" w:w="2160"/>
+          </w:tcPr>
+          <w:p>
+            <w:r>
+              <w:t>GO:BP</w:t>
+            </w:r>
+          </w:p>
+        </w:tc>
+        <w:tc>
+          <w:tcPr>
+            <w:tcW w:type="dxa" w:w="2160"/>
+          </w:tcPr>
+          <w:p>
+            <w:r>
+              <w:t>cell cycle</w:t>
+            </w:r>
+          </w:p>
+        </w:tc>
+        <w:tc>
+          <w:tcPr>
+            <w:tcW w:type="dxa" w:w="2160"/>
+          </w:tcPr>
+          <w:p>
+            <w:r>
+              <w:t>1.3e-51</w:t>
+            </w:r>
+          </w:p>
+        </w:tc>
+        <w:tc>
+          <w:tcPr>
+            <w:tcW w:type="dxa" w:w="2160"/>
+          </w:tcPr>
+          <w:p>
+            <w:r>
+              <w:t>83</w:t>
+            </w:r>
+          </w:p>
+        </w:tc>
+      </w:tr>
+      <w:tr>
+        <w:tc>
+          <w:tcPr>
+            <w:tcW w:type="dxa" w:w="2160"/>
+          </w:tcPr>
+          <w:p>
+            <w:r>
+              <w:t>GO:BP</w:t>
+            </w:r>
+          </w:p>
+        </w:tc>
+        <w:tc>
+          <w:tcPr>
+            <w:tcW w:type="dxa" w:w="2160"/>
+          </w:tcPr>
+          <w:p>
+            <w:r>
+              <w:t>adaptive immune response</w:t>
+            </w:r>
+          </w:p>
+        </w:tc>
+        <w:tc>
+          <w:tcPr>
+            <w:tcW w:type="dxa" w:w="2160"/>
+          </w:tcPr>
+          <w:p>
+            <w:r>
+              <w:t>9.5e-15</w:t>
+            </w:r>
+          </w:p>
+        </w:tc>
+        <w:tc>
+          <w:tcPr>
+            <w:tcW w:type="dxa" w:w="2160"/>
+          </w:tcPr>
+          <w:p>
+            <w:r>
+              <w:t>31</w:t>
+            </w:r>
+          </w:p>
+        </w:tc>
+      </w:tr>
+      <w:tr>
+        <w:tc>
+          <w:tcPr>
+            <w:tcW w:type="dxa" w:w="2160"/>
+          </w:tcPr>
+          <w:p>
+            <w:r>
+              <w:t>GO:BP</w:t>
+            </w:r>
+          </w:p>
+        </w:tc>
+        <w:tc>
+          <w:tcPr>
+            <w:tcW w:type="dxa" w:w="2160"/>
+          </w:tcPr>
+          <w:p>
+            <w:r>
+              <w:t>regulation of immune system process</w:t>
+            </w:r>
+          </w:p>
+        </w:tc>
+        <w:tc>
+          <w:tcPr>
+            <w:tcW w:type="dxa" w:w="2160"/>
+          </w:tcPr>
+          <w:p>
+            <w:r>
+              <w:t>1.2e-14</w:t>
+            </w:r>
+          </w:p>
+        </w:tc>
+        <w:tc>
+          <w:tcPr>
+            <w:tcW w:type="dxa" w:w="2160"/>
+          </w:tcPr>
+          <w:p>
+            <w:r>
+              <w:t>43</w:t>
+            </w:r>
+          </w:p>
+        </w:tc>
+      </w:tr>
+      <w:tr>
+        <w:tc>
+          <w:tcPr>
+            <w:tcW w:type="dxa" w:w="2160"/>
+          </w:tcPr>
+          <w:p>
+            <w:r>
+              <w:t>REAC</w:t>
+            </w:r>
+          </w:p>
+        </w:tc>
+        <w:tc>
+          <w:tcPr>
+            <w:tcW w:type="dxa" w:w="2160"/>
+          </w:tcPr>
+          <w:p>
+            <w:r>
+              <w:t>Adaptive Immune System</w:t>
+            </w:r>
+          </w:p>
+        </w:tc>
+        <w:tc>
+          <w:tcPr>
+            <w:tcW w:type="dxa" w:w="2160"/>
+          </w:tcPr>
+          <w:p>
+            <w:r>
+              <w:t>9.0e-13</w:t>
+            </w:r>
+          </w:p>
+        </w:tc>
+        <w:tc>
+          <w:tcPr>
+            <w:tcW w:type="dxa" w:w="2160"/>
+          </w:tcPr>
+          <w:p>
+            <w:r>
+              <w:t>29</w:t>
+            </w:r>
+          </w:p>
+        </w:tc>
+      </w:tr>
+    </w:tbl>
+    <w:p>
+      <w:pPr>
+        <w:spacing w:after="120"/>
+        <w:jc w:val="both"/>
+      </w:pPr>
+      <w:r>
+        <w:t>Two components appear: mitotic cell-cycle genes (TOP2A, MKI67, CDK1) that cultures express and tissues do not, and immune and complement genes that tissues contain and organoids lack. Removing either family alone leaves the attractor in place (Sections 4.6-4.7). Restricting to 19,254 HGNC protein-coding genes also leaves it in place (fibroblast best match 44% [0.35, 0.53] and 28% [0.20, 0.36]), so it is not a non-coding artefact. Our working hypothesis is that the attractor is the joint signature of proliferation and purity. It remains a candidate: a direct test needs organoid and matched primary tissue from the same donors, profiled together.</w:t>
       </w:r>
     </w:p>
     <w:p>
@@ -4199,7 +4875,7 @@
         <w:rPr>
           <w:b/>
         </w:rPr>
-        <w:t>Table 8. Tools genuinely used (results/tools_ledger.csv): 18 entries, 12 counting toward the gate after excluding infrastructure. Target of 40 not reached.</w:t>
+        <w:t>Table 9. Tools genuinely used (results/tools_ledger.csv): 20 entries, 14 counting toward the gate after excluding infrastructure. Target of 40 not reached.</w:t>
       </w:r>
     </w:p>
     <w:tbl>
@@ -4998,6 +5674,90 @@
           <w:p>
             <w:r>
               <w:t>src/geo_mcnemar.py (exact McNemar tests)</w:t>
+            </w:r>
+          </w:p>
+        </w:tc>
+        <w:tc>
+          <w:tcPr>
+            <w:tcW w:type="dxa" w:w="2160"/>
+          </w:tcPr>
+          <w:p>
+            <w:r>
+              <w:t>counts</w:t>
+            </w:r>
+          </w:p>
+        </w:tc>
+      </w:tr>
+      <w:tr>
+        <w:tc>
+          <w:tcPr>
+            <w:tcW w:type="dxa" w:w="2160"/>
+          </w:tcPr>
+          <w:p>
+            <w:r>
+              <w:t>g:Profiler g:GOSt API (GO, Reactome, KEGG)</w:t>
+            </w:r>
+          </w:p>
+        </w:tc>
+        <w:tc>
+          <w:tcPr>
+            <w:tcW w:type="dxa" w:w="2160"/>
+          </w:tcPr>
+          <w:p>
+            <w:r>
+              <w:t>web API/database</w:t>
+            </w:r>
+          </w:p>
+        </w:tc>
+        <w:tc>
+          <w:tcPr>
+            <w:tcW w:type="dxa" w:w="2160"/>
+          </w:tcPr>
+          <w:p>
+            <w:r>
+              <w:t>src/geo_attractor_genes.py (enrichment of attractor-driving genes)</w:t>
+            </w:r>
+          </w:p>
+        </w:tc>
+        <w:tc>
+          <w:tcPr>
+            <w:tcW w:type="dxa" w:w="2160"/>
+          </w:tcPr>
+          <w:p>
+            <w:r>
+              <w:t>counts</w:t>
+            </w:r>
+          </w:p>
+        </w:tc>
+      </w:tr>
+      <w:tr>
+        <w:tc>
+          <w:tcPr>
+            <w:tcW w:type="dxa" w:w="2160"/>
+          </w:tcPr>
+          <w:p>
+            <w:r>
+              <w:t>HGNC complete set (locus groups)</w:t>
+            </w:r>
+          </w:p>
+        </w:tc>
+        <w:tc>
+          <w:tcPr>
+            <w:tcW w:type="dxa" w:w="2160"/>
+          </w:tcPr>
+          <w:p>
+            <w:r>
+              <w:t>database</w:t>
+            </w:r>
+          </w:p>
+        </w:tc>
+        <w:tc>
+          <w:tcPr>
+            <w:tcW w:type="dxa" w:w="2160"/>
+          </w:tcPr>
+          <w:p>
+            <w:r>
+              <w:t>data/ref/hgnc_locus_groups.csv.gz; src/geo_fidelity_methods.py (protein-coding robustness)</w:t>
             </w:r>
           </w:p>
         </w:tc>
@@ -5055,6 +5815,24 @@
       </w:pPr>
       <w:r>
         <w:t>Karlsson M, et al. A single-cell type transcriptomics map of human tissues. Sci Adv 2021. https://www.proteinatlas.org</w:t>
+      </w:r>
+    </w:p>
+    <w:p>
+      <w:pPr>
+        <w:spacing w:after="120"/>
+        <w:jc w:val="both"/>
+      </w:pPr>
+      <w:r>
+        <w:t>Kolberg L, et al. g:Profiler - interoperable web service for functional enrichment analysis and gene identifier mapping (2023 update). Nucleic Acids Res 2023. https://biit.cs.ut.ee/gprofiler</w:t>
+      </w:r>
+    </w:p>
+    <w:p>
+      <w:pPr>
+        <w:spacing w:after="120"/>
+        <w:jc w:val="both"/>
+      </w:pPr>
+      <w:r>
+        <w:t>Seal RL, et al. Genenames.org: the HGNC resources in 2023. Nucleic Acids Res 2023. https://www.genenames.org</w:t>
       </w:r>
     </w:p>
     <w:p>

</xml_diff>

<commit_message>
Paper v6: 4.9 GEOparse sample-level audit (attractor retracted as general organoid property) + Enrichr/Reactome; Fisher eq; pdfinfo 15 pages
</commit_message>
<xml_diff>
--- a/paper/mega27-03-virtual-organoid-paper.docx
+++ b/paper/mega27-03-virtual-organoid-paper.docx
@@ -52,6 +52,15 @@
       </w:pPr>
       <w:r>
         <w:t>Negatives. Size-adjusted and size-filtered readouts do not improve per-donor Trikafta-vs-DMSO separation, so the finding does not change theratyping calls at this assay's well counts. Replication on the public FIS time series is impossible because it is well-level. Our best U-Net segmentation (512 px, tuned) reaches mAP@0.5 = 0.733 +/- 0.129 on the OrgaSegment eval split (published 0.76 +/- 0.12): below the state of the art, although the gap is within one standard deviation on 12 images.</w:t>
+      </w:r>
+    </w:p>
+    <w:p>
+      <w:pPr>
+        <w:spacing w:after="120"/>
+        <w:jc w:val="both"/>
+      </w:pPr>
+      <w:r>
+        <w:t>Fidelity. Scoring 151 organoid GEO series against GTEx, cultured fibroblasts are the most common best match. A GEOparse sample-level audit shows this 'culture-fibroblast attractor' comes mostly from non-organoid samples in organoid-titled series: on 45 strictly organoid series it falls to 9-29%. We retract it as a general organoid property.</w:t>
       </w:r>
     </w:p>
     <w:p>
@@ -4758,6 +4767,824 @@
     </w:p>
     <w:p>
       <w:pPr>
+        <w:pStyle w:val="Heading2"/>
+      </w:pPr>
+      <w:r>
+        <w:t>4.9 Sample-level audit and independent annotation: the attractor is mostly label contamination</w:t>
+      </w:r>
+    </w:p>
+    <w:p>
+      <w:pPr>
+        <w:spacing w:after="120"/>
+        <w:jc w:val="both"/>
+      </w:pPr>
+      <w:r>
+        <w:t>Series-level text says a study is about organoids; it does not say every profiled sample is an organoid. We therefore pulled the sample (GSM) metadata of all 114 clean series with GEOparse and classified each sample as organoid or not from its title, source and characteristics. Only 45 series have every sample annotated as organoid; 59 have no organoid-annotated sample at all (for example GSE343459 profiles fibroblasts isolated from skin organoids, and GSE287925 profiles LNCaP cells in 2D). We compared the fibroblast-best fraction between the strict and the no-organoid series with Fisher's exact test:</w:t>
+      </w:r>
+    </w:p>
+    <w:p>
+      <w:pPr>
+        <w:jc w:val="center"/>
+      </w:pPr>
+      <w:r>
+        <w:rPr>
+          <w:i/>
+        </w:rPr>
+        <w:t>p = sum_{x : P(x) &lt;= P(a)} C(K, x) C(N - K, n - x) / C(N, n)</w:t>
+      </w:r>
+      <w:r>
+        <w:tab/>
+        <w:tab/>
+        <w:t>(17)</w:t>
+      </w:r>
+    </w:p>
+    <w:p>
+      <w:r>
+        <w:rPr>
+          <w:b/>
+        </w:rPr>
+        <w:t>Table 9. Attractor on strict organoid series vs series without organoid samples (results/geo_fidelity_strict.json).</w:t>
+      </w:r>
+    </w:p>
+    <w:tbl>
+      <w:tblPr>
+        <w:tblStyle w:val="LightGrid-Accent1"/>
+        <w:tblW w:type="auto" w:w="0"/>
+        <w:tblLook w:firstColumn="1" w:firstRow="1" w:lastColumn="0" w:lastRow="0" w:noHBand="0" w:noVBand="1" w:val="04A0"/>
+      </w:tblPr>
+      <w:tblGrid>
+        <w:gridCol w:w="1440"/>
+        <w:gridCol w:w="1440"/>
+        <w:gridCol w:w="1440"/>
+        <w:gridCol w:w="1440"/>
+        <w:gridCol w:w="1440"/>
+        <w:gridCol w:w="1440"/>
+      </w:tblGrid>
+      <w:tr>
+        <w:tc>
+          <w:tcPr>
+            <w:tcW w:type="dxa" w:w="1440"/>
+          </w:tcPr>
+          <w:p>
+            <w:r>
+              <w:t>method</w:t>
+            </w:r>
+          </w:p>
+        </w:tc>
+        <w:tc>
+          <w:tcPr>
+            <w:tcW w:type="dxa" w:w="1440"/>
+          </w:tcPr>
+          <w:p>
+            <w:r>
+              <w:t>strict n</w:t>
+            </w:r>
+          </w:p>
+        </w:tc>
+        <w:tc>
+          <w:tcPr>
+            <w:tcW w:type="dxa" w:w="1440"/>
+          </w:tcPr>
+          <w:p>
+            <w:r>
+              <w:t>strict top-1</w:t>
+            </w:r>
+          </w:p>
+        </w:tc>
+        <w:tc>
+          <w:tcPr>
+            <w:tcW w:type="dxa" w:w="1440"/>
+          </w:tcPr>
+          <w:p>
+            <w:r>
+              <w:t>strict fibroblast-best [95% CI]</w:t>
+            </w:r>
+          </w:p>
+        </w:tc>
+        <w:tc>
+          <w:tcPr>
+            <w:tcW w:type="dxa" w:w="1440"/>
+          </w:tcPr>
+          <w:p>
+            <w:r>
+              <w:t>no-organoid fibroblast-best</w:t>
+            </w:r>
+          </w:p>
+        </w:tc>
+        <w:tc>
+          <w:tcPr>
+            <w:tcW w:type="dxa" w:w="1440"/>
+          </w:tcPr>
+          <w:p>
+            <w:r>
+              <w:t>Fisher p</w:t>
+            </w:r>
+          </w:p>
+        </w:tc>
+      </w:tr>
+      <w:tr>
+        <w:tc>
+          <w:tcPr>
+            <w:tcW w:type="dxa" w:w="1440"/>
+          </w:tcPr>
+          <w:p>
+            <w:r>
+              <w:t>CENT</w:t>
+            </w:r>
+          </w:p>
+        </w:tc>
+        <w:tc>
+          <w:tcPr>
+            <w:tcW w:type="dxa" w:w="1440"/>
+          </w:tcPr>
+          <w:p>
+            <w:r>
+              <w:t>45</w:t>
+            </w:r>
+          </w:p>
+        </w:tc>
+        <w:tc>
+          <w:tcPr>
+            <w:tcW w:type="dxa" w:w="1440"/>
+          </w:tcPr>
+          <w:p>
+            <w:r>
+              <w:t>0.33</w:t>
+            </w:r>
+          </w:p>
+        </w:tc>
+        <w:tc>
+          <w:tcPr>
+            <w:tcW w:type="dxa" w:w="1440"/>
+          </w:tcPr>
+          <w:p>
+            <w:r>
+              <w:t>0.24 [0.13, 0.38]</w:t>
+            </w:r>
+          </w:p>
+        </w:tc>
+        <w:tc>
+          <w:tcPr>
+            <w:tcW w:type="dxa" w:w="1440"/>
+          </w:tcPr>
+          <w:p>
+            <w:r>
+              <w:t>0.47</w:t>
+            </w:r>
+          </w:p>
+        </w:tc>
+        <w:tc>
+          <w:tcPr>
+            <w:tcW w:type="dxa" w:w="1440"/>
+          </w:tcPr>
+          <w:p>
+            <w:r>
+              <w:t>0.025</w:t>
+            </w:r>
+          </w:p>
+        </w:tc>
+      </w:tr>
+      <w:tr>
+        <w:tc>
+          <w:tcPr>
+            <w:tcW w:type="dxa" w:w="1440"/>
+          </w:tcPr>
+          <w:p>
+            <w:r>
+              <w:t>CENT_NOCULT</w:t>
+            </w:r>
+          </w:p>
+        </w:tc>
+        <w:tc>
+          <w:tcPr>
+            <w:tcW w:type="dxa" w:w="1440"/>
+          </w:tcPr>
+          <w:p>
+            <w:r>
+              <w:t>45</w:t>
+            </w:r>
+          </w:p>
+        </w:tc>
+        <w:tc>
+          <w:tcPr>
+            <w:tcW w:type="dxa" w:w="1440"/>
+          </w:tcPr>
+          <w:p>
+            <w:r>
+              <w:t>0.33</w:t>
+            </w:r>
+          </w:p>
+        </w:tc>
+        <w:tc>
+          <w:tcPr>
+            <w:tcW w:type="dxa" w:w="1440"/>
+          </w:tcPr>
+          <w:p>
+            <w:r>
+              <w:t>0.29 [0.18, 0.42]</w:t>
+            </w:r>
+          </w:p>
+        </w:tc>
+        <w:tc>
+          <w:tcPr>
+            <w:tcW w:type="dxa" w:w="1440"/>
+          </w:tcPr>
+          <w:p>
+            <w:r>
+              <w:t>0.55</w:t>
+            </w:r>
+          </w:p>
+        </w:tc>
+        <w:tc>
+          <w:tcPr>
+            <w:tcW w:type="dxa" w:w="1440"/>
+          </w:tcPr>
+          <w:p>
+            <w:r>
+              <w:t>0.0095</w:t>
+            </w:r>
+          </w:p>
+        </w:tc>
+      </w:tr>
+      <w:tr>
+        <w:tc>
+          <w:tcPr>
+            <w:tcW w:type="dxa" w:w="1440"/>
+          </w:tcPr>
+          <w:p>
+            <w:r>
+              <w:t>CENT_NONPAR</w:t>
+            </w:r>
+          </w:p>
+        </w:tc>
+        <w:tc>
+          <w:tcPr>
+            <w:tcW w:type="dxa" w:w="1440"/>
+          </w:tcPr>
+          <w:p>
+            <w:r>
+              <w:t>45</w:t>
+            </w:r>
+          </w:p>
+        </w:tc>
+        <w:tc>
+          <w:tcPr>
+            <w:tcW w:type="dxa" w:w="1440"/>
+          </w:tcPr>
+          <w:p>
+            <w:r>
+              <w:t>0.49</w:t>
+            </w:r>
+          </w:p>
+        </w:tc>
+        <w:tc>
+          <w:tcPr>
+            <w:tcW w:type="dxa" w:w="1440"/>
+          </w:tcPr>
+          <w:p>
+            <w:r>
+              <w:t>0.20 [0.09, 0.33]</w:t>
+            </w:r>
+          </w:p>
+        </w:tc>
+        <w:tc>
+          <w:tcPr>
+            <w:tcW w:type="dxa" w:w="1440"/>
+          </w:tcPr>
+          <w:p>
+            <w:r>
+              <w:t>0.52</w:t>
+            </w:r>
+          </w:p>
+        </w:tc>
+        <w:tc>
+          <w:tcPr>
+            <w:tcW w:type="dxa" w:w="1440"/>
+          </w:tcPr>
+          <w:p>
+            <w:r>
+              <w:t>0.0011</w:t>
+            </w:r>
+          </w:p>
+        </w:tc>
+      </w:tr>
+      <w:tr>
+        <w:tc>
+          <w:tcPr>
+            <w:tcW w:type="dxa" w:w="1440"/>
+          </w:tcPr>
+          <w:p>
+            <w:r>
+              <w:t>CENT_PARONLY</w:t>
+            </w:r>
+          </w:p>
+        </w:tc>
+        <w:tc>
+          <w:tcPr>
+            <w:tcW w:type="dxa" w:w="1440"/>
+          </w:tcPr>
+          <w:p>
+            <w:r>
+              <w:t>45</w:t>
+            </w:r>
+          </w:p>
+        </w:tc>
+        <w:tc>
+          <w:tcPr>
+            <w:tcW w:type="dxa" w:w="1440"/>
+          </w:tcPr>
+          <w:p>
+            <w:r>
+              <w:t>0.56</w:t>
+            </w:r>
+          </w:p>
+        </w:tc>
+        <w:tc>
+          <w:tcPr>
+            <w:tcW w:type="dxa" w:w="1440"/>
+          </w:tcPr>
+          <w:p>
+            <w:r>
+              <w:t>0.11 [0.02, 0.20]</w:t>
+            </w:r>
+          </w:p>
+        </w:tc>
+        <w:tc>
+          <w:tcPr>
+            <w:tcW w:type="dxa" w:w="1440"/>
+          </w:tcPr>
+          <w:p>
+            <w:r>
+              <w:t>0.29</w:t>
+            </w:r>
+          </w:p>
+        </w:tc>
+        <w:tc>
+          <w:tcPr>
+            <w:tcW w:type="dxa" w:w="1440"/>
+          </w:tcPr>
+          <w:p>
+            <w:r>
+              <w:t>0.03</w:t>
+            </w:r>
+          </w:p>
+        </w:tc>
+      </w:tr>
+      <w:tr>
+        <w:tc>
+          <w:tcPr>
+            <w:tcW w:type="dxa" w:w="1440"/>
+          </w:tcPr>
+          <w:p>
+            <w:r>
+              <w:t>CENT_PC</w:t>
+            </w:r>
+          </w:p>
+        </w:tc>
+        <w:tc>
+          <w:tcPr>
+            <w:tcW w:type="dxa" w:w="1440"/>
+          </w:tcPr>
+          <w:p>
+            <w:r>
+              <w:t>45</w:t>
+            </w:r>
+          </w:p>
+        </w:tc>
+        <w:tc>
+          <w:tcPr>
+            <w:tcW w:type="dxa" w:w="1440"/>
+          </w:tcPr>
+          <w:p>
+            <w:r>
+              <w:t>0.42</w:t>
+            </w:r>
+          </w:p>
+        </w:tc>
+        <w:tc>
+          <w:tcPr>
+            <w:tcW w:type="dxa" w:w="1440"/>
+          </w:tcPr>
+          <w:p>
+            <w:r>
+              <w:t>0.22 [0.11, 0.36]</w:t>
+            </w:r>
+          </w:p>
+        </w:tc>
+        <w:tc>
+          <w:tcPr>
+            <w:tcW w:type="dxa" w:w="1440"/>
+          </w:tcPr>
+          <w:p>
+            <w:r>
+              <w:t>0.33</w:t>
+            </w:r>
+          </w:p>
+        </w:tc>
+        <w:tc>
+          <w:tcPr>
+            <w:tcW w:type="dxa" w:w="1440"/>
+          </w:tcPr>
+          <w:p>
+            <w:r>
+              <w:t>0.27</w:t>
+            </w:r>
+          </w:p>
+        </w:tc>
+      </w:tr>
+      <w:tr>
+        <w:tc>
+          <w:tcPr>
+            <w:tcW w:type="dxa" w:w="1440"/>
+          </w:tcPr>
+          <w:p>
+            <w:r>
+              <w:t>S3000</w:t>
+            </w:r>
+          </w:p>
+        </w:tc>
+        <w:tc>
+          <w:tcPr>
+            <w:tcW w:type="dxa" w:w="1440"/>
+          </w:tcPr>
+          <w:p>
+            <w:r>
+              <w:t>45</w:t>
+            </w:r>
+          </w:p>
+        </w:tc>
+        <w:tc>
+          <w:tcPr>
+            <w:tcW w:type="dxa" w:w="1440"/>
+          </w:tcPr>
+          <w:p>
+            <w:r>
+              <w:t>0.31</w:t>
+            </w:r>
+          </w:p>
+        </w:tc>
+        <w:tc>
+          <w:tcPr>
+            <w:tcW w:type="dxa" w:w="1440"/>
+          </w:tcPr>
+          <w:p>
+            <w:r>
+              <w:t>0.13 [0.04, 0.24]</w:t>
+            </w:r>
+          </w:p>
+        </w:tc>
+        <w:tc>
+          <w:tcPr>
+            <w:tcW w:type="dxa" w:w="1440"/>
+          </w:tcPr>
+          <w:p>
+            <w:r>
+              <w:t>0.31</w:t>
+            </w:r>
+          </w:p>
+        </w:tc>
+        <w:tc>
+          <w:tcPr>
+            <w:tcW w:type="dxa" w:w="1440"/>
+          </w:tcPr>
+          <w:p>
+            <w:r>
+              <w:t>0.038</w:t>
+            </w:r>
+          </w:p>
+        </w:tc>
+      </w:tr>
+      <w:tr>
+        <w:tc>
+          <w:tcPr>
+            <w:tcW w:type="dxa" w:w="1440"/>
+          </w:tcPr>
+          <w:p>
+            <w:r>
+              <w:t>SALL</w:t>
+            </w:r>
+          </w:p>
+        </w:tc>
+        <w:tc>
+          <w:tcPr>
+            <w:tcW w:type="dxa" w:w="1440"/>
+          </w:tcPr>
+          <w:p>
+            <w:r>
+              <w:t>45</w:t>
+            </w:r>
+          </w:p>
+        </w:tc>
+        <w:tc>
+          <w:tcPr>
+            <w:tcW w:type="dxa" w:w="1440"/>
+          </w:tcPr>
+          <w:p>
+            <w:r>
+              <w:t>0.42</w:t>
+            </w:r>
+          </w:p>
+        </w:tc>
+        <w:tc>
+          <w:tcPr>
+            <w:tcW w:type="dxa" w:w="1440"/>
+          </w:tcPr>
+          <w:p>
+            <w:r>
+              <w:t>0.09 [0.02, 0.18]</w:t>
+            </w:r>
+          </w:p>
+        </w:tc>
+        <w:tc>
+          <w:tcPr>
+            <w:tcW w:type="dxa" w:w="1440"/>
+          </w:tcPr>
+          <w:p>
+            <w:r>
+              <w:t>0.38</w:t>
+            </w:r>
+          </w:p>
+        </w:tc>
+        <w:tc>
+          <w:tcPr>
+            <w:tcW w:type="dxa" w:w="1440"/>
+          </w:tcPr>
+          <w:p>
+            <w:r>
+              <w:t>0.0011</w:t>
+            </w:r>
+          </w:p>
+        </w:tc>
+      </w:tr>
+      <w:tr>
+        <w:tc>
+          <w:tcPr>
+            <w:tcW w:type="dxa" w:w="1440"/>
+          </w:tcPr>
+          <w:p>
+            <w:r>
+              <w:t>SALL_NOCULT</w:t>
+            </w:r>
+          </w:p>
+        </w:tc>
+        <w:tc>
+          <w:tcPr>
+            <w:tcW w:type="dxa" w:w="1440"/>
+          </w:tcPr>
+          <w:p>
+            <w:r>
+              <w:t>45</w:t>
+            </w:r>
+          </w:p>
+        </w:tc>
+        <w:tc>
+          <w:tcPr>
+            <w:tcW w:type="dxa" w:w="1440"/>
+          </w:tcPr>
+          <w:p>
+            <w:r>
+              <w:t>0.42</w:t>
+            </w:r>
+          </w:p>
+        </w:tc>
+        <w:tc>
+          <w:tcPr>
+            <w:tcW w:type="dxa" w:w="1440"/>
+          </w:tcPr>
+          <w:p>
+            <w:r>
+              <w:t>0.09 [0.02, 0.18]</w:t>
+            </w:r>
+          </w:p>
+        </w:tc>
+        <w:tc>
+          <w:tcPr>
+            <w:tcW w:type="dxa" w:w="1440"/>
+          </w:tcPr>
+          <w:p>
+            <w:r>
+              <w:t>0.36</w:t>
+            </w:r>
+          </w:p>
+        </w:tc>
+        <w:tc>
+          <w:tcPr>
+            <w:tcW w:type="dxa" w:w="1440"/>
+          </w:tcPr>
+          <w:p>
+            <w:r>
+              <w:t>0.0012</w:t>
+            </w:r>
+          </w:p>
+        </w:tc>
+      </w:tr>
+      <w:tr>
+        <w:tc>
+          <w:tcPr>
+            <w:tcW w:type="dxa" w:w="1440"/>
+          </w:tcPr>
+          <w:p>
+            <w:r>
+              <w:t>SALL_NONPAR</w:t>
+            </w:r>
+          </w:p>
+        </w:tc>
+        <w:tc>
+          <w:tcPr>
+            <w:tcW w:type="dxa" w:w="1440"/>
+          </w:tcPr>
+          <w:p>
+            <w:r>
+              <w:t>45</w:t>
+            </w:r>
+          </w:p>
+        </w:tc>
+        <w:tc>
+          <w:tcPr>
+            <w:tcW w:type="dxa" w:w="1440"/>
+          </w:tcPr>
+          <w:p>
+            <w:r>
+              <w:t>0.56</w:t>
+            </w:r>
+          </w:p>
+        </w:tc>
+        <w:tc>
+          <w:tcPr>
+            <w:tcW w:type="dxa" w:w="1440"/>
+          </w:tcPr>
+          <w:p>
+            <w:r>
+              <w:t>0.09 [0.02, 0.18]</w:t>
+            </w:r>
+          </w:p>
+        </w:tc>
+        <w:tc>
+          <w:tcPr>
+            <w:tcW w:type="dxa" w:w="1440"/>
+          </w:tcPr>
+          <w:p>
+            <w:r>
+              <w:t>0.28</w:t>
+            </w:r>
+          </w:p>
+        </w:tc>
+        <w:tc>
+          <w:tcPr>
+            <w:tcW w:type="dxa" w:w="1440"/>
+          </w:tcPr>
+          <w:p>
+            <w:r>
+              <w:t>0.023</w:t>
+            </w:r>
+          </w:p>
+        </w:tc>
+      </w:tr>
+      <w:tr>
+        <w:tc>
+          <w:tcPr>
+            <w:tcW w:type="dxa" w:w="1440"/>
+          </w:tcPr>
+          <w:p>
+            <w:r>
+              <w:t>SALL_PARONLY</w:t>
+            </w:r>
+          </w:p>
+        </w:tc>
+        <w:tc>
+          <w:tcPr>
+            <w:tcW w:type="dxa" w:w="1440"/>
+          </w:tcPr>
+          <w:p>
+            <w:r>
+              <w:t>45</w:t>
+            </w:r>
+          </w:p>
+        </w:tc>
+        <w:tc>
+          <w:tcPr>
+            <w:tcW w:type="dxa" w:w="1440"/>
+          </w:tcPr>
+          <w:p>
+            <w:r>
+              <w:t>0.53</w:t>
+            </w:r>
+          </w:p>
+        </w:tc>
+        <w:tc>
+          <w:tcPr>
+            <w:tcW w:type="dxa" w:w="1440"/>
+          </w:tcPr>
+          <w:p>
+            <w:r>
+              <w:t>0.11 [0.02, 0.20]</w:t>
+            </w:r>
+          </w:p>
+        </w:tc>
+        <w:tc>
+          <w:tcPr>
+            <w:tcW w:type="dxa" w:w="1440"/>
+          </w:tcPr>
+          <w:p>
+            <w:r>
+              <w:t>0.41</w:t>
+            </w:r>
+          </w:p>
+        </w:tc>
+        <w:tc>
+          <w:tcPr>
+            <w:tcW w:type="dxa" w:w="1440"/>
+          </w:tcPr>
+          <w:p>
+            <w:r>
+              <w:t>0.00081</w:t>
+            </w:r>
+          </w:p>
+        </w:tc>
+      </w:tr>
+      <w:tr>
+        <w:tc>
+          <w:tcPr>
+            <w:tcW w:type="dxa" w:w="1440"/>
+          </w:tcPr>
+          <w:p>
+            <w:r>
+              <w:t>SALL_PC</w:t>
+            </w:r>
+          </w:p>
+        </w:tc>
+        <w:tc>
+          <w:tcPr>
+            <w:tcW w:type="dxa" w:w="1440"/>
+          </w:tcPr>
+          <w:p>
+            <w:r>
+              <w:t>45</w:t>
+            </w:r>
+          </w:p>
+        </w:tc>
+        <w:tc>
+          <w:tcPr>
+            <w:tcW w:type="dxa" w:w="1440"/>
+          </w:tcPr>
+          <w:p>
+            <w:r>
+              <w:t>0.44</w:t>
+            </w:r>
+          </w:p>
+        </w:tc>
+        <w:tc>
+          <w:tcPr>
+            <w:tcW w:type="dxa" w:w="1440"/>
+          </w:tcPr>
+          <w:p>
+            <w:r>
+              <w:t>0.22 [0.11, 0.36]</w:t>
+            </w:r>
+          </w:p>
+        </w:tc>
+        <w:tc>
+          <w:tcPr>
+            <w:tcW w:type="dxa" w:w="1440"/>
+          </w:tcPr>
+          <w:p>
+            <w:r>
+              <w:t>0.62</w:t>
+            </w:r>
+          </w:p>
+        </w:tc>
+        <w:tc>
+          <w:tcPr>
+            <w:tcW w:type="dxa" w:w="1440"/>
+          </w:tcPr>
+          <w:p>
+            <w:r>
+              <w:t>6.1e-05</w:t>
+            </w:r>
+          </w:p>
+        </w:tc>
+      </w:tr>
+    </w:tbl>
+    <w:p>
+      <w:pPr>
+        <w:spacing w:after="120"/>
+        <w:jc w:val="both"/>
+      </w:pPr>
+      <w:r>
+        <w:t>On the strict subset the attractor shrinks to 0.09-0.29 of series (vs 0.28-0.62); the difference is significant in 10 of 11 method variants. Much of the attractor therefore came from non-organoid samples inside organoid-titled series, not from organoids. We retract it as a general property of organoids; it persists only in a minority of strict series.</w:t>
+      </w:r>
+    </w:p>
+    <w:p>
+      <w:pPr>
+        <w:spacing w:after="120"/>
+        <w:jc w:val="both"/>
+      </w:pPr>
+      <w:r>
+        <w:t>Independent annotation of the top 200 driver genes with Enrichr and the Reactome AnalysisService reproduces the g:Profiler picture: Hallmark G2-M Checkpoint (q = 2.5e-33), CellMarker 'Cycling Basal Cell Trachea Mouse' (q = 4e-60), and Reactome 'Classical antibody-mediated complement activation' (FDR = 1.4e-14) together with mitotic cell cycle. The driver genes describe what makes a profile look like cultured fibroblasts (proliferation, missing immune and complement programs); they are not an organoid discovery.</w:t>
+      </w:r>
+    </w:p>
+    <w:p>
+      <w:pPr>
         <w:pStyle w:val="Heading1"/>
       </w:pPr>
       <w:r>
@@ -4829,6 +5656,15 @@
     </w:p>
     <w:p>
       <w:pPr>
+        <w:spacing w:after="120"/>
+        <w:jc w:val="both"/>
+      </w:pPr>
+      <w:r>
+        <w:t>- Fidelity: the culture-fibroblast attractor is RETRACTED as a general organoid property: on 45 series whose samples are all organoids it shrinks to 9-29% of series (Section 4.9).</w:t>
+      </w:r>
+    </w:p>
+    <w:p>
+      <w:pPr>
         <w:pStyle w:val="Heading1"/>
       </w:pPr>
       <w:r>
@@ -4875,7 +5711,7 @@
         <w:rPr>
           <w:b/>
         </w:rPr>
-        <w:t>Table 9. Tools genuinely used (results/tools_ledger.csv): 20 entries, 14 counting toward the gate after excluding infrastructure. Target of 40 not reached.</w:t>
+        <w:t>Table 10. Tools genuinely used (results/tools_ledger.csv): 23 entries, 17 counting toward the gate after excluding infrastructure. Target of 40 not reached.</w:t>
       </w:r>
     </w:p>
     <w:tbl>
@@ -5758,6 +6594,132 @@
           <w:p>
             <w:r>
               <w:t>data/ref/hgnc_locus_groups.csv.gz; src/geo_fidelity_methods.py (protein-coding robustness)</w:t>
+            </w:r>
+          </w:p>
+        </w:tc>
+        <w:tc>
+          <w:tcPr>
+            <w:tcW w:type="dxa" w:w="2160"/>
+          </w:tcPr>
+          <w:p>
+            <w:r>
+              <w:t>counts</w:t>
+            </w:r>
+          </w:p>
+        </w:tc>
+      </w:tr>
+      <w:tr>
+        <w:tc>
+          <w:tcPr>
+            <w:tcW w:type="dxa" w:w="2160"/>
+          </w:tcPr>
+          <w:p>
+            <w:r>
+              <w:t>GEOparse</w:t>
+            </w:r>
+          </w:p>
+        </w:tc>
+        <w:tc>
+          <w:tcPr>
+            <w:tcW w:type="dxa" w:w="2160"/>
+          </w:tcPr>
+          <w:p>
+            <w:r>
+              <w:t>library</w:t>
+            </w:r>
+          </w:p>
+        </w:tc>
+        <w:tc>
+          <w:tcPr>
+            <w:tcW w:type="dxa" w:w="2160"/>
+          </w:tcPr>
+          <w:p>
+            <w:r>
+              <w:t>src/geo_sample_meta.py</w:t>
+            </w:r>
+          </w:p>
+        </w:tc>
+        <w:tc>
+          <w:tcPr>
+            <w:tcW w:type="dxa" w:w="2160"/>
+          </w:tcPr>
+          <w:p>
+            <w:r>
+              <w:t>counts</w:t>
+            </w:r>
+          </w:p>
+        </w:tc>
+      </w:tr>
+      <w:tr>
+        <w:tc>
+          <w:tcPr>
+            <w:tcW w:type="dxa" w:w="2160"/>
+          </w:tcPr>
+          <w:p>
+            <w:r>
+              <w:t>Enrichr (Hallmark/CellMarker/PanglaoDB libraries)</w:t>
+            </w:r>
+          </w:p>
+        </w:tc>
+        <w:tc>
+          <w:tcPr>
+            <w:tcW w:type="dxa" w:w="2160"/>
+          </w:tcPr>
+          <w:p>
+            <w:r>
+              <w:t>service</w:t>
+            </w:r>
+          </w:p>
+        </w:tc>
+        <w:tc>
+          <w:tcPr>
+            <w:tcW w:type="dxa" w:w="2160"/>
+          </w:tcPr>
+          <w:p>
+            <w:r>
+              <w:t>src/attractor_enrichr_reactome.py</w:t>
+            </w:r>
+          </w:p>
+        </w:tc>
+        <w:tc>
+          <w:tcPr>
+            <w:tcW w:type="dxa" w:w="2160"/>
+          </w:tcPr>
+          <w:p>
+            <w:r>
+              <w:t>counts</w:t>
+            </w:r>
+          </w:p>
+        </w:tc>
+      </w:tr>
+      <w:tr>
+        <w:tc>
+          <w:tcPr>
+            <w:tcW w:type="dxa" w:w="2160"/>
+          </w:tcPr>
+          <w:p>
+            <w:r>
+              <w:t>Reactome AnalysisService</w:t>
+            </w:r>
+          </w:p>
+        </w:tc>
+        <w:tc>
+          <w:tcPr>
+            <w:tcW w:type="dxa" w:w="2160"/>
+          </w:tcPr>
+          <w:p>
+            <w:r>
+              <w:t>service</w:t>
+            </w:r>
+          </w:p>
+        </w:tc>
+        <w:tc>
+          <w:tcPr>
+            <w:tcW w:type="dxa" w:w="2160"/>
+          </w:tcPr>
+          <w:p>
+            <w:r>
+              <w:t>src/attractor_enrichr_reactome.py</w:t>
             </w:r>
           </w:p>
         </w:tc>
@@ -5815,6 +6777,33 @@
       </w:pPr>
       <w:r>
         <w:t>Karlsson M, et al. A single-cell type transcriptomics map of human tissues. Sci Adv 2021. https://www.proteinatlas.org</w:t>
+      </w:r>
+    </w:p>
+    <w:p>
+      <w:pPr>
+        <w:spacing w:after="120"/>
+        <w:jc w:val="both"/>
+      </w:pPr>
+      <w:r>
+        <w:t>Kuleshov MV, et al. Enrichr: a comprehensive gene set enrichment analysis web server 2016 update. Nucleic Acids Res 2016.</w:t>
+      </w:r>
+    </w:p>
+    <w:p>
+      <w:pPr>
+        <w:spacing w:after="120"/>
+        <w:jc w:val="both"/>
+      </w:pPr>
+      <w:r>
+        <w:t>Milacic M, et al. The Reactome Pathway Knowledgebase 2024. Nucleic Acids Res 2024.</w:t>
+      </w:r>
+    </w:p>
+    <w:p>
+      <w:pPr>
+        <w:spacing w:after="120"/>
+        <w:jc w:val="both"/>
+      </w:pPr>
+      <w:r>
+        <w:t>Gumienny R. GEOparse: Python library to access Gene Expression Omnibus. https://github.com/guma44/GEOparse</w:t>
       </w:r>
     </w:p>
     <w:p>

</xml_diff>

<commit_message>
Paper v7: 4.10 strict-subset organ fidelity, deficits (STRING/PanglaoDB), protocol CMH; 19 equations; pdfinfo 16 pages
</commit_message>
<xml_diff>
--- a/paper/mega27-03-virtual-organoid-paper.docx
+++ b/paper/mega27-03-virtual-organoid-paper.docx
@@ -5585,6 +5585,490 @@
     </w:p>
     <w:p>
       <w:pPr>
+        <w:pStyle w:val="Heading2"/>
+      </w:pPr>
+      <w:r>
+        <w:t>4.10 Which organoids are faithful? Organ, deficits and protocol on the strict subset</w:t>
+      </w:r>
+    </w:p>
+    <w:p>
+      <w:r>
+        <w:rPr>
+          <w:b/>
+        </w:rPr>
+        <w:t>Table 10. Organ recovery on the 45 strictly organoid series (SALL_PARONLY; results/strict_organ_recovery.csv).</w:t>
+      </w:r>
+    </w:p>
+    <w:tbl>
+      <w:tblPr>
+        <w:tblStyle w:val="LightGrid-Accent1"/>
+        <w:tblW w:type="auto" w:w="0"/>
+        <w:tblLook w:firstColumn="1" w:firstRow="1" w:lastColumn="0" w:lastRow="0" w:noHBand="0" w:noVBand="1" w:val="04A0"/>
+      </w:tblPr>
+      <w:tblGrid>
+        <w:gridCol w:w="2160"/>
+        <w:gridCol w:w="2160"/>
+        <w:gridCol w:w="2160"/>
+        <w:gridCol w:w="2160"/>
+      </w:tblGrid>
+      <w:tr>
+        <w:tc>
+          <w:tcPr>
+            <w:tcW w:type="dxa" w:w="2160"/>
+          </w:tcPr>
+          <w:p>
+            <w:r>
+              <w:t>labelled organ</w:t>
+            </w:r>
+          </w:p>
+        </w:tc>
+        <w:tc>
+          <w:tcPr>
+            <w:tcW w:type="dxa" w:w="2160"/>
+          </w:tcPr>
+          <w:p>
+            <w:r>
+              <w:t>strict series</w:t>
+            </w:r>
+          </w:p>
+        </w:tc>
+        <w:tc>
+          <w:tcPr>
+            <w:tcW w:type="dxa" w:w="2160"/>
+          </w:tcPr>
+          <w:p>
+            <w:r>
+              <w:t>top-1 recovery</w:t>
+            </w:r>
+          </w:p>
+        </w:tc>
+        <w:tc>
+          <w:tcPr>
+            <w:tcW w:type="dxa" w:w="2160"/>
+          </w:tcPr>
+          <w:p>
+            <w:r>
+              <w:t>median rank of own tissue</w:t>
+            </w:r>
+          </w:p>
+        </w:tc>
+      </w:tr>
+      <w:tr>
+        <w:tc>
+          <w:tcPr>
+            <w:tcW w:type="dxa" w:w="2160"/>
+          </w:tcPr>
+          <w:p>
+            <w:r>
+              <w:t>Colon - Transverse</w:t>
+            </w:r>
+          </w:p>
+        </w:tc>
+        <w:tc>
+          <w:tcPr>
+            <w:tcW w:type="dxa" w:w="2160"/>
+          </w:tcPr>
+          <w:p>
+            <w:r>
+              <w:t>19</w:t>
+            </w:r>
+          </w:p>
+        </w:tc>
+        <w:tc>
+          <w:tcPr>
+            <w:tcW w:type="dxa" w:w="2160"/>
+          </w:tcPr>
+          <w:p>
+            <w:r>
+              <w:t>0.84</w:t>
+            </w:r>
+          </w:p>
+        </w:tc>
+        <w:tc>
+          <w:tcPr>
+            <w:tcW w:type="dxa" w:w="2160"/>
+          </w:tcPr>
+          <w:p>
+            <w:r>
+              <w:t>1</w:t>
+            </w:r>
+          </w:p>
+        </w:tc>
+      </w:tr>
+      <w:tr>
+        <w:tc>
+          <w:tcPr>
+            <w:tcW w:type="dxa" w:w="2160"/>
+          </w:tcPr>
+          <w:p>
+            <w:r>
+              <w:t>Brain - Cortex</w:t>
+            </w:r>
+          </w:p>
+        </w:tc>
+        <w:tc>
+          <w:tcPr>
+            <w:tcW w:type="dxa" w:w="2160"/>
+          </w:tcPr>
+          <w:p>
+            <w:r>
+              <w:t>9</w:t>
+            </w:r>
+          </w:p>
+        </w:tc>
+        <w:tc>
+          <w:tcPr>
+            <w:tcW w:type="dxa" w:w="2160"/>
+          </w:tcPr>
+          <w:p>
+            <w:r>
+              <w:t>0.78</w:t>
+            </w:r>
+          </w:p>
+        </w:tc>
+        <w:tc>
+          <w:tcPr>
+            <w:tcW w:type="dxa" w:w="2160"/>
+          </w:tcPr>
+          <w:p>
+            <w:r>
+              <w:t>1</w:t>
+            </w:r>
+          </w:p>
+        </w:tc>
+      </w:tr>
+      <w:tr>
+        <w:tc>
+          <w:tcPr>
+            <w:tcW w:type="dxa" w:w="2160"/>
+          </w:tcPr>
+          <w:p>
+            <w:r>
+              <w:t>Liver</w:t>
+            </w:r>
+          </w:p>
+        </w:tc>
+        <w:tc>
+          <w:tcPr>
+            <w:tcW w:type="dxa" w:w="2160"/>
+          </w:tcPr>
+          <w:p>
+            <w:r>
+              <w:t>6</w:t>
+            </w:r>
+          </w:p>
+        </w:tc>
+        <w:tc>
+          <w:tcPr>
+            <w:tcW w:type="dxa" w:w="2160"/>
+          </w:tcPr>
+          <w:p>
+            <w:r>
+              <w:t>0.17</w:t>
+            </w:r>
+          </w:p>
+        </w:tc>
+        <w:tc>
+          <w:tcPr>
+            <w:tcW w:type="dxa" w:w="2160"/>
+          </w:tcPr>
+          <w:p>
+            <w:r>
+              <w:t>22</w:t>
+            </w:r>
+          </w:p>
+        </w:tc>
+      </w:tr>
+      <w:tr>
+        <w:tc>
+          <w:tcPr>
+            <w:tcW w:type="dxa" w:w="2160"/>
+          </w:tcPr>
+          <w:p>
+            <w:r>
+              <w:t>Kidney - Cortex</w:t>
+            </w:r>
+          </w:p>
+        </w:tc>
+        <w:tc>
+          <w:tcPr>
+            <w:tcW w:type="dxa" w:w="2160"/>
+          </w:tcPr>
+          <w:p>
+            <w:r>
+              <w:t>4</w:t>
+            </w:r>
+          </w:p>
+        </w:tc>
+        <w:tc>
+          <w:tcPr>
+            <w:tcW w:type="dxa" w:w="2160"/>
+          </w:tcPr>
+          <w:p>
+            <w:r>
+              <w:t>0.00</w:t>
+            </w:r>
+          </w:p>
+        </w:tc>
+        <w:tc>
+          <w:tcPr>
+            <w:tcW w:type="dxa" w:w="2160"/>
+          </w:tcPr>
+          <w:p>
+            <w:r>
+              <w:t>14.5</w:t>
+            </w:r>
+          </w:p>
+        </w:tc>
+      </w:tr>
+      <w:tr>
+        <w:tc>
+          <w:tcPr>
+            <w:tcW w:type="dxa" w:w="2160"/>
+          </w:tcPr>
+          <w:p>
+            <w:r>
+              <w:t>Lung</w:t>
+            </w:r>
+          </w:p>
+        </w:tc>
+        <w:tc>
+          <w:tcPr>
+            <w:tcW w:type="dxa" w:w="2160"/>
+          </w:tcPr>
+          <w:p>
+            <w:r>
+              <w:t>4</w:t>
+            </w:r>
+          </w:p>
+        </w:tc>
+        <w:tc>
+          <w:tcPr>
+            <w:tcW w:type="dxa" w:w="2160"/>
+          </w:tcPr>
+          <w:p>
+            <w:r>
+              <w:t>0.00</w:t>
+            </w:r>
+          </w:p>
+        </w:tc>
+        <w:tc>
+          <w:tcPr>
+            <w:tcW w:type="dxa" w:w="2160"/>
+          </w:tcPr>
+          <w:p>
+            <w:r>
+              <w:t>6.5</w:t>
+            </w:r>
+          </w:p>
+        </w:tc>
+      </w:tr>
+      <w:tr>
+        <w:tc>
+          <w:tcPr>
+            <w:tcW w:type="dxa" w:w="2160"/>
+          </w:tcPr>
+          <w:p>
+            <w:r>
+              <w:t>Esophagus - Mucosa</w:t>
+            </w:r>
+          </w:p>
+        </w:tc>
+        <w:tc>
+          <w:tcPr>
+            <w:tcW w:type="dxa" w:w="2160"/>
+          </w:tcPr>
+          <w:p>
+            <w:r>
+              <w:t>1</w:t>
+            </w:r>
+          </w:p>
+        </w:tc>
+        <w:tc>
+          <w:tcPr>
+            <w:tcW w:type="dxa" w:w="2160"/>
+          </w:tcPr>
+          <w:p>
+            <w:r>
+              <w:t>0.00</w:t>
+            </w:r>
+          </w:p>
+        </w:tc>
+        <w:tc>
+          <w:tcPr>
+            <w:tcW w:type="dxa" w:w="2160"/>
+          </w:tcPr>
+          <w:p>
+            <w:r>
+              <w:t>6</w:t>
+            </w:r>
+          </w:p>
+        </w:tc>
+      </w:tr>
+      <w:tr>
+        <w:tc>
+          <w:tcPr>
+            <w:tcW w:type="dxa" w:w="2160"/>
+          </w:tcPr>
+          <w:p>
+            <w:r>
+              <w:t>Stomach</w:t>
+            </w:r>
+          </w:p>
+        </w:tc>
+        <w:tc>
+          <w:tcPr>
+            <w:tcW w:type="dxa" w:w="2160"/>
+          </w:tcPr>
+          <w:p>
+            <w:r>
+              <w:t>1</w:t>
+            </w:r>
+          </w:p>
+        </w:tc>
+        <w:tc>
+          <w:tcPr>
+            <w:tcW w:type="dxa" w:w="2160"/>
+          </w:tcPr>
+          <w:p>
+            <w:r>
+              <w:t>0.00</w:t>
+            </w:r>
+          </w:p>
+        </w:tc>
+        <w:tc>
+          <w:tcPr>
+            <w:tcW w:type="dxa" w:w="2160"/>
+          </w:tcPr>
+          <w:p>
+            <w:r>
+              <w:t>3</w:t>
+            </w:r>
+          </w:p>
+        </w:tc>
+      </w:tr>
+      <w:tr>
+        <w:tc>
+          <w:tcPr>
+            <w:tcW w:type="dxa" w:w="2160"/>
+          </w:tcPr>
+          <w:p>
+            <w:r>
+              <w:t>Uterus</w:t>
+            </w:r>
+          </w:p>
+        </w:tc>
+        <w:tc>
+          <w:tcPr>
+            <w:tcW w:type="dxa" w:w="2160"/>
+          </w:tcPr>
+          <w:p>
+            <w:r>
+              <w:t>1</w:t>
+            </w:r>
+          </w:p>
+        </w:tc>
+        <w:tc>
+          <w:tcPr>
+            <w:tcW w:type="dxa" w:w="2160"/>
+          </w:tcPr>
+          <w:p>
+            <w:r>
+              <w:t>0.00</w:t>
+            </w:r>
+          </w:p>
+        </w:tc>
+        <w:tc>
+          <w:tcPr>
+            <w:tcW w:type="dxa" w:w="2160"/>
+          </w:tcPr>
+          <w:p>
+            <w:r>
+              <w:t>9</w:t>
+            </w:r>
+          </w:p>
+        </w:tc>
+      </w:tr>
+    </w:tbl>
+    <w:p>
+      <w:pPr>
+        <w:spacing w:after="120"/>
+        <w:jc w:val="both"/>
+      </w:pPr>
+      <w:r>
+        <w:t>Colon and cortical organoids recover their own tissue (23 of 28 top-1); liver, kidney and lung organoids almost never do (1 of 14; Fisher p = 3.9e-06). The grouping was chosen after seeing the table, so this p is descriptive. To see what the unfaithful organoids lack we scored, for each series, the deficit of each gene relative to its labelled tissue and averaged within organ:</w:t>
+      </w:r>
+    </w:p>
+    <w:p>
+      <w:pPr>
+        <w:jc w:val="center"/>
+      </w:pPr>
+      <w:r>
+        <w:rPr>
+          <w:i/>
+        </w:rPr>
+        <w:t>delta_g = (1/|S_o|) sum_{s in S_o} [ z(G_g,o) - z(p_sg) ]</w:t>
+      </w:r>
+      <w:r>
+        <w:tab/>
+        <w:tab/>
+        <w:t>(18)</w:t>
+      </w:r>
+    </w:p>
+    <w:p>
+      <w:pPr>
+        <w:spacing w:after="120"/>
+        <w:jc w:val="both"/>
+      </w:pPr>
+      <w:r>
+        <w:t>The 100 largest deficits were annotated with STRING functional enrichment and Enrichr PanglaoDB. Liver organoids lack the hepatocyte program (Hepatocytes (q = 1.7e-31); STRING Organic acid metabolic process (q = 4.6e-12)); kidney organoids lack proximal tubule (Proximal Tubule Cells (q = 5.7e-22)); lung organoids lack mainly stroma (Pancreatic Stellate Cells (q = 1.2e-15)). Faithful colon and cortical organoids lack mostly stromal, vascular and immune cells (Peritubular Myoid Cells (q = 1.3e-16); Satellite Glial Cells (q = 4.8e-14)).</w:t>
+      </w:r>
+    </w:p>
+    <w:p>
+      <w:pPr>
+        <w:spacing w:after="120"/>
+        <w:jc w:val="both"/>
+      </w:pPr>
+      <w:r>
+        <w:t>A direct mechanism test is inconclusive: the share of HPA parenchymal-only genes among the deficits is only modestly higher in unfaithful organs (OR = 1.45, p = 0.061), because lung deficits are stromal (share 0.15) while liver (0.68) and kidney (0.55) deficits are parenchymal.</w:t>
+      </w:r>
+    </w:p>
+    <w:p>
+      <w:pPr>
+        <w:spacing w:after="120"/>
+        <w:jc w:val="both"/>
+      </w:pPr>
+      <w:r>
+        <w:t>Protocol. Classifying series from GEO text as PSC-derived or adult-tissue-derived (keyword rules, not manually validated), derivation alone is weakly associated with recovery (Fisher p = 0.10). The organ effect holds within each stratum (PSC 7/11 vs 0/5, p = 0.034; adult 16/16 vs 0/5, p = 4.9e-05) and in a Cochran-Mantel-Haenszel test:</w:t>
+      </w:r>
+    </w:p>
+    <w:p>
+      <w:pPr>
+        <w:jc w:val="center"/>
+      </w:pPr>
+      <w:r>
+        <w:rPr>
+          <w:i/>
+        </w:rPr>
+        <w:t>OR_MH = sum_k (a_k d_k / n_k) / sum_k (b_k c_k / n_k)</w:t>
+      </w:r>
+      <w:r>
+        <w:tab/>
+        <w:tab/>
+        <w:t>(19)</w:t>
+      </w:r>
+    </w:p>
+    <w:p>
+      <w:pPr>
+        <w:spacing w:after="120"/>
+        <w:jc w:val="both"/>
+      </w:pPr>
+      <w:r>
+        <w:t>(pooled OR = 46 with a 0.5 continuity correction, p = 5.8e-05). We name the candidate the metabolic-parenchyma gap: liver and kidney organoids miss their tissue because they lack mature metabolic epithelium, while intestinal and cortical organoids match despite missing stroma. It is falsified if, in new strictly organoid liver or kidney series, hepatocyte and proximal-tubule genes do not account for most of the rank gap. Brain organoids are all PSC-derived, so organ and protocol cannot be separated there; per-organ n is small.</w:t>
+      </w:r>
+    </w:p>
+    <w:p>
+      <w:pPr>
         <w:pStyle w:val="Heading1"/>
       </w:pPr>
       <w:r>
@@ -5660,6 +6144,15 @@
         <w:jc w:val="both"/>
       </w:pPr>
       <w:r>
+        <w:t>- Fidelity: the HPA parenchymal share of deficit genes does not clearly separate faithful from unfaithful organs (p = 0.061); lung organoids break the pattern.</w:t>
+      </w:r>
+    </w:p>
+    <w:p>
+      <w:pPr>
+        <w:spacing w:after="120"/>
+        <w:jc w:val="both"/>
+      </w:pPr>
+      <w:r>
         <w:t>- Fidelity: the culture-fibroblast attractor is RETRACTED as a general organoid property: on 45 series whose samples are all organoids it shrinks to 9-29% of series (Section 4.9).</w:t>
       </w:r>
     </w:p>
@@ -5711,7 +6204,7 @@
         <w:rPr>
           <w:b/>
         </w:rPr>
-        <w:t>Table 10. Tools genuinely used (results/tools_ledger.csv): 23 entries, 17 counting toward the gate after excluding infrastructure. Target of 40 not reached.</w:t>
+        <w:t>Table 11. Tools genuinely used (results/tools_ledger.csv): 24 entries, 18 counting toward the gate after excluding infrastructure. Target of 40 not reached.</w:t>
       </w:r>
     </w:p>
     <w:tbl>
@@ -6720,6 +7213,48 @@
           <w:p>
             <w:r>
               <w:t>src/attractor_enrichr_reactome.py</w:t>
+            </w:r>
+          </w:p>
+        </w:tc>
+        <w:tc>
+          <w:tcPr>
+            <w:tcW w:type="dxa" w:w="2160"/>
+          </w:tcPr>
+          <w:p>
+            <w:r>
+              <w:t>counts</w:t>
+            </w:r>
+          </w:p>
+        </w:tc>
+      </w:tr>
+      <w:tr>
+        <w:tc>
+          <w:tcPr>
+            <w:tcW w:type="dxa" w:w="2160"/>
+          </w:tcPr>
+          <w:p>
+            <w:r>
+              <w:t>STRING functional enrichment API (string-db.org)</w:t>
+            </w:r>
+          </w:p>
+        </w:tc>
+        <w:tc>
+          <w:tcPr>
+            <w:tcW w:type="dxa" w:w="2160"/>
+          </w:tcPr>
+          <w:p>
+            <w:r>
+              <w:t>service</w:t>
+            </w:r>
+          </w:p>
+        </w:tc>
+        <w:tc>
+          <w:tcPr>
+            <w:tcW w:type="dxa" w:w="2160"/>
+          </w:tcPr>
+          <w:p>
+            <w:r>
+              <w:t>src/strict_organ_deficits.py</w:t>
             </w:r>
           </w:p>
         </w:tc>
@@ -6777,6 +7312,15 @@
       </w:pPr>
       <w:r>
         <w:t>Karlsson M, et al. A single-cell type transcriptomics map of human tissues. Sci Adv 2021. https://www.proteinatlas.org</w:t>
+      </w:r>
+    </w:p>
+    <w:p>
+      <w:pPr>
+        <w:spacing w:after="120"/>
+        <w:jc w:val="both"/>
+      </w:pPr>
+      <w:r>
+        <w:t>Szklarczyk D, et al. The STRING database in 2023. Nucleic Acids Res 2023.</w:t>
       </w:r>
     </w:p>
     <w:p>

</xml_diff>

<commit_message>
Paper v8: UniProt secretome negative, 4.11 pre-registered ArrayExpress replication (MWU eq), kidney non-replication negative; 20 equations; pdfinfo 18 pages
</commit_message>
<xml_diff>
--- a/paper/mega27-03-virtual-organoid-paper.docx
+++ b/paper/mega27-03-virtual-organoid-paper.docx
@@ -6069,6 +6069,591 @@
     </w:p>
     <w:p>
       <w:pPr>
+        <w:spacing w:after="120"/>
+        <w:jc w:val="both"/>
+      </w:pPr>
+      <w:r>
+        <w:t>Secretome check (UniProt). The share of deficit genes whose reviewed UniProt entry has a signal peptide or a 'Secreted' location is 0.30-0.57 per organ against 0.17 for 2,000 random expressed genes (all q &lt;= 0.001). Every organoid type lacks secreted proteins, faithful or not, so this does not explain the organ split (negative).</w:t>
+      </w:r>
+    </w:p>
+    <w:p>
+      <w:pPr>
+        <w:pStyle w:val="Heading2"/>
+      </w:pPr>
+      <w:r>
+        <w:t>4.11 Pre-registered out-of-sample test on ArrayExpress</w:t>
+      </w:r>
+    </w:p>
+    <w:p>
+      <w:pPr>
+        <w:spacing w:after="120"/>
+        <w:jc w:val="both"/>
+      </w:pPr>
+      <w:r>
+        <w:t>Before downloading any new data we committed a pre-registration (results/preregistration_organ_split.md): on organoid bulk profiles outside the GEO scan, liver, kidney and lung organoids should rank their own tissue worse than intestinal and brain organoids, tested by a one-sided Mann-Whitney U at 0.05:</w:t>
+      </w:r>
+    </w:p>
+    <w:p>
+      <w:pPr>
+        <w:jc w:val="center"/>
+      </w:pPr>
+      <w:r>
+        <w:rPr>
+          <w:i/>
+        </w:rPr>
+        <w:t>U = sum_{i in unfaithful} sum_{j in faithful} [ 1(r_i &gt; r_j) + 0.5 * 1(r_i = r_j) ]</w:t>
+      </w:r>
+      <w:r>
+        <w:tab/>
+        <w:tab/>
+        <w:t>(20)</w:t>
+      </w:r>
+    </w:p>
+    <w:p>
+      <w:pPr>
+        <w:spacing w:after="120"/>
+        <w:jc w:val="both"/>
+      </w:pPr>
+      <w:r>
+        <w:t>A BioStudies/ArrayExpress search gave 18 curated human non-cancer organoid studies with processed files; 11 could be scored (the others had mouse gene IDs, probe IDs only, malformed tables, or single-cell data only).</w:t>
+      </w:r>
+    </w:p>
+    <w:p>
+      <w:r>
+        <w:rPr>
+          <w:b/>
+        </w:rPr>
+        <w:t>Table 11. Out-of-sample organoid profiles (results/ae_replication.csv).</w:t>
+      </w:r>
+    </w:p>
+    <w:tbl>
+      <w:tblPr>
+        <w:tblStyle w:val="LightGrid-Accent1"/>
+        <w:tblW w:type="auto" w:w="0"/>
+        <w:tblLook w:firstColumn="1" w:firstRow="1" w:lastColumn="0" w:lastRow="0" w:noHBand="0" w:noVBand="1" w:val="04A0"/>
+      </w:tblPr>
+      <w:tblGrid>
+        <w:gridCol w:w="2160"/>
+        <w:gridCol w:w="2160"/>
+        <w:gridCol w:w="2160"/>
+        <w:gridCol w:w="2160"/>
+      </w:tblGrid>
+      <w:tr>
+        <w:tc>
+          <w:tcPr>
+            <w:tcW w:type="dxa" w:w="2160"/>
+          </w:tcPr>
+          <w:p>
+            <w:r>
+              <w:t>accession</w:t>
+            </w:r>
+          </w:p>
+        </w:tc>
+        <w:tc>
+          <w:tcPr>
+            <w:tcW w:type="dxa" w:w="2160"/>
+          </w:tcPr>
+          <w:p>
+            <w:r>
+              <w:t>organ</w:t>
+            </w:r>
+          </w:p>
+        </w:tc>
+        <w:tc>
+          <w:tcPr>
+            <w:tcW w:type="dxa" w:w="2160"/>
+          </w:tcPr>
+          <w:p>
+            <w:r>
+              <w:t>rank of own tissue</w:t>
+            </w:r>
+          </w:p>
+        </w:tc>
+        <w:tc>
+          <w:tcPr>
+            <w:tcW w:type="dxa" w:w="2160"/>
+          </w:tcPr>
+          <w:p>
+            <w:r>
+              <w:t>best GTEx match</w:t>
+            </w:r>
+          </w:p>
+        </w:tc>
+      </w:tr>
+      <w:tr>
+        <w:tc>
+          <w:tcPr>
+            <w:tcW w:type="dxa" w:w="2160"/>
+          </w:tcPr>
+          <w:p>
+            <w:r>
+              <w:t>E-MTAB-9044</w:t>
+            </w:r>
+          </w:p>
+        </w:tc>
+        <w:tc>
+          <w:tcPr>
+            <w:tcW w:type="dxa" w:w="2160"/>
+          </w:tcPr>
+          <w:p>
+            <w:r>
+              <w:t>liver</w:t>
+            </w:r>
+          </w:p>
+        </w:tc>
+        <w:tc>
+          <w:tcPr>
+            <w:tcW w:type="dxa" w:w="2160"/>
+          </w:tcPr>
+          <w:p>
+            <w:r>
+              <w:t>39</w:t>
+            </w:r>
+          </w:p>
+        </w:tc>
+        <w:tc>
+          <w:tcPr>
+            <w:tcW w:type="dxa" w:w="2160"/>
+          </w:tcPr>
+          <w:p>
+            <w:r>
+              <w:t>Stomach</w:t>
+            </w:r>
+          </w:p>
+        </w:tc>
+      </w:tr>
+      <w:tr>
+        <w:tc>
+          <w:tcPr>
+            <w:tcW w:type="dxa" w:w="2160"/>
+          </w:tcPr>
+          <w:p>
+            <w:r>
+              <w:t>E-MTAB-12822</w:t>
+            </w:r>
+          </w:p>
+        </w:tc>
+        <w:tc>
+          <w:tcPr>
+            <w:tcW w:type="dxa" w:w="2160"/>
+          </w:tcPr>
+          <w:p>
+            <w:r>
+              <w:t>kidney</w:t>
+            </w:r>
+          </w:p>
+        </w:tc>
+        <w:tc>
+          <w:tcPr>
+            <w:tcW w:type="dxa" w:w="2160"/>
+          </w:tcPr>
+          <w:p>
+            <w:r>
+              <w:t>2</w:t>
+            </w:r>
+          </w:p>
+        </w:tc>
+        <w:tc>
+          <w:tcPr>
+            <w:tcW w:type="dxa" w:w="2160"/>
+          </w:tcPr>
+          <w:p>
+            <w:r>
+              <w:t>Cervix - Endocervix</w:t>
+            </w:r>
+          </w:p>
+        </w:tc>
+      </w:tr>
+      <w:tr>
+        <w:tc>
+          <w:tcPr>
+            <w:tcW w:type="dxa" w:w="2160"/>
+          </w:tcPr>
+          <w:p>
+            <w:r>
+              <w:t>E-MTAB-9807</w:t>
+            </w:r>
+          </w:p>
+        </w:tc>
+        <w:tc>
+          <w:tcPr>
+            <w:tcW w:type="dxa" w:w="2160"/>
+          </w:tcPr>
+          <w:p>
+            <w:r>
+              <w:t>liver</w:t>
+            </w:r>
+          </w:p>
+        </w:tc>
+        <w:tc>
+          <w:tcPr>
+            <w:tcW w:type="dxa" w:w="2160"/>
+          </w:tcPr>
+          <w:p>
+            <w:r>
+              <w:t>37</w:t>
+            </w:r>
+          </w:p>
+        </w:tc>
+        <w:tc>
+          <w:tcPr>
+            <w:tcW w:type="dxa" w:w="2160"/>
+          </w:tcPr>
+          <w:p>
+            <w:r>
+              <w:t>Stomach</w:t>
+            </w:r>
+          </w:p>
+        </w:tc>
+      </w:tr>
+      <w:tr>
+        <w:tc>
+          <w:tcPr>
+            <w:tcW w:type="dxa" w:w="2160"/>
+          </w:tcPr>
+          <w:p>
+            <w:r>
+              <w:t>E-MTAB-11221</w:t>
+            </w:r>
+          </w:p>
+        </w:tc>
+        <w:tc>
+          <w:tcPr>
+            <w:tcW w:type="dxa" w:w="2160"/>
+          </w:tcPr>
+          <w:p>
+            <w:r>
+              <w:t>intestine</w:t>
+            </w:r>
+          </w:p>
+        </w:tc>
+        <w:tc>
+          <w:tcPr>
+            <w:tcW w:type="dxa" w:w="2160"/>
+          </w:tcPr>
+          <w:p>
+            <w:r>
+              <w:t>1</w:t>
+            </w:r>
+          </w:p>
+        </w:tc>
+        <w:tc>
+          <w:tcPr>
+            <w:tcW w:type="dxa" w:w="2160"/>
+          </w:tcPr>
+          <w:p>
+            <w:r>
+              <w:t>Colon - Transverse</w:t>
+            </w:r>
+          </w:p>
+        </w:tc>
+      </w:tr>
+      <w:tr>
+        <w:tc>
+          <w:tcPr>
+            <w:tcW w:type="dxa" w:w="2160"/>
+          </w:tcPr>
+          <w:p>
+            <w:r>
+              <w:t>E-MTAB-9134</w:t>
+            </w:r>
+          </w:p>
+        </w:tc>
+        <w:tc>
+          <w:tcPr>
+            <w:tcW w:type="dxa" w:w="2160"/>
+          </w:tcPr>
+          <w:p>
+            <w:r>
+              <w:t>intestine</w:t>
+            </w:r>
+          </w:p>
+        </w:tc>
+        <w:tc>
+          <w:tcPr>
+            <w:tcW w:type="dxa" w:w="2160"/>
+          </w:tcPr>
+          <w:p>
+            <w:r>
+              <w:t>1</w:t>
+            </w:r>
+          </w:p>
+        </w:tc>
+        <w:tc>
+          <w:tcPr>
+            <w:tcW w:type="dxa" w:w="2160"/>
+          </w:tcPr>
+          <w:p>
+            <w:r>
+              <w:t>Colon - Transverse</w:t>
+            </w:r>
+          </w:p>
+        </w:tc>
+      </w:tr>
+      <w:tr>
+        <w:tc>
+          <w:tcPr>
+            <w:tcW w:type="dxa" w:w="2160"/>
+          </w:tcPr>
+          <w:p>
+            <w:r>
+              <w:t>E-MTAB-11297</w:t>
+            </w:r>
+          </w:p>
+        </w:tc>
+        <w:tc>
+          <w:tcPr>
+            <w:tcW w:type="dxa" w:w="2160"/>
+          </w:tcPr>
+          <w:p>
+            <w:r>
+              <w:t>intestine</w:t>
+            </w:r>
+          </w:p>
+        </w:tc>
+        <w:tc>
+          <w:tcPr>
+            <w:tcW w:type="dxa" w:w="2160"/>
+          </w:tcPr>
+          <w:p>
+            <w:r>
+              <w:t>1</w:t>
+            </w:r>
+          </w:p>
+        </w:tc>
+        <w:tc>
+          <w:tcPr>
+            <w:tcW w:type="dxa" w:w="2160"/>
+          </w:tcPr>
+          <w:p>
+            <w:r>
+              <w:t>Small Intestine - Terminal Ileum</w:t>
+            </w:r>
+          </w:p>
+        </w:tc>
+      </w:tr>
+      <w:tr>
+        <w:tc>
+          <w:tcPr>
+            <w:tcW w:type="dxa" w:w="2160"/>
+          </w:tcPr>
+          <w:p>
+            <w:r>
+              <w:t>E-MTAB-13901</w:t>
+            </w:r>
+          </w:p>
+        </w:tc>
+        <w:tc>
+          <w:tcPr>
+            <w:tcW w:type="dxa" w:w="2160"/>
+          </w:tcPr>
+          <w:p>
+            <w:r>
+              <w:t>kidney</w:t>
+            </w:r>
+          </w:p>
+        </w:tc>
+        <w:tc>
+          <w:tcPr>
+            <w:tcW w:type="dxa" w:w="2160"/>
+          </w:tcPr>
+          <w:p>
+            <w:r>
+              <w:t>1</w:t>
+            </w:r>
+          </w:p>
+        </w:tc>
+        <w:tc>
+          <w:tcPr>
+            <w:tcW w:type="dxa" w:w="2160"/>
+          </w:tcPr>
+          <w:p>
+            <w:r>
+              <w:t>Kidney - Medulla</w:t>
+            </w:r>
+          </w:p>
+        </w:tc>
+      </w:tr>
+      <w:tr>
+        <w:tc>
+          <w:tcPr>
+            <w:tcW w:type="dxa" w:w="2160"/>
+          </w:tcPr>
+          <w:p>
+            <w:r>
+              <w:t>E-MTAB-6017</w:t>
+            </w:r>
+          </w:p>
+        </w:tc>
+        <w:tc>
+          <w:tcPr>
+            <w:tcW w:type="dxa" w:w="2160"/>
+          </w:tcPr>
+          <w:p>
+            <w:r>
+              <w:t>intestine</w:t>
+            </w:r>
+          </w:p>
+        </w:tc>
+        <w:tc>
+          <w:tcPr>
+            <w:tcW w:type="dxa" w:w="2160"/>
+          </w:tcPr>
+          <w:p>
+            <w:r>
+              <w:t>1</w:t>
+            </w:r>
+          </w:p>
+        </w:tc>
+        <w:tc>
+          <w:tcPr>
+            <w:tcW w:type="dxa" w:w="2160"/>
+          </w:tcPr>
+          <w:p>
+            <w:r>
+              <w:t>Small Intestine - Terminal Ileum</w:t>
+            </w:r>
+          </w:p>
+        </w:tc>
+      </w:tr>
+      <w:tr>
+        <w:tc>
+          <w:tcPr>
+            <w:tcW w:type="dxa" w:w="2160"/>
+          </w:tcPr>
+          <w:p>
+            <w:r>
+              <w:t>E-MTAB-13578</w:t>
+            </w:r>
+          </w:p>
+        </w:tc>
+        <w:tc>
+          <w:tcPr>
+            <w:tcW w:type="dxa" w:w="2160"/>
+          </w:tcPr>
+          <w:p>
+            <w:r>
+              <w:t>intestine</w:t>
+            </w:r>
+          </w:p>
+        </w:tc>
+        <w:tc>
+          <w:tcPr>
+            <w:tcW w:type="dxa" w:w="2160"/>
+          </w:tcPr>
+          <w:p>
+            <w:r>
+              <w:t>1</w:t>
+            </w:r>
+          </w:p>
+        </w:tc>
+        <w:tc>
+          <w:tcPr>
+            <w:tcW w:type="dxa" w:w="2160"/>
+          </w:tcPr>
+          <w:p>
+            <w:r>
+              <w:t>Small Intestine - Terminal Ileum</w:t>
+            </w:r>
+          </w:p>
+        </w:tc>
+      </w:tr>
+      <w:tr>
+        <w:tc>
+          <w:tcPr>
+            <w:tcW w:type="dxa" w:w="2160"/>
+          </w:tcPr>
+          <w:p>
+            <w:r>
+              <w:t>E-MTAB-17066</w:t>
+            </w:r>
+          </w:p>
+        </w:tc>
+        <w:tc>
+          <w:tcPr>
+            <w:tcW w:type="dxa" w:w="2160"/>
+          </w:tcPr>
+          <w:p>
+            <w:r>
+              <w:t>brain</w:t>
+            </w:r>
+          </w:p>
+        </w:tc>
+        <w:tc>
+          <w:tcPr>
+            <w:tcW w:type="dxa" w:w="2160"/>
+          </w:tcPr>
+          <w:p>
+            <w:r>
+              <w:t>1</w:t>
+            </w:r>
+          </w:p>
+        </w:tc>
+        <w:tc>
+          <w:tcPr>
+            <w:tcW w:type="dxa" w:w="2160"/>
+          </w:tcPr>
+          <w:p>
+            <w:r>
+              <w:t>Brain - Hypothalamus</w:t>
+            </w:r>
+          </w:p>
+        </w:tc>
+      </w:tr>
+      <w:tr>
+        <w:tc>
+          <w:tcPr>
+            <w:tcW w:type="dxa" w:w="2160"/>
+          </w:tcPr>
+          <w:p>
+            <w:r>
+              <w:t>E-MTAB-10037</w:t>
+            </w:r>
+          </w:p>
+        </w:tc>
+        <w:tc>
+          <w:tcPr>
+            <w:tcW w:type="dxa" w:w="2160"/>
+          </w:tcPr>
+          <w:p>
+            <w:r>
+              <w:t>brain</w:t>
+            </w:r>
+          </w:p>
+        </w:tc>
+        <w:tc>
+          <w:tcPr>
+            <w:tcW w:type="dxa" w:w="2160"/>
+          </w:tcPr>
+          <w:p>
+            <w:r>
+              <w:t>26</w:t>
+            </w:r>
+          </w:p>
+        </w:tc>
+        <w:tc>
+          <w:tcPr>
+            <w:tcW w:type="dxa" w:w="2160"/>
+          </w:tcPr>
+          <w:p>
+            <w:r>
+              <w:t>Cells - Cultured fibroblasts</w:t>
+            </w:r>
+          </w:p>
+        </w:tc>
+      </w:tr>
+    </w:tbl>
+    <w:p>
+      <w:pPr>
+        <w:spacing w:after="120"/>
+        <w:jc w:val="both"/>
+      </w:pPr>
+      <w:r>
+        <w:t>Median rank 19.5 vs 1; top-1 0.25 vs 0.86; one-sided p = 0.031. The pre-registered test passes, but the support is weak: there is no lung dataset, both liver datasets are cholangiocyte organoids on microarrays (so cell type and platform are confounded), and both kidney datasets match kidney well (ranks 1 and 2), which contradicts the kidney part of the candidate. The metabolic-parenchyma gap remains a candidate; its kidney component did not replicate.</w:t>
+      </w:r>
+    </w:p>
+    <w:p>
+      <w:pPr>
         <w:pStyle w:val="Heading1"/>
       </w:pPr>
       <w:r>
@@ -6153,6 +6738,24 @@
         <w:jc w:val="both"/>
       </w:pPr>
       <w:r>
+        <w:t>- Fidelity: all organoid types lack secreted proteins (UniProt), so the secretome does not explain the organ split.</w:t>
+      </w:r>
+    </w:p>
+    <w:p>
+      <w:pPr>
+        <w:spacing w:after="120"/>
+        <w:jc w:val="both"/>
+      </w:pPr>
+      <w:r>
+        <w:t>- Replication: the kidney part of the organ split failed out of sample (two ArrayExpress kidney datasets rank kidney 1st and 2nd).</w:t>
+      </w:r>
+    </w:p>
+    <w:p>
+      <w:pPr>
+        <w:spacing w:after="120"/>
+        <w:jc w:val="both"/>
+      </w:pPr>
+      <w:r>
         <w:t>- Fidelity: the culture-fibroblast attractor is RETRACTED as a general organoid property: on 45 series whose samples are all organoids it shrinks to 9-29% of series (Section 4.9).</w:t>
       </w:r>
     </w:p>
@@ -6204,7 +6807,7 @@
         <w:rPr>
           <w:b/>
         </w:rPr>
-        <w:t>Table 11. Tools genuinely used (results/tools_ledger.csv): 24 entries, 18 counting toward the gate after excluding infrastructure. Target of 40 not reached.</w:t>
+        <w:t>Table 12. Tools genuinely used (results/tools_ledger.csv): 26 entries, 20 counting toward the gate after excluding infrastructure. Target of 40 not reached.</w:t>
       </w:r>
     </w:p>
     <w:tbl>
@@ -7255,6 +7858,90 @@
           <w:p>
             <w:r>
               <w:t>src/strict_organ_deficits.py</w:t>
+            </w:r>
+          </w:p>
+        </w:tc>
+        <w:tc>
+          <w:tcPr>
+            <w:tcW w:type="dxa" w:w="2160"/>
+          </w:tcPr>
+          <w:p>
+            <w:r>
+              <w:t>counts</w:t>
+            </w:r>
+          </w:p>
+        </w:tc>
+      </w:tr>
+      <w:tr>
+        <w:tc>
+          <w:tcPr>
+            <w:tcW w:type="dxa" w:w="2160"/>
+          </w:tcPr>
+          <w:p>
+            <w:r>
+              <w:t>UniProt REST (UniProtKB reviewed human)</w:t>
+            </w:r>
+          </w:p>
+        </w:tc>
+        <w:tc>
+          <w:tcPr>
+            <w:tcW w:type="dxa" w:w="2160"/>
+          </w:tcPr>
+          <w:p>
+            <w:r>
+              <w:t>database</w:t>
+            </w:r>
+          </w:p>
+        </w:tc>
+        <w:tc>
+          <w:tcPr>
+            <w:tcW w:type="dxa" w:w="2160"/>
+          </w:tcPr>
+          <w:p>
+            <w:r>
+              <w:t>src/strict_deficit_uniprot.py</w:t>
+            </w:r>
+          </w:p>
+        </w:tc>
+        <w:tc>
+          <w:tcPr>
+            <w:tcW w:type="dxa" w:w="2160"/>
+          </w:tcPr>
+          <w:p>
+            <w:r>
+              <w:t>counts</w:t>
+            </w:r>
+          </w:p>
+        </w:tc>
+      </w:tr>
+      <w:tr>
+        <w:tc>
+          <w:tcPr>
+            <w:tcW w:type="dxa" w:w="2160"/>
+          </w:tcPr>
+          <w:p>
+            <w:r>
+              <w:t>EBI BioStudies / ArrayExpress API + FTP</w:t>
+            </w:r>
+          </w:p>
+        </w:tc>
+        <w:tc>
+          <w:tcPr>
+            <w:tcW w:type="dxa" w:w="2160"/>
+          </w:tcPr>
+          <w:p>
+            <w:r>
+              <w:t>database</w:t>
+            </w:r>
+          </w:p>
+        </w:tc>
+        <w:tc>
+          <w:tcPr>
+            <w:tcW w:type="dxa" w:w="2160"/>
+          </w:tcPr>
+          <w:p>
+            <w:r>
+              <w:t>src/ae_scan.py; src/ae_replication.py</w:t>
             </w:r>
           </w:p>
         </w:tc>
@@ -7321,6 +8008,24 @@
       </w:pPr>
       <w:r>
         <w:t>Szklarczyk D, et al. The STRING database in 2023. Nucleic Acids Res 2023.</w:t>
+      </w:r>
+    </w:p>
+    <w:p>
+      <w:pPr>
+        <w:spacing w:after="120"/>
+        <w:jc w:val="both"/>
+      </w:pPr>
+      <w:r>
+        <w:t>The UniProt Consortium. UniProt: the Universal Protein Knowledgebase in 2023. Nucleic Acids Res 2023.</w:t>
+      </w:r>
+    </w:p>
+    <w:p>
+      <w:pPr>
+        <w:spacing w:after="120"/>
+        <w:jc w:val="both"/>
+      </w:pPr>
+      <w:r>
+        <w:t>Moreno P, et al. Expression Atlas and ArrayExpress/BioStudies at EMBL-EBI. Nucleic Acids Res 2022.</w:t>
       </w:r>
     </w:p>
     <w:p>

</xml_diff>

<commit_message>
Paper v9 adds orthogonal organoid checks and negative results
</commit_message>
<xml_diff>
--- a/paper/mega27-03-virtual-organoid-paper.docx
+++ b/paper/mega27-03-virtual-organoid-paper.docx
@@ -16,7 +16,7 @@
         <w:jc w:val="center"/>
       </w:pPr>
       <w:r>
-        <w:t>MEGA-PROGRAM-27, Item 3 - Udita Phookan (program owner); computational work by an AI research agent. Draft of 24 September 2026.</w:t>
+        <w:t>MEGA-PROGRAM-27, Item 3 - Udita Phookan (program owner); computational work by an AI research agent. Draft of 25 September 2026.</w:t>
       </w:r>
     </w:p>
     <w:p>
@@ -6654,6 +6654,102 @@
     </w:p>
     <w:p>
       <w:pPr>
+        <w:pStyle w:val="Heading2"/>
+      </w:pPr>
+      <w:r>
+        <w:t>4.12 Orthogonal checks of the metabolic-parenchyma candidate</w:t>
+      </w:r>
+    </w:p>
+    <w:p>
+      <w:pPr>
+        <w:spacing w:after="120"/>
+        <w:jc w:val="both"/>
+      </w:pPr>
+      <w:r>
+        <w:t>GSEApy preranked GSEA used MSigDB Hallmark v2023.2 on all ranked strict-subset deficit genes, with 500 permutations. Positive normalized enrichment score (NES) means higher expression in the reference tissue than the organoids. The mean over six metabolic Hallmarks is 1.96 in liver, 1.95 in kidney, 1.65 in brain, and 0.74 in colon (descriptive Mann-Whitney p=0.004; pathways overlap and are not independent). Brain nevertheless has oxidative phosphorylation NES 2.63, despite matching its reference tissue. A metabolic deficit alone cannot explain fidelity (results/strict_gsea_summary.json).</w:t>
+      </w:r>
+    </w:p>
+    <w:p>
+      <w:pPr>
+        <w:spacing w:after="120"/>
+        <w:jc w:val="both"/>
+      </w:pPr>
+      <w:r>
+        <w:t>Pre-registered Open Targets disease relevance. We compared each organ's top 100 deficit genes against the top 500 targets of its corresponding organ-disease term. Diagonal dominance in the five-by-five overlap matrix is:</w:t>
+      </w:r>
+    </w:p>
+    <w:p>
+      <w:pPr>
+        <w:jc w:val="center"/>
+      </w:pPr>
+      <w:r>
+        <w:rPr>
+          <w:i/>
+        </w:rPr>
+        <w:t>D = (1/5) sum_o M_oo - (1/20) sum_{o != d} M_od</w:t>
+      </w:r>
+      <w:r>
+        <w:tab/>
+        <w:tab/>
+        <w:t>(21)</w:t>
+      </w:r>
+    </w:p>
+    <w:p>
+      <w:pPr>
+        <w:spacing w:after="120"/>
+        <w:jc w:val="both"/>
+      </w:pPr>
+      <w:r>
+        <w:t>D=2.6, permutation p=0.0005: the primary test passes (results/deficit_opentargets.json). But liver-specific disease enrichment fails (2/100 own-disease hits, p=0.62). The pass is driven more by lung and colon than liver; the few hits per cell limit its use as a discovery claim.</w:t>
+      </w:r>
+    </w:p>
+    <w:p>
+      <w:pPr>
+        <w:spacing w:after="120"/>
+        <w:jc w:val="both"/>
+      </w:pPr>
+      <w:r>
+        <w:t>Pre-registered decoupler univariate linear modeling used OmniPath CollecTRI transcription factor regulons and PROGENy footprints on 4,261 shared genes. Only 2/12 tested lineage master factors ranked in the top decile of deficient factors (binomial p=0.34); the positive control FAILS. Exploratory PROGENy scores show PI3K higher and JAK-STAT and p53 lower in organoids across all five organs, a shared culture signature rather than an organ-specific mechanism (results/deficit_decoupler.json).</w:t>
+      </w:r>
+    </w:p>
+    <w:p>
+      <w:pPr>
+        <w:spacing w:after="120"/>
+        <w:jc w:val="both"/>
+      </w:pPr>
+      <w:r>
+        <w:t>Reference robustness. We replaced GTEx with Expression Atlas Illumina Body Map E-MTAB-513. The pre-registered test passed: deficit-vector Spearman rho 0.57-0.72 across organs, top-100 overlap 52-75. The Open Targets diagonal-dominance rerun also passes (D=2.1, permutation p=0.0026). Both deficit vectors share the organoid measurements, so this checks reference sensitivity, not independent biological replication (results/deficit_bodymap.json).</w:t>
+      </w:r>
+    </w:p>
+    <w:p>
+      <w:pPr>
+        <w:spacing w:after="120"/>
+        <w:jc w:val="both"/>
+      </w:pPr>
+      <w:r>
+        <w:t>ClinPGx pharmacogenes: the pre-registered VIP-or-CPIC gene set is unusable because the source release marks all 25,041 genes as VIP. We retain that failure. A documented, post-registration CPIC-guideline-only deviation finds liver deficits in 21 tested genes (median 0.32 vs 0.03 in other genes, p=0.0004), but liver specificity fails (p=0.23, only 6 genes shared across all organ vectors). This is a drug-testing caution, not evidence of a liver-specific mechanism (results/deficit_clinpgx.json).</w:t>
+      </w:r>
+    </w:p>
+    <w:p>
+      <w:pPr>
+        <w:spacing w:after="120"/>
+        <w:jc w:val="both"/>
+      </w:pPr>
+      <w:r>
+        <w:t>Pre-registered population-constraint and coding-composition checks were negative. In gnomAD v2.1.1, liver deficit genes have median LOEUF 1.256 vs brain 1.107 (one-sided p=0.263; lower LOEUF is more loss-of-function constrained). Ensembl REST mapped all fixed top-100 genes per organ: liver 99/100 and brain 100/100 are protein coding (one-sided Fisher p=1.0). Neither check supplies a mechanism; the gene universe is already coding-enriched (results/deficit_gnomad.json; results/deficit_ensembl_biotype.json).</w:t>
+      </w:r>
+    </w:p>
+    <w:p>
+      <w:pPr>
+        <w:spacing w:after="120"/>
+        <w:jc w:val="both"/>
+      </w:pPr>
+      <w:r>
+        <w:t>Synthesis. Organoid deficits are reproducible to a reference swap and linked to organ-disease targets in aggregate, but the metabolic-parenchyma gap lacks liver specificity and the kidney finding fails external replication. It remains a falsifiable candidate, not a new discovery or a validated diagnostic tool.</w:t>
+      </w:r>
+    </w:p>
+    <w:p>
+      <w:pPr>
         <w:pStyle w:val="Heading1"/>
       </w:pPr>
       <w:r>
@@ -6756,6 +6852,51 @@
         <w:jc w:val="both"/>
       </w:pPr>
       <w:r>
+        <w:t>- GSEA: metabolic deficits are also present in faithful brain organoids; not specific to poor fidelity.</w:t>
+      </w:r>
+    </w:p>
+    <w:p>
+      <w:pPr>
+        <w:spacing w:after="120"/>
+        <w:jc w:val="both"/>
+      </w:pPr>
+      <w:r>
+        <w:t>- Open Targets: liver deficits show no liver-disease enrichment despite the aggregate diagonal-dominance pass.</w:t>
+      </w:r>
+    </w:p>
+    <w:p>
+      <w:pPr>
+        <w:spacing w:after="120"/>
+        <w:jc w:val="both"/>
+      </w:pPr>
+      <w:r>
+        <w:t>- decoupler: lineage master-TF positive control fails (2/12); pathway signals are shared across cultures.</w:t>
+      </w:r>
+    </w:p>
+    <w:p>
+      <w:pPr>
+        <w:spacing w:after="120"/>
+        <w:jc w:val="both"/>
+      </w:pPr>
+      <w:r>
+        <w:t>- ClinPGx: pre-registered VIP flag is defective; CPIC-only deviation passes liver deficit but fails liver specificity.</w:t>
+      </w:r>
+    </w:p>
+    <w:p>
+      <w:pPr>
+        <w:spacing w:after="120"/>
+        <w:jc w:val="both"/>
+      </w:pPr>
+      <w:r>
+        <w:t>- gnomAD and Ensembl: no liver-vs-brain differentiation by LOEUF or protein-coding composition.</w:t>
+      </w:r>
+    </w:p>
+    <w:p>
+      <w:pPr>
+        <w:spacing w:after="120"/>
+        <w:jc w:val="both"/>
+      </w:pPr>
+      <w:r>
         <w:t>- Fidelity: the culture-fibroblast attractor is RETRACTED as a general organoid property: on 45 series whose samples are all organoids it shrinks to 9-29% of series (Section 4.9).</w:t>
       </w:r>
     </w:p>
@@ -6807,7 +6948,7 @@
         <w:rPr>
           <w:b/>
         </w:rPr>
-        <w:t>Table 12. Tools genuinely used (results/tools_ledger.csv): 26 entries, 20 counting toward the gate after excluding infrastructure. Target of 40 not reached.</w:t>
+        <w:t>Table 12. Tools genuinely used (results/tools_ledger.csv): 34 entries, 28 counting toward the gate after excluding infrastructure. Target of 40 not reached.</w:t>
       </w:r>
     </w:p>
     <w:tbl>
@@ -7942,6 +8083,342 @@
           <w:p>
             <w:r>
               <w:t>src/ae_scan.py; src/ae_replication.py</w:t>
+            </w:r>
+          </w:p>
+        </w:tc>
+        <w:tc>
+          <w:tcPr>
+            <w:tcW w:type="dxa" w:w="2160"/>
+          </w:tcPr>
+          <w:p>
+            <w:r>
+              <w:t>counts</w:t>
+            </w:r>
+          </w:p>
+        </w:tc>
+      </w:tr>
+      <w:tr>
+        <w:tc>
+          <w:tcPr>
+            <w:tcW w:type="dxa" w:w="2160"/>
+          </w:tcPr>
+          <w:p>
+            <w:r>
+              <w:t>GSEApy prerank (v1.3.1)</w:t>
+            </w:r>
+          </w:p>
+        </w:tc>
+        <w:tc>
+          <w:tcPr>
+            <w:tcW w:type="dxa" w:w="2160"/>
+          </w:tcPr>
+          <w:p>
+            <w:r>
+              <w:t>library</w:t>
+            </w:r>
+          </w:p>
+        </w:tc>
+        <w:tc>
+          <w:tcPr>
+            <w:tcW w:type="dxa" w:w="2160"/>
+          </w:tcPr>
+          <w:p>
+            <w:r>
+              <w:t>src/strict_gsea.py</w:t>
+            </w:r>
+          </w:p>
+        </w:tc>
+        <w:tc>
+          <w:tcPr>
+            <w:tcW w:type="dxa" w:w="2160"/>
+          </w:tcPr>
+          <w:p>
+            <w:r>
+              <w:t>counts</w:t>
+            </w:r>
+          </w:p>
+        </w:tc>
+      </w:tr>
+      <w:tr>
+        <w:tc>
+          <w:tcPr>
+            <w:tcW w:type="dxa" w:w="2160"/>
+          </w:tcPr>
+          <w:p>
+            <w:r>
+              <w:t>Open Targets Platform GraphQL API (v26.9)</w:t>
+            </w:r>
+          </w:p>
+        </w:tc>
+        <w:tc>
+          <w:tcPr>
+            <w:tcW w:type="dxa" w:w="2160"/>
+          </w:tcPr>
+          <w:p>
+            <w:r>
+              <w:t>database/service</w:t>
+            </w:r>
+          </w:p>
+        </w:tc>
+        <w:tc>
+          <w:tcPr>
+            <w:tcW w:type="dxa" w:w="2160"/>
+          </w:tcPr>
+          <w:p>
+            <w:r>
+              <w:t>src/deficit_opentargets.py</w:t>
+            </w:r>
+          </w:p>
+        </w:tc>
+        <w:tc>
+          <w:tcPr>
+            <w:tcW w:type="dxa" w:w="2160"/>
+          </w:tcPr>
+          <w:p>
+            <w:r>
+              <w:t>counts</w:t>
+            </w:r>
+          </w:p>
+        </w:tc>
+      </w:tr>
+      <w:tr>
+        <w:tc>
+          <w:tcPr>
+            <w:tcW w:type="dxa" w:w="2160"/>
+          </w:tcPr>
+          <w:p>
+            <w:r>
+              <w:t>decoupler 2.1.4 (ulm)</w:t>
+            </w:r>
+          </w:p>
+        </w:tc>
+        <w:tc>
+          <w:tcPr>
+            <w:tcW w:type="dxa" w:w="2160"/>
+          </w:tcPr>
+          <w:p>
+            <w:r>
+              <w:t>library</w:t>
+            </w:r>
+          </w:p>
+        </w:tc>
+        <w:tc>
+          <w:tcPr>
+            <w:tcW w:type="dxa" w:w="2160"/>
+          </w:tcPr>
+          <w:p>
+            <w:r>
+              <w:t>src/deficit_decoupler.py</w:t>
+            </w:r>
+          </w:p>
+        </w:tc>
+        <w:tc>
+          <w:tcPr>
+            <w:tcW w:type="dxa" w:w="2160"/>
+          </w:tcPr>
+          <w:p>
+            <w:r>
+              <w:t>counts</w:t>
+            </w:r>
+          </w:p>
+        </w:tc>
+      </w:tr>
+      <w:tr>
+        <w:tc>
+          <w:tcPr>
+            <w:tcW w:type="dxa" w:w="2160"/>
+          </w:tcPr>
+          <w:p>
+            <w:r>
+              <w:t>OmniPath (CollecTRI TF regulons + PROGENy pathway footprints)</w:t>
+            </w:r>
+          </w:p>
+        </w:tc>
+        <w:tc>
+          <w:tcPr>
+            <w:tcW w:type="dxa" w:w="2160"/>
+          </w:tcPr>
+          <w:p>
+            <w:r>
+              <w:t>database/service</w:t>
+            </w:r>
+          </w:p>
+        </w:tc>
+        <w:tc>
+          <w:tcPr>
+            <w:tcW w:type="dxa" w:w="2160"/>
+          </w:tcPr>
+          <w:p>
+            <w:r>
+              <w:t>src/deficit_decoupler.py</w:t>
+            </w:r>
+          </w:p>
+        </w:tc>
+        <w:tc>
+          <w:tcPr>
+            <w:tcW w:type="dxa" w:w="2160"/>
+          </w:tcPr>
+          <w:p>
+            <w:r>
+              <w:t>counts</w:t>
+            </w:r>
+          </w:p>
+        </w:tc>
+      </w:tr>
+      <w:tr>
+        <w:tc>
+          <w:tcPr>
+            <w:tcW w:type="dxa" w:w="2160"/>
+          </w:tcPr>
+          <w:p>
+            <w:r>
+              <w:t>EBI Expression Atlas (baseline experiments FTP)</w:t>
+            </w:r>
+          </w:p>
+        </w:tc>
+        <w:tc>
+          <w:tcPr>
+            <w:tcW w:type="dxa" w:w="2160"/>
+          </w:tcPr>
+          <w:p>
+            <w:r>
+              <w:t>database/service</w:t>
+            </w:r>
+          </w:p>
+        </w:tc>
+        <w:tc>
+          <w:tcPr>
+            <w:tcW w:type="dxa" w:w="2160"/>
+          </w:tcPr>
+          <w:p>
+            <w:r>
+              <w:t>src/deficit_bodymap.py</w:t>
+            </w:r>
+          </w:p>
+        </w:tc>
+        <w:tc>
+          <w:tcPr>
+            <w:tcW w:type="dxa" w:w="2160"/>
+          </w:tcPr>
+          <w:p>
+            <w:r>
+              <w:t>counts</w:t>
+            </w:r>
+          </w:p>
+        </w:tc>
+      </w:tr>
+      <w:tr>
+        <w:tc>
+          <w:tcPr>
+            <w:tcW w:type="dxa" w:w="2160"/>
+          </w:tcPr>
+          <w:p>
+            <w:r>
+              <w:t>ClinPGx / PharmGKB gene download (release 2026-09-05)</w:t>
+            </w:r>
+          </w:p>
+        </w:tc>
+        <w:tc>
+          <w:tcPr>
+            <w:tcW w:type="dxa" w:w="2160"/>
+          </w:tcPr>
+          <w:p>
+            <w:r>
+              <w:t>database/service</w:t>
+            </w:r>
+          </w:p>
+        </w:tc>
+        <w:tc>
+          <w:tcPr>
+            <w:tcW w:type="dxa" w:w="2160"/>
+          </w:tcPr>
+          <w:p>
+            <w:r>
+              <w:t>src/deficit_clinpgx.py</w:t>
+            </w:r>
+          </w:p>
+        </w:tc>
+        <w:tc>
+          <w:tcPr>
+            <w:tcW w:type="dxa" w:w="2160"/>
+          </w:tcPr>
+          <w:p>
+            <w:r>
+              <w:t>counts</w:t>
+            </w:r>
+          </w:p>
+        </w:tc>
+      </w:tr>
+      <w:tr>
+        <w:tc>
+          <w:tcPr>
+            <w:tcW w:type="dxa" w:w="2160"/>
+          </w:tcPr>
+          <w:p>
+            <w:r>
+              <w:t>gnomAD v2.1.1 gene-level pLoF constraint</w:t>
+            </w:r>
+          </w:p>
+        </w:tc>
+        <w:tc>
+          <w:tcPr>
+            <w:tcW w:type="dxa" w:w="2160"/>
+          </w:tcPr>
+          <w:p>
+            <w:r>
+              <w:t>reference database</w:t>
+            </w:r>
+          </w:p>
+        </w:tc>
+        <w:tc>
+          <w:tcPr>
+            <w:tcW w:type="dxa" w:w="2160"/>
+          </w:tcPr>
+          <w:p>
+            <w:r>
+              <w:t>src/deficit_gnomad.py; results/deficit_gnomad.json</w:t>
+            </w:r>
+          </w:p>
+        </w:tc>
+        <w:tc>
+          <w:tcPr>
+            <w:tcW w:type="dxa" w:w="2160"/>
+          </w:tcPr>
+          <w:p>
+            <w:r>
+              <w:t>counts</w:t>
+            </w:r>
+          </w:p>
+        </w:tc>
+      </w:tr>
+      <w:tr>
+        <w:tc>
+          <w:tcPr>
+            <w:tcW w:type="dxa" w:w="2160"/>
+          </w:tcPr>
+          <w:p>
+            <w:r>
+              <w:t>Ensembl REST lookup/id</w:t>
+            </w:r>
+          </w:p>
+        </w:tc>
+        <w:tc>
+          <w:tcPr>
+            <w:tcW w:type="dxa" w:w="2160"/>
+          </w:tcPr>
+          <w:p>
+            <w:r>
+              <w:t>web API</w:t>
+            </w:r>
+          </w:p>
+        </w:tc>
+        <w:tc>
+          <w:tcPr>
+            <w:tcW w:type="dxa" w:w="2160"/>
+          </w:tcPr>
+          <w:p>
+            <w:r>
+              <w:t>src/deficit_ensembl_biotype.py; results/deficit_ensembl_biotype.json</w:t>
             </w:r>
           </w:p>
         </w:tc>
@@ -8026,6 +8503,60 @@
       </w:pPr>
       <w:r>
         <w:t>Moreno P, et al. Expression Atlas and ArrayExpress/BioStudies at EMBL-EBI. Nucleic Acids Res 2022.</w:t>
+      </w:r>
+    </w:p>
+    <w:p>
+      <w:pPr>
+        <w:spacing w:after="120"/>
+        <w:jc w:val="both"/>
+      </w:pPr>
+      <w:r>
+        <w:t>Open Targets Platform. https://platform.opentargets.org/</w:t>
+      </w:r>
+    </w:p>
+    <w:p>
+      <w:pPr>
+        <w:spacing w:after="120"/>
+        <w:jc w:val="both"/>
+      </w:pPr>
+      <w:r>
+        <w:t>Badia-i-Mompel P, et al. decoupleR: ensemble of computational methods to infer biological activities from omics data. Bioinform Adv 2022. https://bioconductor.org/packages/decoupleR/</w:t>
+      </w:r>
+    </w:p>
+    <w:p>
+      <w:pPr>
+        <w:spacing w:after="120"/>
+        <w:jc w:val="both"/>
+      </w:pPr>
+      <w:r>
+        <w:t>Turei D, et al. OmniPath: guidelines and gateway for literature-curated signaling pathway resources. Nat Methods 2016. https://omnipathdb.org/</w:t>
+      </w:r>
+    </w:p>
+    <w:p>
+      <w:pPr>
+        <w:spacing w:after="120"/>
+        <w:jc w:val="both"/>
+      </w:pPr>
+      <w:r>
+        <w:t>ClinPGx / PharmGKB. https://www.clinpgx.org/</w:t>
+      </w:r>
+    </w:p>
+    <w:p>
+      <w:pPr>
+        <w:spacing w:after="120"/>
+        <w:jc w:val="both"/>
+      </w:pPr>
+      <w:r>
+        <w:t>Karczewski KJ, et al. The mutational constraint spectrum quantified from variation in 141,456 humans. Nature 2020. https://gnomad.broadinstitute.org/help/constraint</w:t>
+      </w:r>
+    </w:p>
+    <w:p>
+      <w:pPr>
+        <w:spacing w:after="120"/>
+        <w:jc w:val="both"/>
+      </w:pPr>
+      <w:r>
+        <w:t>Ensembl REST API. https://rest.ensembl.org/documentation/info/lookup_post</w:t>
       </w:r>
     </w:p>
     <w:p>

</xml_diff>

<commit_message>
Paper v10 incorporates protein, pathway, single-cell and invalid tests
</commit_message>
<xml_diff>
--- a/paper/mega27-03-virtual-organoid-paper.docx
+++ b/paper/mega27-03-virtual-organoid-paper.docx
@@ -22,7 +22,7 @@
         <w:rPr>
           <w:rFonts w:ascii="Times New Roman" w:hAnsi="Times New Roman" w:eastAsia="Times New Roman"/>
         </w:rPr>
-        <w:t>MEGA-PROGRAM-27, Item 3 - Udita Phookan (program owner); computational work by an AI research agent. Draft of 25 September 2026.</w:t>
+        <w:t>MEGA-PROGRAM-27, Item 3 - Udita Phookan (program owner); computational work by an AI research agent. Working draft of 25 September 2026.</w:t>
       </w:r>
     </w:p>
     <w:p>
@@ -8641,6 +8641,113 @@
     </w:p>
     <w:p>
       <w:pPr>
+        <w:pStyle w:val="Heading2"/>
+      </w:pPr>
+      <w:r>
+        <w:rPr>
+          <w:rFonts w:ascii="Times New Roman" w:hAnsi="Times New Roman" w:eastAsia="Times New Roman"/>
+        </w:rPr>
+        <w:t>4.13 Independent protein and pathway annotation, single-cell challenge, and prior art</w:t>
+      </w:r>
+    </w:p>
+    <w:p>
+      <w:pPr>
+        <w:spacing w:after="120"/>
+        <w:jc w:val="both"/>
+      </w:pPr>
+      <w:r>
+        <w:rPr>
+          <w:rFonts w:ascii="Times New Roman" w:hAnsi="Times New Roman" w:eastAsia="Times New Roman"/>
+        </w:rPr>
+        <w:t>Independent pathway annotation (WikiPathways 2026-09-10, NCBI Gene mapping). A pre-registered fixed-name filter selected 16 pathways containing 'bile acid', 'fatty acid', 'drug metabolism' or 'xenobiotic metabolism'. Their union intersects 11/100 liver versus 1/100 brain top deficits (Fisher OR=12.24, p=0.0025; test passes). This supports the liver top-deficit pathway label in a second resource, not causation or organoid specificity; the comparison follows earlier exploratory results (results/deficit_wikipathways.json).</w:t>
+      </w:r>
+    </w:p>
+    <w:p>
+      <w:pPr>
+        <w:spacing w:after="120"/>
+        <w:jc w:val="both"/>
+      </w:pPr>
+      <w:r>
+        <w:rPr>
+          <w:rFonts w:ascii="Times New Roman" w:hAnsi="Times New Roman" w:eastAsia="Times New Roman"/>
+        </w:rPr>
+        <w:t>Adult-tissue protein check (HPA v25.1 mass spectrometry). Liver protein is detected in 75/100 liver versus 29/100 brain top deficits (Fisher OR=7.34, p=4.5e-11; pre-registered H1 passes). Only 26 liver and 22 brain list proteins have measured intensity in both adult liver and cortex, below the registered 50-per-list minimum, so the quantitative H2 is uninterpretable. There is no organoid proteome in this check (results/deficit_hpa_ms.json).</w:t>
+      </w:r>
+    </w:p>
+    <w:p>
+      <w:pPr>
+        <w:spacing w:after="120"/>
+        <w:jc w:val="both"/>
+      </w:pPr>
+      <w:r>
+        <w:rPr>
+          <w:rFonts w:ascii="Times New Roman" w:hAnsi="Times New Roman" w:eastAsia="Times New Roman"/>
+        </w:rPr>
+        <w:t>Single-cell challenge on an independent public human kidney-organoid accession, GSE108291. Scanpy sparse QC retains 9,638 cells in the main run and 1,421 in a second run; no cell coexpresses ALDOB and SLC17A3 (zero in both). The registered 1% two-marker H1 fails; the &lt;20% H2 passes. This does not show that proximal-tubule cells are absent, because sparse single-cell dropout and developmental state remain untested. QC thresholds were set after registration but before looking at marker coexpression; both runs count as one accession (results/sc_kidney_markers.json).</w:t>
+      </w:r>
+    </w:p>
+    <w:p>
+      <w:pPr>
+        <w:spacing w:after="120"/>
+        <w:jc w:val="both"/>
+      </w:pPr>
+      <w:r>
+        <w:rPr>
+          <w:rFonts w:ascii="Times New Roman" w:hAnsi="Times New Roman" w:eastAsia="Times New Roman"/>
+        </w:rPr>
+        <w:t>Ontology audit (EBI OLS4) distinguishes kidney cortex UBERON:0001225 from kidney UBERON:0002113, and cholangiocyte CL:1000488 from hepatocyte CL:0000182. This is a label check only, not proof of anatomical hierarchy or expression similarity; the exact 'proximal tubule cell' query was unresolved (results/ols_anatomy_audit.json).</w:t>
+      </w:r>
+    </w:p>
+    <w:p>
+      <w:pPr>
+        <w:spacing w:after="120"/>
+        <w:jc w:val="both"/>
+      </w:pPr>
+      <w:r>
+        <w:rPr>
+          <w:rFonts w:ascii="Times New Roman" w:hAnsi="Times New Roman" w:eastAsia="Times New Roman"/>
+        </w:rPr>
+        <w:t>HPO direct gene-phenotype annotation could not test liver-vs-brain metabolic phenotype enrichment: only 35/100 liver and 28/100 brain deficits have any HPO annotation, below the pre-registered 50/list coverage floor. No clinical inference from the missing annotations (results/deficit_hpo.json).</w:t>
+      </w:r>
+    </w:p>
+    <w:p>
+      <w:pPr>
+        <w:spacing w:after="120"/>
+        <w:jc w:val="both"/>
+      </w:pPr>
+      <w:r>
+        <w:rPr>
+          <w:rFonts w:ascii="Times New Roman" w:hAnsi="Times New Roman" w:eastAsia="Times New Roman"/>
+        </w:rPr>
+        <w:t>InterPro domain audit is invalid as a top-deficit comparison. Its registered six liver pharmacogenes were incorrectly called top-100 deficits: only CYP2D6 actually is one. The protein-domain annotations remain correct, but the primary contrast cannot be scored (results/deficit_interpro.json).</w:t>
+      </w:r>
+    </w:p>
+    <w:p>
+      <w:pPr>
+        <w:spacing w:after="120"/>
+        <w:jc w:val="both"/>
+      </w:pPr>
+      <w:r>
+        <w:rPr>
+          <w:rFonts w:ascii="Times New Roman" w:hAnsi="Times New Roman" w:eastAsia="Times New Roman"/>
+        </w:rPr>
+        <w:t>A fixed three-query Europe PMC title/abstract search returned 6 distinct records. None explicitly reported human intestinal CF organoid starting-size moderation of modulator-induced FIS in its abstract, but absence in a narrow search does not establish novelty. Related work links nasal organoid lumen to baseline CFTR function and pig pancreatic organoid size to absent lumen (results/epmc_priorart_review.md).</w:t>
+      </w:r>
+    </w:p>
+    <w:p>
+      <w:pPr>
+        <w:spacing w:after="120"/>
+        <w:jc w:val="both"/>
+      </w:pPr>
+      <w:r>
+        <w:rPr>
+          <w:rFonts w:ascii="Times New Roman" w:hAnsi="Times New Roman" w:eastAsia="Times New Roman"/>
+        </w:rPr>
+        <w:t>Synthesis. The liver top-deficit list has independent pathway and adult-tissue protein support, while no new organoid proteome, matched tissue, perturbation, or clinical outcomes validate its effect on fidelity. The kidney external profiles recover their tissue despite the strict single-cell marker test failing. The candidate remains unproven; do not offer the tool as diagnosis.</w:t>
+      </w:r>
+    </w:p>
+    <w:p>
+      <w:pPr>
         <w:pStyle w:val="Heading1"/>
       </w:pPr>
       <w:r>
@@ -8839,6 +8946,42 @@
         <w:rPr>
           <w:rFonts w:ascii="Times New Roman" w:hAnsi="Times New Roman" w:eastAsia="Times New Roman"/>
         </w:rPr>
+        <w:t>- Single-cell GSE108291: no ALDOB/SLC17A3 coexpression under the registered two-marker definition; dropout is an alternative.</w:t>
+      </w:r>
+    </w:p>
+    <w:p>
+      <w:pPr>
+        <w:spacing w:after="120"/>
+        <w:jc w:val="both"/>
+      </w:pPr>
+      <w:r>
+        <w:rPr>
+          <w:rFonts w:ascii="Times New Roman" w:hAnsi="Times New Roman" w:eastAsia="Times New Roman"/>
+        </w:rPr>
+        <w:t>- HPO: too few annotated genes for the registered clinical phenotype contrast.</w:t>
+      </w:r>
+    </w:p>
+    <w:p>
+      <w:pPr>
+        <w:spacing w:after="120"/>
+        <w:jc w:val="both"/>
+      </w:pPr>
+      <w:r>
+        <w:rPr>
+          <w:rFonts w:ascii="Times New Roman" w:hAnsi="Times New Roman" w:eastAsia="Times New Roman"/>
+        </w:rPr>
+        <w:t>- InterPro: primary contrast invalid due to mistaken liver top-100 gene-set membership.</w:t>
+      </w:r>
+    </w:p>
+    <w:p>
+      <w:pPr>
+        <w:spacing w:after="120"/>
+        <w:jc w:val="both"/>
+      </w:pPr>
+      <w:r>
+        <w:rPr>
+          <w:rFonts w:ascii="Times New Roman" w:hAnsi="Times New Roman" w:eastAsia="Times New Roman"/>
+        </w:rPr>
         <w:t>- Fidelity: the culture-fibroblast attractor is RETRACTED as a general organoid property: on 45 series whose samples are all organoids it shrinks to 9-29% of series (Section 4.9).</w:t>
       </w:r>
     </w:p>
@@ -8906,7 +9049,7 @@
           <w:rFonts w:ascii="Times New Roman" w:hAnsi="Times New Roman" w:eastAsia="Times New Roman"/>
           <w:b/>
         </w:rPr>
-        <w:t>Table 12. Tools genuinely used (results/tools_ledger.csv): 35 entries, 29 counting toward the gate after excluding infrastructure. Target of 40 not reached.</w:t>
+        <w:t>Table 12. Tools genuinely used (results/tools_ledger.csv): 42 entries, 35 counting toward the gate after excluding infrastructure. Target of 40 not reached.</w:t>
       </w:r>
     </w:p>
     <w:tbl>
@@ -10861,6 +11004,384 @@
                 <w:rFonts w:ascii="Times New Roman" w:hAnsi="Times New Roman" w:eastAsia="Times New Roman"/>
               </w:rPr>
               <w:t>counts</w:t>
+            </w:r>
+          </w:p>
+        </w:tc>
+      </w:tr>
+      <w:tr>
+        <w:tc>
+          <w:tcPr>
+            <w:tcW w:type="dxa" w:w="2160"/>
+          </w:tcPr>
+          <w:p>
+            <w:r>
+              <w:rPr>
+                <w:rFonts w:ascii="Times New Roman" w:hAnsi="Times New Roman" w:eastAsia="Times New Roman"/>
+              </w:rPr>
+              <w:t>Scanpy 1.11.5</w:t>
+            </w:r>
+          </w:p>
+        </w:tc>
+        <w:tc>
+          <w:tcPr>
+            <w:tcW w:type="dxa" w:w="2160"/>
+          </w:tcPr>
+          <w:p>
+            <w:r>
+              <w:rPr>
+                <w:rFonts w:ascii="Times New Roman" w:hAnsi="Times New Roman" w:eastAsia="Times New Roman"/>
+              </w:rPr>
+              <w:t>library</w:t>
+            </w:r>
+          </w:p>
+        </w:tc>
+        <w:tc>
+          <w:tcPr>
+            <w:tcW w:type="dxa" w:w="2160"/>
+          </w:tcPr>
+          <w:p>
+            <w:r>
+              <w:rPr>
+                <w:rFonts w:ascii="Times New Roman" w:hAnsi="Times New Roman" w:eastAsia="Times New Roman"/>
+              </w:rPr>
+              <w:t>src/sc_kidney_markers.py; results/sc_kidney_markers.json</w:t>
+            </w:r>
+          </w:p>
+        </w:tc>
+        <w:tc>
+          <w:tcPr>
+            <w:tcW w:type="dxa" w:w="2160"/>
+          </w:tcPr>
+          <w:p>
+            <w:r>
+              <w:rPr>
+                <w:rFonts w:ascii="Times New Roman" w:hAnsi="Times New Roman" w:eastAsia="Times New Roman"/>
+              </w:rPr>
+              <w:t>counts</w:t>
+            </w:r>
+          </w:p>
+        </w:tc>
+      </w:tr>
+      <w:tr>
+        <w:tc>
+          <w:tcPr>
+            <w:tcW w:type="dxa" w:w="2160"/>
+          </w:tcPr>
+          <w:p>
+            <w:r>
+              <w:rPr>
+                <w:rFonts w:ascii="Times New Roman" w:hAnsi="Times New Roman" w:eastAsia="Times New Roman"/>
+              </w:rPr>
+              <w:t>Human Phenotype Ontology gene-to-phenotype release</w:t>
+            </w:r>
+          </w:p>
+        </w:tc>
+        <w:tc>
+          <w:tcPr>
+            <w:tcW w:type="dxa" w:w="2160"/>
+          </w:tcPr>
+          <w:p>
+            <w:r>
+              <w:rPr>
+                <w:rFonts w:ascii="Times New Roman" w:hAnsi="Times New Roman" w:eastAsia="Times New Roman"/>
+              </w:rPr>
+              <w:t>reference ontology/database</w:t>
+            </w:r>
+          </w:p>
+        </w:tc>
+        <w:tc>
+          <w:tcPr>
+            <w:tcW w:type="dxa" w:w="2160"/>
+          </w:tcPr>
+          <w:p>
+            <w:r>
+              <w:rPr>
+                <w:rFonts w:ascii="Times New Roman" w:hAnsi="Times New Roman" w:eastAsia="Times New Roman"/>
+              </w:rPr>
+              <w:t>src/deficit_hpo.py; results/deficit_hpo.json</w:t>
+            </w:r>
+          </w:p>
+        </w:tc>
+        <w:tc>
+          <w:tcPr>
+            <w:tcW w:type="dxa" w:w="2160"/>
+          </w:tcPr>
+          <w:p>
+            <w:r>
+              <w:rPr>
+                <w:rFonts w:ascii="Times New Roman" w:hAnsi="Times New Roman" w:eastAsia="Times New Roman"/>
+              </w:rPr>
+              <w:t>counts</w:t>
+            </w:r>
+          </w:p>
+        </w:tc>
+      </w:tr>
+      <w:tr>
+        <w:tc>
+          <w:tcPr>
+            <w:tcW w:type="dxa" w:w="2160"/>
+          </w:tcPr>
+          <w:p>
+            <w:r>
+              <w:rPr>
+                <w:rFonts w:ascii="Times New Roman" w:hAnsi="Times New Roman" w:eastAsia="Times New Roman"/>
+              </w:rPr>
+              <w:t>Europe PMC REST search</w:t>
+            </w:r>
+          </w:p>
+        </w:tc>
+        <w:tc>
+          <w:tcPr>
+            <w:tcW w:type="dxa" w:w="2160"/>
+          </w:tcPr>
+          <w:p>
+            <w:r>
+              <w:rPr>
+                <w:rFonts w:ascii="Times New Roman" w:hAnsi="Times New Roman" w:eastAsia="Times New Roman"/>
+              </w:rPr>
+              <w:t>literature API</w:t>
+            </w:r>
+          </w:p>
+        </w:tc>
+        <w:tc>
+          <w:tcPr>
+            <w:tcW w:type="dxa" w:w="2160"/>
+          </w:tcPr>
+          <w:p>
+            <w:r>
+              <w:rPr>
+                <w:rFonts w:ascii="Times New Roman" w:hAnsi="Times New Roman" w:eastAsia="Times New Roman"/>
+              </w:rPr>
+              <w:t>src/epmc_priorart.py; results/epmc_priorart.json; results/epmc_priorart_review.md</w:t>
+            </w:r>
+          </w:p>
+        </w:tc>
+        <w:tc>
+          <w:tcPr>
+            <w:tcW w:type="dxa" w:w="2160"/>
+          </w:tcPr>
+          <w:p>
+            <w:r>
+              <w:rPr>
+                <w:rFonts w:ascii="Times New Roman" w:hAnsi="Times New Roman" w:eastAsia="Times New Roman"/>
+              </w:rPr>
+              <w:t>counts</w:t>
+            </w:r>
+          </w:p>
+        </w:tc>
+      </w:tr>
+      <w:tr>
+        <w:tc>
+          <w:tcPr>
+            <w:tcW w:type="dxa" w:w="2160"/>
+          </w:tcPr>
+          <w:p>
+            <w:r>
+              <w:rPr>
+                <w:rFonts w:ascii="Times New Roman" w:hAnsi="Times New Roman" w:eastAsia="Times New Roman"/>
+              </w:rPr>
+              <w:t>InterPro protein-domain API</w:t>
+            </w:r>
+          </w:p>
+        </w:tc>
+        <w:tc>
+          <w:tcPr>
+            <w:tcW w:type="dxa" w:w="2160"/>
+          </w:tcPr>
+          <w:p>
+            <w:r>
+              <w:rPr>
+                <w:rFonts w:ascii="Times New Roman" w:hAnsi="Times New Roman" w:eastAsia="Times New Roman"/>
+              </w:rPr>
+              <w:t>database/service</w:t>
+            </w:r>
+          </w:p>
+        </w:tc>
+        <w:tc>
+          <w:tcPr>
+            <w:tcW w:type="dxa" w:w="2160"/>
+          </w:tcPr>
+          <w:p>
+            <w:r>
+              <w:rPr>
+                <w:rFonts w:ascii="Times New Roman" w:hAnsi="Times New Roman" w:eastAsia="Times New Roman"/>
+              </w:rPr>
+              <w:t>src/deficit_interpro.py; results/deficit_interpro.json</w:t>
+            </w:r>
+          </w:p>
+        </w:tc>
+        <w:tc>
+          <w:tcPr>
+            <w:tcW w:type="dxa" w:w="2160"/>
+          </w:tcPr>
+          <w:p>
+            <w:r>
+              <w:rPr>
+                <w:rFonts w:ascii="Times New Roman" w:hAnsi="Times New Roman" w:eastAsia="Times New Roman"/>
+              </w:rPr>
+              <w:t>counts</w:t>
+            </w:r>
+          </w:p>
+        </w:tc>
+      </w:tr>
+      <w:tr>
+        <w:tc>
+          <w:tcPr>
+            <w:tcW w:type="dxa" w:w="2160"/>
+          </w:tcPr>
+          <w:p>
+            <w:r>
+              <w:rPr>
+                <w:rFonts w:ascii="Times New Roman" w:hAnsi="Times New Roman" w:eastAsia="Times New Roman"/>
+              </w:rPr>
+              <w:t>WikiPathways 2026-09-10 human GMT</w:t>
+            </w:r>
+          </w:p>
+        </w:tc>
+        <w:tc>
+          <w:tcPr>
+            <w:tcW w:type="dxa" w:w="2160"/>
+          </w:tcPr>
+          <w:p>
+            <w:r>
+              <w:rPr>
+                <w:rFonts w:ascii="Times New Roman" w:hAnsi="Times New Roman" w:eastAsia="Times New Roman"/>
+              </w:rPr>
+              <w:t>pathway database</w:t>
+            </w:r>
+          </w:p>
+        </w:tc>
+        <w:tc>
+          <w:tcPr>
+            <w:tcW w:type="dxa" w:w="2160"/>
+          </w:tcPr>
+          <w:p>
+            <w:r>
+              <w:rPr>
+                <w:rFonts w:ascii="Times New Roman" w:hAnsi="Times New Roman" w:eastAsia="Times New Roman"/>
+              </w:rPr>
+              <w:t>src/deficit_wikipathways.py; results/deficit_wikipathways.json</w:t>
+            </w:r>
+          </w:p>
+        </w:tc>
+        <w:tc>
+          <w:tcPr>
+            <w:tcW w:type="dxa" w:w="2160"/>
+          </w:tcPr>
+          <w:p>
+            <w:r>
+              <w:rPr>
+                <w:rFonts w:ascii="Times New Roman" w:hAnsi="Times New Roman" w:eastAsia="Times New Roman"/>
+              </w:rPr>
+              <w:t>counts</w:t>
+            </w:r>
+          </w:p>
+        </w:tc>
+      </w:tr>
+      <w:tr>
+        <w:tc>
+          <w:tcPr>
+            <w:tcW w:type="dxa" w:w="2160"/>
+          </w:tcPr>
+          <w:p>
+            <w:r>
+              <w:rPr>
+                <w:rFonts w:ascii="Times New Roman" w:hAnsi="Times New Roman" w:eastAsia="Times New Roman"/>
+              </w:rPr>
+              <w:t>NCBI Gene human gene_info</w:t>
+            </w:r>
+          </w:p>
+        </w:tc>
+        <w:tc>
+          <w:tcPr>
+            <w:tcW w:type="dxa" w:w="2160"/>
+          </w:tcPr>
+          <w:p>
+            <w:r>
+              <w:rPr>
+                <w:rFonts w:ascii="Times New Roman" w:hAnsi="Times New Roman" w:eastAsia="Times New Roman"/>
+              </w:rPr>
+              <w:t>reference database</w:t>
+            </w:r>
+          </w:p>
+        </w:tc>
+        <w:tc>
+          <w:tcPr>
+            <w:tcW w:type="dxa" w:w="2160"/>
+          </w:tcPr>
+          <w:p>
+            <w:r>
+              <w:rPr>
+                <w:rFonts w:ascii="Times New Roman" w:hAnsi="Times New Roman" w:eastAsia="Times New Roman"/>
+              </w:rPr>
+              <w:t>src/deficit_wikipathways.py; results/deficit_wikipathways.json</w:t>
+            </w:r>
+          </w:p>
+        </w:tc>
+        <w:tc>
+          <w:tcPr>
+            <w:tcW w:type="dxa" w:w="2160"/>
+          </w:tcPr>
+          <w:p>
+            <w:r>
+              <w:rPr>
+                <w:rFonts w:ascii="Times New Roman" w:hAnsi="Times New Roman" w:eastAsia="Times New Roman"/>
+              </w:rPr>
+              <w:t>counts</w:t>
+            </w:r>
+          </w:p>
+        </w:tc>
+      </w:tr>
+      <w:tr>
+        <w:tc>
+          <w:tcPr>
+            <w:tcW w:type="dxa" w:w="2160"/>
+          </w:tcPr>
+          <w:p>
+            <w:r>
+              <w:rPr>
+                <w:rFonts w:ascii="Times New Roman" w:hAnsi="Times New Roman" w:eastAsia="Times New Roman"/>
+              </w:rPr>
+              <w:t>Human Protein Atlas mass-spectrometry tissue download</w:t>
+            </w:r>
+          </w:p>
+        </w:tc>
+        <w:tc>
+          <w:tcPr>
+            <w:tcW w:type="dxa" w:w="2160"/>
+          </w:tcPr>
+          <w:p>
+            <w:r>
+              <w:rPr>
+                <w:rFonts w:ascii="Times New Roman" w:hAnsi="Times New Roman" w:eastAsia="Times New Roman"/>
+              </w:rPr>
+              <w:t>dataset</w:t>
+            </w:r>
+          </w:p>
+        </w:tc>
+        <w:tc>
+          <w:tcPr>
+            <w:tcW w:type="dxa" w:w="2160"/>
+          </w:tcPr>
+          <w:p>
+            <w:r>
+              <w:rPr>
+                <w:rFonts w:ascii="Times New Roman" w:hAnsi="Times New Roman" w:eastAsia="Times New Roman"/>
+              </w:rPr>
+              <w:t>src/deficit_hpa_ms.py; results/deficit_hpa_ms.json</w:t>
+            </w:r>
+          </w:p>
+        </w:tc>
+        <w:tc>
+          <w:tcPr>
+            <w:tcW w:type="dxa" w:w="2160"/>
+          </w:tcPr>
+          <w:p>
+            <w:r>
+              <w:rPr>
+                <w:rFonts w:ascii="Times New Roman" w:hAnsi="Times New Roman" w:eastAsia="Times New Roman"/>
+              </w:rPr>
+              <w:t>infra (excluded)</w:t>
             </w:r>
           </w:p>
         </w:tc>
@@ -11031,6 +11552,90 @@
           <w:rFonts w:ascii="Times New Roman" w:hAnsi="Times New Roman" w:eastAsia="Times New Roman"/>
         </w:rPr>
         <w:t>Ensembl REST API. https://rest.ensembl.org/documentation/info/lookup_post</w:t>
+      </w:r>
+    </w:p>
+    <w:p>
+      <w:pPr>
+        <w:spacing w:after="120"/>
+        <w:jc w:val="both"/>
+      </w:pPr>
+      <w:r>
+        <w:rPr>
+          <w:rFonts w:ascii="Times New Roman" w:hAnsi="Times New Roman" w:eastAsia="Times New Roman"/>
+        </w:rPr>
+        <w:t>WikiPathways monthly releases. https://data.wikipathways.org/20260910/gmt/</w:t>
+      </w:r>
+    </w:p>
+    <w:p>
+      <w:pPr>
+        <w:spacing w:after="120"/>
+        <w:jc w:val="both"/>
+      </w:pPr>
+      <w:r>
+        <w:rPr>
+          <w:rFonts w:ascii="Times New Roman" w:hAnsi="Times New Roman" w:eastAsia="Times New Roman"/>
+        </w:rPr>
+        <w:t>Human Protein Atlas protein mass-spectrometry normal tissue download. https://www.proteinatlas.org/humanproteome/tissue/data</w:t>
+      </w:r>
+    </w:p>
+    <w:p>
+      <w:pPr>
+        <w:spacing w:after="120"/>
+        <w:jc w:val="both"/>
+      </w:pPr>
+      <w:r>
+        <w:rPr>
+          <w:rFonts w:ascii="Times New Roman" w:hAnsi="Times New Roman" w:eastAsia="Times New Roman"/>
+        </w:rPr>
+        <w:t>Human Phenotype Ontology gene-to-phenotype annotation. https://obophenotype.github.io/human-phenotype-ontology/annotations/genes_to_phenotype/</w:t>
+      </w:r>
+    </w:p>
+    <w:p>
+      <w:pPr>
+        <w:spacing w:after="120"/>
+        <w:jc w:val="both"/>
+      </w:pPr>
+      <w:r>
+        <w:rPr>
+          <w:rFonts w:ascii="Times New Roman" w:hAnsi="Times New Roman" w:eastAsia="Times New Roman"/>
+        </w:rPr>
+        <w:t>EBI Ontology Lookup Service 4. https://www.ebi.ac.uk/ols4/api-docs</w:t>
+      </w:r>
+    </w:p>
+    <w:p>
+      <w:pPr>
+        <w:spacing w:after="120"/>
+        <w:jc w:val="both"/>
+      </w:pPr>
+      <w:r>
+        <w:rPr>
+          <w:rFonts w:ascii="Times New Roman" w:hAnsi="Times New Roman" w:eastAsia="Times New Roman"/>
+        </w:rPr>
+        <w:t>Human Cell Atlas GSE108291 kidney organoid single-cell project. https://explore.data.humancellatlas.org/projects/7b947aa2-43a7-4082-afff-222a3e3a4635</w:t>
+      </w:r>
+    </w:p>
+    <w:p>
+      <w:pPr>
+        <w:spacing w:after="120"/>
+        <w:jc w:val="both"/>
+      </w:pPr>
+      <w:r>
+        <w:rPr>
+          <w:rFonts w:ascii="Times New Roman" w:hAnsi="Times New Roman" w:eastAsia="Times New Roman"/>
+        </w:rPr>
+        <w:t>InterPro API. https://interpro-documentation.readthedocs.io/en/latest/api.html</w:t>
+      </w:r>
+    </w:p>
+    <w:p>
+      <w:pPr>
+        <w:spacing w:after="120"/>
+        <w:jc w:val="both"/>
+      </w:pPr>
+      <w:r>
+        <w:rPr>
+          <w:rFonts w:ascii="Times New Roman" w:hAnsi="Times New Roman" w:eastAsia="Times New Roman"/>
+        </w:rPr>
+        <w:t>Europe PMC RESTful Web Service. https://europepmc.org/RestfulWebService</w:t>
       </w:r>
     </w:p>
     <w:p>

</xml_diff>

<commit_message>
Correct validation leakage claim and audit held-out eval uncertainty
</commit_message>
<xml_diff>
--- a/paper/mega27-03-virtual-organoid-paper.docx
+++ b/paper/mega27-03-virtual-organoid-paper.docx
@@ -435,7 +435,7 @@
           <w:rFonts w:ascii="Times New Roman" w:hAnsi="Times New Roman" w:eastAsia="Times New Roman"/>
           <w:b/>
         </w:rPr>
-        <w:t>Table 1. Dataset manifest (distinct, accession-level). Three distinct assay/image datasets shown here; the separate, committed accession ledger includes 164 primary GEO/ArrayExpress datasets used for the organoid-fidelity analyses.</w:t>
+        <w:t>Table 1. Dataset manifest (distinct, accession-level). Three distinct assay/image datasets shown here; the separate, committed accession ledger includes 165 primary GEO/ArrayExpress accessions (including GSE108291) used for organoid-fidelity analyses.</w:t>
       </w:r>
     </w:p>
     <w:tbl>
@@ -3440,6 +3440,29 @@
           <w:rFonts w:ascii="Times New Roman" w:hAnsi="Times New Roman" w:eastAsia="Times New Roman"/>
         </w:rPr>
         <w:t>Caveat: the validation images used for tuning were also in the training set, so the tuning signal is optimistic; the eval split was scored once. The 512-px model (resumed from checkpoint after an out-of-memory kill at epoch 18) raises the tuned score from 0.710 to 0.733, still below the published mean. With 12 eval images and sd near 0.13, neither a win nor a loss against OrgaSegment is statistically resolved; we report it as below state of the art.</w:t>
+      </w:r>
+    </w:p>
+    <w:p>
+      <w:pPr>
+        <w:pStyle w:val="Heading2"/>
+      </w:pPr>
+      <w:r>
+        <w:rPr>
+          <w:rFonts w:ascii="Times New Roman" w:hAnsi="Times New Roman" w:eastAsia="Times New Roman"/>
+        </w:rPr>
+        <w:t>4.5a Segmentation split-integrity correction</w:t>
+      </w:r>
+    </w:p>
+    <w:p>
+      <w:pPr>
+        <w:spacing w:after="120"/>
+        <w:jc w:val="both"/>
+      </w:pPr>
+      <w:r>
+        <w:rPr>
+          <w:rFonts w:ascii="Times New Roman" w:hAnsi="Times New Roman" w:eastAsia="Times New Roman"/>
+        </w:rPr>
+        <w:t>Training combined 184 train and 35 validation images. The later post-processing grid was tuned on the first 20 validation images, so its validation mAP is biased by overlap with network training and is not an independent model-selection result. The disjoint 12-image eval split was held out, and its mAP@0.5 remains 0.733 versus published 0.76. Bootstrap across our eval images gives CI [0.663, 0.808] for our mean, but leader per-image predictions and guaranteed identical AP implementation are unavailable. No benchmark break (results/seg_integrity_audit.json).</w:t>
       </w:r>
     </w:p>
     <w:p>

</xml_diff>

<commit_message>
Update paper with GOA KEGG and Rhea evidence and limits
</commit_message>
<xml_diff>
--- a/paper/mega27-03-virtual-organoid-paper.docx
+++ b/paper/mega27-03-virtual-organoid-paper.docx
@@ -8686,6 +8686,309 @@
       </w:r>
     </w:p>
     <w:p>
+      <w:r>
+        <w:rPr>
+          <w:rFonts w:ascii="Times New Roman" w:hAnsi="Times New Roman" w:eastAsia="Times New Roman"/>
+          <w:b/>
+        </w:rPr>
+        <w:t>Table 12. Further pre-registered annotation checks on fixed 100-gene deficit lists, not independent experiments. Each p is descriptive in an exploratory sequence; results/deficit_goa.json, deficit_kegg.json, deficit_rhea.json.</w:t>
+      </w:r>
+    </w:p>
+    <w:tbl>
+      <w:tblPr>
+        <w:tblStyle w:val="LightGrid-Accent1"/>
+        <w:tblW w:type="auto" w:w="0"/>
+        <w:tblLook w:firstColumn="1" w:firstRow="1" w:lastColumn="0" w:lastRow="0" w:noHBand="0" w:noVBand="1" w:val="04A0"/>
+      </w:tblPr>
+      <w:tblGrid>
+        <w:gridCol w:w="1728"/>
+        <w:gridCol w:w="1728"/>
+        <w:gridCol w:w="1728"/>
+        <w:gridCol w:w="1728"/>
+        <w:gridCol w:w="1728"/>
+      </w:tblGrid>
+      <w:tr>
+        <w:tc>
+          <w:tcPr>
+            <w:tcW w:type="dxa" w:w="1728"/>
+          </w:tcPr>
+          <w:p>
+            <w:r>
+              <w:rPr>
+                <w:rFonts w:ascii="Times New Roman" w:hAnsi="Times New Roman" w:eastAsia="Times New Roman"/>
+              </w:rPr>
+              <w:t>curated source</w:t>
+            </w:r>
+          </w:p>
+        </w:tc>
+        <w:tc>
+          <w:tcPr>
+            <w:tcW w:type="dxa" w:w="1728"/>
+          </w:tcPr>
+          <w:p>
+            <w:r>
+              <w:rPr>
+                <w:rFonts w:ascii="Times New Roman" w:hAnsi="Times New Roman" w:eastAsia="Times New Roman"/>
+              </w:rPr>
+              <w:t>selected definition</w:t>
+            </w:r>
+          </w:p>
+        </w:tc>
+        <w:tc>
+          <w:tcPr>
+            <w:tcW w:type="dxa" w:w="1728"/>
+          </w:tcPr>
+          <w:p>
+            <w:r>
+              <w:rPr>
+                <w:rFonts w:ascii="Times New Roman" w:hAnsi="Times New Roman" w:eastAsia="Times New Roman"/>
+              </w:rPr>
+              <w:t>liver top-100</w:t>
+            </w:r>
+          </w:p>
+        </w:tc>
+        <w:tc>
+          <w:tcPr>
+            <w:tcW w:type="dxa" w:w="1728"/>
+          </w:tcPr>
+          <w:p>
+            <w:r>
+              <w:rPr>
+                <w:rFonts w:ascii="Times New Roman" w:hAnsi="Times New Roman" w:eastAsia="Times New Roman"/>
+              </w:rPr>
+              <w:t>brain top-100</w:t>
+            </w:r>
+          </w:p>
+        </w:tc>
+        <w:tc>
+          <w:tcPr>
+            <w:tcW w:type="dxa" w:w="1728"/>
+          </w:tcPr>
+          <w:p>
+            <w:r>
+              <w:rPr>
+                <w:rFonts w:ascii="Times New Roman" w:hAnsi="Times New Roman" w:eastAsia="Times New Roman"/>
+              </w:rPr>
+              <w:t>one-sided Fisher p</w:t>
+            </w:r>
+          </w:p>
+        </w:tc>
+      </w:tr>
+      <w:tr>
+        <w:tc>
+          <w:tcPr>
+            <w:tcW w:type="dxa" w:w="1728"/>
+          </w:tcPr>
+          <w:p>
+            <w:r>
+              <w:rPr>
+                <w:rFonts w:ascii="Times New Roman" w:hAnsi="Times New Roman" w:eastAsia="Times New Roman"/>
+              </w:rPr>
+              <w:t>EBI GOA</w:t>
+            </w:r>
+          </w:p>
+        </w:tc>
+        <w:tc>
+          <w:tcPr>
+            <w:tcW w:type="dxa" w:w="1728"/>
+          </w:tcPr>
+          <w:p>
+            <w:r>
+              <w:rPr>
+                <w:rFonts w:ascii="Times New Roman" w:hAnsi="Times New Roman" w:eastAsia="Times New Roman"/>
+              </w:rPr>
+              <w:t>3 direct metabolic BP terms</w:t>
+            </w:r>
+          </w:p>
+        </w:tc>
+        <w:tc>
+          <w:tcPr>
+            <w:tcW w:type="dxa" w:w="1728"/>
+          </w:tcPr>
+          <w:p>
+            <w:r>
+              <w:rPr>
+                <w:rFonts w:ascii="Times New Roman" w:hAnsi="Times New Roman" w:eastAsia="Times New Roman"/>
+              </w:rPr>
+              <w:t>11</w:t>
+            </w:r>
+          </w:p>
+        </w:tc>
+        <w:tc>
+          <w:tcPr>
+            <w:tcW w:type="dxa" w:w="1728"/>
+          </w:tcPr>
+          <w:p>
+            <w:r>
+              <w:rPr>
+                <w:rFonts w:ascii="Times New Roman" w:hAnsi="Times New Roman" w:eastAsia="Times New Roman"/>
+              </w:rPr>
+              <w:t>2</w:t>
+            </w:r>
+          </w:p>
+        </w:tc>
+        <w:tc>
+          <w:tcPr>
+            <w:tcW w:type="dxa" w:w="1728"/>
+          </w:tcPr>
+          <w:p>
+            <w:r>
+              <w:rPr>
+                <w:rFonts w:ascii="Times New Roman" w:hAnsi="Times New Roman" w:eastAsia="Times New Roman"/>
+              </w:rPr>
+              <w:t>0.0092</w:t>
+            </w:r>
+          </w:p>
+        </w:tc>
+      </w:tr>
+      <w:tr>
+        <w:tc>
+          <w:tcPr>
+            <w:tcW w:type="dxa" w:w="1728"/>
+          </w:tcPr>
+          <w:p>
+            <w:r>
+              <w:rPr>
+                <w:rFonts w:ascii="Times New Roman" w:hAnsi="Times New Roman" w:eastAsia="Times New Roman"/>
+              </w:rPr>
+              <w:t>KEGG REST</w:t>
+            </w:r>
+          </w:p>
+        </w:tc>
+        <w:tc>
+          <w:tcPr>
+            <w:tcW w:type="dxa" w:w="1728"/>
+          </w:tcPr>
+          <w:p>
+            <w:r>
+              <w:rPr>
+                <w:rFonts w:ascii="Times New Roman" w:hAnsi="Times New Roman" w:eastAsia="Times New Roman"/>
+              </w:rPr>
+              <w:t>9 fixed-title metabolic pathways</w:t>
+            </w:r>
+          </w:p>
+        </w:tc>
+        <w:tc>
+          <w:tcPr>
+            <w:tcW w:type="dxa" w:w="1728"/>
+          </w:tcPr>
+          <w:p>
+            <w:r>
+              <w:rPr>
+                <w:rFonts w:ascii="Times New Roman" w:hAnsi="Times New Roman" w:eastAsia="Times New Roman"/>
+              </w:rPr>
+              <w:t>7</w:t>
+            </w:r>
+          </w:p>
+        </w:tc>
+        <w:tc>
+          <w:tcPr>
+            <w:tcW w:type="dxa" w:w="1728"/>
+          </w:tcPr>
+          <w:p>
+            <w:r>
+              <w:rPr>
+                <w:rFonts w:ascii="Times New Roman" w:hAnsi="Times New Roman" w:eastAsia="Times New Roman"/>
+              </w:rPr>
+              <w:t>0</w:t>
+            </w:r>
+          </w:p>
+        </w:tc>
+        <w:tc>
+          <w:tcPr>
+            <w:tcW w:type="dxa" w:w="1728"/>
+          </w:tcPr>
+          <w:p>
+            <w:r>
+              <w:rPr>
+                <w:rFonts w:ascii="Times New Roman" w:hAnsi="Times New Roman" w:eastAsia="Times New Roman"/>
+              </w:rPr>
+              <w:t>0.0070</w:t>
+            </w:r>
+          </w:p>
+        </w:tc>
+      </w:tr>
+      <w:tr>
+        <w:tc>
+          <w:tcPr>
+            <w:tcW w:type="dxa" w:w="1728"/>
+          </w:tcPr>
+          <w:p>
+            <w:r>
+              <w:rPr>
+                <w:rFonts w:ascii="Times New Roman" w:hAnsi="Times New Roman" w:eastAsia="Times New Roman"/>
+              </w:rPr>
+              <w:t>Rhea</w:t>
+            </w:r>
+          </w:p>
+        </w:tc>
+        <w:tc>
+          <w:tcPr>
+            <w:tcW w:type="dxa" w:w="1728"/>
+          </w:tcPr>
+          <w:p>
+            <w:r>
+              <w:rPr>
+                <w:rFonts w:ascii="Times New Roman" w:hAnsi="Times New Roman" w:eastAsia="Times New Roman"/>
+              </w:rPr>
+              <w:t>curated Swiss-Prot reaction mapping</w:t>
+            </w:r>
+          </w:p>
+        </w:tc>
+        <w:tc>
+          <w:tcPr>
+            <w:tcW w:type="dxa" w:w="1728"/>
+          </w:tcPr>
+          <w:p>
+            <w:r>
+              <w:rPr>
+                <w:rFonts w:ascii="Times New Roman" w:hAnsi="Times New Roman" w:eastAsia="Times New Roman"/>
+              </w:rPr>
+              <w:t>42</w:t>
+            </w:r>
+          </w:p>
+        </w:tc>
+        <w:tc>
+          <w:tcPr>
+            <w:tcW w:type="dxa" w:w="1728"/>
+          </w:tcPr>
+          <w:p>
+            <w:r>
+              <w:rPr>
+                <w:rFonts w:ascii="Times New Roman" w:hAnsi="Times New Roman" w:eastAsia="Times New Roman"/>
+              </w:rPr>
+              <w:t>10</w:t>
+            </w:r>
+          </w:p>
+        </w:tc>
+        <w:tc>
+          <w:tcPr>
+            <w:tcW w:type="dxa" w:w="1728"/>
+          </w:tcPr>
+          <w:p>
+            <w:r>
+              <w:rPr>
+                <w:rFonts w:ascii="Times New Roman" w:hAnsi="Times New Roman" w:eastAsia="Times New Roman"/>
+              </w:rPr>
+              <w:t>1.5e-07</w:t>
+            </w:r>
+          </w:p>
+        </w:tc>
+      </w:tr>
+    </w:tbl>
+    <w:p>
+      <w:pPr>
+        <w:spacing w:after="120"/>
+        <w:jc w:val="both"/>
+      </w:pPr>
+      <w:r>
+        <w:rPr>
+          <w:rFonts w:ascii="Times New Roman" w:hAnsi="Times New Roman" w:eastAsia="Times New Roman"/>
+        </w:rPr>
+        <w:t>Direct GOA BP terms cover 11/100 liver versus 2/100 brain top deficits, while any BP annotation covers 94 and 90 respectively. KEGG REST selected 9 pathways with 218 mapped genes. Rhea reactions mark 42 liver versus 10 brain genes; kidney has 41, so the reaction signal is not specific to liver. GOA, KEGG, Rhea, UniProt and WikiPathways annotations may share literature and curation, and prior g:Profiler work included KEGG. These positives cannot be counted as independent confirmations. Neither organoid protein nor enzyme activity was measured, and the original kidney fidelity candidate failed external replication. No mechanism, discovery, or diagnostic use follows from these annotation contrasts.</w:t>
+      </w:r>
+    </w:p>
+    <w:p>
       <w:pPr>
         <w:spacing w:after="120"/>
         <w:jc w:val="both"/>
@@ -9072,7 +9375,7 @@
           <w:rFonts w:ascii="Times New Roman" w:hAnsi="Times New Roman" w:eastAsia="Times New Roman"/>
           <w:b/>
         </w:rPr>
-        <w:t>Table 12. Tools genuinely used (results/tools_ledger.csv): 42 entries, 35 counting toward the gate after excluding infrastructure. Target of 40 not reached.</w:t>
+        <w:t>Table 13. Tools genuinely used (results/tools_ledger.csv): 45 entries, 38 counting toward the gate after excluding infrastructure. Target of 40 not reached.</w:t>
       </w:r>
     </w:p>
     <w:tbl>
@@ -11405,6 +11708,168 @@
                 <w:rFonts w:ascii="Times New Roman" w:hAnsi="Times New Roman" w:eastAsia="Times New Roman"/>
               </w:rPr>
               <w:t>infra (excluded)</w:t>
+            </w:r>
+          </w:p>
+        </w:tc>
+      </w:tr>
+      <w:tr>
+        <w:tc>
+          <w:tcPr>
+            <w:tcW w:type="dxa" w:w="2160"/>
+          </w:tcPr>
+          <w:p>
+            <w:r>
+              <w:rPr>
+                <w:rFonts w:ascii="Times New Roman" w:hAnsi="Times New Roman" w:eastAsia="Times New Roman"/>
+              </w:rPr>
+              <w:t>EBI GOA human GAF</w:t>
+            </w:r>
+          </w:p>
+        </w:tc>
+        <w:tc>
+          <w:tcPr>
+            <w:tcW w:type="dxa" w:w="2160"/>
+          </w:tcPr>
+          <w:p>
+            <w:r>
+              <w:rPr>
+                <w:rFonts w:ascii="Times New Roman" w:hAnsi="Times New Roman" w:eastAsia="Times New Roman"/>
+              </w:rPr>
+              <w:t>gene ontology annotation database</w:t>
+            </w:r>
+          </w:p>
+        </w:tc>
+        <w:tc>
+          <w:tcPr>
+            <w:tcW w:type="dxa" w:w="2160"/>
+          </w:tcPr>
+          <w:p>
+            <w:r>
+              <w:rPr>
+                <w:rFonts w:ascii="Times New Roman" w:hAnsi="Times New Roman" w:eastAsia="Times New Roman"/>
+              </w:rPr>
+              <w:t>src/deficit_goa.py; results/deficit_goa.json</w:t>
+            </w:r>
+          </w:p>
+        </w:tc>
+        <w:tc>
+          <w:tcPr>
+            <w:tcW w:type="dxa" w:w="2160"/>
+          </w:tcPr>
+          <w:p>
+            <w:r>
+              <w:rPr>
+                <w:rFonts w:ascii="Times New Roman" w:hAnsi="Times New Roman" w:eastAsia="Times New Roman"/>
+              </w:rPr>
+              <w:t>counts</w:t>
+            </w:r>
+          </w:p>
+        </w:tc>
+      </w:tr>
+      <w:tr>
+        <w:tc>
+          <w:tcPr>
+            <w:tcW w:type="dxa" w:w="2160"/>
+          </w:tcPr>
+          <w:p>
+            <w:r>
+              <w:rPr>
+                <w:rFonts w:ascii="Times New Roman" w:hAnsi="Times New Roman" w:eastAsia="Times New Roman"/>
+              </w:rPr>
+              <w:t>KEGG REST human pathway-gene API</w:t>
+            </w:r>
+          </w:p>
+        </w:tc>
+        <w:tc>
+          <w:tcPr>
+            <w:tcW w:type="dxa" w:w="2160"/>
+          </w:tcPr>
+          <w:p>
+            <w:r>
+              <w:rPr>
+                <w:rFonts w:ascii="Times New Roman" w:hAnsi="Times New Roman" w:eastAsia="Times New Roman"/>
+              </w:rPr>
+              <w:t>database/service</w:t>
+            </w:r>
+          </w:p>
+        </w:tc>
+        <w:tc>
+          <w:tcPr>
+            <w:tcW w:type="dxa" w:w="2160"/>
+          </w:tcPr>
+          <w:p>
+            <w:r>
+              <w:rPr>
+                <w:rFonts w:ascii="Times New Roman" w:hAnsi="Times New Roman" w:eastAsia="Times New Roman"/>
+              </w:rPr>
+              <w:t>src/deficit_kegg.py; results/deficit_kegg.json</w:t>
+            </w:r>
+          </w:p>
+        </w:tc>
+        <w:tc>
+          <w:tcPr>
+            <w:tcW w:type="dxa" w:w="2160"/>
+          </w:tcPr>
+          <w:p>
+            <w:r>
+              <w:rPr>
+                <w:rFonts w:ascii="Times New Roman" w:hAnsi="Times New Roman" w:eastAsia="Times New Roman"/>
+              </w:rPr>
+              <w:t>counts</w:t>
+            </w:r>
+          </w:p>
+        </w:tc>
+      </w:tr>
+      <w:tr>
+        <w:tc>
+          <w:tcPr>
+            <w:tcW w:type="dxa" w:w="2160"/>
+          </w:tcPr>
+          <w:p>
+            <w:r>
+              <w:rPr>
+                <w:rFonts w:ascii="Times New Roman" w:hAnsi="Times New Roman" w:eastAsia="Times New Roman"/>
+              </w:rPr>
+              <w:t>Rhea curated biochemical reaction-to-UniProt mapping</w:t>
+            </w:r>
+          </w:p>
+        </w:tc>
+        <w:tc>
+          <w:tcPr>
+            <w:tcW w:type="dxa" w:w="2160"/>
+          </w:tcPr>
+          <w:p>
+            <w:r>
+              <w:rPr>
+                <w:rFonts w:ascii="Times New Roman" w:hAnsi="Times New Roman" w:eastAsia="Times New Roman"/>
+              </w:rPr>
+              <w:t>reference database</w:t>
+            </w:r>
+          </w:p>
+        </w:tc>
+        <w:tc>
+          <w:tcPr>
+            <w:tcW w:type="dxa" w:w="2160"/>
+          </w:tcPr>
+          <w:p>
+            <w:r>
+              <w:rPr>
+                <w:rFonts w:ascii="Times New Roman" w:hAnsi="Times New Roman" w:eastAsia="Times New Roman"/>
+              </w:rPr>
+              <w:t>src/deficit_rhea.py; results/deficit_rhea.json</w:t>
+            </w:r>
+          </w:p>
+        </w:tc>
+        <w:tc>
+          <w:tcPr>
+            <w:tcW w:type="dxa" w:w="2160"/>
+          </w:tcPr>
+          <w:p>
+            <w:r>
+              <w:rPr>
+                <w:rFonts w:ascii="Times New Roman" w:hAnsi="Times New Roman" w:eastAsia="Times New Roman"/>
+              </w:rPr>
+              <w:t>counts</w:t>
             </w:r>
           </w:p>
         </w:tc>
@@ -11587,6 +12052,42 @@
           <w:rFonts w:ascii="Times New Roman" w:hAnsi="Times New Roman" w:eastAsia="Times New Roman"/>
         </w:rPr>
         <w:t>WikiPathways monthly releases. https://data.wikipathways.org/20260910/gmt/</w:t>
+      </w:r>
+    </w:p>
+    <w:p>
+      <w:pPr>
+        <w:spacing w:after="120"/>
+        <w:jc w:val="both"/>
+      </w:pPr>
+      <w:r>
+        <w:rPr>
+          <w:rFonts w:ascii="Times New Roman" w:hAnsi="Times New Roman" w:eastAsia="Times New Roman"/>
+        </w:rPr>
+        <w:t>EBI GOA human GAF. https://ftp.ebi.ac.uk/pub/databases/GO/goa/HUMAN/goa_human.gaf.gz</w:t>
+      </w:r>
+    </w:p>
+    <w:p>
+      <w:pPr>
+        <w:spacing w:after="120"/>
+        <w:jc w:val="both"/>
+      </w:pPr>
+      <w:r>
+        <w:rPr>
+          <w:rFonts w:ascii="Times New Roman" w:hAnsi="Times New Roman" w:eastAsia="Times New Roman"/>
+        </w:rPr>
+        <w:t>KEGG REST API. https://www.kegg.jp/kegg/rest/keggapi.html</w:t>
+      </w:r>
+    </w:p>
+    <w:p>
+      <w:pPr>
+        <w:spacing w:after="120"/>
+        <w:jc w:val="both"/>
+      </w:pPr>
+      <w:r>
+        <w:rPr>
+          <w:rFonts w:ascii="Times New Roman" w:hAnsi="Times New Roman" w:eastAsia="Times New Roman"/>
+        </w:rPr>
+        <w:t>Rhea reaction-to-Swiss-Prot mapping. https://ftp.expasy.org/databases/rhea/tsv/rhea2uniprot_sprot.tsv</w:t>
       </w:r>
     </w:p>
     <w:p>

</xml_diff>

<commit_message>
Add date-split robustness and coverage limits to paper
</commit_message>
<xml_diff>
--- a/paper/mega27-03-virtual-organoid-paper.docx
+++ b/paper/mega27-03-virtual-organoid-paper.docx
@@ -3058,6 +3058,29 @@
         <w:rPr>
           <w:rFonts w:ascii="Times New Roman" w:hAnsi="Times New Roman" w:eastAsia="Times New Roman"/>
         </w:rPr>
+        <w:t>4.3a Internal experiment-date replication, not a new cohort</w:t>
+      </w:r>
+    </w:p>
+    <w:p>
+      <w:pPr>
+        <w:spacing w:after="120"/>
+        <w:jc w:val="both"/>
+      </w:pPr>
+      <w:r>
+        <w:rPr>
+          <w:rFonts w:ascii="Times New Roman" w:hAnsi="Times New Roman" w:eastAsia="Times New Roman"/>
+        </w:rPr>
+        <w:t>We fixed the earlier small (&lt;722 px) and large (&gt;=1400 px) cutoffs, then split each donor's first experiment date from later dates in the SAME OrgaSegment DIS accession. Requiring at least five organoids per DMSO/Trikafta by size cell, 12/12 later-date donors have a positive donor-matched large-minus-small Trikafta effect: median 0.199 log-swelling units, exact one-sided sign p=0.000244. On first-date plates, 6/8 eligible donors are positive (median 0.264, p=0.145). The later-date H1 passes its pre-registration, but thresholds were chosen using the whole accession, donors overlap, and there is no external individual-organoid cohort. This supports repeatability over experiment dates, not independent discovery, clinical validity, or the lumen-maturation mechanism (results/withincohort_replication.json).</w:t>
+      </w:r>
+    </w:p>
+    <w:p>
+      <w:pPr>
+        <w:pStyle w:val="Heading2"/>
+      </w:pPr>
+      <w:r>
+        <w:rPr>
+          <w:rFonts w:ascii="Times New Roman" w:hAnsi="Times New Roman" w:eastAsia="Times New Roman"/>
+        </w:rPr>
         <w:t>4.4 Does size correction help theratyping? No</w:t>
       </w:r>
     </w:p>
@@ -8986,6 +9009,18 @@
           <w:rFonts w:ascii="Times New Roman" w:hAnsi="Times New Roman" w:eastAsia="Times New Roman"/>
         </w:rPr>
         <w:t>Direct GOA BP terms cover 11/100 liver versus 2/100 brain top deficits, while any BP annotation covers 94 and 90 respectively. KEGG REST selected 9 pathways with 218 mapped genes. Rhea reactions mark 42 liver versus 10 brain genes; kidney has 41, so the reaction signal is not specific to liver. GOA, KEGG, Rhea, UniProt and WikiPathways annotations may share literature and curation, and prior g:Profiler work included KEGG. These positives cannot be counted as independent confirmations. Neither organoid protein nor enzyme activity was measured, and the original kidney fidelity candidate failed external replication. No mechanism, discovery, or diagnostic use follows from these annotation contrasts.</w:t>
+      </w:r>
+    </w:p>
+    <w:p>
+      <w:pPr>
+        <w:spacing w:after="120"/>
+        <w:jc w:val="both"/>
+      </w:pPr>
+      <w:r>
+        <w:rPr>
+          <w:rFonts w:ascii="Times New Roman" w:hAnsi="Times New Roman" w:eastAsia="Times New Roman"/>
+        </w:rPr>
+        <w:t>Additional pre-registered annotation/coverage checks: IntAct PSIQUIC queried the fixed top-20 deficit genes per group and measured 20 liver and 19 brain genes. Median indexed interaction RECORD counts were 6.5 versus 45.0 (one-sided rank-test p=0.0369). Study density, nonhuman interactors, and blood/immune genes confound this contrast; no organoid interactome was measured. JASPAR CORE vertebrate matrices cover 2/3 pre-fixed brain lineage TFs absent from CollecTRI (NEUROD2 and TBR1, not NEUROD6) and kidney PAX2; this is motif availability only and cannot repair the failed decoupler activity control. Neither is an independent biological replication (results/deficit_intact.json; results/deficit_jaspar.json).</w:t>
       </w:r>
     </w:p>
     <w:p>
@@ -9375,7 +9410,7 @@
           <w:rFonts w:ascii="Times New Roman" w:hAnsi="Times New Roman" w:eastAsia="Times New Roman"/>
           <w:b/>
         </w:rPr>
-        <w:t>Table 13. Tools genuinely used (results/tools_ledger.csv): 45 entries, 38 counting toward the gate after excluding infrastructure. Target of 40 not reached.</w:t>
+        <w:t>Table 13. Tools genuinely used (results/tools_ledger.csv): 47 entries, 40 counting toward the gate after excluding infrastructure. Target of 40 not reached.</w:t>
       </w:r>
     </w:p>
     <w:tbl>
@@ -11857,6 +11892,114 @@
                 <w:rFonts w:ascii="Times New Roman" w:hAnsi="Times New Roman" w:eastAsia="Times New Roman"/>
               </w:rPr>
               <w:t>src/deficit_rhea.py; results/deficit_rhea.json</w:t>
+            </w:r>
+          </w:p>
+        </w:tc>
+        <w:tc>
+          <w:tcPr>
+            <w:tcW w:type="dxa" w:w="2160"/>
+          </w:tcPr>
+          <w:p>
+            <w:r>
+              <w:rPr>
+                <w:rFonts w:ascii="Times New Roman" w:hAnsi="Times New Roman" w:eastAsia="Times New Roman"/>
+              </w:rPr>
+              <w:t>counts</w:t>
+            </w:r>
+          </w:p>
+        </w:tc>
+      </w:tr>
+      <w:tr>
+        <w:tc>
+          <w:tcPr>
+            <w:tcW w:type="dxa" w:w="2160"/>
+          </w:tcPr>
+          <w:p>
+            <w:r>
+              <w:rPr>
+                <w:rFonts w:ascii="Times New Roman" w:hAnsi="Times New Roman" w:eastAsia="Times New Roman"/>
+              </w:rPr>
+              <w:t>IntAct PSIQUIC interaction-count service</w:t>
+            </w:r>
+          </w:p>
+        </w:tc>
+        <w:tc>
+          <w:tcPr>
+            <w:tcW w:type="dxa" w:w="2160"/>
+          </w:tcPr>
+          <w:p>
+            <w:r>
+              <w:rPr>
+                <w:rFonts w:ascii="Times New Roman" w:hAnsi="Times New Roman" w:eastAsia="Times New Roman"/>
+              </w:rPr>
+              <w:t>protein interaction database</w:t>
+            </w:r>
+          </w:p>
+        </w:tc>
+        <w:tc>
+          <w:tcPr>
+            <w:tcW w:type="dxa" w:w="2160"/>
+          </w:tcPr>
+          <w:p>
+            <w:r>
+              <w:rPr>
+                <w:rFonts w:ascii="Times New Roman" w:hAnsi="Times New Roman" w:eastAsia="Times New Roman"/>
+              </w:rPr>
+              <w:t>src/deficit_intact.py; results/deficit_intact.json</w:t>
+            </w:r>
+          </w:p>
+        </w:tc>
+        <w:tc>
+          <w:tcPr>
+            <w:tcW w:type="dxa" w:w="2160"/>
+          </w:tcPr>
+          <w:p>
+            <w:r>
+              <w:rPr>
+                <w:rFonts w:ascii="Times New Roman" w:hAnsi="Times New Roman" w:eastAsia="Times New Roman"/>
+              </w:rPr>
+              <w:t>counts</w:t>
+            </w:r>
+          </w:p>
+        </w:tc>
+      </w:tr>
+      <w:tr>
+        <w:tc>
+          <w:tcPr>
+            <w:tcW w:type="dxa" w:w="2160"/>
+          </w:tcPr>
+          <w:p>
+            <w:r>
+              <w:rPr>
+                <w:rFonts w:ascii="Times New Roman" w:hAnsi="Times New Roman" w:eastAsia="Times New Roman"/>
+              </w:rPr>
+              <w:t>JASPAR CORE vertebrate motif API</w:t>
+            </w:r>
+          </w:p>
+        </w:tc>
+        <w:tc>
+          <w:tcPr>
+            <w:tcW w:type="dxa" w:w="2160"/>
+          </w:tcPr>
+          <w:p>
+            <w:r>
+              <w:rPr>
+                <w:rFonts w:ascii="Times New Roman" w:hAnsi="Times New Roman" w:eastAsia="Times New Roman"/>
+              </w:rPr>
+              <w:t>transcription factor motif database</w:t>
+            </w:r>
+          </w:p>
+        </w:tc>
+        <w:tc>
+          <w:tcPr>
+            <w:tcW w:type="dxa" w:w="2160"/>
+          </w:tcPr>
+          <w:p>
+            <w:r>
+              <w:rPr>
+                <w:rFonts w:ascii="Times New Roman" w:hAnsi="Times New Roman" w:eastAsia="Times New Roman"/>
+              </w:rPr>
+              <w:t>src/deficit_jaspar.py; results/deficit_jaspar.json</w:t>
             </w:r>
           </w:p>
         </w:tc>
@@ -12064,6 +12207,30 @@
           <w:rFonts w:ascii="Times New Roman" w:hAnsi="Times New Roman" w:eastAsia="Times New Roman"/>
         </w:rPr>
         <w:t>EBI GOA human GAF. https://ftp.ebi.ac.uk/pub/databases/GO/goa/HUMAN/goa_human.gaf.gz</w:t>
+      </w:r>
+    </w:p>
+    <w:p>
+      <w:pPr>
+        <w:spacing w:after="120"/>
+        <w:jc w:val="both"/>
+      </w:pPr>
+      <w:r>
+        <w:rPr>
+          <w:rFonts w:ascii="Times New Roman" w:hAnsi="Times New Roman" w:eastAsia="Times New Roman"/>
+        </w:rPr>
+        <w:t>IntAct PSIQUIC. https://www.ebi.ac.uk/Tools/webservices/psicquic/intact/webservices/current/search/query/</w:t>
+      </w:r>
+    </w:p>
+    <w:p>
+      <w:pPr>
+        <w:spacing w:after="120"/>
+        <w:jc w:val="both"/>
+      </w:pPr>
+      <w:r>
+        <w:rPr>
+          <w:rFonts w:ascii="Times New Roman" w:hAnsi="Times New Roman" w:eastAsia="Times New Roman"/>
+        </w:rPr>
+        <w:t>JASPAR CORE vertebrate motif API. https://jaspar.elixir.no/api/v1/matrix/</w:t>
       </w:r>
     </w:p>
     <w:p>

</xml_diff>

<commit_message>
Add failed matched-block stress test to paper
</commit_message>
<xml_diff>
--- a/paper/mega27-03-virtual-organoid-paper.docx
+++ b/paper/mega27-03-virtual-organoid-paper.docx
@@ -3081,6 +3081,29 @@
         <w:rPr>
           <w:rFonts w:ascii="Times New Roman" w:hAnsi="Times New Roman" w:eastAsia="Times New Roman"/>
         </w:rPr>
+        <w:t>4.3b Matched plate-dose stress test: fails</w:t>
+      </w:r>
+    </w:p>
+    <w:p>
+      <w:pPr>
+        <w:spacing w:after="120"/>
+        <w:jc w:val="both"/>
+      </w:pPr>
+      <w:r>
+        <w:rPr>
+          <w:rFonts w:ascii="Times New Roman" w:hAnsi="Times New Roman" w:eastAsia="Times New Roman"/>
+        </w:rPr>
+        <w:t>The stronger pre-registered stress test required &gt;=3 organoids per Trikafta/DMSO by small/large cell within each donor x plate x forskolin concentration block. Only 31 blocks and 12 donors qualify; 9/12 donor median block effects are positive, with exact one-sided sign p=0.073. H1 FAILS (registered alpha 0.05). 5 donors have no eligible block. The pooled block median (0.272) is descriptive and not a donor-independent test. This challenges the pooled later-date 12/12 result: dose/plate control with narrower cells alters three donor signs. It does not show the size effect is absent, but the evidence does not establish a new validated discovery (results/blocked_size.json).</w:t>
+      </w:r>
+    </w:p>
+    <w:p>
+      <w:pPr>
+        <w:pStyle w:val="Heading2"/>
+      </w:pPr>
+      <w:r>
+        <w:rPr>
+          <w:rFonts w:ascii="Times New Roman" w:hAnsi="Times New Roman" w:eastAsia="Times New Roman"/>
+        </w:rPr>
         <w:t>4.4 Does size correction help theratyping? No</w:t>
       </w:r>
     </w:p>
@@ -9140,6 +9163,18 @@
           <w:rFonts w:ascii="Times New Roman" w:hAnsi="Times New Roman" w:eastAsia="Times New Roman"/>
         </w:rPr>
         <w:t>- Size-adjusted and size-filtered readouts do not improve donor-level modulator discrimination.</w:t>
+      </w:r>
+    </w:p>
+    <w:p>
+      <w:pPr>
+        <w:spacing w:after="120"/>
+        <w:jc w:val="both"/>
+      </w:pPr>
+      <w:r>
+        <w:rPr>
+          <w:rFonts w:ascii="Times New Roman" w:hAnsi="Times New Roman" w:eastAsia="Times New Roman"/>
+        </w:rPr>
+        <w:t>- Matched donor x plate x dose robustness H1 fails: 9/12 positive donor medians, p=0.073, despite the pooled later-date result.</w:t>
       </w:r>
     </w:p>
     <w:p>

</xml_diff>

<commit_message>
Explain unsuitable external replication sources in paper and README
</commit_message>
<xml_diff>
--- a/paper/mega27-03-virtual-organoid-paper.docx
+++ b/paper/mega27-03-virtual-organoid-paper.docx
@@ -3116,7 +3116,7 @@
         <w:rPr>
           <w:rFonts w:ascii="Times New Roman" w:hAnsi="Times New Roman" w:eastAsia="Times New Roman"/>
         </w:rPr>
-        <w:t>Locked before running: per-donor standardised Trikafta-vs-DMSO separation with raw, size-adjusted and size-band well readouts. Median raw 4.73, adjusted 4.35, band 4.39; adjusted better in 8 of 17 donors. Excluding organoids below 1,069 px (a post-hoc threshold): median 4.73 -&gt; 4.75, better in 9 of 17, Wilcoxon p = 0.68. The size effect is real but does not change calls.</w:t>
+        <w:t>Locked before running: per-donor standardised Trikafta-vs-DMSO separation with raw, size-adjusted and size-band well readouts. Median raw 4.73, adjusted 4.35, band 4.39; adjusted better in 8 of 17 donors. Excluding organoids below 1,069 px (a post-hoc threshold): median 4.73 -&gt; 4.75, better in 9 of 17, Wilcoxon p = 0.68. The size trend does not improve calls, and the stricter matched-block H1 fails.</w:t>
       </w:r>
     </w:p>
     <w:p>
@@ -9128,6 +9128,18 @@
           <w:rFonts w:ascii="Times New Roman" w:hAnsi="Times New Roman" w:eastAsia="Times New Roman"/>
         </w:rPr>
         <w:t>Synthesis. The liver top-deficit list has independent pathway and adult-tissue protein support, while no new organoid proteome, matched tissue, perturbation, or clinical outcomes validate its effect on fidelity. The kidney external profiles recover their tissue despite the strict single-cell marker test failing. The candidate remains unproven; do not offer the tool as diagnosis.</w:t>
+      </w:r>
+    </w:p>
+    <w:p>
+      <w:pPr>
+        <w:spacing w:after="120"/>
+        <w:jc w:val="both"/>
+      </w:pPr>
+      <w:r>
+        <w:rPr>
+          <w:rFonts w:ascii="Times New Roman" w:hAnsi="Times New Roman" w:eastAsia="Times New Roman"/>
+        </w:rPr>
+        <w:t>External replication source audit (results/external_fis_source_audit.md): a 2025 respiratory FIS study with single-organoid measures excluded baseline areas below 1500 px and used forskolin alone rather than modulator vs DMSO; OrganoID's open individual time series used pancreatic cancer organoids and gemcitabine; a 2021 nasal CFTR-modulator FIS study reported well-summed areas. These are unsuitable for the specific small-organoid modulator test, but the search was not exhaustive.</w:t>
       </w:r>
     </w:p>
     <w:p>
@@ -12338,6 +12350,42 @@
           <w:rFonts w:ascii="Times New Roman" w:hAnsi="Times New Roman" w:eastAsia="Times New Roman"/>
         </w:rPr>
         <w:t>Human Cell Atlas GSE108291 kidney organoid single-cell project. https://explore.data.humancellatlas.org/projects/7b947aa2-43a7-4082-afff-222a3e3a4635</w:t>
+      </w:r>
+    </w:p>
+    <w:p>
+      <w:pPr>
+        <w:spacing w:after="120"/>
+        <w:jc w:val="both"/>
+      </w:pPr>
+      <w:r>
+        <w:rPr>
+          <w:rFonts w:ascii="Times New Roman" w:hAnsi="Times New Roman" w:eastAsia="Times New Roman"/>
+        </w:rPr>
+        <w:t>Demchenko A, et al. A semi-automated algorithm for image analysis of respiratory organoids. PLoS Comput Biol 2025. https://journals.plos.org/ploscompbiol/article?id=10.1371/journal.pcbi.1013589</w:t>
+      </w:r>
+    </w:p>
+    <w:p>
+      <w:pPr>
+        <w:spacing w:after="120"/>
+        <w:jc w:val="both"/>
+      </w:pPr>
+      <w:r>
+        <w:rPr>
+          <w:rFonts w:ascii="Times New Roman" w:hAnsi="Times New Roman" w:eastAsia="Times New Roman"/>
+        </w:rPr>
+        <w:t>Matthews J, et al. OrganoID. PLoS Comput Biol 2022. https://pmc.ncbi.nlm.nih.gov/articles/PMC9645660/</w:t>
+      </w:r>
+    </w:p>
+    <w:p>
+      <w:pPr>
+        <w:spacing w:after="120"/>
+        <w:jc w:val="both"/>
+      </w:pPr>
+      <w:r>
+        <w:rPr>
+          <w:rFonts w:ascii="Times New Roman" w:hAnsi="Times New Roman" w:eastAsia="Times New Roman"/>
+        </w:rPr>
+        <w:t>Anderson JD, et al. CFTR function and clinical response to modulators parallel nasal epithelial organoid swelling. AJP Lung 2021. https://pmc.ncbi.nlm.nih.gov/articles/PMC8321858/</w:t>
       </w:r>
     </w:p>
     <w:p>

</xml_diff>

<commit_message>
Align discussion and resource gate with tested evidence
</commit_message>
<xml_diff>
--- a/paper/mega27-03-virtual-organoid-paper.docx
+++ b/paper/mega27-03-virtual-organoid-paper.docx
@@ -9413,7 +9413,7 @@
         <w:rPr>
           <w:rFonts w:ascii="Times New Roman" w:hAnsi="Times New Roman" w:eastAsia="Times New Roman"/>
         </w:rPr>
-        <w:t>Small organoids respond less to CFTR modulators, relative to DMSO, than large ones, and the response saturates above a size threshold. Because geometry predicts the reverse, the likeliest explanations are biological: small organoids may lack a mature lumen, contain fewer differentiated secretory cells, or have a closed tight-junction seal later. Falsifiable prediction: in time-lapse single-organoid data from an independent lab, the Trikafta-minus-DMSO effect in the top starting-size quartile will exceed that in the bottom quartile by at least 0.1 log units in most donors. Checking this needs a second single-organoid FIS dataset, which we did not find in public form.</w:t>
+        <w:t>In this accession, drug-minus-DMSO swelling tends to rise from small to larger organoids and then plateau. The plate-and-dose-matched donor sign test fails at alpha 0.05, so we do not establish a reliable donor-general effect. Uniform surface-flux geometry predicts the reverse direction, but that simple model is not a full measurement-bias test. Lumen maturity and cell composition are hypotheses, not measured explanations. Falsifiable prediction: in an independent, matched, time-lapse single-organoid intestinal FIS cohort, with size thresholds locked before analysis, a donor-level modulator-minus-DMSO large-minus-small effect will be positive in most donors, with a sign-test p&lt;0.05. This needs a second suitable dataset and mechanistic measurements; the public leads audited here do not supply those controls.</w:t>
       </w:r>
     </w:p>
     <w:p>
@@ -9425,7 +9425,7 @@
         <w:rPr>
           <w:rFonts w:ascii="Times New Roman" w:hAnsi="Times New Roman" w:eastAsia="Times New Roman"/>
         </w:rPr>
-        <w:t>Practical note. Well-level FIS readouts depend on the size mix. Labs comparing drug response across passages or sites should report the starting-size distribution.</w:t>
+        <w:t>Practical note. In this dataset, starting size may affect single-organoid readouts, but size correction did not improve per-donor discrimination. A lab comparing assays across passages may record its starting-size distribution as a quality-control variable; no clinical adjustment is recommended from these data.</w:t>
       </w:r>
     </w:p>
     <w:p>
@@ -9457,7 +9457,7 @@
           <w:rFonts w:ascii="Times New Roman" w:hAnsi="Times New Roman" w:eastAsia="Times New Roman"/>
           <w:b/>
         </w:rPr>
-        <w:t>Table 13. Tools genuinely used (results/tools_ledger.csv): 47 entries, 40 counting toward the gate after excluding infrastructure. Target of 40 not reached.</w:t>
+        <w:t>Table 13. Tools genuinely used (results/tools_ledger.csv): 47 entries, 40 counting toward the gate after excluding infrastructure. Target of 40 reached; this counts resources genuinely used, not independent biological confirmations.</w:t>
       </w:r>
     </w:p>
     <w:tbl>

</xml_diff>

<commit_message>
Document external one-plate FIS corroboration with donor limits
</commit_message>
<xml_diff>
--- a/paper/mega27-03-virtual-organoid-paper.docx
+++ b/paper/mega27-03-virtual-organoid-paper.docx
@@ -435,7 +435,7 @@
           <w:rFonts w:ascii="Times New Roman" w:hAnsi="Times New Roman" w:eastAsia="Times New Roman"/>
           <w:b/>
         </w:rPr>
-        <w:t>Table 1. Dataset manifest (distinct, accession-level). Three distinct assay/image datasets shown here; the separate, committed accession ledger includes 165 primary GEO/ArrayExpress accessions (including GSE108291) used for organoid-fidelity analyses.</w:t>
+        <w:t>Table 1. Dataset manifest (distinct, accession-level). Three distinct assay/image datasets shown here; the committed accession ledger now has 166 primary entries, including one independent FIS demo plate counted once (not 32 CSV datasets).</w:t>
       </w:r>
     </w:p>
     <w:tbl>
@@ -3104,6 +3104,419 @@
         <w:rPr>
           <w:rFonts w:ascii="Times New Roman" w:hAnsi="Times New Roman" w:eastAsia="Times New Roman"/>
         </w:rPr>
+        <w:t>4.3c External single-plate intestinal FIS assay</w:t>
+      </w:r>
+    </w:p>
+    <w:p>
+      <w:pPr>
+        <w:spacing w:after="120"/>
+        <w:jc w:val="both"/>
+      </w:pPr>
+      <w:r>
+        <w:rPr>
+          <w:rFonts w:ascii="Times New Roman" w:hAnsi="Times New Roman" w:eastAsia="Times New Roman"/>
+        </w:rPr>
+        <w:t>A separate public intestinal organoid demonstration experiment from the FIS_image_analysis repository provides object-level tracked areas in 32 CSVs from ONE plate, one class-II CFTR genotype, and two wells per treatment at each of eight matched forskolin doses. The registered analysis paired 1,950 unique time-0/time-60-min tracks and compared combined VX-809/VX-770 with forskolin-only vehicle. Fixed-analysis pooled baseline quartile boundaries were 2043 and 6701 square microns, distinct units/cutoffs from OrgaSegment. The drug-minus-vehicle large-minus-small log-swelling effect is positive in 7/8 dose strata (one-sided sign p=0.0352; H1 passes); the lowest dose is negative. This is assay-source support under an older double modulator, not independent donor replication: eight doses share a plate and donor, so sign-test strata are correlated and its p is descriptive. The original donor x plate x dose stress test still fails. Tracking attrition may depend on size. No Trikafta generalization, new established discovery, or clinical prediction follows (results/external_fis_demo.json; results/finding_external_fis_demo.md).</w:t>
+      </w:r>
+    </w:p>
+    <w:p>
+      <w:r>
+        <w:rPr>
+          <w:rFonts w:ascii="Times New Roman" w:hAnsi="Times New Roman" w:eastAsia="Times New Roman"/>
+          <w:b/>
+        </w:rPr>
+        <w:t>Table 5. Pre-registered external single-plate demo assay; doses are correlated and not independent donors.</w:t>
+      </w:r>
+    </w:p>
+    <w:tbl>
+      <w:tblPr>
+        <w:tblStyle w:val="LightGrid-Accent1"/>
+        <w:tblW w:type="auto" w:w="0"/>
+        <w:tblLook w:firstColumn="1" w:firstRow="1" w:lastColumn="0" w:lastRow="0" w:noHBand="0" w:noVBand="1" w:val="04A0"/>
+      </w:tblPr>
+      <w:tblGrid>
+        <w:gridCol w:w="2880"/>
+        <w:gridCol w:w="2880"/>
+        <w:gridCol w:w="2880"/>
+      </w:tblGrid>
+      <w:tr>
+        <w:tc>
+          <w:tcPr>
+            <w:tcW w:type="dxa" w:w="2880"/>
+          </w:tcPr>
+          <w:p>
+            <w:r>
+              <w:rPr>
+                <w:rFonts w:ascii="Times New Roman" w:hAnsi="Times New Roman" w:eastAsia="Times New Roman"/>
+              </w:rPr>
+              <w:t>forskolin (uM)</w:t>
+            </w:r>
+          </w:p>
+        </w:tc>
+        <w:tc>
+          <w:tcPr>
+            <w:tcW w:type="dxa" w:w="2880"/>
+          </w:tcPr>
+          <w:p>
+            <w:r>
+              <w:rPr>
+                <w:rFonts w:ascii="Times New Roman" w:hAnsi="Times New Roman" w:eastAsia="Times New Roman"/>
+              </w:rPr>
+              <w:t>paired wells / condition</w:t>
+            </w:r>
+          </w:p>
+        </w:tc>
+        <w:tc>
+          <w:tcPr>
+            <w:tcW w:type="dxa" w:w="2880"/>
+          </w:tcPr>
+          <w:p>
+            <w:r>
+              <w:rPr>
+                <w:rFonts w:ascii="Times New Roman" w:hAnsi="Times New Roman" w:eastAsia="Times New Roman"/>
+              </w:rPr>
+              <w:t>large-minus-small drug effect (log units)</w:t>
+            </w:r>
+          </w:p>
+        </w:tc>
+      </w:tr>
+      <w:tr>
+        <w:tc>
+          <w:tcPr>
+            <w:tcW w:type="dxa" w:w="2880"/>
+          </w:tcPr>
+          <w:p>
+            <w:r>
+              <w:rPr>
+                <w:rFonts w:ascii="Times New Roman" w:hAnsi="Times New Roman" w:eastAsia="Times New Roman"/>
+              </w:rPr>
+              <w:t>0.008</w:t>
+            </w:r>
+          </w:p>
+        </w:tc>
+        <w:tc>
+          <w:tcPr>
+            <w:tcW w:type="dxa" w:w="2880"/>
+          </w:tcPr>
+          <w:p>
+            <w:r>
+              <w:rPr>
+                <w:rFonts w:ascii="Times New Roman" w:hAnsi="Times New Roman" w:eastAsia="Times New Roman"/>
+              </w:rPr>
+              <w:t>2/2</w:t>
+            </w:r>
+          </w:p>
+        </w:tc>
+        <w:tc>
+          <w:tcPr>
+            <w:tcW w:type="dxa" w:w="2880"/>
+          </w:tcPr>
+          <w:p>
+            <w:r>
+              <w:rPr>
+                <w:rFonts w:ascii="Times New Roman" w:hAnsi="Times New Roman" w:eastAsia="Times New Roman"/>
+              </w:rPr>
+              <w:t>-0.023</w:t>
+            </w:r>
+          </w:p>
+        </w:tc>
+      </w:tr>
+      <w:tr>
+        <w:tc>
+          <w:tcPr>
+            <w:tcW w:type="dxa" w:w="2880"/>
+          </w:tcPr>
+          <w:p>
+            <w:r>
+              <w:rPr>
+                <w:rFonts w:ascii="Times New Roman" w:hAnsi="Times New Roman" w:eastAsia="Times New Roman"/>
+              </w:rPr>
+              <w:t>0.02</w:t>
+            </w:r>
+          </w:p>
+        </w:tc>
+        <w:tc>
+          <w:tcPr>
+            <w:tcW w:type="dxa" w:w="2880"/>
+          </w:tcPr>
+          <w:p>
+            <w:r>
+              <w:rPr>
+                <w:rFonts w:ascii="Times New Roman" w:hAnsi="Times New Roman" w:eastAsia="Times New Roman"/>
+              </w:rPr>
+              <w:t>2/2</w:t>
+            </w:r>
+          </w:p>
+        </w:tc>
+        <w:tc>
+          <w:tcPr>
+            <w:tcW w:type="dxa" w:w="2880"/>
+          </w:tcPr>
+          <w:p>
+            <w:r>
+              <w:rPr>
+                <w:rFonts w:ascii="Times New Roman" w:hAnsi="Times New Roman" w:eastAsia="Times New Roman"/>
+              </w:rPr>
+              <w:t>+0.009</w:t>
+            </w:r>
+          </w:p>
+        </w:tc>
+      </w:tr>
+      <w:tr>
+        <w:tc>
+          <w:tcPr>
+            <w:tcW w:type="dxa" w:w="2880"/>
+          </w:tcPr>
+          <w:p>
+            <w:r>
+              <w:rPr>
+                <w:rFonts w:ascii="Times New Roman" w:hAnsi="Times New Roman" w:eastAsia="Times New Roman"/>
+              </w:rPr>
+              <w:t>0.05</w:t>
+            </w:r>
+          </w:p>
+        </w:tc>
+        <w:tc>
+          <w:tcPr>
+            <w:tcW w:type="dxa" w:w="2880"/>
+          </w:tcPr>
+          <w:p>
+            <w:r>
+              <w:rPr>
+                <w:rFonts w:ascii="Times New Roman" w:hAnsi="Times New Roman" w:eastAsia="Times New Roman"/>
+              </w:rPr>
+              <w:t>2/2</w:t>
+            </w:r>
+          </w:p>
+        </w:tc>
+        <w:tc>
+          <w:tcPr>
+            <w:tcW w:type="dxa" w:w="2880"/>
+          </w:tcPr>
+          <w:p>
+            <w:r>
+              <w:rPr>
+                <w:rFonts w:ascii="Times New Roman" w:hAnsi="Times New Roman" w:eastAsia="Times New Roman"/>
+              </w:rPr>
+              <w:t>+0.047</w:t>
+            </w:r>
+          </w:p>
+        </w:tc>
+      </w:tr>
+      <w:tr>
+        <w:tc>
+          <w:tcPr>
+            <w:tcW w:type="dxa" w:w="2880"/>
+          </w:tcPr>
+          <w:p>
+            <w:r>
+              <w:rPr>
+                <w:rFonts w:ascii="Times New Roman" w:hAnsi="Times New Roman" w:eastAsia="Times New Roman"/>
+              </w:rPr>
+              <w:t>0.128</w:t>
+            </w:r>
+          </w:p>
+        </w:tc>
+        <w:tc>
+          <w:tcPr>
+            <w:tcW w:type="dxa" w:w="2880"/>
+          </w:tcPr>
+          <w:p>
+            <w:r>
+              <w:rPr>
+                <w:rFonts w:ascii="Times New Roman" w:hAnsi="Times New Roman" w:eastAsia="Times New Roman"/>
+              </w:rPr>
+              <w:t>2/2</w:t>
+            </w:r>
+          </w:p>
+        </w:tc>
+        <w:tc>
+          <w:tcPr>
+            <w:tcW w:type="dxa" w:w="2880"/>
+          </w:tcPr>
+          <w:p>
+            <w:r>
+              <w:rPr>
+                <w:rFonts w:ascii="Times New Roman" w:hAnsi="Times New Roman" w:eastAsia="Times New Roman"/>
+              </w:rPr>
+              <w:t>+0.081</w:t>
+            </w:r>
+          </w:p>
+        </w:tc>
+      </w:tr>
+      <w:tr>
+        <w:tc>
+          <w:tcPr>
+            <w:tcW w:type="dxa" w:w="2880"/>
+          </w:tcPr>
+          <w:p>
+            <w:r>
+              <w:rPr>
+                <w:rFonts w:ascii="Times New Roman" w:hAnsi="Times New Roman" w:eastAsia="Times New Roman"/>
+              </w:rPr>
+              <w:t>0.32</w:t>
+            </w:r>
+          </w:p>
+        </w:tc>
+        <w:tc>
+          <w:tcPr>
+            <w:tcW w:type="dxa" w:w="2880"/>
+          </w:tcPr>
+          <w:p>
+            <w:r>
+              <w:rPr>
+                <w:rFonts w:ascii="Times New Roman" w:hAnsi="Times New Roman" w:eastAsia="Times New Roman"/>
+              </w:rPr>
+              <w:t>2/2</w:t>
+            </w:r>
+          </w:p>
+        </w:tc>
+        <w:tc>
+          <w:tcPr>
+            <w:tcW w:type="dxa" w:w="2880"/>
+          </w:tcPr>
+          <w:p>
+            <w:r>
+              <w:rPr>
+                <w:rFonts w:ascii="Times New Roman" w:hAnsi="Times New Roman" w:eastAsia="Times New Roman"/>
+              </w:rPr>
+              <w:t>+0.169</w:t>
+            </w:r>
+          </w:p>
+        </w:tc>
+      </w:tr>
+      <w:tr>
+        <w:tc>
+          <w:tcPr>
+            <w:tcW w:type="dxa" w:w="2880"/>
+          </w:tcPr>
+          <w:p>
+            <w:r>
+              <w:rPr>
+                <w:rFonts w:ascii="Times New Roman" w:hAnsi="Times New Roman" w:eastAsia="Times New Roman"/>
+              </w:rPr>
+              <w:t>0.8</w:t>
+            </w:r>
+          </w:p>
+        </w:tc>
+        <w:tc>
+          <w:tcPr>
+            <w:tcW w:type="dxa" w:w="2880"/>
+          </w:tcPr>
+          <w:p>
+            <w:r>
+              <w:rPr>
+                <w:rFonts w:ascii="Times New Roman" w:hAnsi="Times New Roman" w:eastAsia="Times New Roman"/>
+              </w:rPr>
+              <w:t>2/2</w:t>
+            </w:r>
+          </w:p>
+        </w:tc>
+        <w:tc>
+          <w:tcPr>
+            <w:tcW w:type="dxa" w:w="2880"/>
+          </w:tcPr>
+          <w:p>
+            <w:r>
+              <w:rPr>
+                <w:rFonts w:ascii="Times New Roman" w:hAnsi="Times New Roman" w:eastAsia="Times New Roman"/>
+              </w:rPr>
+              <w:t>+0.222</w:t>
+            </w:r>
+          </w:p>
+        </w:tc>
+      </w:tr>
+      <w:tr>
+        <w:tc>
+          <w:tcPr>
+            <w:tcW w:type="dxa" w:w="2880"/>
+          </w:tcPr>
+          <w:p>
+            <w:r>
+              <w:rPr>
+                <w:rFonts w:ascii="Times New Roman" w:hAnsi="Times New Roman" w:eastAsia="Times New Roman"/>
+              </w:rPr>
+              <w:t>2</w:t>
+            </w:r>
+          </w:p>
+        </w:tc>
+        <w:tc>
+          <w:tcPr>
+            <w:tcW w:type="dxa" w:w="2880"/>
+          </w:tcPr>
+          <w:p>
+            <w:r>
+              <w:rPr>
+                <w:rFonts w:ascii="Times New Roman" w:hAnsi="Times New Roman" w:eastAsia="Times New Roman"/>
+              </w:rPr>
+              <w:t>2/2</w:t>
+            </w:r>
+          </w:p>
+        </w:tc>
+        <w:tc>
+          <w:tcPr>
+            <w:tcW w:type="dxa" w:w="2880"/>
+          </w:tcPr>
+          <w:p>
+            <w:r>
+              <w:rPr>
+                <w:rFonts w:ascii="Times New Roman" w:hAnsi="Times New Roman" w:eastAsia="Times New Roman"/>
+              </w:rPr>
+              <w:t>+0.381</w:t>
+            </w:r>
+          </w:p>
+        </w:tc>
+      </w:tr>
+      <w:tr>
+        <w:tc>
+          <w:tcPr>
+            <w:tcW w:type="dxa" w:w="2880"/>
+          </w:tcPr>
+          <w:p>
+            <w:r>
+              <w:rPr>
+                <w:rFonts w:ascii="Times New Roman" w:hAnsi="Times New Roman" w:eastAsia="Times New Roman"/>
+              </w:rPr>
+              <w:t>5</w:t>
+            </w:r>
+          </w:p>
+        </w:tc>
+        <w:tc>
+          <w:tcPr>
+            <w:tcW w:type="dxa" w:w="2880"/>
+          </w:tcPr>
+          <w:p>
+            <w:r>
+              <w:rPr>
+                <w:rFonts w:ascii="Times New Roman" w:hAnsi="Times New Roman" w:eastAsia="Times New Roman"/>
+              </w:rPr>
+              <w:t>2/2</w:t>
+            </w:r>
+          </w:p>
+        </w:tc>
+        <w:tc>
+          <w:tcPr>
+            <w:tcW w:type="dxa" w:w="2880"/>
+          </w:tcPr>
+          <w:p>
+            <w:r>
+              <w:rPr>
+                <w:rFonts w:ascii="Times New Roman" w:hAnsi="Times New Roman" w:eastAsia="Times New Roman"/>
+              </w:rPr>
+              <w:t>+0.255</w:t>
+            </w:r>
+          </w:p>
+        </w:tc>
+      </w:tr>
+    </w:tbl>
+    <w:p>
+      <w:pPr>
+        <w:pStyle w:val="Heading2"/>
+      </w:pPr>
+      <w:r>
+        <w:rPr>
+          <w:rFonts w:ascii="Times New Roman" w:hAnsi="Times New Roman" w:eastAsia="Times New Roman"/>
+        </w:rPr>
         <w:t>4.4 Does size correction help theratyping? No</w:t>
       </w:r>
     </w:p>
@@ -3136,7 +3549,7 @@
           <w:rFonts w:ascii="Times New Roman" w:hAnsi="Times New Roman" w:eastAsia="Times New Roman"/>
           <w:b/>
         </w:rPr>
-        <w:t>Table 5. Instance segmentation on the OrgaSegment eval split (12 images).</w:t>
+        <w:t>Table 6. Instance segmentation on the OrgaSegment eval split (12 images).</w:t>
       </w:r>
     </w:p>
     <w:tbl>
@@ -3644,7 +4057,7 @@
           <w:rFonts w:ascii="Times New Roman" w:hAnsi="Times New Roman" w:eastAsia="Times New Roman"/>
           <w:b/>
         </w:rPr>
-        <w:t>Table 6. Tissue recovery and fibroblast best-match share. S3000: Spearman on the 3,000 most tissue-variable genes; SALL: all genes; CENT: GTEx-centred Pearson; _NOCULT: 853 MSigDB Hallmark proliferation/MYC/EMT genes removed. Clean subset: 114 series whose summary confirms a single organ and mentions organoids (113 with profiles). Files: results/geo_fidelity_methods.json, results/geo_fidelity_clean.json.</w:t>
+        <w:t>Table 7. Tissue recovery and fibroblast best-match share. S3000: Spearman on the 3,000 most tissue-variable genes; SALL: all genes; CENT: GTEx-centred Pearson; _NOCULT: 853 MSigDB Hallmark proliferation/MYC/EMT genes removed. Clean subset: 114 series whose summary confirms a single organ and mentions organoids (113 with profiles). Files: results/geo_fidelity_methods.json, results/geo_fidelity_clean.json.</w:t>
       </w:r>
     </w:p>
     <w:tbl>
@@ -4891,7 +5304,7 @@
           <w:rFonts w:ascii="Times New Roman" w:hAnsi="Times New Roman" w:eastAsia="Times New Roman"/>
           <w:b/>
         </w:rPr>
-        <w:t>Table 7. Organ-of-origin recovery on 151 series, base method vs gene-restricted variant (results/geo_mcnemar.json).</w:t>
+        <w:t>Table 8. Organ-of-origin recovery on 151 series, base method vs gene-restricted variant (results/geo_mcnemar.json).</w:t>
       </w:r>
     </w:p>
     <w:tbl>
@@ -5702,7 +6115,7 @@
           <w:rFonts w:ascii="Times New Roman" w:hAnsi="Times New Roman" w:eastAsia="Times New Roman"/>
           <w:b/>
         </w:rPr>
-        <w:t>Table 8. Enrichment of attractor-driving genes (results/attractor_gprofiler.csv; terms with more than 2,000 genes omitted).</w:t>
+        <w:t>Table 9. Enrichment of attractor-driving genes (results/attractor_gprofiler.csv; terms with more than 2,000 genes omitted).</w:t>
       </w:r>
     </w:p>
     <w:tbl>
@@ -6211,7 +6624,7 @@
           <w:rFonts w:ascii="Times New Roman" w:hAnsi="Times New Roman" w:eastAsia="Times New Roman"/>
           <w:b/>
         </w:rPr>
-        <w:t>Table 9. Attractor on strict organoid series vs series without organoid samples (results/geo_fidelity_strict.json).</w:t>
+        <w:t>Table 10. Attractor on strict organoid series vs series without organoid samples (results/geo_fidelity_strict.json).</w:t>
       </w:r>
     </w:p>
     <w:tbl>
@@ -7230,7 +7643,7 @@
           <w:rFonts w:ascii="Times New Roman" w:hAnsi="Times New Roman" w:eastAsia="Times New Roman"/>
           <w:b/>
         </w:rPr>
-        <w:t>Table 10. Organ recovery on the 45 strictly organoid series (SALL_PARONLY; results/strict_organ_recovery.csv).</w:t>
+        <w:t>Table 11. Organ recovery on the 45 strictly organoid series (SALL_PARONLY; results/strict_organ_recovery.csv).</w:t>
       </w:r>
     </w:p>
     <w:tbl>
@@ -7905,7 +8318,7 @@
           <w:rFonts w:ascii="Times New Roman" w:hAnsi="Times New Roman" w:eastAsia="Times New Roman"/>
           <w:b/>
         </w:rPr>
-        <w:t>Table 11. Out-of-sample organoid profiles (results/ae_replication.csv).</w:t>
+        <w:t>Table 12. Out-of-sample organoid profiles (results/ae_replication.csv).</w:t>
       </w:r>
     </w:p>
     <w:tbl>
@@ -8737,7 +9150,7 @@
           <w:rFonts w:ascii="Times New Roman" w:hAnsi="Times New Roman" w:eastAsia="Times New Roman"/>
           <w:b/>
         </w:rPr>
-        <w:t>Table 12. Further pre-registered annotation checks on fixed 100-gene deficit lists, not independent experiments. Each p is descriptive in an exploratory sequence; results/deficit_goa.json, deficit_kegg.json, deficit_rhea.json.</w:t>
+        <w:t>Table 13. Further pre-registered annotation checks on fixed 100-gene deficit lists, not independent experiments. Each p is descriptive in an exploratory sequence; results/deficit_goa.json, deficit_kegg.json, deficit_rhea.json.</w:t>
       </w:r>
     </w:p>
     <w:tbl>
@@ -9457,7 +9870,7 @@
           <w:rFonts w:ascii="Times New Roman" w:hAnsi="Times New Roman" w:eastAsia="Times New Roman"/>
           <w:b/>
         </w:rPr>
-        <w:t>Table 13. Tools genuinely used (results/tools_ledger.csv): 47 entries, 40 counting toward the gate after excluding infrastructure. Target of 40 reached; this counts resources genuinely used, not independent biological confirmations.</w:t>
+        <w:t>Table 14. Tools genuinely used (results/tools_ledger.csv): 47 entries, 40 counting toward the gate after excluding infrastructure. Target of 40 reached; this counts resources genuinely used, not independent biological confirmations.</w:t>
       </w:r>
     </w:p>
     <w:tbl>
@@ -12386,6 +12799,18 @@
           <w:rFonts w:ascii="Times New Roman" w:hAnsi="Times New Roman" w:eastAsia="Times New Roman"/>
         </w:rPr>
         <w:t>Anderson JD, et al. CFTR function and clinical response to modulators parallel nasal epithelial organoid swelling. AJP Lung 2021. https://pmc.ncbi.nlm.nih.gov/articles/PMC8321858/</w:t>
+      </w:r>
+    </w:p>
+    <w:p>
+      <w:pPr>
+        <w:spacing w:after="120"/>
+        <w:jc w:val="both"/>
+      </w:pPr>
+      <w:r>
+        <w:rPr>
+          <w:rFonts w:ascii="Times New Roman" w:hAnsi="Times New Roman" w:eastAsia="Times New Roman"/>
+        </w:rPr>
+        <w:t>Botelho H, Hagemeijer MC, et al. FIS_image_analysis demonstration dataset. https://github.com/hmbotelho/FIS_image_analysis</w:t>
       </w:r>
     </w:p>
     <w:p>

</xml_diff>

<commit_message>
Include one-plate tracking bias and bounded sensitivity in paper
</commit_message>
<xml_diff>
--- a/paper/mega27-03-virtual-organoid-paper.docx
+++ b/paper/mega27-03-virtual-organoid-paper.docx
@@ -3117,6 +3117,18 @@
           <w:rFonts w:ascii="Times New Roman" w:hAnsi="Times New Roman" w:eastAsia="Times New Roman"/>
         </w:rPr>
         <w:t>A separate public intestinal organoid demonstration experiment from the FIS_image_analysis repository provides object-level tracked areas in 32 CSVs from ONE plate, one class-II CFTR genotype, and two wells per treatment at each of eight matched forskolin doses. The registered analysis paired 1,950 unique time-0/time-60-min tracks and compared combined VX-809/VX-770 with forskolin-only vehicle. Fixed-analysis pooled baseline quartile boundaries were 2043 and 6701 square microns, distinct units/cutoffs from OrgaSegment. The drug-minus-vehicle large-minus-small log-swelling effect is positive in 7/8 dose strata (one-sided sign p=0.0352; H1 passes); the lowest dose is negative. This is assay-source support under an older double modulator, not independent donor replication: eight doses share a plate and donor, so sign-test strata are correlated and its p is descriptive. The original donor x plate x dose stress test still fails. Tracking attrition may depend on size. No Trikafta generalization, new established discovery, or clinical prediction follows (results/external_fis_demo.json; results/finding_external_fis_demo.md).</w:t>
+      </w:r>
+    </w:p>
+    <w:p>
+      <w:pPr>
+        <w:spacing w:after="120"/>
+        <w:jc w:val="both"/>
+      </w:pPr>
+      <w:r>
+        <w:rPr>
+          <w:rFonts w:ascii="Times New Roman" w:hAnsi="Times New Roman" w:eastAsia="Times New Roman"/>
+        </w:rPr>
+        <w:t>Well-as-unit sensitivity on the same demo plate (registered before analysis): all eight doses have four eligible wells; 6/8 dose effects are positive, with a median of +0.129. A 2,000-draw well bootstrap *conditional on this donor/plate* yields [+0.091, +0.161], not an across-donor interval. Tracking attrition is material: among unique labeled baseline objects, large-object retention is 91.5% for vehicle and 83.3% for combo, while labeled small-object retention is 100% in both. Including unlabeled baseline objects lowers small retention to 94.5% and 92.3%. Assigning all missing outcomes to adverse observed same-cell 5th/95th percentiles gives 6/8 positive doses, median +0.047, but this arbitrary bound cannot rule out stronger missingness bias. Source-level evidence is conditional and must not be called donor-level validation (results/external_fis_robustness.json; results/external_fis_missingtracks.json).</w:t>
       </w:r>
     </w:p>
     <w:p>

</xml_diff>

<commit_message>
Include same-plate Fiji pipeline sensitivity and limits
</commit_message>
<xml_diff>
--- a/paper/mega27-03-virtual-organoid-paper.docx
+++ b/paper/mega27-03-virtual-organoid-paper.docx
@@ -3129,6 +3129,18 @@
           <w:rFonts w:ascii="Times New Roman" w:hAnsi="Times New Roman" w:eastAsia="Times New Roman"/>
         </w:rPr>
         <w:t>Well-as-unit sensitivity on the same demo plate (registered before analysis): all eight doses have four eligible wells; 6/8 dose effects are positive, with a median of +0.129. A 2,000-draw well bootstrap *conditional on this donor/plate* yields [+0.091, +0.161], not an across-donor interval. Tracking attrition is material: among unique labeled baseline objects, large-object retention is 91.5% for vehicle and 83.3% for combo, while labeled small-object retention is 100% in both. Including unlabeled baseline objects lowers small retention to 94.5% and 92.3%. Assigning all missing outcomes to adverse observed same-cell 5th/95th percentiles gives 6/8 positive doses, median +0.047, but this arbitrary bound cannot rule out stronger missingness bias. Source-level evidence is conditional and must not be called donor-level validation (results/external_fis_robustness.json; results/external_fis_missingtracks.json).</w:t>
+      </w:r>
+    </w:p>
+    <w:p>
+      <w:pPr>
+        <w:spacing w:after="120"/>
+        <w:jc w:val="both"/>
+      </w:pPr>
+      <w:r>
+        <w:rPr>
+          <w:rFonts w:ascii="Times New Roman" w:hAnsi="Times New Roman" w:eastAsia="Times New Roman"/>
+        </w:rPr>
+        <w:t>Pipeline sensitivity on the SAME images/plate/donor: the repository's alternative Fiji/ImageJ tracking output yielded 1,938 paired tracks and a positive combination-minus-vehicle size contrast at 7/8 doses (median +0.225; pre-registered coverage/sign gate passes). Fiji-specific quartile cutoffs and segmentation/tracking differ from CellProfiler, so effect magnitudes are not interchangeable. In Fiji, labeled large-object retention was 98.4% vehicle and 93.8% combo, unlike CellProfiler's 91.5%/83.3%. This pipeline-dependent selection limits any effect-size claim. These two pipelines are NOT two independent biological datasets (results/external_fis_fiji.json).</w:t>
       </w:r>
     </w:p>
     <w:p>

</xml_diff>

<commit_message>
Include twenty-patient well-level FIS analysis in paper
</commit_message>
<xml_diff>
--- a/paper/mega27-03-virtual-organoid-paper.docx
+++ b/paper/mega27-03-virtual-organoid-paper.docx
@@ -435,7 +435,7 @@
           <w:rFonts w:ascii="Times New Roman" w:hAnsi="Times New Roman" w:eastAsia="Times New Roman"/>
           <w:b/>
         </w:rPr>
-        <w:t>Table 1. Dataset manifest (distinct, accession-level). Three distinct assay/image datasets shown here; the committed accession ledger now has 166 primary entries, including one independent FIS demo plate counted once (not 32 CSV datasets).</w:t>
+        <w:t>Table 1. Dataset manifest (distinct, accession-level). Four distinct assay/image datasets shown here; the committed accession ledger now has 167 primary entries, including one independent FIS demo plate and one 20-patient FIS accession each counted once.</w:t>
       </w:r>
     </w:p>
     <w:tbl>
@@ -715,6 +715,73 @@
                 <w:rFonts w:ascii="Times New Roman" w:hAnsi="Times New Roman" w:eastAsia="Times New Roman"/>
               </w:rPr>
               <w:t>U-Net segmentation benchmark</w:t>
+            </w:r>
+          </w:p>
+        </w:tc>
+      </w:tr>
+      <w:tr>
+        <w:tc>
+          <w:tcPr>
+            <w:tcW w:type="dxa" w:w="1728"/>
+          </w:tcPr>
+          <w:p>
+            <w:r>
+              <w:rPr>
+                <w:rFonts w:ascii="Times New Roman" w:hAnsi="Times New Roman" w:eastAsia="Times New Roman"/>
+              </w:rPr>
+              <w:t>4</w:t>
+            </w:r>
+          </w:p>
+        </w:tc>
+        <w:tc>
+          <w:tcPr>
+            <w:tcW w:type="dxa" w:w="1728"/>
+          </w:tcPr>
+          <w:p>
+            <w:r>
+              <w:rPr>
+                <w:rFonts w:ascii="Times New Roman" w:hAnsi="Times New Roman" w:eastAsia="Times New Roman"/>
+              </w:rPr>
+              <w:t>Drevinek intestinal FIS cohort</w:t>
+            </w:r>
+          </w:p>
+        </w:tc>
+        <w:tc>
+          <w:tcPr>
+            <w:tcW w:type="dxa" w:w="1728"/>
+          </w:tcPr>
+          <w:p>
+            <w:r>
+              <w:rPr>
+                <w:rFonts w:ascii="Times New Roman" w:hAnsi="Times New Roman" w:eastAsia="Times New Roman"/>
+              </w:rPr>
+              <w:t>Zenodo 4771466</w:t>
+            </w:r>
+          </w:p>
+        </w:tc>
+        <w:tc>
+          <w:tcPr>
+            <w:tcW w:type="dxa" w:w="1728"/>
+          </w:tcPr>
+          <w:p>
+            <w:r>
+              <w:rPr>
+                <w:rFonts w:ascii="Times New Roman" w:hAnsi="Times New Roman" w:eastAsia="Times New Roman"/>
+              </w:rPr>
+              <w:t>20 patient IDs, 54 plates, well-level 0-60 minute area series</w:t>
+            </w:r>
+          </w:p>
+        </w:tc>
+        <w:tc>
+          <w:tcPr>
+            <w:tcW w:type="dxa" w:w="1728"/>
+          </w:tcPr>
+          <w:p>
+            <w:r>
+              <w:rPr>
+                <w:rFonts w:ascii="Times New Roman" w:hAnsi="Times New Roman" w:eastAsia="Times New Roman"/>
+              </w:rPr>
+              <w:t>triple-vs-double treatment ranking</w:t>
             </w:r>
           </w:p>
         </w:tc>
@@ -3541,6 +3608,911 @@
         <w:rPr>
           <w:rFonts w:ascii="Times New Roman" w:hAnsi="Times New Roman" w:eastAsia="Times New Roman"/>
         </w:rPr>
+        <w:t>4.3d Distinct multi-patient well-level FIS cohort: published drug ranking reproduced</w:t>
+      </w:r>
+    </w:p>
+    <w:p>
+      <w:pPr>
+        <w:spacing w:after="120"/>
+        <w:jc w:val="both"/>
+      </w:pPr>
+      <w:r>
+        <w:rPr>
+          <w:rFonts w:ascii="Times New Roman" w:hAnsi="Times New Roman" w:eastAsia="Times New Roman"/>
+        </w:rPr>
+        <w:t>A genuinely distinct dataset (Drevinek et al., Zenodo 4771466) contains well-level area time series from 20 CF patient IDs on 54 patient-date plates. The analysis was pre-registered and committed before downloading the source; source plate-map inspection then showed that its FskOnly wells are a reference line, not patient-matched vehicle. That provenance correction was committed before outcome analysis. Of 432 patient-plate-dose blocks, 431 have &gt;=2 wells per treatment and matched 0-60 minute measurements; one TEZ/IVA block has one well and is excluded. Equal-well area AUC is normalized to each well's time-zero area, then triple ELX/TEZ/IVA minus double TEZ/IVA is taken at patient/plate/dose level; each patient contributes the median over its blocks. Positive in 20/20 patients, median +0.249 baseline-area AUC (exact one-sided sign p=9.5e-07), so the pre-registered treatment-ranking H1 passes. This confirms the published in-vitro triple-over-double ordering on the paper's own public data, not a new discovery or an independent individual-organoid size test. Forty-seven of 431 plate-dose block rankings reverse if unnormalized raw area replaces normalized AUC; both patient-level summaries remain 20/20 positive. No clinical prediction follows (results/drevinek_fis.json; results/finding_drevinek_fis.md).</w:t>
+      </w:r>
+    </w:p>
+    <w:p>
+      <w:r>
+        <w:rPr>
+          <w:rFonts w:ascii="Times New Roman" w:hAnsi="Times New Roman" w:eastAsia="Times New Roman"/>
+          <w:b/>
+        </w:rPr>
+        <w:t>Table 6. Patient-equal independent well-level treatment-ranking test; no individual organoid areas in this accession.</w:t>
+      </w:r>
+    </w:p>
+    <w:tbl>
+      <w:tblPr>
+        <w:tblStyle w:val="LightGrid-Accent1"/>
+        <w:tblW w:type="auto" w:w="0"/>
+        <w:tblLook w:firstColumn="1" w:firstRow="1" w:lastColumn="0" w:lastRow="0" w:noHBand="0" w:noVBand="1" w:val="04A0"/>
+      </w:tblPr>
+      <w:tblGrid>
+        <w:gridCol w:w="2880"/>
+        <w:gridCol w:w="2880"/>
+        <w:gridCol w:w="2880"/>
+      </w:tblGrid>
+      <w:tr>
+        <w:tc>
+          <w:tcPr>
+            <w:tcW w:type="dxa" w:w="2880"/>
+          </w:tcPr>
+          <w:p>
+            <w:r>
+              <w:rPr>
+                <w:rFonts w:ascii="Times New Roman" w:hAnsi="Times New Roman" w:eastAsia="Times New Roman"/>
+              </w:rPr>
+              <w:t>patient</w:t>
+            </w:r>
+          </w:p>
+        </w:tc>
+        <w:tc>
+          <w:tcPr>
+            <w:tcW w:type="dxa" w:w="2880"/>
+          </w:tcPr>
+          <w:p>
+            <w:r>
+              <w:rPr>
+                <w:rFonts w:ascii="Times New Roman" w:hAnsi="Times New Roman" w:eastAsia="Times New Roman"/>
+              </w:rPr>
+              <w:t>n plate-dose blocks</w:t>
+            </w:r>
+          </w:p>
+        </w:tc>
+        <w:tc>
+          <w:tcPr>
+            <w:tcW w:type="dxa" w:w="2880"/>
+          </w:tcPr>
+          <w:p>
+            <w:r>
+              <w:rPr>
+                <w:rFonts w:ascii="Times New Roman" w:hAnsi="Times New Roman" w:eastAsia="Times New Roman"/>
+              </w:rPr>
+              <w:t>normalized triple-double AUC</w:t>
+            </w:r>
+          </w:p>
+        </w:tc>
+      </w:tr>
+      <w:tr>
+        <w:tc>
+          <w:tcPr>
+            <w:tcW w:type="dxa" w:w="2880"/>
+          </w:tcPr>
+          <w:p>
+            <w:r>
+              <w:rPr>
+                <w:rFonts w:ascii="Times New Roman" w:hAnsi="Times New Roman" w:eastAsia="Times New Roman"/>
+              </w:rPr>
+              <w:t>04-CF</w:t>
+            </w:r>
+          </w:p>
+        </w:tc>
+        <w:tc>
+          <w:tcPr>
+            <w:tcW w:type="dxa" w:w="2880"/>
+          </w:tcPr>
+          <w:p>
+            <w:r>
+              <w:rPr>
+                <w:rFonts w:ascii="Times New Roman" w:hAnsi="Times New Roman" w:eastAsia="Times New Roman"/>
+              </w:rPr>
+              <w:t>24</w:t>
+            </w:r>
+          </w:p>
+        </w:tc>
+        <w:tc>
+          <w:tcPr>
+            <w:tcW w:type="dxa" w:w="2880"/>
+          </w:tcPr>
+          <w:p>
+            <w:r>
+              <w:rPr>
+                <w:rFonts w:ascii="Times New Roman" w:hAnsi="Times New Roman" w:eastAsia="Times New Roman"/>
+              </w:rPr>
+              <w:t>+0.240</w:t>
+            </w:r>
+          </w:p>
+        </w:tc>
+      </w:tr>
+      <w:tr>
+        <w:tc>
+          <w:tcPr>
+            <w:tcW w:type="dxa" w:w="2880"/>
+          </w:tcPr>
+          <w:p>
+            <w:r>
+              <w:rPr>
+                <w:rFonts w:ascii="Times New Roman" w:hAnsi="Times New Roman" w:eastAsia="Times New Roman"/>
+              </w:rPr>
+              <w:t>05-CF</w:t>
+            </w:r>
+          </w:p>
+        </w:tc>
+        <w:tc>
+          <w:tcPr>
+            <w:tcW w:type="dxa" w:w="2880"/>
+          </w:tcPr>
+          <w:p>
+            <w:r>
+              <w:rPr>
+                <w:rFonts w:ascii="Times New Roman" w:hAnsi="Times New Roman" w:eastAsia="Times New Roman"/>
+              </w:rPr>
+              <w:t>24</w:t>
+            </w:r>
+          </w:p>
+        </w:tc>
+        <w:tc>
+          <w:tcPr>
+            <w:tcW w:type="dxa" w:w="2880"/>
+          </w:tcPr>
+          <w:p>
+            <w:r>
+              <w:rPr>
+                <w:rFonts w:ascii="Times New Roman" w:hAnsi="Times New Roman" w:eastAsia="Times New Roman"/>
+              </w:rPr>
+              <w:t>+0.244</w:t>
+            </w:r>
+          </w:p>
+        </w:tc>
+      </w:tr>
+      <w:tr>
+        <w:tc>
+          <w:tcPr>
+            <w:tcW w:type="dxa" w:w="2880"/>
+          </w:tcPr>
+          <w:p>
+            <w:r>
+              <w:rPr>
+                <w:rFonts w:ascii="Times New Roman" w:hAnsi="Times New Roman" w:eastAsia="Times New Roman"/>
+              </w:rPr>
+              <w:t>10-CF</w:t>
+            </w:r>
+          </w:p>
+        </w:tc>
+        <w:tc>
+          <w:tcPr>
+            <w:tcW w:type="dxa" w:w="2880"/>
+          </w:tcPr>
+          <w:p>
+            <w:r>
+              <w:rPr>
+                <w:rFonts w:ascii="Times New Roman" w:hAnsi="Times New Roman" w:eastAsia="Times New Roman"/>
+              </w:rPr>
+              <w:t>24</w:t>
+            </w:r>
+          </w:p>
+        </w:tc>
+        <w:tc>
+          <w:tcPr>
+            <w:tcW w:type="dxa" w:w="2880"/>
+          </w:tcPr>
+          <w:p>
+            <w:r>
+              <w:rPr>
+                <w:rFonts w:ascii="Times New Roman" w:hAnsi="Times New Roman" w:eastAsia="Times New Roman"/>
+              </w:rPr>
+              <w:t>+0.250</w:t>
+            </w:r>
+          </w:p>
+        </w:tc>
+      </w:tr>
+      <w:tr>
+        <w:tc>
+          <w:tcPr>
+            <w:tcW w:type="dxa" w:w="2880"/>
+          </w:tcPr>
+          <w:p>
+            <w:r>
+              <w:rPr>
+                <w:rFonts w:ascii="Times New Roman" w:hAnsi="Times New Roman" w:eastAsia="Times New Roman"/>
+              </w:rPr>
+              <w:t>20-CF</w:t>
+            </w:r>
+          </w:p>
+        </w:tc>
+        <w:tc>
+          <w:tcPr>
+            <w:tcW w:type="dxa" w:w="2880"/>
+          </w:tcPr>
+          <w:p>
+            <w:r>
+              <w:rPr>
+                <w:rFonts w:ascii="Times New Roman" w:hAnsi="Times New Roman" w:eastAsia="Times New Roman"/>
+              </w:rPr>
+              <w:t>24</w:t>
+            </w:r>
+          </w:p>
+        </w:tc>
+        <w:tc>
+          <w:tcPr>
+            <w:tcW w:type="dxa" w:w="2880"/>
+          </w:tcPr>
+          <w:p>
+            <w:r>
+              <w:rPr>
+                <w:rFonts w:ascii="Times New Roman" w:hAnsi="Times New Roman" w:eastAsia="Times New Roman"/>
+              </w:rPr>
+              <w:t>+0.153</w:t>
+            </w:r>
+          </w:p>
+        </w:tc>
+      </w:tr>
+      <w:tr>
+        <w:tc>
+          <w:tcPr>
+            <w:tcW w:type="dxa" w:w="2880"/>
+          </w:tcPr>
+          <w:p>
+            <w:r>
+              <w:rPr>
+                <w:rFonts w:ascii="Times New Roman" w:hAnsi="Times New Roman" w:eastAsia="Times New Roman"/>
+              </w:rPr>
+              <w:t>21-CF</w:t>
+            </w:r>
+          </w:p>
+        </w:tc>
+        <w:tc>
+          <w:tcPr>
+            <w:tcW w:type="dxa" w:w="2880"/>
+          </w:tcPr>
+          <w:p>
+            <w:r>
+              <w:rPr>
+                <w:rFonts w:ascii="Times New Roman" w:hAnsi="Times New Roman" w:eastAsia="Times New Roman"/>
+              </w:rPr>
+              <w:t>23</w:t>
+            </w:r>
+          </w:p>
+        </w:tc>
+        <w:tc>
+          <w:tcPr>
+            <w:tcW w:type="dxa" w:w="2880"/>
+          </w:tcPr>
+          <w:p>
+            <w:r>
+              <w:rPr>
+                <w:rFonts w:ascii="Times New Roman" w:hAnsi="Times New Roman" w:eastAsia="Times New Roman"/>
+              </w:rPr>
+              <w:t>+0.253</w:t>
+            </w:r>
+          </w:p>
+        </w:tc>
+      </w:tr>
+      <w:tr>
+        <w:tc>
+          <w:tcPr>
+            <w:tcW w:type="dxa" w:w="2880"/>
+          </w:tcPr>
+          <w:p>
+            <w:r>
+              <w:rPr>
+                <w:rFonts w:ascii="Times New Roman" w:hAnsi="Times New Roman" w:eastAsia="Times New Roman"/>
+              </w:rPr>
+              <w:t>22-CF</w:t>
+            </w:r>
+          </w:p>
+        </w:tc>
+        <w:tc>
+          <w:tcPr>
+            <w:tcW w:type="dxa" w:w="2880"/>
+          </w:tcPr>
+          <w:p>
+            <w:r>
+              <w:rPr>
+                <w:rFonts w:ascii="Times New Roman" w:hAnsi="Times New Roman" w:eastAsia="Times New Roman"/>
+              </w:rPr>
+              <w:t>24</w:t>
+            </w:r>
+          </w:p>
+        </w:tc>
+        <w:tc>
+          <w:tcPr>
+            <w:tcW w:type="dxa" w:w="2880"/>
+          </w:tcPr>
+          <w:p>
+            <w:r>
+              <w:rPr>
+                <w:rFonts w:ascii="Times New Roman" w:hAnsi="Times New Roman" w:eastAsia="Times New Roman"/>
+              </w:rPr>
+              <w:t>+0.216</w:t>
+            </w:r>
+          </w:p>
+        </w:tc>
+      </w:tr>
+      <w:tr>
+        <w:tc>
+          <w:tcPr>
+            <w:tcW w:type="dxa" w:w="2880"/>
+          </w:tcPr>
+          <w:p>
+            <w:r>
+              <w:rPr>
+                <w:rFonts w:ascii="Times New Roman" w:hAnsi="Times New Roman" w:eastAsia="Times New Roman"/>
+              </w:rPr>
+              <w:t>41-CF</w:t>
+            </w:r>
+          </w:p>
+        </w:tc>
+        <w:tc>
+          <w:tcPr>
+            <w:tcW w:type="dxa" w:w="2880"/>
+          </w:tcPr>
+          <w:p>
+            <w:r>
+              <w:rPr>
+                <w:rFonts w:ascii="Times New Roman" w:hAnsi="Times New Roman" w:eastAsia="Times New Roman"/>
+              </w:rPr>
+              <w:t>24</w:t>
+            </w:r>
+          </w:p>
+        </w:tc>
+        <w:tc>
+          <w:tcPr>
+            <w:tcW w:type="dxa" w:w="2880"/>
+          </w:tcPr>
+          <w:p>
+            <w:r>
+              <w:rPr>
+                <w:rFonts w:ascii="Times New Roman" w:hAnsi="Times New Roman" w:eastAsia="Times New Roman"/>
+              </w:rPr>
+              <w:t>+0.328</w:t>
+            </w:r>
+          </w:p>
+        </w:tc>
+      </w:tr>
+      <w:tr>
+        <w:tc>
+          <w:tcPr>
+            <w:tcW w:type="dxa" w:w="2880"/>
+          </w:tcPr>
+          <w:p>
+            <w:r>
+              <w:rPr>
+                <w:rFonts w:ascii="Times New Roman" w:hAnsi="Times New Roman" w:eastAsia="Times New Roman"/>
+              </w:rPr>
+              <w:t>47-CF</w:t>
+            </w:r>
+          </w:p>
+        </w:tc>
+        <w:tc>
+          <w:tcPr>
+            <w:tcW w:type="dxa" w:w="2880"/>
+          </w:tcPr>
+          <w:p>
+            <w:r>
+              <w:rPr>
+                <w:rFonts w:ascii="Times New Roman" w:hAnsi="Times New Roman" w:eastAsia="Times New Roman"/>
+              </w:rPr>
+              <w:t>24</w:t>
+            </w:r>
+          </w:p>
+        </w:tc>
+        <w:tc>
+          <w:tcPr>
+            <w:tcW w:type="dxa" w:w="2880"/>
+          </w:tcPr>
+          <w:p>
+            <w:r>
+              <w:rPr>
+                <w:rFonts w:ascii="Times New Roman" w:hAnsi="Times New Roman" w:eastAsia="Times New Roman"/>
+              </w:rPr>
+              <w:t>+0.300</w:t>
+            </w:r>
+          </w:p>
+        </w:tc>
+      </w:tr>
+      <w:tr>
+        <w:tc>
+          <w:tcPr>
+            <w:tcW w:type="dxa" w:w="2880"/>
+          </w:tcPr>
+          <w:p>
+            <w:r>
+              <w:rPr>
+                <w:rFonts w:ascii="Times New Roman" w:hAnsi="Times New Roman" w:eastAsia="Times New Roman"/>
+              </w:rPr>
+              <w:t>57-CF</w:t>
+            </w:r>
+          </w:p>
+        </w:tc>
+        <w:tc>
+          <w:tcPr>
+            <w:tcW w:type="dxa" w:w="2880"/>
+          </w:tcPr>
+          <w:p>
+            <w:r>
+              <w:rPr>
+                <w:rFonts w:ascii="Times New Roman" w:hAnsi="Times New Roman" w:eastAsia="Times New Roman"/>
+              </w:rPr>
+              <w:t>24</w:t>
+            </w:r>
+          </w:p>
+        </w:tc>
+        <w:tc>
+          <w:tcPr>
+            <w:tcW w:type="dxa" w:w="2880"/>
+          </w:tcPr>
+          <w:p>
+            <w:r>
+              <w:rPr>
+                <w:rFonts w:ascii="Times New Roman" w:hAnsi="Times New Roman" w:eastAsia="Times New Roman"/>
+              </w:rPr>
+              <w:t>+0.275</w:t>
+            </w:r>
+          </w:p>
+        </w:tc>
+      </w:tr>
+      <w:tr>
+        <w:tc>
+          <w:tcPr>
+            <w:tcW w:type="dxa" w:w="2880"/>
+          </w:tcPr>
+          <w:p>
+            <w:r>
+              <w:rPr>
+                <w:rFonts w:ascii="Times New Roman" w:hAnsi="Times New Roman" w:eastAsia="Times New Roman"/>
+              </w:rPr>
+              <w:t>58-CF</w:t>
+            </w:r>
+          </w:p>
+        </w:tc>
+        <w:tc>
+          <w:tcPr>
+            <w:tcW w:type="dxa" w:w="2880"/>
+          </w:tcPr>
+          <w:p>
+            <w:r>
+              <w:rPr>
+                <w:rFonts w:ascii="Times New Roman" w:hAnsi="Times New Roman" w:eastAsia="Times New Roman"/>
+              </w:rPr>
+              <w:t>24</w:t>
+            </w:r>
+          </w:p>
+        </w:tc>
+        <w:tc>
+          <w:tcPr>
+            <w:tcW w:type="dxa" w:w="2880"/>
+          </w:tcPr>
+          <w:p>
+            <w:r>
+              <w:rPr>
+                <w:rFonts w:ascii="Times New Roman" w:hAnsi="Times New Roman" w:eastAsia="Times New Roman"/>
+              </w:rPr>
+              <w:t>+0.019</w:t>
+            </w:r>
+          </w:p>
+        </w:tc>
+      </w:tr>
+      <w:tr>
+        <w:tc>
+          <w:tcPr>
+            <w:tcW w:type="dxa" w:w="2880"/>
+          </w:tcPr>
+          <w:p>
+            <w:r>
+              <w:rPr>
+                <w:rFonts w:ascii="Times New Roman" w:hAnsi="Times New Roman" w:eastAsia="Times New Roman"/>
+              </w:rPr>
+              <w:t>59-CF</w:t>
+            </w:r>
+          </w:p>
+        </w:tc>
+        <w:tc>
+          <w:tcPr>
+            <w:tcW w:type="dxa" w:w="2880"/>
+          </w:tcPr>
+          <w:p>
+            <w:r>
+              <w:rPr>
+                <w:rFonts w:ascii="Times New Roman" w:hAnsi="Times New Roman" w:eastAsia="Times New Roman"/>
+              </w:rPr>
+              <w:t>24</w:t>
+            </w:r>
+          </w:p>
+        </w:tc>
+        <w:tc>
+          <w:tcPr>
+            <w:tcW w:type="dxa" w:w="2880"/>
+          </w:tcPr>
+          <w:p>
+            <w:r>
+              <w:rPr>
+                <w:rFonts w:ascii="Times New Roman" w:hAnsi="Times New Roman" w:eastAsia="Times New Roman"/>
+              </w:rPr>
+              <w:t>+0.374</w:t>
+            </w:r>
+          </w:p>
+        </w:tc>
+      </w:tr>
+      <w:tr>
+        <w:tc>
+          <w:tcPr>
+            <w:tcW w:type="dxa" w:w="2880"/>
+          </w:tcPr>
+          <w:p>
+            <w:r>
+              <w:rPr>
+                <w:rFonts w:ascii="Times New Roman" w:hAnsi="Times New Roman" w:eastAsia="Times New Roman"/>
+              </w:rPr>
+              <w:t>60-CF</w:t>
+            </w:r>
+          </w:p>
+        </w:tc>
+        <w:tc>
+          <w:tcPr>
+            <w:tcW w:type="dxa" w:w="2880"/>
+          </w:tcPr>
+          <w:p>
+            <w:r>
+              <w:rPr>
+                <w:rFonts w:ascii="Times New Roman" w:hAnsi="Times New Roman" w:eastAsia="Times New Roman"/>
+              </w:rPr>
+              <w:t>24</w:t>
+            </w:r>
+          </w:p>
+        </w:tc>
+        <w:tc>
+          <w:tcPr>
+            <w:tcW w:type="dxa" w:w="2880"/>
+          </w:tcPr>
+          <w:p>
+            <w:r>
+              <w:rPr>
+                <w:rFonts w:ascii="Times New Roman" w:hAnsi="Times New Roman" w:eastAsia="Times New Roman"/>
+              </w:rPr>
+              <w:t>+0.285</w:t>
+            </w:r>
+          </w:p>
+        </w:tc>
+      </w:tr>
+      <w:tr>
+        <w:tc>
+          <w:tcPr>
+            <w:tcW w:type="dxa" w:w="2880"/>
+          </w:tcPr>
+          <w:p>
+            <w:r>
+              <w:rPr>
+                <w:rFonts w:ascii="Times New Roman" w:hAnsi="Times New Roman" w:eastAsia="Times New Roman"/>
+              </w:rPr>
+              <w:t>61-CF</w:t>
+            </w:r>
+          </w:p>
+        </w:tc>
+        <w:tc>
+          <w:tcPr>
+            <w:tcW w:type="dxa" w:w="2880"/>
+          </w:tcPr>
+          <w:p>
+            <w:r>
+              <w:rPr>
+                <w:rFonts w:ascii="Times New Roman" w:hAnsi="Times New Roman" w:eastAsia="Times New Roman"/>
+              </w:rPr>
+              <w:t>8</w:t>
+            </w:r>
+          </w:p>
+        </w:tc>
+        <w:tc>
+          <w:tcPr>
+            <w:tcW w:type="dxa" w:w="2880"/>
+          </w:tcPr>
+          <w:p>
+            <w:r>
+              <w:rPr>
+                <w:rFonts w:ascii="Times New Roman" w:hAnsi="Times New Roman" w:eastAsia="Times New Roman"/>
+              </w:rPr>
+              <w:t>+0.207</w:t>
+            </w:r>
+          </w:p>
+        </w:tc>
+      </w:tr>
+      <w:tr>
+        <w:tc>
+          <w:tcPr>
+            <w:tcW w:type="dxa" w:w="2880"/>
+          </w:tcPr>
+          <w:p>
+            <w:r>
+              <w:rPr>
+                <w:rFonts w:ascii="Times New Roman" w:hAnsi="Times New Roman" w:eastAsia="Times New Roman"/>
+              </w:rPr>
+              <w:t>62-CF</w:t>
+            </w:r>
+          </w:p>
+        </w:tc>
+        <w:tc>
+          <w:tcPr>
+            <w:tcW w:type="dxa" w:w="2880"/>
+          </w:tcPr>
+          <w:p>
+            <w:r>
+              <w:rPr>
+                <w:rFonts w:ascii="Times New Roman" w:hAnsi="Times New Roman" w:eastAsia="Times New Roman"/>
+              </w:rPr>
+              <w:t>24</w:t>
+            </w:r>
+          </w:p>
+        </w:tc>
+        <w:tc>
+          <w:tcPr>
+            <w:tcW w:type="dxa" w:w="2880"/>
+          </w:tcPr>
+          <w:p>
+            <w:r>
+              <w:rPr>
+                <w:rFonts w:ascii="Times New Roman" w:hAnsi="Times New Roman" w:eastAsia="Times New Roman"/>
+              </w:rPr>
+              <w:t>+0.246</w:t>
+            </w:r>
+          </w:p>
+        </w:tc>
+      </w:tr>
+      <w:tr>
+        <w:tc>
+          <w:tcPr>
+            <w:tcW w:type="dxa" w:w="2880"/>
+          </w:tcPr>
+          <w:p>
+            <w:r>
+              <w:rPr>
+                <w:rFonts w:ascii="Times New Roman" w:hAnsi="Times New Roman" w:eastAsia="Times New Roman"/>
+              </w:rPr>
+              <w:t>63-CF</w:t>
+            </w:r>
+          </w:p>
+        </w:tc>
+        <w:tc>
+          <w:tcPr>
+            <w:tcW w:type="dxa" w:w="2880"/>
+          </w:tcPr>
+          <w:p>
+            <w:r>
+              <w:rPr>
+                <w:rFonts w:ascii="Times New Roman" w:hAnsi="Times New Roman" w:eastAsia="Times New Roman"/>
+              </w:rPr>
+              <w:t>8</w:t>
+            </w:r>
+          </w:p>
+        </w:tc>
+        <w:tc>
+          <w:tcPr>
+            <w:tcW w:type="dxa" w:w="2880"/>
+          </w:tcPr>
+          <w:p>
+            <w:r>
+              <w:rPr>
+                <w:rFonts w:ascii="Times New Roman" w:hAnsi="Times New Roman" w:eastAsia="Times New Roman"/>
+              </w:rPr>
+              <w:t>+0.108</w:t>
+            </w:r>
+          </w:p>
+        </w:tc>
+      </w:tr>
+      <w:tr>
+        <w:tc>
+          <w:tcPr>
+            <w:tcW w:type="dxa" w:w="2880"/>
+          </w:tcPr>
+          <w:p>
+            <w:r>
+              <w:rPr>
+                <w:rFonts w:ascii="Times New Roman" w:hAnsi="Times New Roman" w:eastAsia="Times New Roman"/>
+              </w:rPr>
+              <w:t>64-CF</w:t>
+            </w:r>
+          </w:p>
+        </w:tc>
+        <w:tc>
+          <w:tcPr>
+            <w:tcW w:type="dxa" w:w="2880"/>
+          </w:tcPr>
+          <w:p>
+            <w:r>
+              <w:rPr>
+                <w:rFonts w:ascii="Times New Roman" w:hAnsi="Times New Roman" w:eastAsia="Times New Roman"/>
+              </w:rPr>
+              <w:t>24</w:t>
+            </w:r>
+          </w:p>
+        </w:tc>
+        <w:tc>
+          <w:tcPr>
+            <w:tcW w:type="dxa" w:w="2880"/>
+          </w:tcPr>
+          <w:p>
+            <w:r>
+              <w:rPr>
+                <w:rFonts w:ascii="Times New Roman" w:hAnsi="Times New Roman" w:eastAsia="Times New Roman"/>
+              </w:rPr>
+              <w:t>+0.264</w:t>
+            </w:r>
+          </w:p>
+        </w:tc>
+      </w:tr>
+      <w:tr>
+        <w:tc>
+          <w:tcPr>
+            <w:tcW w:type="dxa" w:w="2880"/>
+          </w:tcPr>
+          <w:p>
+            <w:r>
+              <w:rPr>
+                <w:rFonts w:ascii="Times New Roman" w:hAnsi="Times New Roman" w:eastAsia="Times New Roman"/>
+              </w:rPr>
+              <w:t>65-CF</w:t>
+            </w:r>
+          </w:p>
+        </w:tc>
+        <w:tc>
+          <w:tcPr>
+            <w:tcW w:type="dxa" w:w="2880"/>
+          </w:tcPr>
+          <w:p>
+            <w:r>
+              <w:rPr>
+                <w:rFonts w:ascii="Times New Roman" w:hAnsi="Times New Roman" w:eastAsia="Times New Roman"/>
+              </w:rPr>
+              <w:t>24</w:t>
+            </w:r>
+          </w:p>
+        </w:tc>
+        <w:tc>
+          <w:tcPr>
+            <w:tcW w:type="dxa" w:w="2880"/>
+          </w:tcPr>
+          <w:p>
+            <w:r>
+              <w:rPr>
+                <w:rFonts w:ascii="Times New Roman" w:hAnsi="Times New Roman" w:eastAsia="Times New Roman"/>
+              </w:rPr>
+              <w:t>+0.247</w:t>
+            </w:r>
+          </w:p>
+        </w:tc>
+      </w:tr>
+      <w:tr>
+        <w:tc>
+          <w:tcPr>
+            <w:tcW w:type="dxa" w:w="2880"/>
+          </w:tcPr>
+          <w:p>
+            <w:r>
+              <w:rPr>
+                <w:rFonts w:ascii="Times New Roman" w:hAnsi="Times New Roman" w:eastAsia="Times New Roman"/>
+              </w:rPr>
+              <w:t>66-CF</w:t>
+            </w:r>
+          </w:p>
+        </w:tc>
+        <w:tc>
+          <w:tcPr>
+            <w:tcW w:type="dxa" w:w="2880"/>
+          </w:tcPr>
+          <w:p>
+            <w:r>
+              <w:rPr>
+                <w:rFonts w:ascii="Times New Roman" w:hAnsi="Times New Roman" w:eastAsia="Times New Roman"/>
+              </w:rPr>
+              <w:t>24</w:t>
+            </w:r>
+          </w:p>
+        </w:tc>
+        <w:tc>
+          <w:tcPr>
+            <w:tcW w:type="dxa" w:w="2880"/>
+          </w:tcPr>
+          <w:p>
+            <w:r>
+              <w:rPr>
+                <w:rFonts w:ascii="Times New Roman" w:hAnsi="Times New Roman" w:eastAsia="Times New Roman"/>
+              </w:rPr>
+              <w:t>+0.295</w:t>
+            </w:r>
+          </w:p>
+        </w:tc>
+      </w:tr>
+      <w:tr>
+        <w:tc>
+          <w:tcPr>
+            <w:tcW w:type="dxa" w:w="2880"/>
+          </w:tcPr>
+          <w:p>
+            <w:r>
+              <w:rPr>
+                <w:rFonts w:ascii="Times New Roman" w:hAnsi="Times New Roman" w:eastAsia="Times New Roman"/>
+              </w:rPr>
+              <w:t>68-CF</w:t>
+            </w:r>
+          </w:p>
+        </w:tc>
+        <w:tc>
+          <w:tcPr>
+            <w:tcW w:type="dxa" w:w="2880"/>
+          </w:tcPr>
+          <w:p>
+            <w:r>
+              <w:rPr>
+                <w:rFonts w:ascii="Times New Roman" w:hAnsi="Times New Roman" w:eastAsia="Times New Roman"/>
+              </w:rPr>
+              <w:t>24</w:t>
+            </w:r>
+          </w:p>
+        </w:tc>
+        <w:tc>
+          <w:tcPr>
+            <w:tcW w:type="dxa" w:w="2880"/>
+          </w:tcPr>
+          <w:p>
+            <w:r>
+              <w:rPr>
+                <w:rFonts w:ascii="Times New Roman" w:hAnsi="Times New Roman" w:eastAsia="Times New Roman"/>
+              </w:rPr>
+              <w:t>+0.283</w:t>
+            </w:r>
+          </w:p>
+        </w:tc>
+      </w:tr>
+      <w:tr>
+        <w:tc>
+          <w:tcPr>
+            <w:tcW w:type="dxa" w:w="2880"/>
+          </w:tcPr>
+          <w:p>
+            <w:r>
+              <w:rPr>
+                <w:rFonts w:ascii="Times New Roman" w:hAnsi="Times New Roman" w:eastAsia="Times New Roman"/>
+              </w:rPr>
+              <w:t>69-CF</w:t>
+            </w:r>
+          </w:p>
+        </w:tc>
+        <w:tc>
+          <w:tcPr>
+            <w:tcW w:type="dxa" w:w="2880"/>
+          </w:tcPr>
+          <w:p>
+            <w:r>
+              <w:rPr>
+                <w:rFonts w:ascii="Times New Roman" w:hAnsi="Times New Roman" w:eastAsia="Times New Roman"/>
+              </w:rPr>
+              <w:t>8</w:t>
+            </w:r>
+          </w:p>
+        </w:tc>
+        <w:tc>
+          <w:tcPr>
+            <w:tcW w:type="dxa" w:w="2880"/>
+          </w:tcPr>
+          <w:p>
+            <w:r>
+              <w:rPr>
+                <w:rFonts w:ascii="Times New Roman" w:hAnsi="Times New Roman" w:eastAsia="Times New Roman"/>
+              </w:rPr>
+              <w:t>+0.172</w:t>
+            </w:r>
+          </w:p>
+        </w:tc>
+      </w:tr>
+    </w:tbl>
+    <w:p>
+      <w:pPr>
+        <w:pStyle w:val="Heading2"/>
+      </w:pPr>
+      <w:r>
+        <w:rPr>
+          <w:rFonts w:ascii="Times New Roman" w:hAnsi="Times New Roman" w:eastAsia="Times New Roman"/>
+        </w:rPr>
         <w:t>4.4 Does size correction help theratyping? No</w:t>
       </w:r>
     </w:p>
@@ -3573,7 +4545,7 @@
           <w:rFonts w:ascii="Times New Roman" w:hAnsi="Times New Roman" w:eastAsia="Times New Roman"/>
           <w:b/>
         </w:rPr>
-        <w:t>Table 6. Instance segmentation on the OrgaSegment eval split (12 images).</w:t>
+        <w:t>Table 7. Instance segmentation on the OrgaSegment eval split (12 images).</w:t>
       </w:r>
     </w:p>
     <w:tbl>
@@ -4081,7 +5053,7 @@
           <w:rFonts w:ascii="Times New Roman" w:hAnsi="Times New Roman" w:eastAsia="Times New Roman"/>
           <w:b/>
         </w:rPr>
-        <w:t>Table 7. Tissue recovery and fibroblast best-match share. S3000: Spearman on the 3,000 most tissue-variable genes; SALL: all genes; CENT: GTEx-centred Pearson; _NOCULT: 853 MSigDB Hallmark proliferation/MYC/EMT genes removed. Clean subset: 114 series whose summary confirms a single organ and mentions organoids (113 with profiles). Files: results/geo_fidelity_methods.json, results/geo_fidelity_clean.json.</w:t>
+        <w:t>Table 8. Tissue recovery and fibroblast best-match share. S3000: Spearman on the 3,000 most tissue-variable genes; SALL: all genes; CENT: GTEx-centred Pearson; _NOCULT: 853 MSigDB Hallmark proliferation/MYC/EMT genes removed. Clean subset: 114 series whose summary confirms a single organ and mentions organoids (113 with profiles). Files: results/geo_fidelity_methods.json, results/geo_fidelity_clean.json.</w:t>
       </w:r>
     </w:p>
     <w:tbl>
@@ -5328,7 +6300,7 @@
           <w:rFonts w:ascii="Times New Roman" w:hAnsi="Times New Roman" w:eastAsia="Times New Roman"/>
           <w:b/>
         </w:rPr>
-        <w:t>Table 8. Organ-of-origin recovery on 151 series, base method vs gene-restricted variant (results/geo_mcnemar.json).</w:t>
+        <w:t>Table 9. Organ-of-origin recovery on 151 series, base method vs gene-restricted variant (results/geo_mcnemar.json).</w:t>
       </w:r>
     </w:p>
     <w:tbl>
@@ -6139,7 +7111,7 @@
           <w:rFonts w:ascii="Times New Roman" w:hAnsi="Times New Roman" w:eastAsia="Times New Roman"/>
           <w:b/>
         </w:rPr>
-        <w:t>Table 9. Enrichment of attractor-driving genes (results/attractor_gprofiler.csv; terms with more than 2,000 genes omitted).</w:t>
+        <w:t>Table 10. Enrichment of attractor-driving genes (results/attractor_gprofiler.csv; terms with more than 2,000 genes omitted).</w:t>
       </w:r>
     </w:p>
     <w:tbl>
@@ -6648,7 +7620,7 @@
           <w:rFonts w:ascii="Times New Roman" w:hAnsi="Times New Roman" w:eastAsia="Times New Roman"/>
           <w:b/>
         </w:rPr>
-        <w:t>Table 10. Attractor on strict organoid series vs series without organoid samples (results/geo_fidelity_strict.json).</w:t>
+        <w:t>Table 11. Attractor on strict organoid series vs series without organoid samples (results/geo_fidelity_strict.json).</w:t>
       </w:r>
     </w:p>
     <w:tbl>
@@ -7667,7 +8639,7 @@
           <w:rFonts w:ascii="Times New Roman" w:hAnsi="Times New Roman" w:eastAsia="Times New Roman"/>
           <w:b/>
         </w:rPr>
-        <w:t>Table 11. Organ recovery on the 45 strictly organoid series (SALL_PARONLY; results/strict_organ_recovery.csv).</w:t>
+        <w:t>Table 12. Organ recovery on the 45 strictly organoid series (SALL_PARONLY; results/strict_organ_recovery.csv).</w:t>
       </w:r>
     </w:p>
     <w:tbl>
@@ -8342,7 +9314,7 @@
           <w:rFonts w:ascii="Times New Roman" w:hAnsi="Times New Roman" w:eastAsia="Times New Roman"/>
           <w:b/>
         </w:rPr>
-        <w:t>Table 12. Out-of-sample organoid profiles (results/ae_replication.csv).</w:t>
+        <w:t>Table 13. Out-of-sample organoid profiles (results/ae_replication.csv).</w:t>
       </w:r>
     </w:p>
     <w:tbl>
@@ -9174,7 +10146,7 @@
           <w:rFonts w:ascii="Times New Roman" w:hAnsi="Times New Roman" w:eastAsia="Times New Roman"/>
           <w:b/>
         </w:rPr>
-        <w:t>Table 13. Further pre-registered annotation checks on fixed 100-gene deficit lists, not independent experiments. Each p is descriptive in an exploratory sequence; results/deficit_goa.json, deficit_kegg.json, deficit_rhea.json.</w:t>
+        <w:t>Table 14. Further pre-registered annotation checks on fixed 100-gene deficit lists, not independent experiments. Each p is descriptive in an exploratory sequence; results/deficit_goa.json, deficit_kegg.json, deficit_rhea.json.</w:t>
       </w:r>
     </w:p>
     <w:tbl>
@@ -9576,7 +10548,7 @@
         <w:rPr>
           <w:rFonts w:ascii="Times New Roman" w:hAnsi="Times New Roman" w:eastAsia="Times New Roman"/>
         </w:rPr>
-        <w:t>External replication source audit (results/external_fis_source_audit.md): a 2025 respiratory FIS study with single-organoid measures excluded baseline areas below 1500 px and used forskolin alone rather than modulator vs DMSO; OrganoID's open individual time series used pancreatic cancer organoids and gemcitabine; a 2021 nasal CFTR-modulator FIS study reported well-summed areas. These are unsuitable for the specific small-organoid modulator test, but the search was not exhaustive.</w:t>
+        <w:t>External replication source audit (results/external_fis_source_audit.md): a 2025 respiratory FIS study with single-organoid measures excluded baseline areas below 1500 px and used forskolin alone rather than modulator vs DMSO; OrganoID's open individual time series used pancreatic cancer organoids and gemcitabine; two nasal CFTR-modulator papers reported either well-summed areas or summary plots without a verified public matched-object table. Drevinek's 20-patient area series was suitable for well-level drug-ranking analysis, not individual-size replication. This search is not exhaustive.</w:t>
       </w:r>
     </w:p>
     <w:p>
@@ -9635,7 +10607,7 @@
         <w:rPr>
           <w:rFonts w:ascii="Times New Roman" w:hAnsi="Times New Roman" w:eastAsia="Times New Roman"/>
         </w:rPr>
-        <w:t>- Replication on the public FIS time series is impossible: it is well-level.</w:t>
+        <w:t>- Small-organoid replication on the public FIS time series is impossible: it is well-level; its separate 20-patient treatment-ranking test passes but cannot resolve individual-size moderation.</w:t>
       </w:r>
     </w:p>
     <w:p>
@@ -9894,7 +10866,7 @@
           <w:rFonts w:ascii="Times New Roman" w:hAnsi="Times New Roman" w:eastAsia="Times New Roman"/>
           <w:b/>
         </w:rPr>
-        <w:t>Table 14. Tools genuinely used (results/tools_ledger.csv): 47 entries, 40 counting toward the gate after excluding infrastructure. Target of 40 reached; this counts resources genuinely used, not independent biological confirmations.</w:t>
+        <w:t>Table 15. Tools genuinely used (results/tools_ledger.csv): 47 entries, 40 counting toward the gate after excluding infrastructure. Target of 40 reached; this counts resources genuinely used, not independent biological confirmations.</w:t>
       </w:r>
     </w:p>
     <w:tbl>
@@ -12835,6 +13807,18 @@
           <w:rFonts w:ascii="Times New Roman" w:hAnsi="Times New Roman" w:eastAsia="Times New Roman"/>
         </w:rPr>
         <w:t>Botelho H, Hagemeijer MC, et al. FIS_image_analysis demonstration dataset. https://github.com/hmbotelho/FIS_image_analysis</w:t>
+      </w:r>
+    </w:p>
+    <w:p>
+      <w:pPr>
+        <w:spacing w:after="120"/>
+        <w:jc w:val="both"/>
+      </w:pPr>
+      <w:r>
+        <w:rPr>
+          <w:rFonts w:ascii="Times New Roman" w:hAnsi="Times New Roman" w:eastAsia="Times New Roman"/>
+        </w:rPr>
+        <w:t>Drevinek P, et al. Response to elexacaftor/tezacaftor/ivacaftor in intestinal organoids derived from people with cystic fibrosis. J Cyst Fibros 2021. https://doi.org/10.1016/j.jcf.2021.07.006 . Data: https://zenodo.org/records/4771466</w:t>
       </w:r>
     </w:p>
     <w:p>

</xml_diff>

<commit_message>
Tighten paper caveat and compact patient table
</commit_message>
<xml_diff>
--- a/paper/mega27-03-virtual-organoid-paper.docx
+++ b/paper/mega27-03-virtual-organoid-paper.docx
@@ -57,7 +57,7 @@
         <w:rPr>
           <w:rFonts w:ascii="Times New Roman" w:hAnsi="Times New Roman" w:eastAsia="Times New Roman"/>
         </w:rPr>
-        <w:t>Finding (candidate). Modulator-induced swelling is attenuated in the smallest organoids and saturates above a size threshold. For elexacaftor/tezacaftor/ivacaftor (Trikafta) the drug-minus-DMSO log-swelling effect rises from 0.336 [0.262, 0.405] in the smallest size octile to a plateau near 0.55-0.64; top minus bottom 0.251 [0.184, 0.323] (donor bootstrap). Per donor, the effect in the largest size quartile exceeds that in the smallest in 14 of 17 donors, and the attenuation does not track overall response (Spearman rho = 0.24, p = 0.35). Geometry predicts the opposite sign: under a uniform surface flux, small organoids should swell more. Area noise also biases the slope negative. So the effect is unlikely to be a measurement artefact.</w:t>
+        <w:t>Finding (candidate). Modulator-induced swelling is attenuated in the smallest organoids and saturates above a size threshold. For elexacaftor/tezacaftor/ivacaftor (Trikafta) the drug-minus-DMSO log-swelling effect rises from 0.336 [0.262, 0.405] in the smallest size octile to a plateau near 0.55-0.64; top minus bottom 0.251 [0.184, 0.323] (donor bootstrap). Per donor, the effect in the largest size quartile exceeds that in the smallest in 14 of 17 donors, and the attenuation does not track overall response (Spearman rho = 0.24, p = 0.35). Geometry predicts the opposite sign: under a uniform surface flux, small organoids should swell more. Area noise also biases the slope negative. So the effect is unlikely to be a measurement artefact, but track-selection bias remains unbounded.</w:t>
       </w:r>
     </w:p>
     <w:p>
@@ -3629,7 +3629,7 @@
           <w:rFonts w:ascii="Times New Roman" w:hAnsi="Times New Roman" w:eastAsia="Times New Roman"/>
           <w:b/>
         </w:rPr>
-        <w:t>Table 6. Patient-equal independent well-level treatment-ranking test; no individual organoid areas in this accession.</w:t>
+        <w:t>Table 6. Patient-equal well-level treatment-ranking test; no individual organoid areas in this accession.</w:t>
       </w:r>
     </w:p>
     <w:tbl>
@@ -3639,14 +3639,17 @@
         <w:tblLook w:firstColumn="1" w:firstRow="1" w:lastColumn="0" w:lastRow="0" w:noHBand="0" w:noVBand="1" w:val="04A0"/>
       </w:tblPr>
       <w:tblGrid>
-        <w:gridCol w:w="2880"/>
-        <w:gridCol w:w="2880"/>
-        <w:gridCol w:w="2880"/>
+        <w:gridCol w:w="1440"/>
+        <w:gridCol w:w="1440"/>
+        <w:gridCol w:w="1440"/>
+        <w:gridCol w:w="1440"/>
+        <w:gridCol w:w="1440"/>
+        <w:gridCol w:w="1440"/>
       </w:tblGrid>
       <w:tr>
         <w:tc>
           <w:tcPr>
-            <w:tcW w:type="dxa" w:w="2880"/>
+            <w:tcW w:type="dxa" w:w="1440"/>
           </w:tcPr>
           <w:p>
             <w:r>
@@ -3659,27 +3662,66 @@
         </w:tc>
         <w:tc>
           <w:tcPr>
-            <w:tcW w:type="dxa" w:w="2880"/>
-          </w:tcPr>
-          <w:p>
-            <w:r>
-              <w:rPr>
-                <w:rFonts w:ascii="Times New Roman" w:hAnsi="Times New Roman" w:eastAsia="Times New Roman"/>
-              </w:rPr>
-              <w:t>n plate-dose blocks</w:t>
-            </w:r>
-          </w:p>
-        </w:tc>
-        <w:tc>
-          <w:tcPr>
-            <w:tcW w:type="dxa" w:w="2880"/>
-          </w:tcPr>
-          <w:p>
-            <w:r>
-              <w:rPr>
-                <w:rFonts w:ascii="Times New Roman" w:hAnsi="Times New Roman" w:eastAsia="Times New Roman"/>
-              </w:rPr>
-              <w:t>normalized triple-double AUC</w:t>
+            <w:tcW w:type="dxa" w:w="1440"/>
+          </w:tcPr>
+          <w:p>
+            <w:r>
+              <w:rPr>
+                <w:rFonts w:ascii="Times New Roman" w:hAnsi="Times New Roman" w:eastAsia="Times New Roman"/>
+              </w:rPr>
+              <w:t>blocks</w:t>
+            </w:r>
+          </w:p>
+        </w:tc>
+        <w:tc>
+          <w:tcPr>
+            <w:tcW w:type="dxa" w:w="1440"/>
+          </w:tcPr>
+          <w:p>
+            <w:r>
+              <w:rPr>
+                <w:rFonts w:ascii="Times New Roman" w:hAnsi="Times New Roman" w:eastAsia="Times New Roman"/>
+              </w:rPr>
+              <w:t>triple-double AUC</w:t>
+            </w:r>
+          </w:p>
+        </w:tc>
+        <w:tc>
+          <w:tcPr>
+            <w:tcW w:type="dxa" w:w="1440"/>
+          </w:tcPr>
+          <w:p>
+            <w:r>
+              <w:rPr>
+                <w:rFonts w:ascii="Times New Roman" w:hAnsi="Times New Roman" w:eastAsia="Times New Roman"/>
+              </w:rPr>
+              <w:t>patient</w:t>
+            </w:r>
+          </w:p>
+        </w:tc>
+        <w:tc>
+          <w:tcPr>
+            <w:tcW w:type="dxa" w:w="1440"/>
+          </w:tcPr>
+          <w:p>
+            <w:r>
+              <w:rPr>
+                <w:rFonts w:ascii="Times New Roman" w:hAnsi="Times New Roman" w:eastAsia="Times New Roman"/>
+              </w:rPr>
+              <w:t>blocks</w:t>
+            </w:r>
+          </w:p>
+        </w:tc>
+        <w:tc>
+          <w:tcPr>
+            <w:tcW w:type="dxa" w:w="1440"/>
+          </w:tcPr>
+          <w:p>
+            <w:r>
+              <w:rPr>
+                <w:rFonts w:ascii="Times New Roman" w:hAnsi="Times New Roman" w:eastAsia="Times New Roman"/>
+              </w:rPr>
+              <w:t>triple-double AUC</w:t>
             </w:r>
           </w:p>
         </w:tc>
@@ -3687,7 +3729,7 @@
       <w:tr>
         <w:tc>
           <w:tcPr>
-            <w:tcW w:type="dxa" w:w="2880"/>
+            <w:tcW w:type="dxa" w:w="1440"/>
           </w:tcPr>
           <w:p>
             <w:r>
@@ -3700,7 +3742,7 @@
         </w:tc>
         <w:tc>
           <w:tcPr>
-            <w:tcW w:type="dxa" w:w="2880"/>
+            <w:tcW w:type="dxa" w:w="1440"/>
           </w:tcPr>
           <w:p>
             <w:r>
@@ -3713,7 +3755,7 @@
         </w:tc>
         <w:tc>
           <w:tcPr>
-            <w:tcW w:type="dxa" w:w="2880"/>
+            <w:tcW w:type="dxa" w:w="1440"/>
           </w:tcPr>
           <w:p>
             <w:r>
@@ -3721,6 +3763,45 @@
                 <w:rFonts w:ascii="Times New Roman" w:hAnsi="Times New Roman" w:eastAsia="Times New Roman"/>
               </w:rPr>
               <w:t>+0.240</w:t>
+            </w:r>
+          </w:p>
+        </w:tc>
+        <w:tc>
+          <w:tcPr>
+            <w:tcW w:type="dxa" w:w="1440"/>
+          </w:tcPr>
+          <w:p>
+            <w:r>
+              <w:rPr>
+                <w:rFonts w:ascii="Times New Roman" w:hAnsi="Times New Roman" w:eastAsia="Times New Roman"/>
+              </w:rPr>
+              <w:t>59-CF</w:t>
+            </w:r>
+          </w:p>
+        </w:tc>
+        <w:tc>
+          <w:tcPr>
+            <w:tcW w:type="dxa" w:w="1440"/>
+          </w:tcPr>
+          <w:p>
+            <w:r>
+              <w:rPr>
+                <w:rFonts w:ascii="Times New Roman" w:hAnsi="Times New Roman" w:eastAsia="Times New Roman"/>
+              </w:rPr>
+              <w:t>24</w:t>
+            </w:r>
+          </w:p>
+        </w:tc>
+        <w:tc>
+          <w:tcPr>
+            <w:tcW w:type="dxa" w:w="1440"/>
+          </w:tcPr>
+          <w:p>
+            <w:r>
+              <w:rPr>
+                <w:rFonts w:ascii="Times New Roman" w:hAnsi="Times New Roman" w:eastAsia="Times New Roman"/>
+              </w:rPr>
+              <w:t>+0.374</w:t>
             </w:r>
           </w:p>
         </w:tc>
@@ -3728,7 +3809,7 @@
       <w:tr>
         <w:tc>
           <w:tcPr>
-            <w:tcW w:type="dxa" w:w="2880"/>
+            <w:tcW w:type="dxa" w:w="1440"/>
           </w:tcPr>
           <w:p>
             <w:r>
@@ -3741,7 +3822,7 @@
         </w:tc>
         <w:tc>
           <w:tcPr>
-            <w:tcW w:type="dxa" w:w="2880"/>
+            <w:tcW w:type="dxa" w:w="1440"/>
           </w:tcPr>
           <w:p>
             <w:r>
@@ -3754,7 +3835,7 @@
         </w:tc>
         <w:tc>
           <w:tcPr>
-            <w:tcW w:type="dxa" w:w="2880"/>
+            <w:tcW w:type="dxa" w:w="1440"/>
           </w:tcPr>
           <w:p>
             <w:r>
@@ -3762,6 +3843,45 @@
                 <w:rFonts w:ascii="Times New Roman" w:hAnsi="Times New Roman" w:eastAsia="Times New Roman"/>
               </w:rPr>
               <w:t>+0.244</w:t>
+            </w:r>
+          </w:p>
+        </w:tc>
+        <w:tc>
+          <w:tcPr>
+            <w:tcW w:type="dxa" w:w="1440"/>
+          </w:tcPr>
+          <w:p>
+            <w:r>
+              <w:rPr>
+                <w:rFonts w:ascii="Times New Roman" w:hAnsi="Times New Roman" w:eastAsia="Times New Roman"/>
+              </w:rPr>
+              <w:t>60-CF</w:t>
+            </w:r>
+          </w:p>
+        </w:tc>
+        <w:tc>
+          <w:tcPr>
+            <w:tcW w:type="dxa" w:w="1440"/>
+          </w:tcPr>
+          <w:p>
+            <w:r>
+              <w:rPr>
+                <w:rFonts w:ascii="Times New Roman" w:hAnsi="Times New Roman" w:eastAsia="Times New Roman"/>
+              </w:rPr>
+              <w:t>24</w:t>
+            </w:r>
+          </w:p>
+        </w:tc>
+        <w:tc>
+          <w:tcPr>
+            <w:tcW w:type="dxa" w:w="1440"/>
+          </w:tcPr>
+          <w:p>
+            <w:r>
+              <w:rPr>
+                <w:rFonts w:ascii="Times New Roman" w:hAnsi="Times New Roman" w:eastAsia="Times New Roman"/>
+              </w:rPr>
+              <w:t>+0.285</w:t>
             </w:r>
           </w:p>
         </w:tc>
@@ -3769,7 +3889,7 @@
       <w:tr>
         <w:tc>
           <w:tcPr>
-            <w:tcW w:type="dxa" w:w="2880"/>
+            <w:tcW w:type="dxa" w:w="1440"/>
           </w:tcPr>
           <w:p>
             <w:r>
@@ -3782,7 +3902,7 @@
         </w:tc>
         <w:tc>
           <w:tcPr>
-            <w:tcW w:type="dxa" w:w="2880"/>
+            <w:tcW w:type="dxa" w:w="1440"/>
           </w:tcPr>
           <w:p>
             <w:r>
@@ -3795,7 +3915,7 @@
         </w:tc>
         <w:tc>
           <w:tcPr>
-            <w:tcW w:type="dxa" w:w="2880"/>
+            <w:tcW w:type="dxa" w:w="1440"/>
           </w:tcPr>
           <w:p>
             <w:r>
@@ -3803,6 +3923,45 @@
                 <w:rFonts w:ascii="Times New Roman" w:hAnsi="Times New Roman" w:eastAsia="Times New Roman"/>
               </w:rPr>
               <w:t>+0.250</w:t>
+            </w:r>
+          </w:p>
+        </w:tc>
+        <w:tc>
+          <w:tcPr>
+            <w:tcW w:type="dxa" w:w="1440"/>
+          </w:tcPr>
+          <w:p>
+            <w:r>
+              <w:rPr>
+                <w:rFonts w:ascii="Times New Roman" w:hAnsi="Times New Roman" w:eastAsia="Times New Roman"/>
+              </w:rPr>
+              <w:t>61-CF</w:t>
+            </w:r>
+          </w:p>
+        </w:tc>
+        <w:tc>
+          <w:tcPr>
+            <w:tcW w:type="dxa" w:w="1440"/>
+          </w:tcPr>
+          <w:p>
+            <w:r>
+              <w:rPr>
+                <w:rFonts w:ascii="Times New Roman" w:hAnsi="Times New Roman" w:eastAsia="Times New Roman"/>
+              </w:rPr>
+              <w:t>8</w:t>
+            </w:r>
+          </w:p>
+        </w:tc>
+        <w:tc>
+          <w:tcPr>
+            <w:tcW w:type="dxa" w:w="1440"/>
+          </w:tcPr>
+          <w:p>
+            <w:r>
+              <w:rPr>
+                <w:rFonts w:ascii="Times New Roman" w:hAnsi="Times New Roman" w:eastAsia="Times New Roman"/>
+              </w:rPr>
+              <w:t>+0.207</w:t>
             </w:r>
           </w:p>
         </w:tc>
@@ -3810,7 +3969,7 @@
       <w:tr>
         <w:tc>
           <w:tcPr>
-            <w:tcW w:type="dxa" w:w="2880"/>
+            <w:tcW w:type="dxa" w:w="1440"/>
           </w:tcPr>
           <w:p>
             <w:r>
@@ -3823,7 +3982,7 @@
         </w:tc>
         <w:tc>
           <w:tcPr>
-            <w:tcW w:type="dxa" w:w="2880"/>
+            <w:tcW w:type="dxa" w:w="1440"/>
           </w:tcPr>
           <w:p>
             <w:r>
@@ -3836,7 +3995,7 @@
         </w:tc>
         <w:tc>
           <w:tcPr>
-            <w:tcW w:type="dxa" w:w="2880"/>
+            <w:tcW w:type="dxa" w:w="1440"/>
           </w:tcPr>
           <w:p>
             <w:r>
@@ -3844,6 +4003,45 @@
                 <w:rFonts w:ascii="Times New Roman" w:hAnsi="Times New Roman" w:eastAsia="Times New Roman"/>
               </w:rPr>
               <w:t>+0.153</w:t>
+            </w:r>
+          </w:p>
+        </w:tc>
+        <w:tc>
+          <w:tcPr>
+            <w:tcW w:type="dxa" w:w="1440"/>
+          </w:tcPr>
+          <w:p>
+            <w:r>
+              <w:rPr>
+                <w:rFonts w:ascii="Times New Roman" w:hAnsi="Times New Roman" w:eastAsia="Times New Roman"/>
+              </w:rPr>
+              <w:t>62-CF</w:t>
+            </w:r>
+          </w:p>
+        </w:tc>
+        <w:tc>
+          <w:tcPr>
+            <w:tcW w:type="dxa" w:w="1440"/>
+          </w:tcPr>
+          <w:p>
+            <w:r>
+              <w:rPr>
+                <w:rFonts w:ascii="Times New Roman" w:hAnsi="Times New Roman" w:eastAsia="Times New Roman"/>
+              </w:rPr>
+              <w:t>24</w:t>
+            </w:r>
+          </w:p>
+        </w:tc>
+        <w:tc>
+          <w:tcPr>
+            <w:tcW w:type="dxa" w:w="1440"/>
+          </w:tcPr>
+          <w:p>
+            <w:r>
+              <w:rPr>
+                <w:rFonts w:ascii="Times New Roman" w:hAnsi="Times New Roman" w:eastAsia="Times New Roman"/>
+              </w:rPr>
+              <w:t>+0.246</w:t>
             </w:r>
           </w:p>
         </w:tc>
@@ -3851,7 +4049,7 @@
       <w:tr>
         <w:tc>
           <w:tcPr>
-            <w:tcW w:type="dxa" w:w="2880"/>
+            <w:tcW w:type="dxa" w:w="1440"/>
           </w:tcPr>
           <w:p>
             <w:r>
@@ -3864,7 +4062,7 @@
         </w:tc>
         <w:tc>
           <w:tcPr>
-            <w:tcW w:type="dxa" w:w="2880"/>
+            <w:tcW w:type="dxa" w:w="1440"/>
           </w:tcPr>
           <w:p>
             <w:r>
@@ -3877,7 +4075,7 @@
         </w:tc>
         <w:tc>
           <w:tcPr>
-            <w:tcW w:type="dxa" w:w="2880"/>
+            <w:tcW w:type="dxa" w:w="1440"/>
           </w:tcPr>
           <w:p>
             <w:r>
@@ -3885,6 +4083,45 @@
                 <w:rFonts w:ascii="Times New Roman" w:hAnsi="Times New Roman" w:eastAsia="Times New Roman"/>
               </w:rPr>
               <w:t>+0.253</w:t>
+            </w:r>
+          </w:p>
+        </w:tc>
+        <w:tc>
+          <w:tcPr>
+            <w:tcW w:type="dxa" w:w="1440"/>
+          </w:tcPr>
+          <w:p>
+            <w:r>
+              <w:rPr>
+                <w:rFonts w:ascii="Times New Roman" w:hAnsi="Times New Roman" w:eastAsia="Times New Roman"/>
+              </w:rPr>
+              <w:t>63-CF</w:t>
+            </w:r>
+          </w:p>
+        </w:tc>
+        <w:tc>
+          <w:tcPr>
+            <w:tcW w:type="dxa" w:w="1440"/>
+          </w:tcPr>
+          <w:p>
+            <w:r>
+              <w:rPr>
+                <w:rFonts w:ascii="Times New Roman" w:hAnsi="Times New Roman" w:eastAsia="Times New Roman"/>
+              </w:rPr>
+              <w:t>8</w:t>
+            </w:r>
+          </w:p>
+        </w:tc>
+        <w:tc>
+          <w:tcPr>
+            <w:tcW w:type="dxa" w:w="1440"/>
+          </w:tcPr>
+          <w:p>
+            <w:r>
+              <w:rPr>
+                <w:rFonts w:ascii="Times New Roman" w:hAnsi="Times New Roman" w:eastAsia="Times New Roman"/>
+              </w:rPr>
+              <w:t>+0.108</w:t>
             </w:r>
           </w:p>
         </w:tc>
@@ -3892,7 +4129,7 @@
       <w:tr>
         <w:tc>
           <w:tcPr>
-            <w:tcW w:type="dxa" w:w="2880"/>
+            <w:tcW w:type="dxa" w:w="1440"/>
           </w:tcPr>
           <w:p>
             <w:r>
@@ -3905,7 +4142,7 @@
         </w:tc>
         <w:tc>
           <w:tcPr>
-            <w:tcW w:type="dxa" w:w="2880"/>
+            <w:tcW w:type="dxa" w:w="1440"/>
           </w:tcPr>
           <w:p>
             <w:r>
@@ -3918,7 +4155,7 @@
         </w:tc>
         <w:tc>
           <w:tcPr>
-            <w:tcW w:type="dxa" w:w="2880"/>
+            <w:tcW w:type="dxa" w:w="1440"/>
           </w:tcPr>
           <w:p>
             <w:r>
@@ -3926,6 +4163,45 @@
                 <w:rFonts w:ascii="Times New Roman" w:hAnsi="Times New Roman" w:eastAsia="Times New Roman"/>
               </w:rPr>
               <w:t>+0.216</w:t>
+            </w:r>
+          </w:p>
+        </w:tc>
+        <w:tc>
+          <w:tcPr>
+            <w:tcW w:type="dxa" w:w="1440"/>
+          </w:tcPr>
+          <w:p>
+            <w:r>
+              <w:rPr>
+                <w:rFonts w:ascii="Times New Roman" w:hAnsi="Times New Roman" w:eastAsia="Times New Roman"/>
+              </w:rPr>
+              <w:t>64-CF</w:t>
+            </w:r>
+          </w:p>
+        </w:tc>
+        <w:tc>
+          <w:tcPr>
+            <w:tcW w:type="dxa" w:w="1440"/>
+          </w:tcPr>
+          <w:p>
+            <w:r>
+              <w:rPr>
+                <w:rFonts w:ascii="Times New Roman" w:hAnsi="Times New Roman" w:eastAsia="Times New Roman"/>
+              </w:rPr>
+              <w:t>24</w:t>
+            </w:r>
+          </w:p>
+        </w:tc>
+        <w:tc>
+          <w:tcPr>
+            <w:tcW w:type="dxa" w:w="1440"/>
+          </w:tcPr>
+          <w:p>
+            <w:r>
+              <w:rPr>
+                <w:rFonts w:ascii="Times New Roman" w:hAnsi="Times New Roman" w:eastAsia="Times New Roman"/>
+              </w:rPr>
+              <w:t>+0.264</w:t>
             </w:r>
           </w:p>
         </w:tc>
@@ -3933,7 +4209,7 @@
       <w:tr>
         <w:tc>
           <w:tcPr>
-            <w:tcW w:type="dxa" w:w="2880"/>
+            <w:tcW w:type="dxa" w:w="1440"/>
           </w:tcPr>
           <w:p>
             <w:r>
@@ -3946,7 +4222,7 @@
         </w:tc>
         <w:tc>
           <w:tcPr>
-            <w:tcW w:type="dxa" w:w="2880"/>
+            <w:tcW w:type="dxa" w:w="1440"/>
           </w:tcPr>
           <w:p>
             <w:r>
@@ -3959,7 +4235,7 @@
         </w:tc>
         <w:tc>
           <w:tcPr>
-            <w:tcW w:type="dxa" w:w="2880"/>
+            <w:tcW w:type="dxa" w:w="1440"/>
           </w:tcPr>
           <w:p>
             <w:r>
@@ -3967,6 +4243,45 @@
                 <w:rFonts w:ascii="Times New Roman" w:hAnsi="Times New Roman" w:eastAsia="Times New Roman"/>
               </w:rPr>
               <w:t>+0.328</w:t>
+            </w:r>
+          </w:p>
+        </w:tc>
+        <w:tc>
+          <w:tcPr>
+            <w:tcW w:type="dxa" w:w="1440"/>
+          </w:tcPr>
+          <w:p>
+            <w:r>
+              <w:rPr>
+                <w:rFonts w:ascii="Times New Roman" w:hAnsi="Times New Roman" w:eastAsia="Times New Roman"/>
+              </w:rPr>
+              <w:t>65-CF</w:t>
+            </w:r>
+          </w:p>
+        </w:tc>
+        <w:tc>
+          <w:tcPr>
+            <w:tcW w:type="dxa" w:w="1440"/>
+          </w:tcPr>
+          <w:p>
+            <w:r>
+              <w:rPr>
+                <w:rFonts w:ascii="Times New Roman" w:hAnsi="Times New Roman" w:eastAsia="Times New Roman"/>
+              </w:rPr>
+              <w:t>24</w:t>
+            </w:r>
+          </w:p>
+        </w:tc>
+        <w:tc>
+          <w:tcPr>
+            <w:tcW w:type="dxa" w:w="1440"/>
+          </w:tcPr>
+          <w:p>
+            <w:r>
+              <w:rPr>
+                <w:rFonts w:ascii="Times New Roman" w:hAnsi="Times New Roman" w:eastAsia="Times New Roman"/>
+              </w:rPr>
+              <w:t>+0.247</w:t>
             </w:r>
           </w:p>
         </w:tc>
@@ -3974,7 +4289,7 @@
       <w:tr>
         <w:tc>
           <w:tcPr>
-            <w:tcW w:type="dxa" w:w="2880"/>
+            <w:tcW w:type="dxa" w:w="1440"/>
           </w:tcPr>
           <w:p>
             <w:r>
@@ -3987,7 +4302,7 @@
         </w:tc>
         <w:tc>
           <w:tcPr>
-            <w:tcW w:type="dxa" w:w="2880"/>
+            <w:tcW w:type="dxa" w:w="1440"/>
           </w:tcPr>
           <w:p>
             <w:r>
@@ -4000,7 +4315,7 @@
         </w:tc>
         <w:tc>
           <w:tcPr>
-            <w:tcW w:type="dxa" w:w="2880"/>
+            <w:tcW w:type="dxa" w:w="1440"/>
           </w:tcPr>
           <w:p>
             <w:r>
@@ -4008,6 +4323,45 @@
                 <w:rFonts w:ascii="Times New Roman" w:hAnsi="Times New Roman" w:eastAsia="Times New Roman"/>
               </w:rPr>
               <w:t>+0.300</w:t>
+            </w:r>
+          </w:p>
+        </w:tc>
+        <w:tc>
+          <w:tcPr>
+            <w:tcW w:type="dxa" w:w="1440"/>
+          </w:tcPr>
+          <w:p>
+            <w:r>
+              <w:rPr>
+                <w:rFonts w:ascii="Times New Roman" w:hAnsi="Times New Roman" w:eastAsia="Times New Roman"/>
+              </w:rPr>
+              <w:t>66-CF</w:t>
+            </w:r>
+          </w:p>
+        </w:tc>
+        <w:tc>
+          <w:tcPr>
+            <w:tcW w:type="dxa" w:w="1440"/>
+          </w:tcPr>
+          <w:p>
+            <w:r>
+              <w:rPr>
+                <w:rFonts w:ascii="Times New Roman" w:hAnsi="Times New Roman" w:eastAsia="Times New Roman"/>
+              </w:rPr>
+              <w:t>24</w:t>
+            </w:r>
+          </w:p>
+        </w:tc>
+        <w:tc>
+          <w:tcPr>
+            <w:tcW w:type="dxa" w:w="1440"/>
+          </w:tcPr>
+          <w:p>
+            <w:r>
+              <w:rPr>
+                <w:rFonts w:ascii="Times New Roman" w:hAnsi="Times New Roman" w:eastAsia="Times New Roman"/>
+              </w:rPr>
+              <w:t>+0.295</w:t>
             </w:r>
           </w:p>
         </w:tc>
@@ -4015,7 +4369,7 @@
       <w:tr>
         <w:tc>
           <w:tcPr>
-            <w:tcW w:type="dxa" w:w="2880"/>
+            <w:tcW w:type="dxa" w:w="1440"/>
           </w:tcPr>
           <w:p>
             <w:r>
@@ -4028,7 +4382,7 @@
         </w:tc>
         <w:tc>
           <w:tcPr>
-            <w:tcW w:type="dxa" w:w="2880"/>
+            <w:tcW w:type="dxa" w:w="1440"/>
           </w:tcPr>
           <w:p>
             <w:r>
@@ -4041,7 +4395,7 @@
         </w:tc>
         <w:tc>
           <w:tcPr>
-            <w:tcW w:type="dxa" w:w="2880"/>
+            <w:tcW w:type="dxa" w:w="1440"/>
           </w:tcPr>
           <w:p>
             <w:r>
@@ -4049,6 +4403,45 @@
                 <w:rFonts w:ascii="Times New Roman" w:hAnsi="Times New Roman" w:eastAsia="Times New Roman"/>
               </w:rPr>
               <w:t>+0.275</w:t>
+            </w:r>
+          </w:p>
+        </w:tc>
+        <w:tc>
+          <w:tcPr>
+            <w:tcW w:type="dxa" w:w="1440"/>
+          </w:tcPr>
+          <w:p>
+            <w:r>
+              <w:rPr>
+                <w:rFonts w:ascii="Times New Roman" w:hAnsi="Times New Roman" w:eastAsia="Times New Roman"/>
+              </w:rPr>
+              <w:t>68-CF</w:t>
+            </w:r>
+          </w:p>
+        </w:tc>
+        <w:tc>
+          <w:tcPr>
+            <w:tcW w:type="dxa" w:w="1440"/>
+          </w:tcPr>
+          <w:p>
+            <w:r>
+              <w:rPr>
+                <w:rFonts w:ascii="Times New Roman" w:hAnsi="Times New Roman" w:eastAsia="Times New Roman"/>
+              </w:rPr>
+              <w:t>24</w:t>
+            </w:r>
+          </w:p>
+        </w:tc>
+        <w:tc>
+          <w:tcPr>
+            <w:tcW w:type="dxa" w:w="1440"/>
+          </w:tcPr>
+          <w:p>
+            <w:r>
+              <w:rPr>
+                <w:rFonts w:ascii="Times New Roman" w:hAnsi="Times New Roman" w:eastAsia="Times New Roman"/>
+              </w:rPr>
+              <w:t>+0.283</w:t>
             </w:r>
           </w:p>
         </w:tc>
@@ -4056,7 +4449,7 @@
       <w:tr>
         <w:tc>
           <w:tcPr>
-            <w:tcW w:type="dxa" w:w="2880"/>
+            <w:tcW w:type="dxa" w:w="1440"/>
           </w:tcPr>
           <w:p>
             <w:r>
@@ -4069,7 +4462,7 @@
         </w:tc>
         <w:tc>
           <w:tcPr>
-            <w:tcW w:type="dxa" w:w="2880"/>
+            <w:tcW w:type="dxa" w:w="1440"/>
           </w:tcPr>
           <w:p>
             <w:r>
@@ -4082,7 +4475,7 @@
         </w:tc>
         <w:tc>
           <w:tcPr>
-            <w:tcW w:type="dxa" w:w="2880"/>
+            <w:tcW w:type="dxa" w:w="1440"/>
           </w:tcPr>
           <w:p>
             <w:r>
@@ -4093,106 +4486,22 @@
             </w:r>
           </w:p>
         </w:tc>
-      </w:tr>
-      <w:tr>
-        <w:tc>
-          <w:tcPr>
-            <w:tcW w:type="dxa" w:w="2880"/>
-          </w:tcPr>
-          <w:p>
-            <w:r>
-              <w:rPr>
-                <w:rFonts w:ascii="Times New Roman" w:hAnsi="Times New Roman" w:eastAsia="Times New Roman"/>
-              </w:rPr>
-              <w:t>59-CF</w:t>
-            </w:r>
-          </w:p>
-        </w:tc>
-        <w:tc>
-          <w:tcPr>
-            <w:tcW w:type="dxa" w:w="2880"/>
-          </w:tcPr>
-          <w:p>
-            <w:r>
-              <w:rPr>
-                <w:rFonts w:ascii="Times New Roman" w:hAnsi="Times New Roman" w:eastAsia="Times New Roman"/>
-              </w:rPr>
-              <w:t>24</w:t>
-            </w:r>
-          </w:p>
-        </w:tc>
-        <w:tc>
-          <w:tcPr>
-            <w:tcW w:type="dxa" w:w="2880"/>
-          </w:tcPr>
-          <w:p>
-            <w:r>
-              <w:rPr>
-                <w:rFonts w:ascii="Times New Roman" w:hAnsi="Times New Roman" w:eastAsia="Times New Roman"/>
-              </w:rPr>
-              <w:t>+0.374</w:t>
-            </w:r>
-          </w:p>
-        </w:tc>
-      </w:tr>
-      <w:tr>
-        <w:tc>
-          <w:tcPr>
-            <w:tcW w:type="dxa" w:w="2880"/>
-          </w:tcPr>
-          <w:p>
-            <w:r>
-              <w:rPr>
-                <w:rFonts w:ascii="Times New Roman" w:hAnsi="Times New Roman" w:eastAsia="Times New Roman"/>
-              </w:rPr>
-              <w:t>60-CF</w:t>
-            </w:r>
-          </w:p>
-        </w:tc>
-        <w:tc>
-          <w:tcPr>
-            <w:tcW w:type="dxa" w:w="2880"/>
-          </w:tcPr>
-          <w:p>
-            <w:r>
-              <w:rPr>
-                <w:rFonts w:ascii="Times New Roman" w:hAnsi="Times New Roman" w:eastAsia="Times New Roman"/>
-              </w:rPr>
-              <w:t>24</w:t>
-            </w:r>
-          </w:p>
-        </w:tc>
-        <w:tc>
-          <w:tcPr>
-            <w:tcW w:type="dxa" w:w="2880"/>
-          </w:tcPr>
-          <w:p>
-            <w:r>
-              <w:rPr>
-                <w:rFonts w:ascii="Times New Roman" w:hAnsi="Times New Roman" w:eastAsia="Times New Roman"/>
-              </w:rPr>
-              <w:t>+0.285</w:t>
-            </w:r>
-          </w:p>
-        </w:tc>
-      </w:tr>
-      <w:tr>
-        <w:tc>
-          <w:tcPr>
-            <w:tcW w:type="dxa" w:w="2880"/>
-          </w:tcPr>
-          <w:p>
-            <w:r>
-              <w:rPr>
-                <w:rFonts w:ascii="Times New Roman" w:hAnsi="Times New Roman" w:eastAsia="Times New Roman"/>
-              </w:rPr>
-              <w:t>61-CF</w:t>
-            </w:r>
-          </w:p>
-        </w:tc>
-        <w:tc>
-          <w:tcPr>
-            <w:tcW w:type="dxa" w:w="2880"/>
+        <w:tc>
+          <w:tcPr>
+            <w:tcW w:type="dxa" w:w="1440"/>
+          </w:tcPr>
+          <w:p>
+            <w:r>
+              <w:rPr>
+                <w:rFonts w:ascii="Times New Roman" w:hAnsi="Times New Roman" w:eastAsia="Times New Roman"/>
+              </w:rPr>
+              <w:t>69-CF</w:t>
+            </w:r>
+          </w:p>
+        </w:tc>
+        <w:tc>
+          <w:tcPr>
+            <w:tcW w:type="dxa" w:w="1440"/>
           </w:tcPr>
           <w:p>
             <w:r>
@@ -4205,294 +4514,7 @@
         </w:tc>
         <w:tc>
           <w:tcPr>
-            <w:tcW w:type="dxa" w:w="2880"/>
-          </w:tcPr>
-          <w:p>
-            <w:r>
-              <w:rPr>
-                <w:rFonts w:ascii="Times New Roman" w:hAnsi="Times New Roman" w:eastAsia="Times New Roman"/>
-              </w:rPr>
-              <w:t>+0.207</w:t>
-            </w:r>
-          </w:p>
-        </w:tc>
-      </w:tr>
-      <w:tr>
-        <w:tc>
-          <w:tcPr>
-            <w:tcW w:type="dxa" w:w="2880"/>
-          </w:tcPr>
-          <w:p>
-            <w:r>
-              <w:rPr>
-                <w:rFonts w:ascii="Times New Roman" w:hAnsi="Times New Roman" w:eastAsia="Times New Roman"/>
-              </w:rPr>
-              <w:t>62-CF</w:t>
-            </w:r>
-          </w:p>
-        </w:tc>
-        <w:tc>
-          <w:tcPr>
-            <w:tcW w:type="dxa" w:w="2880"/>
-          </w:tcPr>
-          <w:p>
-            <w:r>
-              <w:rPr>
-                <w:rFonts w:ascii="Times New Roman" w:hAnsi="Times New Roman" w:eastAsia="Times New Roman"/>
-              </w:rPr>
-              <w:t>24</w:t>
-            </w:r>
-          </w:p>
-        </w:tc>
-        <w:tc>
-          <w:tcPr>
-            <w:tcW w:type="dxa" w:w="2880"/>
-          </w:tcPr>
-          <w:p>
-            <w:r>
-              <w:rPr>
-                <w:rFonts w:ascii="Times New Roman" w:hAnsi="Times New Roman" w:eastAsia="Times New Roman"/>
-              </w:rPr>
-              <w:t>+0.246</w:t>
-            </w:r>
-          </w:p>
-        </w:tc>
-      </w:tr>
-      <w:tr>
-        <w:tc>
-          <w:tcPr>
-            <w:tcW w:type="dxa" w:w="2880"/>
-          </w:tcPr>
-          <w:p>
-            <w:r>
-              <w:rPr>
-                <w:rFonts w:ascii="Times New Roman" w:hAnsi="Times New Roman" w:eastAsia="Times New Roman"/>
-              </w:rPr>
-              <w:t>63-CF</w:t>
-            </w:r>
-          </w:p>
-        </w:tc>
-        <w:tc>
-          <w:tcPr>
-            <w:tcW w:type="dxa" w:w="2880"/>
-          </w:tcPr>
-          <w:p>
-            <w:r>
-              <w:rPr>
-                <w:rFonts w:ascii="Times New Roman" w:hAnsi="Times New Roman" w:eastAsia="Times New Roman"/>
-              </w:rPr>
-              <w:t>8</w:t>
-            </w:r>
-          </w:p>
-        </w:tc>
-        <w:tc>
-          <w:tcPr>
-            <w:tcW w:type="dxa" w:w="2880"/>
-          </w:tcPr>
-          <w:p>
-            <w:r>
-              <w:rPr>
-                <w:rFonts w:ascii="Times New Roman" w:hAnsi="Times New Roman" w:eastAsia="Times New Roman"/>
-              </w:rPr>
-              <w:t>+0.108</w:t>
-            </w:r>
-          </w:p>
-        </w:tc>
-      </w:tr>
-      <w:tr>
-        <w:tc>
-          <w:tcPr>
-            <w:tcW w:type="dxa" w:w="2880"/>
-          </w:tcPr>
-          <w:p>
-            <w:r>
-              <w:rPr>
-                <w:rFonts w:ascii="Times New Roman" w:hAnsi="Times New Roman" w:eastAsia="Times New Roman"/>
-              </w:rPr>
-              <w:t>64-CF</w:t>
-            </w:r>
-          </w:p>
-        </w:tc>
-        <w:tc>
-          <w:tcPr>
-            <w:tcW w:type="dxa" w:w="2880"/>
-          </w:tcPr>
-          <w:p>
-            <w:r>
-              <w:rPr>
-                <w:rFonts w:ascii="Times New Roman" w:hAnsi="Times New Roman" w:eastAsia="Times New Roman"/>
-              </w:rPr>
-              <w:t>24</w:t>
-            </w:r>
-          </w:p>
-        </w:tc>
-        <w:tc>
-          <w:tcPr>
-            <w:tcW w:type="dxa" w:w="2880"/>
-          </w:tcPr>
-          <w:p>
-            <w:r>
-              <w:rPr>
-                <w:rFonts w:ascii="Times New Roman" w:hAnsi="Times New Roman" w:eastAsia="Times New Roman"/>
-              </w:rPr>
-              <w:t>+0.264</w:t>
-            </w:r>
-          </w:p>
-        </w:tc>
-      </w:tr>
-      <w:tr>
-        <w:tc>
-          <w:tcPr>
-            <w:tcW w:type="dxa" w:w="2880"/>
-          </w:tcPr>
-          <w:p>
-            <w:r>
-              <w:rPr>
-                <w:rFonts w:ascii="Times New Roman" w:hAnsi="Times New Roman" w:eastAsia="Times New Roman"/>
-              </w:rPr>
-              <w:t>65-CF</w:t>
-            </w:r>
-          </w:p>
-        </w:tc>
-        <w:tc>
-          <w:tcPr>
-            <w:tcW w:type="dxa" w:w="2880"/>
-          </w:tcPr>
-          <w:p>
-            <w:r>
-              <w:rPr>
-                <w:rFonts w:ascii="Times New Roman" w:hAnsi="Times New Roman" w:eastAsia="Times New Roman"/>
-              </w:rPr>
-              <w:t>24</w:t>
-            </w:r>
-          </w:p>
-        </w:tc>
-        <w:tc>
-          <w:tcPr>
-            <w:tcW w:type="dxa" w:w="2880"/>
-          </w:tcPr>
-          <w:p>
-            <w:r>
-              <w:rPr>
-                <w:rFonts w:ascii="Times New Roman" w:hAnsi="Times New Roman" w:eastAsia="Times New Roman"/>
-              </w:rPr>
-              <w:t>+0.247</w:t>
-            </w:r>
-          </w:p>
-        </w:tc>
-      </w:tr>
-      <w:tr>
-        <w:tc>
-          <w:tcPr>
-            <w:tcW w:type="dxa" w:w="2880"/>
-          </w:tcPr>
-          <w:p>
-            <w:r>
-              <w:rPr>
-                <w:rFonts w:ascii="Times New Roman" w:hAnsi="Times New Roman" w:eastAsia="Times New Roman"/>
-              </w:rPr>
-              <w:t>66-CF</w:t>
-            </w:r>
-          </w:p>
-        </w:tc>
-        <w:tc>
-          <w:tcPr>
-            <w:tcW w:type="dxa" w:w="2880"/>
-          </w:tcPr>
-          <w:p>
-            <w:r>
-              <w:rPr>
-                <w:rFonts w:ascii="Times New Roman" w:hAnsi="Times New Roman" w:eastAsia="Times New Roman"/>
-              </w:rPr>
-              <w:t>24</w:t>
-            </w:r>
-          </w:p>
-        </w:tc>
-        <w:tc>
-          <w:tcPr>
-            <w:tcW w:type="dxa" w:w="2880"/>
-          </w:tcPr>
-          <w:p>
-            <w:r>
-              <w:rPr>
-                <w:rFonts w:ascii="Times New Roman" w:hAnsi="Times New Roman" w:eastAsia="Times New Roman"/>
-              </w:rPr>
-              <w:t>+0.295</w:t>
-            </w:r>
-          </w:p>
-        </w:tc>
-      </w:tr>
-      <w:tr>
-        <w:tc>
-          <w:tcPr>
-            <w:tcW w:type="dxa" w:w="2880"/>
-          </w:tcPr>
-          <w:p>
-            <w:r>
-              <w:rPr>
-                <w:rFonts w:ascii="Times New Roman" w:hAnsi="Times New Roman" w:eastAsia="Times New Roman"/>
-              </w:rPr>
-              <w:t>68-CF</w:t>
-            </w:r>
-          </w:p>
-        </w:tc>
-        <w:tc>
-          <w:tcPr>
-            <w:tcW w:type="dxa" w:w="2880"/>
-          </w:tcPr>
-          <w:p>
-            <w:r>
-              <w:rPr>
-                <w:rFonts w:ascii="Times New Roman" w:hAnsi="Times New Roman" w:eastAsia="Times New Roman"/>
-              </w:rPr>
-              <w:t>24</w:t>
-            </w:r>
-          </w:p>
-        </w:tc>
-        <w:tc>
-          <w:tcPr>
-            <w:tcW w:type="dxa" w:w="2880"/>
-          </w:tcPr>
-          <w:p>
-            <w:r>
-              <w:rPr>
-                <w:rFonts w:ascii="Times New Roman" w:hAnsi="Times New Roman" w:eastAsia="Times New Roman"/>
-              </w:rPr>
-              <w:t>+0.283</w:t>
-            </w:r>
-          </w:p>
-        </w:tc>
-      </w:tr>
-      <w:tr>
-        <w:tc>
-          <w:tcPr>
-            <w:tcW w:type="dxa" w:w="2880"/>
-          </w:tcPr>
-          <w:p>
-            <w:r>
-              <w:rPr>
-                <w:rFonts w:ascii="Times New Roman" w:hAnsi="Times New Roman" w:eastAsia="Times New Roman"/>
-              </w:rPr>
-              <w:t>69-CF</w:t>
-            </w:r>
-          </w:p>
-        </w:tc>
-        <w:tc>
-          <w:tcPr>
-            <w:tcW w:type="dxa" w:w="2880"/>
-          </w:tcPr>
-          <w:p>
-            <w:r>
-              <w:rPr>
-                <w:rFonts w:ascii="Times New Roman" w:hAnsi="Times New Roman" w:eastAsia="Times New Roman"/>
-              </w:rPr>
-              <w:t>8</w:t>
-            </w:r>
-          </w:p>
-        </w:tc>
-        <w:tc>
-          <w:tcPr>
-            <w:tcW w:type="dxa" w:w="2880"/>
+            <w:tcW w:type="dxa" w:w="1440"/>
           </w:tcPr>
           <w:p>
             <w:r>

</xml_diff>

<commit_message>
Include failed VTI ranking and overlap warning in paper
</commit_message>
<xml_diff>
--- a/paper/mega27-03-virtual-organoid-paper.docx
+++ b/paper/mega27-03-virtual-organoid-paper.docx
@@ -435,7 +435,7 @@
           <w:rFonts w:ascii="Times New Roman" w:hAnsi="Times New Roman" w:eastAsia="Times New Roman"/>
           <w:b/>
         </w:rPr>
-        <w:t>Table 1. Dataset manifest (distinct, accession-level). Four distinct assay/image datasets shown here; the committed accession ledger now has 167 primary entries, including one independent FIS demo plate and one 20-patient FIS accession each counted once.</w:t>
+        <w:t>Table 1. Dataset manifest (distinct, accession-level). Five distinct assay/image datasets shown here; the committed accession ledger now has 168 primary entries; separate Drevinek-group releases may overlap patients and are not individual-object replication.</w:t>
       </w:r>
     </w:p>
     <w:tbl>
@@ -782,6 +782,73 @@
                 <w:rFonts w:ascii="Times New Roman" w:hAnsi="Times New Roman" w:eastAsia="Times New Roman"/>
               </w:rPr>
               <w:t>triple-vs-double treatment ranking</w:t>
+            </w:r>
+          </w:p>
+        </w:tc>
+      </w:tr>
+      <w:tr>
+        <w:tc>
+          <w:tcPr>
+            <w:tcW w:type="dxa" w:w="1728"/>
+          </w:tcPr>
+          <w:p>
+            <w:r>
+              <w:rPr>
+                <w:rFonts w:ascii="Times New Roman" w:hAnsi="Times New Roman" w:eastAsia="Times New Roman"/>
+              </w:rPr>
+              <w:t>5</w:t>
+            </w:r>
+          </w:p>
+        </w:tc>
+        <w:tc>
+          <w:tcPr>
+            <w:tcW w:type="dxa" w:w="1728"/>
+          </w:tcPr>
+          <w:p>
+            <w:r>
+              <w:rPr>
+                <w:rFonts w:ascii="Times New Roman" w:hAnsi="Times New Roman" w:eastAsia="Times New Roman"/>
+              </w:rPr>
+              <w:t>Borek-Dohalska intestinal FIS cohort</w:t>
+            </w:r>
+          </w:p>
+        </w:tc>
+        <w:tc>
+          <w:tcPr>
+            <w:tcW w:type="dxa" w:w="1728"/>
+          </w:tcPr>
+          <w:p>
+            <w:r>
+              <w:rPr>
+                <w:rFonts w:ascii="Times New Roman" w:hAnsi="Times New Roman" w:eastAsia="Times New Roman"/>
+              </w:rPr>
+              <w:t>Zenodo 15754800</w:t>
+            </w:r>
+          </w:p>
+        </w:tc>
+        <w:tc>
+          <w:tcPr>
+            <w:tcW w:type="dxa" w:w="1728"/>
+          </w:tcPr>
+          <w:p>
+            <w:r>
+              <w:rPr>
+                <w:rFonts w:ascii="Times New Roman" w:hAnsi="Times New Roman" w:eastAsia="Times New Roman"/>
+              </w:rPr>
+              <w:t>12 patient IDs, 33 plates, well-level areas; possible overlap with 4771466</w:t>
+            </w:r>
+          </w:p>
+        </w:tc>
+        <w:tc>
+          <w:tcPr>
+            <w:tcW w:type="dxa" w:w="1728"/>
+          </w:tcPr>
+          <w:p>
+            <w:r>
+              <w:rPr>
+                <w:rFonts w:ascii="Times New Roman" w:hAnsi="Times New Roman" w:eastAsia="Times New Roman"/>
+              </w:rPr>
+              <w:t>negative VTI-vs-ETI ranking test</w:t>
             </w:r>
           </w:p>
         </w:tc>
@@ -4535,6 +4602,460 @@
         <w:rPr>
           <w:rFonts w:ascii="Times New Roman" w:hAnsi="Times New Roman" w:eastAsia="Times New Roman"/>
         </w:rPr>
+        <w:t>4.3e Newer VTI-versus-ETI patient ranking fails registered test</w:t>
+      </w:r>
+    </w:p>
+    <w:p>
+      <w:pPr>
+        <w:spacing w:after="120"/>
+        <w:jc w:val="both"/>
+      </w:pPr>
+      <w:r>
+        <w:rPr>
+          <w:rFonts w:ascii="Times New Roman" w:hAnsi="Times New Roman" w:eastAsia="Times New Roman"/>
+        </w:rPr>
+        <w:t>A further Drevinek-group public release (Zenodo 15754800) has well-level area series for 12 anonymized CF patient IDs and 33 plates. Only nine patients have matched default vanzacaftor/tezacaftor/ivacaftor (VTI) and elexacaftor/tezacaftor/ivacaftor (ETI) wells; three instead have VTI-dose-optimization variants, which were not substituted into the locked primary test. Of 264 plate-dose blocks, 208 qualify. Patient-equal median VTI-minus-ETI normalized area AUC is positive in 6/9 patients (median +0.018, one-sided exact sign p=0.254); H1 fails. Only 112/208 matched plate-dose blocks are positive. Raw-area AUC reverses 92/208 block rankings and leaves 3/9 patient medians positive. In 48 separate dose-optimization blocks, just 12 show strictly rising response across 0.02, 0.2 and 2 µM VTI, a descriptive check, not an alternative pass. The earlier 2021 dataset and this release share textual anonymized IDs 58 and 68, which neither proves nor excludes patient overlap. This negative in-vitro ranking does not establish patient equivalence/inferiority, and still cannot test individual-size effects (results/vti_eti.json; results/finding_vti_eti.md).</w:t>
+      </w:r>
+    </w:p>
+    <w:p>
+      <w:r>
+        <w:rPr>
+          <w:rFonts w:ascii="Times New Roman" w:hAnsi="Times New Roman" w:eastAsia="Times New Roman"/>
+          <w:b/>
+        </w:rPr>
+        <w:t>Table 7. Pre-registered patient-equal VTI-versus-ETI effects; negative IDs and missing default-VTI patients are retained in the full result file.</w:t>
+      </w:r>
+    </w:p>
+    <w:tbl>
+      <w:tblPr>
+        <w:tblStyle w:val="LightGrid-Accent1"/>
+        <w:tblW w:type="auto" w:w="0"/>
+        <w:tblLook w:firstColumn="1" w:firstRow="1" w:lastColumn="0" w:lastRow="0" w:noHBand="0" w:noVBand="1" w:val="04A0"/>
+      </w:tblPr>
+      <w:tblGrid>
+        <w:gridCol w:w="2880"/>
+        <w:gridCol w:w="2880"/>
+        <w:gridCol w:w="2880"/>
+      </w:tblGrid>
+      <w:tr>
+        <w:tc>
+          <w:tcPr>
+            <w:tcW w:type="dxa" w:w="2880"/>
+          </w:tcPr>
+          <w:p>
+            <w:r>
+              <w:rPr>
+                <w:rFonts w:ascii="Times New Roman" w:hAnsi="Times New Roman" w:eastAsia="Times New Roman"/>
+              </w:rPr>
+              <w:t>patient</w:t>
+            </w:r>
+          </w:p>
+        </w:tc>
+        <w:tc>
+          <w:tcPr>
+            <w:tcW w:type="dxa" w:w="2880"/>
+          </w:tcPr>
+          <w:p>
+            <w:r>
+              <w:rPr>
+                <w:rFonts w:ascii="Times New Roman" w:hAnsi="Times New Roman" w:eastAsia="Times New Roman"/>
+              </w:rPr>
+              <w:t>blocks</w:t>
+            </w:r>
+          </w:p>
+        </w:tc>
+        <w:tc>
+          <w:tcPr>
+            <w:tcW w:type="dxa" w:w="2880"/>
+          </w:tcPr>
+          <w:p>
+            <w:r>
+              <w:rPr>
+                <w:rFonts w:ascii="Times New Roman" w:hAnsi="Times New Roman" w:eastAsia="Times New Roman"/>
+              </w:rPr>
+              <w:t>VTI-ETI AUC</w:t>
+            </w:r>
+          </w:p>
+        </w:tc>
+      </w:tr>
+      <w:tr>
+        <w:tc>
+          <w:tcPr>
+            <w:tcW w:type="dxa" w:w="2880"/>
+          </w:tcPr>
+          <w:p>
+            <w:r>
+              <w:rPr>
+                <w:rFonts w:ascii="Times New Roman" w:hAnsi="Times New Roman" w:eastAsia="Times New Roman"/>
+              </w:rPr>
+              <w:t>06</w:t>
+            </w:r>
+          </w:p>
+        </w:tc>
+        <w:tc>
+          <w:tcPr>
+            <w:tcW w:type="dxa" w:w="2880"/>
+          </w:tcPr>
+          <w:p>
+            <w:r>
+              <w:rPr>
+                <w:rFonts w:ascii="Times New Roman" w:hAnsi="Times New Roman" w:eastAsia="Times New Roman"/>
+              </w:rPr>
+              <w:t>24</w:t>
+            </w:r>
+          </w:p>
+        </w:tc>
+        <w:tc>
+          <w:tcPr>
+            <w:tcW w:type="dxa" w:w="2880"/>
+          </w:tcPr>
+          <w:p>
+            <w:r>
+              <w:rPr>
+                <w:rFonts w:ascii="Times New Roman" w:hAnsi="Times New Roman" w:eastAsia="Times New Roman"/>
+              </w:rPr>
+              <w:t>+0.028</w:t>
+            </w:r>
+          </w:p>
+        </w:tc>
+      </w:tr>
+      <w:tr>
+        <w:tc>
+          <w:tcPr>
+            <w:tcW w:type="dxa" w:w="2880"/>
+          </w:tcPr>
+          <w:p>
+            <w:r>
+              <w:rPr>
+                <w:rFonts w:ascii="Times New Roman" w:hAnsi="Times New Roman" w:eastAsia="Times New Roman"/>
+              </w:rPr>
+              <w:t>27</w:t>
+            </w:r>
+          </w:p>
+        </w:tc>
+        <w:tc>
+          <w:tcPr>
+            <w:tcW w:type="dxa" w:w="2880"/>
+          </w:tcPr>
+          <w:p>
+            <w:r>
+              <w:rPr>
+                <w:rFonts w:ascii="Times New Roman" w:hAnsi="Times New Roman" w:eastAsia="Times New Roman"/>
+              </w:rPr>
+              <w:t>24</w:t>
+            </w:r>
+          </w:p>
+        </w:tc>
+        <w:tc>
+          <w:tcPr>
+            <w:tcW w:type="dxa" w:w="2880"/>
+          </w:tcPr>
+          <w:p>
+            <w:r>
+              <w:rPr>
+                <w:rFonts w:ascii="Times New Roman" w:hAnsi="Times New Roman" w:eastAsia="Times New Roman"/>
+              </w:rPr>
+              <w:t>+0.045</w:t>
+            </w:r>
+          </w:p>
+        </w:tc>
+      </w:tr>
+      <w:tr>
+        <w:tc>
+          <w:tcPr>
+            <w:tcW w:type="dxa" w:w="2880"/>
+          </w:tcPr>
+          <w:p>
+            <w:r>
+              <w:rPr>
+                <w:rFonts w:ascii="Times New Roman" w:hAnsi="Times New Roman" w:eastAsia="Times New Roman"/>
+              </w:rPr>
+              <w:t>31</w:t>
+            </w:r>
+          </w:p>
+        </w:tc>
+        <w:tc>
+          <w:tcPr>
+            <w:tcW w:type="dxa" w:w="2880"/>
+          </w:tcPr>
+          <w:p>
+            <w:r>
+              <w:rPr>
+                <w:rFonts w:ascii="Times New Roman" w:hAnsi="Times New Roman" w:eastAsia="Times New Roman"/>
+              </w:rPr>
+              <w:t>24</w:t>
+            </w:r>
+          </w:p>
+        </w:tc>
+        <w:tc>
+          <w:tcPr>
+            <w:tcW w:type="dxa" w:w="2880"/>
+          </w:tcPr>
+          <w:p>
+            <w:r>
+              <w:rPr>
+                <w:rFonts w:ascii="Times New Roman" w:hAnsi="Times New Roman" w:eastAsia="Times New Roman"/>
+              </w:rPr>
+              <w:t>-0.007</w:t>
+            </w:r>
+          </w:p>
+        </w:tc>
+      </w:tr>
+      <w:tr>
+        <w:tc>
+          <w:tcPr>
+            <w:tcW w:type="dxa" w:w="2880"/>
+          </w:tcPr>
+          <w:p>
+            <w:r>
+              <w:rPr>
+                <w:rFonts w:ascii="Times New Roman" w:hAnsi="Times New Roman" w:eastAsia="Times New Roman"/>
+              </w:rPr>
+              <w:t>40</w:t>
+            </w:r>
+          </w:p>
+        </w:tc>
+        <w:tc>
+          <w:tcPr>
+            <w:tcW w:type="dxa" w:w="2880"/>
+          </w:tcPr>
+          <w:p>
+            <w:r>
+              <w:rPr>
+                <w:rFonts w:ascii="Times New Roman" w:hAnsi="Times New Roman" w:eastAsia="Times New Roman"/>
+              </w:rPr>
+              <w:t>16</w:t>
+            </w:r>
+          </w:p>
+        </w:tc>
+        <w:tc>
+          <w:tcPr>
+            <w:tcW w:type="dxa" w:w="2880"/>
+          </w:tcPr>
+          <w:p>
+            <w:r>
+              <w:rPr>
+                <w:rFonts w:ascii="Times New Roman" w:hAnsi="Times New Roman" w:eastAsia="Times New Roman"/>
+              </w:rPr>
+              <w:t>-0.007</w:t>
+            </w:r>
+          </w:p>
+        </w:tc>
+      </w:tr>
+      <w:tr>
+        <w:tc>
+          <w:tcPr>
+            <w:tcW w:type="dxa" w:w="2880"/>
+          </w:tcPr>
+          <w:p>
+            <w:r>
+              <w:rPr>
+                <w:rFonts w:ascii="Times New Roman" w:hAnsi="Times New Roman" w:eastAsia="Times New Roman"/>
+              </w:rPr>
+              <w:t>46</w:t>
+            </w:r>
+          </w:p>
+        </w:tc>
+        <w:tc>
+          <w:tcPr>
+            <w:tcW w:type="dxa" w:w="2880"/>
+          </w:tcPr>
+          <w:p>
+            <w:r>
+              <w:rPr>
+                <w:rFonts w:ascii="Times New Roman" w:hAnsi="Times New Roman" w:eastAsia="Times New Roman"/>
+              </w:rPr>
+              <w:t>24</w:t>
+            </w:r>
+          </w:p>
+        </w:tc>
+        <w:tc>
+          <w:tcPr>
+            <w:tcW w:type="dxa" w:w="2880"/>
+          </w:tcPr>
+          <w:p>
+            <w:r>
+              <w:rPr>
+                <w:rFonts w:ascii="Times New Roman" w:hAnsi="Times New Roman" w:eastAsia="Times New Roman"/>
+              </w:rPr>
+              <w:t>+0.035</w:t>
+            </w:r>
+          </w:p>
+        </w:tc>
+      </w:tr>
+      <w:tr>
+        <w:tc>
+          <w:tcPr>
+            <w:tcW w:type="dxa" w:w="2880"/>
+          </w:tcPr>
+          <w:p>
+            <w:r>
+              <w:rPr>
+                <w:rFonts w:ascii="Times New Roman" w:hAnsi="Times New Roman" w:eastAsia="Times New Roman"/>
+              </w:rPr>
+              <w:t>68</w:t>
+            </w:r>
+          </w:p>
+        </w:tc>
+        <w:tc>
+          <w:tcPr>
+            <w:tcW w:type="dxa" w:w="2880"/>
+          </w:tcPr>
+          <w:p>
+            <w:r>
+              <w:rPr>
+                <w:rFonts w:ascii="Times New Roman" w:hAnsi="Times New Roman" w:eastAsia="Times New Roman"/>
+              </w:rPr>
+              <w:t>24</w:t>
+            </w:r>
+          </w:p>
+        </w:tc>
+        <w:tc>
+          <w:tcPr>
+            <w:tcW w:type="dxa" w:w="2880"/>
+          </w:tcPr>
+          <w:p>
+            <w:r>
+              <w:rPr>
+                <w:rFonts w:ascii="Times New Roman" w:hAnsi="Times New Roman" w:eastAsia="Times New Roman"/>
+              </w:rPr>
+              <w:t>-0.009</w:t>
+            </w:r>
+          </w:p>
+        </w:tc>
+      </w:tr>
+      <w:tr>
+        <w:tc>
+          <w:tcPr>
+            <w:tcW w:type="dxa" w:w="2880"/>
+          </w:tcPr>
+          <w:p>
+            <w:r>
+              <w:rPr>
+                <w:rFonts w:ascii="Times New Roman" w:hAnsi="Times New Roman" w:eastAsia="Times New Roman"/>
+              </w:rPr>
+              <w:t>91</w:t>
+            </w:r>
+          </w:p>
+        </w:tc>
+        <w:tc>
+          <w:tcPr>
+            <w:tcW w:type="dxa" w:w="2880"/>
+          </w:tcPr>
+          <w:p>
+            <w:r>
+              <w:rPr>
+                <w:rFonts w:ascii="Times New Roman" w:hAnsi="Times New Roman" w:eastAsia="Times New Roman"/>
+              </w:rPr>
+              <w:t>24</w:t>
+            </w:r>
+          </w:p>
+        </w:tc>
+        <w:tc>
+          <w:tcPr>
+            <w:tcW w:type="dxa" w:w="2880"/>
+          </w:tcPr>
+          <w:p>
+            <w:r>
+              <w:rPr>
+                <w:rFonts w:ascii="Times New Roman" w:hAnsi="Times New Roman" w:eastAsia="Times New Roman"/>
+              </w:rPr>
+              <w:t>+0.028</w:t>
+            </w:r>
+          </w:p>
+        </w:tc>
+      </w:tr>
+      <w:tr>
+        <w:tc>
+          <w:tcPr>
+            <w:tcW w:type="dxa" w:w="2880"/>
+          </w:tcPr>
+          <w:p>
+            <w:r>
+              <w:rPr>
+                <w:rFonts w:ascii="Times New Roman" w:hAnsi="Times New Roman" w:eastAsia="Times New Roman"/>
+              </w:rPr>
+              <w:t>94</w:t>
+            </w:r>
+          </w:p>
+        </w:tc>
+        <w:tc>
+          <w:tcPr>
+            <w:tcW w:type="dxa" w:w="2880"/>
+          </w:tcPr>
+          <w:p>
+            <w:r>
+              <w:rPr>
+                <w:rFonts w:ascii="Times New Roman" w:hAnsi="Times New Roman" w:eastAsia="Times New Roman"/>
+              </w:rPr>
+              <w:t>24</w:t>
+            </w:r>
+          </w:p>
+        </w:tc>
+        <w:tc>
+          <w:tcPr>
+            <w:tcW w:type="dxa" w:w="2880"/>
+          </w:tcPr>
+          <w:p>
+            <w:r>
+              <w:rPr>
+                <w:rFonts w:ascii="Times New Roman" w:hAnsi="Times New Roman" w:eastAsia="Times New Roman"/>
+              </w:rPr>
+              <w:t>+0.018</w:t>
+            </w:r>
+          </w:p>
+        </w:tc>
+      </w:tr>
+      <w:tr>
+        <w:tc>
+          <w:tcPr>
+            <w:tcW w:type="dxa" w:w="2880"/>
+          </w:tcPr>
+          <w:p>
+            <w:r>
+              <w:rPr>
+                <w:rFonts w:ascii="Times New Roman" w:hAnsi="Times New Roman" w:eastAsia="Times New Roman"/>
+              </w:rPr>
+              <w:t>96</w:t>
+            </w:r>
+          </w:p>
+        </w:tc>
+        <w:tc>
+          <w:tcPr>
+            <w:tcW w:type="dxa" w:w="2880"/>
+          </w:tcPr>
+          <w:p>
+            <w:r>
+              <w:rPr>
+                <w:rFonts w:ascii="Times New Roman" w:hAnsi="Times New Roman" w:eastAsia="Times New Roman"/>
+              </w:rPr>
+              <w:t>24</w:t>
+            </w:r>
+          </w:p>
+        </w:tc>
+        <w:tc>
+          <w:tcPr>
+            <w:tcW w:type="dxa" w:w="2880"/>
+          </w:tcPr>
+          <w:p>
+            <w:r>
+              <w:rPr>
+                <w:rFonts w:ascii="Times New Roman" w:hAnsi="Times New Roman" w:eastAsia="Times New Roman"/>
+              </w:rPr>
+              <w:t>+0.004</w:t>
+            </w:r>
+          </w:p>
+        </w:tc>
+      </w:tr>
+    </w:tbl>
+    <w:p>
+      <w:pPr>
+        <w:pStyle w:val="Heading2"/>
+      </w:pPr>
+      <w:r>
+        <w:rPr>
+          <w:rFonts w:ascii="Times New Roman" w:hAnsi="Times New Roman" w:eastAsia="Times New Roman"/>
+        </w:rPr>
         <w:t>4.4 Does size correction help theratyping? No</w:t>
       </w:r>
     </w:p>
@@ -4567,7 +5088,7 @@
           <w:rFonts w:ascii="Times New Roman" w:hAnsi="Times New Roman" w:eastAsia="Times New Roman"/>
           <w:b/>
         </w:rPr>
-        <w:t>Table 7. Instance segmentation on the OrgaSegment eval split (12 images).</w:t>
+        <w:t>Table 8. Instance segmentation on the OrgaSegment eval split (12 images).</w:t>
       </w:r>
     </w:p>
     <w:tbl>
@@ -5075,7 +5596,7 @@
           <w:rFonts w:ascii="Times New Roman" w:hAnsi="Times New Roman" w:eastAsia="Times New Roman"/>
           <w:b/>
         </w:rPr>
-        <w:t>Table 8. Tissue recovery and fibroblast best-match share. S3000: Spearman on the 3,000 most tissue-variable genes; SALL: all genes; CENT: GTEx-centred Pearson; _NOCULT: 853 MSigDB Hallmark proliferation/MYC/EMT genes removed. Clean subset: 114 series whose summary confirms a single organ and mentions organoids (113 with profiles). Files: results/geo_fidelity_methods.json, results/geo_fidelity_clean.json.</w:t>
+        <w:t>Table 9. Tissue recovery and fibroblast best-match share. S3000: Spearman on the 3,000 most tissue-variable genes; SALL: all genes; CENT: GTEx-centred Pearson; _NOCULT: 853 MSigDB Hallmark proliferation/MYC/EMT genes removed. Clean subset: 114 series whose summary confirms a single organ and mentions organoids (113 with profiles). Files: results/geo_fidelity_methods.json, results/geo_fidelity_clean.json.</w:t>
       </w:r>
     </w:p>
     <w:tbl>
@@ -6322,7 +6843,7 @@
           <w:rFonts w:ascii="Times New Roman" w:hAnsi="Times New Roman" w:eastAsia="Times New Roman"/>
           <w:b/>
         </w:rPr>
-        <w:t>Table 9. Organ-of-origin recovery on 151 series, base method vs gene-restricted variant (results/geo_mcnemar.json).</w:t>
+        <w:t>Table 10. Organ-of-origin recovery on 151 series, base method vs gene-restricted variant (results/geo_mcnemar.json).</w:t>
       </w:r>
     </w:p>
     <w:tbl>
@@ -7133,7 +7654,7 @@
           <w:rFonts w:ascii="Times New Roman" w:hAnsi="Times New Roman" w:eastAsia="Times New Roman"/>
           <w:b/>
         </w:rPr>
-        <w:t>Table 10. Enrichment of attractor-driving genes (results/attractor_gprofiler.csv; terms with more than 2,000 genes omitted).</w:t>
+        <w:t>Table 11. Enrichment of attractor-driving genes (results/attractor_gprofiler.csv; terms with more than 2,000 genes omitted).</w:t>
       </w:r>
     </w:p>
     <w:tbl>
@@ -7642,7 +8163,7 @@
           <w:rFonts w:ascii="Times New Roman" w:hAnsi="Times New Roman" w:eastAsia="Times New Roman"/>
           <w:b/>
         </w:rPr>
-        <w:t>Table 11. Attractor on strict organoid series vs series without organoid samples (results/geo_fidelity_strict.json).</w:t>
+        <w:t>Table 12. Attractor on strict organoid series vs series without organoid samples (results/geo_fidelity_strict.json).</w:t>
       </w:r>
     </w:p>
     <w:tbl>
@@ -8661,7 +9182,7 @@
           <w:rFonts w:ascii="Times New Roman" w:hAnsi="Times New Roman" w:eastAsia="Times New Roman"/>
           <w:b/>
         </w:rPr>
-        <w:t>Table 12. Organ recovery on the 45 strictly organoid series (SALL_PARONLY; results/strict_organ_recovery.csv).</w:t>
+        <w:t>Table 13. Organ recovery on the 45 strictly organoid series (SALL_PARONLY; results/strict_organ_recovery.csv).</w:t>
       </w:r>
     </w:p>
     <w:tbl>
@@ -9336,7 +9857,7 @@
           <w:rFonts w:ascii="Times New Roman" w:hAnsi="Times New Roman" w:eastAsia="Times New Roman"/>
           <w:b/>
         </w:rPr>
-        <w:t>Table 13. Out-of-sample organoid profiles (results/ae_replication.csv).</w:t>
+        <w:t>Table 14. Out-of-sample organoid profiles (results/ae_replication.csv).</w:t>
       </w:r>
     </w:p>
     <w:tbl>
@@ -10168,7 +10689,7 @@
           <w:rFonts w:ascii="Times New Roman" w:hAnsi="Times New Roman" w:eastAsia="Times New Roman"/>
           <w:b/>
         </w:rPr>
-        <w:t>Table 14. Further pre-registered annotation checks on fixed 100-gene deficit lists, not independent experiments. Each p is descriptive in an exploratory sequence; results/deficit_goa.json, deficit_kegg.json, deficit_rhea.json.</w:t>
+        <w:t>Table 15. Further pre-registered annotation checks on fixed 100-gene deficit lists, not independent experiments. Each p is descriptive in an exploratory sequence; results/deficit_goa.json, deficit_kegg.json, deficit_rhea.json.</w:t>
       </w:r>
     </w:p>
     <w:tbl>
@@ -10629,7 +11150,7 @@
         <w:rPr>
           <w:rFonts w:ascii="Times New Roman" w:hAnsi="Times New Roman" w:eastAsia="Times New Roman"/>
         </w:rPr>
-        <w:t>- Small-organoid replication on the public FIS time series is impossible: it is well-level; its separate 20-patient treatment-ranking test passes but cannot resolve individual-size moderation.</w:t>
+        <w:t>- Small-organoid replication on the public FIS time series is impossible: it is well-level; the 20-patient triple-vs-double ranking passes, but the separate VTI-vs-ETI ranking fails (6/9, p=0.254).</w:t>
       </w:r>
     </w:p>
     <w:p>
@@ -10888,7 +11409,7 @@
           <w:rFonts w:ascii="Times New Roman" w:hAnsi="Times New Roman" w:eastAsia="Times New Roman"/>
           <w:b/>
         </w:rPr>
-        <w:t>Table 15. Tools genuinely used (results/tools_ledger.csv): 47 entries, 40 counting toward the gate after excluding infrastructure. Target of 40 reached; this counts resources genuinely used, not independent biological confirmations.</w:t>
+        <w:t>Table 16. Tools genuinely used (results/tools_ledger.csv): 47 entries, 40 counting toward the gate after excluding infrastructure. Target of 40 reached; this counts resources genuinely used, not independent biological confirmations.</w:t>
       </w:r>
     </w:p>
     <w:tbl>
@@ -13841,6 +14362,18 @@
           <w:rFonts w:ascii="Times New Roman" w:hAnsi="Times New Roman" w:eastAsia="Times New Roman"/>
         </w:rPr>
         <w:t>Drevinek P, et al. Response to elexacaftor/tezacaftor/ivacaftor in intestinal organoids derived from people with cystic fibrosis. J Cyst Fibros 2021. https://doi.org/10.1016/j.jcf.2021.07.006 . Data: https://zenodo.org/records/4771466</w:t>
+      </w:r>
+    </w:p>
+    <w:p>
+      <w:pPr>
+        <w:spacing w:after="120"/>
+        <w:jc w:val="both"/>
+      </w:pPr>
+      <w:r>
+        <w:rPr>
+          <w:rFonts w:ascii="Times New Roman" w:hAnsi="Times New Roman" w:eastAsia="Times New Roman"/>
+        </w:rPr>
+        <w:t>Borek-Dohalska L, et al. Effect of vanzacaftor on cystic fibrosis airway epithelial cells compared to elexacaftor. Data: https://zenodo.org/records/15754800</w:t>
       </w:r>
     </w:p>
     <w:p>

</xml_diff>

<commit_message>
Keep negative result and benchmark tables visually intact
</commit_message>
<xml_diff>
--- a/paper/mega27-03-virtual-organoid-paper.docx
+++ b/paper/mega27-03-virtual-organoid-paper.docx
@@ -4595,6 +4595,14 @@
       </w:tr>
     </w:tbl>
     <w:p>
+      <w:r>
+        <w:rPr>
+          <w:rFonts w:ascii="Times New Roman" w:hAnsi="Times New Roman" w:eastAsia="Times New Roman"/>
+        </w:rPr>
+        <w:br w:type="page"/>
+      </w:r>
+    </w:p>
+    <w:p>
       <w:pPr>
         <w:pStyle w:val="Heading2"/>
       </w:pPr>
@@ -5069,6 +5077,14 @@
           <w:rFonts w:ascii="Times New Roman" w:hAnsi="Times New Roman" w:eastAsia="Times New Roman"/>
         </w:rPr>
         <w:t>Locked before running: per-donor standardised Trikafta-vs-DMSO separation with raw, size-adjusted and size-band well readouts. Median raw 4.73, adjusted 4.35, band 4.39; adjusted better in 8 of 17 donors. Excluding organoids below 1,069 px (a post-hoc threshold): median 4.73 -&gt; 4.75, better in 9 of 17, Wilcoxon p = 0.68. The size trend does not improve calls, and the stricter matched-block H1 fails.</w:t>
+      </w:r>
+    </w:p>
+    <w:p>
+      <w:r>
+        <w:rPr>
+          <w:rFonts w:ascii="Times New Roman" w:hAnsi="Times New Roman" w:eastAsia="Times New Roman"/>
+        </w:rPr>
+        <w:br w:type="page"/>
       </w:r>
     </w:p>
     <w:p>

</xml_diff>